<commit_message>
Render checkbox fields with ★/□ markers and underlined payloads
Replace pre-rendered checkbox strings in JSON with structured data:
- 對象勾選列: single choice (業者/媒體/其他_payload)
- 方式: single choice (自行邀訪/合作邀訪_partner)
- 申請單位經費/其他來源: boolean checkboxes
- 本署支應列: list of selected support items with checkbox rendering
- 預期效益: structured object with checkbox scope and underlined fields
- 附件資料: prefixed with ★ markers
- 預估金額: always show 外幣：/約合新台幣： labels

Also updates template cell widths, schema.json, extract_fields.md prompt,
and all sample/test JSON fixtures.

Co-Authored-By: Claude Opus 4.6 <noreply@anthropic.com>
</commit_message>
<xml_diff>
--- a/src/main/resources/templates/important-person-invitation-template.docx
+++ b/src/main/resources/templates/important-person-invitation-template.docx
@@ -1154,7 +1154,7 @@
         </w:tc>
         <w:tc>
           <w:tcPr>
-            <w:tcW w:w="3559" w:type="dxa"/>
+            <w:tcW w:w="3059" w:type="dxa"/>
             <w:gridSpan w:val="4"/>
           </w:tcPr>
           <w:p>
@@ -1174,7 +1174,7 @@
         </w:tc>
         <w:tc>
           <w:tcPr>
-            <w:tcW w:w="835" w:type="dxa"/>
+            <w:tcW w:w="1335" w:type="dxa"/>
           </w:tcPr>
           <w:p>
             <w:pPr>
@@ -1269,7 +1269,7 @@
         </w:tc>
         <w:tc>
           <w:tcPr>
-            <w:tcW w:w="3559" w:type="dxa"/>
+            <w:tcW w:w="3059" w:type="dxa"/>
             <w:gridSpan w:val="4"/>
           </w:tcPr>
           <w:p>
@@ -1302,7 +1302,7 @@
         </w:tc>
         <w:tc>
           <w:tcPr>
-            <w:tcW w:w="835" w:type="dxa"/>
+            <w:tcW w:w="1335" w:type="dxa"/>
           </w:tcPr>
           <w:p>
             <w:pPr>
@@ -1372,7 +1372,7 @@
         </w:tc>
         <w:tc>
           <w:tcPr>
-            <w:tcW w:w="3559" w:type="dxa"/>
+            <w:tcW w:w="3059" w:type="dxa"/>
             <w:gridSpan w:val="4"/>
           </w:tcPr>
           <w:p>
@@ -1406,7 +1406,7 @@
         </w:tc>
         <w:tc>
           <w:tcPr>
-            <w:tcW w:w="835" w:type="dxa"/>
+            <w:tcW w:w="1335" w:type="dxa"/>
           </w:tcPr>
           <w:p>
             <w:pPr>
@@ -1586,7 +1586,7 @@
         </w:tc>
         <w:tc>
           <w:tcPr>
-            <w:tcW w:w="3559" w:type="dxa"/>
+            <w:tcW w:w="3059" w:type="dxa"/>
             <w:gridSpan w:val="4"/>
           </w:tcPr>
           <w:p>
@@ -1644,7 +1644,7 @@
         </w:tc>
         <w:tc>
           <w:tcPr>
-            <w:tcW w:w="835" w:type="dxa"/>
+            <w:tcW w:w="1335" w:type="dxa"/>
           </w:tcPr>
           <w:p>
             <w:pPr>
@@ -1733,7 +1733,7 @@
       <w:tr>
         <w:tc>
           <w:tcPr>
-            <w:tcW w:w="2398" w:type="dxa"/>
+            <w:tcW w:w="1800" w:type="dxa"/>
             <w:gridSpan w:val="2"/>
             <w:vAlign w:val="center"/>
           </w:tcPr>
@@ -1754,7 +1754,7 @@
         </w:tc>
         <w:tc>
           <w:tcPr>
-            <w:tcW w:w="6571" w:type="dxa"/>
+            <w:tcW w:w="7169" w:type="dxa"/>
             <w:gridSpan w:val="6"/>
           </w:tcPr>
           <w:p>
@@ -2026,7 +2026,7 @@
       <w:tr>
         <w:tc>
           <w:tcPr>
-            <w:tcW w:w="2398" w:type="dxa"/>
+            <w:tcW w:w="1800" w:type="dxa"/>
             <w:gridSpan w:val="2"/>
             <w:vAlign w:val="center"/>
           </w:tcPr>
@@ -2047,7 +2047,7 @@
         </w:tc>
         <w:tc>
           <w:tcPr>
-            <w:tcW w:w="3487" w:type="dxa"/>
+            <w:tcW w:w="2400" w:type="dxa"/>
             <w:gridSpan w:val="2"/>
           </w:tcPr>
           <w:p>
@@ -2092,7 +2092,7 @@
         </w:tc>
         <w:tc>
           <w:tcPr>
-            <w:tcW w:w="1415" w:type="dxa"/>
+            <w:tcW w:w="2413" w:type="dxa"/>
             <w:gridSpan w:val="2"/>
           </w:tcPr>
           <w:p>
@@ -2116,7 +2116,7 @@
         </w:tc>
         <w:tc>
           <w:tcPr>
-            <w:tcW w:w="1669" w:type="dxa"/>
+            <w:tcW w:w="2356" w:type="dxa"/>
             <w:gridSpan w:val="2"/>
           </w:tcPr>
           <w:p>

</xml_diff>

<commit_message>
Render checkbox fields with ★/□ markers and underlined payloads (#49)
Replace pre-rendered checkbox strings in JSON with structured data:
- 對象勾選列: single choice (業者/媒體/其他_payload)
- 方式: single choice (自行邀訪/合作邀訪_partner)
- 申請單位經費/其他來源: boolean checkboxes
- 本署支應列: list of selected support items with checkbox rendering
- 預期效益: structured object with checkbox scope and underlined fields
- 附件資料: prefixed with ★ markers
- 預估金額: always show 外幣：/約合新台幣： labels

Also updates template cell widths, schema.json, extract_fields.md prompt,
and all sample/test JSON fixtures.

Co-authored-by: Claude Opus 4.6 <noreply@anthropic.com>
</commit_message>
<xml_diff>
--- a/src/main/resources/templates/important-person-invitation-template.docx
+++ b/src/main/resources/templates/important-person-invitation-template.docx
@@ -1154,7 +1154,7 @@
         </w:tc>
         <w:tc>
           <w:tcPr>
-            <w:tcW w:w="3559" w:type="dxa"/>
+            <w:tcW w:w="3059" w:type="dxa"/>
             <w:gridSpan w:val="4"/>
           </w:tcPr>
           <w:p>
@@ -1174,7 +1174,7 @@
         </w:tc>
         <w:tc>
           <w:tcPr>
-            <w:tcW w:w="835" w:type="dxa"/>
+            <w:tcW w:w="1335" w:type="dxa"/>
           </w:tcPr>
           <w:p>
             <w:pPr>
@@ -1269,7 +1269,7 @@
         </w:tc>
         <w:tc>
           <w:tcPr>
-            <w:tcW w:w="3559" w:type="dxa"/>
+            <w:tcW w:w="3059" w:type="dxa"/>
             <w:gridSpan w:val="4"/>
           </w:tcPr>
           <w:p>
@@ -1302,7 +1302,7 @@
         </w:tc>
         <w:tc>
           <w:tcPr>
-            <w:tcW w:w="835" w:type="dxa"/>
+            <w:tcW w:w="1335" w:type="dxa"/>
           </w:tcPr>
           <w:p>
             <w:pPr>
@@ -1372,7 +1372,7 @@
         </w:tc>
         <w:tc>
           <w:tcPr>
-            <w:tcW w:w="3559" w:type="dxa"/>
+            <w:tcW w:w="3059" w:type="dxa"/>
             <w:gridSpan w:val="4"/>
           </w:tcPr>
           <w:p>
@@ -1406,7 +1406,7 @@
         </w:tc>
         <w:tc>
           <w:tcPr>
-            <w:tcW w:w="835" w:type="dxa"/>
+            <w:tcW w:w="1335" w:type="dxa"/>
           </w:tcPr>
           <w:p>
             <w:pPr>
@@ -1586,7 +1586,7 @@
         </w:tc>
         <w:tc>
           <w:tcPr>
-            <w:tcW w:w="3559" w:type="dxa"/>
+            <w:tcW w:w="3059" w:type="dxa"/>
             <w:gridSpan w:val="4"/>
           </w:tcPr>
           <w:p>
@@ -1644,7 +1644,7 @@
         </w:tc>
         <w:tc>
           <w:tcPr>
-            <w:tcW w:w="835" w:type="dxa"/>
+            <w:tcW w:w="1335" w:type="dxa"/>
           </w:tcPr>
           <w:p>
             <w:pPr>
@@ -1733,7 +1733,7 @@
       <w:tr>
         <w:tc>
           <w:tcPr>
-            <w:tcW w:w="2398" w:type="dxa"/>
+            <w:tcW w:w="1800" w:type="dxa"/>
             <w:gridSpan w:val="2"/>
             <w:vAlign w:val="center"/>
           </w:tcPr>
@@ -1754,7 +1754,7 @@
         </w:tc>
         <w:tc>
           <w:tcPr>
-            <w:tcW w:w="6571" w:type="dxa"/>
+            <w:tcW w:w="7169" w:type="dxa"/>
             <w:gridSpan w:val="6"/>
           </w:tcPr>
           <w:p>
@@ -2026,7 +2026,7 @@
       <w:tr>
         <w:tc>
           <w:tcPr>
-            <w:tcW w:w="2398" w:type="dxa"/>
+            <w:tcW w:w="1800" w:type="dxa"/>
             <w:gridSpan w:val="2"/>
             <w:vAlign w:val="center"/>
           </w:tcPr>
@@ -2047,7 +2047,7 @@
         </w:tc>
         <w:tc>
           <w:tcPr>
-            <w:tcW w:w="3487" w:type="dxa"/>
+            <w:tcW w:w="2400" w:type="dxa"/>
             <w:gridSpan w:val="2"/>
           </w:tcPr>
           <w:p>
@@ -2092,7 +2092,7 @@
         </w:tc>
         <w:tc>
           <w:tcPr>
-            <w:tcW w:w="1415" w:type="dxa"/>
+            <w:tcW w:w="2413" w:type="dxa"/>
             <w:gridSpan w:val="2"/>
           </w:tcPr>
           <w:p>
@@ -2116,7 +2116,7 @@
         </w:tc>
         <w:tc>
           <w:tcPr>
-            <w:tcW w:w="1669" w:type="dxa"/>
+            <w:tcW w:w="2356" w:type="dxa"/>
             <w:gridSpan w:val="2"/>
           </w:tcPr>
           <w:p>

</xml_diff>

<commit_message>
Add 附件三：經費概算表 with auto-derived funding row
The application form's funding row (申請單位 / 其他來源 / 本署支應 with
amounts and share ratios) is now computed from 附件三.明細 rows tagged with
資金來源, instead of the model filling 9 separate flat-list fields.

Each budget item carries 內容 / 單價 / 數量 / 資金來源 / 備註; the renderer
auto-numbers 項目, computes 總價 = 單價 × 數量, totals per source, derives
share-ratio percentages, and fills the form's funding row as
"外幣：€X / 約合新台幣：X萬X,XXX 元" using a hardcoded 1 EUR = 36 TWD rate.

Also adds 附件三 page rendering: clones the template data row for each
item, updates the merged 合計 row with the grand total.

Co-Authored-By: Claude Opus 4.7 <noreply@anthropic.com>
</commit_message>
<xml_diff>
--- a/src/main/resources/templates/important-person-invitation-template.docx
+++ b/src/main/resources/templates/important-person-invitation-template.docx
@@ -56,14 +56,14 @@
         <w:tblLook w:val="01E0" w:firstRow="1" w:lastRow="1" w:firstColumn="1" w:lastColumn="1" w:noHBand="0" w:noVBand="0"/>
       </w:tblPr>
       <w:tblGrid>
-        <w:gridCol w:w="491"/>
-        <w:gridCol w:w="1907"/>
-        <w:gridCol w:w="2177"/>
-        <w:gridCol w:w="1310"/>
-        <w:gridCol w:w="107"/>
-        <w:gridCol w:w="1308"/>
-        <w:gridCol w:w="834"/>
-        <w:gridCol w:w="835"/>
+        <w:gridCol w:w="473"/>
+        <w:gridCol w:w="1787"/>
+        <w:gridCol w:w="2038"/>
+        <w:gridCol w:w="210"/>
+        <w:gridCol w:w="1124"/>
+        <w:gridCol w:w="1133"/>
+        <w:gridCol w:w="393"/>
+        <w:gridCol w:w="1811"/>
       </w:tblGrid>
       <w:tr>
         <w:trPr>
@@ -676,7 +676,7 @@
           <w:p>
             <w:pPr>
               <w:rPr>
-                <w:rFonts w:ascii="Calibri" w:eastAsia="KaiTi" w:hAnsi="Calibri" w:cs="Calibri" w:hint="eastAsia"/>
+                <w:rFonts w:ascii="Calibri" w:eastAsia="KaiTi" w:hAnsi="Calibri" w:cs="Calibri"/>
                 <w:u w:val="single"/>
               </w:rPr>
             </w:pPr>
@@ -795,7 +795,7 @@
           <w:p>
             <w:pPr>
               <w:rPr>
-                <w:rFonts w:ascii="KaiTi" w:eastAsia="KaiTi" w:hAnsi="KaiTi" w:hint="eastAsia"/>
+                <w:rFonts w:ascii="KaiTi" w:eastAsia="KaiTi" w:hAnsi="KaiTi"/>
               </w:rPr>
             </w:pPr>
             <w:r>
@@ -1275,7 +1275,7 @@
           <w:p>
             <w:pPr>
               <w:rPr>
-                <w:rFonts w:ascii="KaiTi" w:eastAsia="KaiTi" w:hAnsi="KaiTi" w:hint="eastAsia"/>
+                <w:rFonts w:ascii="KaiTi" w:eastAsia="KaiTi" w:hAnsi="KaiTi"/>
                 <w:bCs/>
               </w:rPr>
             </w:pPr>
@@ -1289,7 +1289,7 @@
           <w:p>
             <w:pPr>
               <w:rPr>
-                <w:rFonts w:ascii="KaiTi" w:eastAsia="KaiTi" w:hAnsi="KaiTi" w:hint="eastAsia"/>
+                <w:rFonts w:ascii="KaiTi" w:eastAsia="KaiTi" w:hAnsi="KaiTi"/>
               </w:rPr>
             </w:pPr>
             <w:r>
@@ -1592,7 +1592,7 @@
           <w:p>
             <w:pPr>
               <w:rPr>
-                <w:rFonts w:ascii="KaiTi" w:eastAsia="KaiTi" w:hAnsi="KaiTi" w:hint="eastAsia"/>
+                <w:rFonts w:ascii="KaiTi" w:eastAsia="KaiTi" w:hAnsi="KaiTi"/>
               </w:rPr>
             </w:pPr>
             <w:r>
@@ -1897,7 +1897,7 @@
           <w:p>
             <w:pPr>
               <w:rPr>
-                <w:rFonts w:ascii="KaiTi" w:eastAsia="KaiTi" w:hAnsi="KaiTi" w:hint="eastAsia"/>
+                <w:rFonts w:ascii="KaiTi" w:eastAsia="KaiTi" w:hAnsi="KaiTi"/>
               </w:rPr>
             </w:pPr>
             <w:r>
@@ -2794,7 +2794,6 @@
                 <w:spacing w:val="0"/>
                 <w:kern w:val="2"/>
                 <w:szCs w:val="24"/>
-                <w:lang w:val="en-US"/>
               </w:rPr>
               <w:t>Costantino della Gherardesca</w:t>
             </w:r>
@@ -2823,9 +2822,54 @@
                 <w:spacing w:val="0"/>
                 <w:kern w:val="2"/>
                 <w:szCs w:val="24"/>
+              </w:rPr>
+              <w:t>，</w:t>
+            </w:r>
+            <w:r>
+              <w:rPr>
+                <w:rFonts w:ascii="KaiTi" w:eastAsia="KaiTi" w:hAnsi="KaiTi" w:hint="eastAsia"/>
+                <w:spacing w:val="0"/>
+                <w:kern w:val="2"/>
+                <w:szCs w:val="24"/>
                 <w:lang w:val="en-US"/>
               </w:rPr>
-              <w:t>，</w:t>
+              <w:t>目前</w:t>
+            </w:r>
+            <w:r>
+              <w:rPr>
+                <w:rFonts w:ascii="KaiTi" w:eastAsia="KaiTi" w:hAnsi="KaiTi"/>
+                <w:spacing w:val="0"/>
+                <w:kern w:val="2"/>
+                <w:szCs w:val="24"/>
+              </w:rPr>
+              <w:t>Instagram</w:t>
+            </w:r>
+            <w:r>
+              <w:rPr>
+                <w:rFonts w:ascii="KaiTi" w:eastAsia="KaiTi" w:hAnsi="KaiTi" w:hint="eastAsia"/>
+                <w:spacing w:val="0"/>
+                <w:kern w:val="2"/>
+                <w:szCs w:val="24"/>
+              </w:rPr>
+              <w:t>追蹤人數</w:t>
+            </w:r>
+            <w:r>
+              <w:rPr>
+                <w:rFonts w:ascii="KaiTi" w:eastAsia="KaiTi" w:hAnsi="KaiTi"/>
+                <w:spacing w:val="0"/>
+                <w:kern w:val="2"/>
+                <w:szCs w:val="24"/>
+              </w:rPr>
+              <w:t>331</w:t>
+            </w:r>
+            <w:r>
+              <w:rPr>
+                <w:rFonts w:ascii="KaiTi" w:eastAsia="KaiTi" w:hAnsi="KaiTi"/>
+                <w:spacing w:val="0"/>
+                <w:kern w:val="2"/>
+                <w:szCs w:val="24"/>
+              </w:rPr>
+              <w:t>,000</w:t>
             </w:r>
             <w:r>
               <w:rPr>
@@ -2835,43 +2879,95 @@
                 <w:szCs w:val="24"/>
                 <w:lang w:val="en-US"/>
               </w:rPr>
-              <w:t>目前</w:t>
-            </w:r>
-            <w:r>
-              <w:rPr>
-                <w:rFonts w:ascii="KaiTi" w:eastAsia="KaiTi" w:hAnsi="KaiTi"/>
-                <w:spacing w:val="0"/>
-                <w:kern w:val="2"/>
-                <w:szCs w:val="24"/>
-              </w:rPr>
-              <w:t>Instagram</w:t>
-            </w:r>
-            <w:r>
-              <w:rPr>
-                <w:rFonts w:ascii="KaiTi" w:eastAsia="KaiTi" w:hAnsi="KaiTi" w:hint="eastAsia"/>
-                <w:spacing w:val="0"/>
-                <w:kern w:val="2"/>
-                <w:szCs w:val="24"/>
-              </w:rPr>
-              <w:t>追蹤人數</w:t>
-            </w:r>
-            <w:r>
-              <w:rPr>
-                <w:rFonts w:ascii="KaiTi" w:eastAsia="KaiTi" w:hAnsi="KaiTi"/>
-                <w:spacing w:val="0"/>
-                <w:kern w:val="2"/>
-                <w:szCs w:val="24"/>
-                <w:lang w:val="en-US"/>
-              </w:rPr>
-              <w:t>331</w:t>
-            </w:r>
-            <w:r>
-              <w:rPr>
-                <w:rFonts w:ascii="KaiTi" w:eastAsia="KaiTi" w:hAnsi="KaiTi"/>
-                <w:spacing w:val="0"/>
-                <w:kern w:val="2"/>
-                <w:szCs w:val="24"/>
-                <w:lang w:val="en-US"/>
+              <w:t>、</w:t>
+            </w:r>
+            <w:r>
+              <w:rPr>
+                <w:rFonts w:ascii="KaiTi" w:eastAsia="KaiTi" w:hAnsi="KaiTi"/>
+                <w:spacing w:val="0"/>
+                <w:kern w:val="2"/>
+                <w:szCs w:val="24"/>
+              </w:rPr>
+              <w:t xml:space="preserve">TikTok </w:t>
+            </w:r>
+            <w:r>
+              <w:rPr>
+                <w:rFonts w:ascii="KaiTi" w:eastAsia="KaiTi" w:hAnsi="KaiTi"/>
+                <w:spacing w:val="0"/>
+                <w:kern w:val="2"/>
+                <w:szCs w:val="24"/>
+              </w:rPr>
+              <w:t>42</w:t>
+            </w:r>
+            <w:r>
+              <w:rPr>
+                <w:rFonts w:ascii="KaiTi" w:eastAsia="KaiTi" w:hAnsi="KaiTi"/>
+                <w:spacing w:val="0"/>
+                <w:kern w:val="2"/>
+                <w:szCs w:val="24"/>
+              </w:rPr>
+              <w:t>,</w:t>
+            </w:r>
+            <w:r>
+              <w:rPr>
+                <w:rFonts w:ascii="KaiTi" w:eastAsia="KaiTi" w:hAnsi="KaiTi"/>
+                <w:spacing w:val="0"/>
+                <w:kern w:val="2"/>
+                <w:szCs w:val="24"/>
+              </w:rPr>
+              <w:t>9</w:t>
+            </w:r>
+            <w:r>
+              <w:rPr>
+                <w:rFonts w:ascii="KaiTi" w:eastAsia="KaiTi" w:hAnsi="KaiTi"/>
+                <w:spacing w:val="0"/>
+                <w:kern w:val="2"/>
+                <w:szCs w:val="24"/>
+              </w:rPr>
+              <w:t>00</w:t>
+            </w:r>
+            <w:r>
+              <w:rPr>
+                <w:rFonts w:ascii="KaiTi" w:eastAsia="KaiTi" w:hAnsi="KaiTi" w:hint="eastAsia"/>
+                <w:spacing w:val="0"/>
+                <w:kern w:val="2"/>
+                <w:szCs w:val="24"/>
+              </w:rPr>
+              <w:t>人、</w:t>
+            </w:r>
+            <w:r>
+              <w:rPr>
+                <w:rFonts w:ascii="KaiTi" w:eastAsia="KaiTi" w:hAnsi="KaiTi"/>
+                <w:spacing w:val="0"/>
+                <w:kern w:val="2"/>
+                <w:szCs w:val="24"/>
+              </w:rPr>
+              <w:t>Youtube</w:t>
+            </w:r>
+            <w:r>
+              <w:rPr>
+                <w:rFonts w:ascii="KaiTi" w:eastAsia="KaiTi" w:hAnsi="KaiTi" w:hint="eastAsia"/>
+                <w:spacing w:val="0"/>
+                <w:kern w:val="2"/>
+                <w:szCs w:val="24"/>
+              </w:rPr>
+              <w:t xml:space="preserve"> </w:t>
+            </w:r>
+            <w:r>
+              <w:rPr>
+                <w:rFonts w:ascii="KaiTi" w:eastAsia="KaiTi" w:hAnsi="KaiTi"/>
+                <w:spacing w:val="0"/>
+                <w:kern w:val="2"/>
+                <w:szCs w:val="24"/>
+              </w:rPr>
+              <w:t>85</w:t>
+            </w:r>
+            <w:r>
+              <w:rPr>
+                <w:rFonts w:ascii="KaiTi" w:eastAsia="KaiTi" w:hAnsi="KaiTi"/>
+                <w:spacing w:val="0"/>
+                <w:kern w:val="2"/>
+                <w:szCs w:val="24"/>
               </w:rPr>
               <w:t>,000</w:t>
             </w:r>
@@ -2881,106 +2977,6 @@
                 <w:spacing w:val="0"/>
                 <w:kern w:val="2"/>
                 <w:szCs w:val="24"/>
-                <w:lang w:val="en-US"/>
-              </w:rPr>
-              <w:t>、</w:t>
-            </w:r>
-            <w:r>
-              <w:rPr>
-                <w:rFonts w:ascii="KaiTi" w:eastAsia="KaiTi" w:hAnsi="KaiTi"/>
-                <w:spacing w:val="0"/>
-                <w:kern w:val="2"/>
-                <w:szCs w:val="24"/>
-              </w:rPr>
-              <w:t xml:space="preserve">TikTok </w:t>
-            </w:r>
-            <w:r>
-              <w:rPr>
-                <w:rFonts w:ascii="KaiTi" w:eastAsia="KaiTi" w:hAnsi="KaiTi"/>
-                <w:spacing w:val="0"/>
-                <w:kern w:val="2"/>
-                <w:szCs w:val="24"/>
-              </w:rPr>
-              <w:t>42</w:t>
-            </w:r>
-            <w:r>
-              <w:rPr>
-                <w:rFonts w:ascii="KaiTi" w:eastAsia="KaiTi" w:hAnsi="KaiTi"/>
-                <w:spacing w:val="0"/>
-                <w:kern w:val="2"/>
-                <w:szCs w:val="24"/>
-              </w:rPr>
-              <w:t>,</w:t>
-            </w:r>
-            <w:r>
-              <w:rPr>
-                <w:rFonts w:ascii="KaiTi" w:eastAsia="KaiTi" w:hAnsi="KaiTi"/>
-                <w:spacing w:val="0"/>
-                <w:kern w:val="2"/>
-                <w:szCs w:val="24"/>
-              </w:rPr>
-              <w:t>9</w:t>
-            </w:r>
-            <w:r>
-              <w:rPr>
-                <w:rFonts w:ascii="KaiTi" w:eastAsia="KaiTi" w:hAnsi="KaiTi"/>
-                <w:spacing w:val="0"/>
-                <w:kern w:val="2"/>
-                <w:szCs w:val="24"/>
-              </w:rPr>
-              <w:t>00</w:t>
-            </w:r>
-            <w:r>
-              <w:rPr>
-                <w:rFonts w:ascii="KaiTi" w:eastAsia="KaiTi" w:hAnsi="KaiTi" w:hint="eastAsia"/>
-                <w:spacing w:val="0"/>
-                <w:kern w:val="2"/>
-                <w:szCs w:val="24"/>
-              </w:rPr>
-              <w:t>人、</w:t>
-            </w:r>
-            <w:r>
-              <w:rPr>
-                <w:rFonts w:ascii="KaiTi" w:eastAsia="KaiTi" w:hAnsi="KaiTi"/>
-                <w:spacing w:val="0"/>
-                <w:kern w:val="2"/>
-                <w:szCs w:val="24"/>
-              </w:rPr>
-              <w:t>Youtube</w:t>
-            </w:r>
-            <w:r>
-              <w:rPr>
-                <w:rFonts w:ascii="KaiTi" w:eastAsia="KaiTi" w:hAnsi="KaiTi" w:hint="eastAsia"/>
-                <w:spacing w:val="0"/>
-                <w:kern w:val="2"/>
-                <w:szCs w:val="24"/>
-              </w:rPr>
-              <w:t xml:space="preserve"> </w:t>
-            </w:r>
-            <w:r>
-              <w:rPr>
-                <w:rFonts w:ascii="KaiTi" w:eastAsia="KaiTi" w:hAnsi="KaiTi"/>
-                <w:spacing w:val="0"/>
-                <w:kern w:val="2"/>
-                <w:szCs w:val="24"/>
-              </w:rPr>
-              <w:t>85</w:t>
-            </w:r>
-            <w:r>
-              <w:rPr>
-                <w:rFonts w:ascii="KaiTi" w:eastAsia="KaiTi" w:hAnsi="KaiTi"/>
-                <w:spacing w:val="0"/>
-                <w:kern w:val="2"/>
-                <w:szCs w:val="24"/>
-              </w:rPr>
-              <w:t>,000</w:t>
-            </w:r>
-            <w:r>
-              <w:rPr>
-                <w:rFonts w:ascii="KaiTi" w:eastAsia="KaiTi" w:hAnsi="KaiTi" w:hint="eastAsia"/>
-                <w:spacing w:val="0"/>
-                <w:kern w:val="2"/>
-                <w:szCs w:val="24"/>
               </w:rPr>
               <w:t>人</w:t>
             </w:r>
@@ -2990,7 +2986,6 @@
                 <w:spacing w:val="0"/>
                 <w:kern w:val="2"/>
                 <w:szCs w:val="24"/>
-                <w:lang w:val="en-US"/>
               </w:rPr>
               <w:t>，</w:t>
             </w:r>
@@ -3292,7 +3287,7 @@
               </w:numPr>
               <w:spacing w:after="0" w:line="360" w:lineRule="exact"/>
               <w:rPr>
-                <w:rFonts w:ascii="KaiTi" w:eastAsia="KaiTi" w:hAnsi="KaiTi" w:hint="eastAsia"/>
+                <w:rFonts w:ascii="KaiTi" w:eastAsia="KaiTi" w:hAnsi="KaiTi"/>
                 <w:spacing w:val="0"/>
                 <w:kern w:val="2"/>
                 <w:szCs w:val="24"/>
@@ -3552,7 +3547,7 @@
               <w:spacing w:after="0" w:line="360" w:lineRule="exact"/>
               <w:ind w:left="357" w:hanging="357"/>
               <w:rPr>
-                <w:rFonts w:ascii="KaiTi" w:eastAsia="KaiTi" w:hAnsi="KaiTi" w:hint="eastAsia"/>
+                <w:rFonts w:ascii="KaiTi" w:eastAsia="KaiTi" w:hAnsi="KaiTi"/>
                 <w:spacing w:val="0"/>
                 <w:kern w:val="2"/>
                 <w:szCs w:val="24"/>
@@ -4054,7 +4049,7 @@
           <w:sz w:val="32"/>
           <w:szCs w:val="32"/>
         </w:rPr>
-        <w:pict w14:anchorId="79CCB533">
+        <w:pict w14:anchorId="53AF8ECB">
           <v:shapetype id="_x0000_t75" coordsize="21600,21600" o:spt="75" o:preferrelative="t" path="m@4@5l@4@11@9@11@9@5xe" filled="f" stroked="f">
             <v:stroke joinstyle="miter"/>
             <v:formulas>
@@ -4074,9 +4069,9 @@
             <v:path o:extrusionok="f" gradientshapeok="t" o:connecttype="rect"/>
             <o:lock v:ext="edit" aspectratio="t"/>
           </v:shapetype>
-          <v:shape id="Grafik 1" o:spid="_x0000_i1025" type="#_x0000_t75" style="width:110.5pt;height:108pt;visibility:visible">
+          <v:shape id="Grafik 1" o:spid="_x0000_i1025" type="#_x0000_t75" style="width:110.8pt;height:108.3pt;visibility:visible;mso-wrap-style:square">
             <v:imagedata r:id="rId7" o:title=""/>
-            <o:lock v:ext="edit" aspectratio="f"/>
+            <o:lock v:ext="edit" rotation="t" cropping="t" verticies="t"/>
           </v:shape>
         </w:pict>
       </w:r>
@@ -4484,35 +4479,35 @@
           <w:p>
             <w:pPr>
               <w:rPr>
-                <w:rFonts w:ascii="Calibri" w:hAnsi="Calibri" w:cs="Calibri" w:hint="eastAsia"/>
-                <w:color w:val="000000"/>
-                <w:sz w:val="22"/>
-                <w:szCs w:val="22"/>
-              </w:rPr>
-            </w:pPr>
-            <w:r>
-              <w:rPr>
                 <w:rFonts w:ascii="Calibri" w:hAnsi="Calibri" w:cs="Calibri"/>
                 <w:color w:val="000000"/>
                 <w:sz w:val="22"/>
                 <w:szCs w:val="22"/>
               </w:rPr>
-              <w:t>Costantino della Gherardesca</w:t>
-            </w:r>
-          </w:p>
-        </w:tc>
-        <w:tc>
-          <w:tcPr>
-            <w:tcW w:w="360" w:type="dxa"/>
-          </w:tcPr>
-          <w:p>
-            <w:pPr>
+            </w:pPr>
+            <w:r>
               <w:rPr>
                 <w:rFonts w:ascii="Calibri" w:hAnsi="Calibri" w:cs="Calibri"/>
                 <w:color w:val="000000"/>
                 <w:sz w:val="22"/>
                 <w:szCs w:val="22"/>
               </w:rPr>
+              <w:t>Costantino della Gherardesca</w:t>
+            </w:r>
+          </w:p>
+        </w:tc>
+        <w:tc>
+          <w:tcPr>
+            <w:tcW w:w="360" w:type="dxa"/>
+          </w:tcPr>
+          <w:p>
+            <w:pPr>
+              <w:rPr>
+                <w:rFonts w:ascii="Calibri" w:hAnsi="Calibri" w:cs="Calibri"/>
+                <w:color w:val="000000"/>
+                <w:sz w:val="22"/>
+                <w:szCs w:val="22"/>
+              </w:rPr>
             </w:pPr>
             <w:r>
               <w:rPr>
@@ -4562,7 +4557,6 @@
         <w:tc>
           <w:tcPr>
             <w:tcW w:w="1418" w:type="dxa"/>
-            <w:vMerge w:val="restart"/>
             <w:vAlign w:val="center"/>
           </w:tcPr>
           <w:p>
@@ -4646,7 +4640,7 @@
           <w:p>
             <w:pPr>
               <w:rPr>
-                <w:rFonts w:ascii="KaiTi" w:eastAsia="KaiTi" w:hAnsi="KaiTi" w:hint="eastAsia"/>
+                <w:rFonts w:ascii="KaiTi" w:eastAsia="KaiTi" w:hAnsi="KaiTi"/>
               </w:rPr>
             </w:pPr>
             <w:r>
@@ -4682,7 +4676,7 @@
                 <w:sz w:val="22"/>
                 <w:szCs w:val="22"/>
               </w:rPr>
-              <w:t>2</w:t>
+              <w:t>1</w:t>
             </w:r>
           </w:p>
         </w:tc>
@@ -4699,70 +4693,60 @@
                 <w:szCs w:val="22"/>
               </w:rPr>
             </w:pPr>
-            <w:r>
+          </w:p>
+        </w:tc>
+        <w:tc>
+          <w:tcPr>
+            <w:tcW w:w="360" w:type="dxa"/>
+          </w:tcPr>
+          <w:p>
+            <w:pPr>
+              <w:rPr>
+                <w:rFonts w:ascii="PingFang TC" w:eastAsia="PingFang TC" w:hAnsi="PingFang TC" w:cs="PingFang TC"/>
+                <w:color w:val="000000"/>
+                <w:sz w:val="22"/>
+                <w:szCs w:val="22"/>
+              </w:rPr>
+            </w:pPr>
+            <w:r>
+              <w:rPr>
+                <w:rFonts w:ascii="PingFang TC" w:eastAsia="PingFang TC" w:hAnsi="PingFang TC" w:cs="PingFang TC"/>
+                <w:color w:val="000000"/>
+                <w:sz w:val="22"/>
+                <w:szCs w:val="22"/>
+              </w:rPr>
+              <w:t>M</w:t>
+            </w:r>
+          </w:p>
+        </w:tc>
+        <w:tc>
+          <w:tcPr>
+            <w:tcW w:w="1836" w:type="dxa"/>
+            <w:vAlign w:val="center"/>
+          </w:tcPr>
+          <w:p>
+            <w:pPr>
               <w:rPr>
                 <w:rFonts w:ascii="Calibri" w:hAnsi="Calibri" w:cs="Calibri"/>
                 <w:color w:val="000000"/>
                 <w:sz w:val="22"/>
                 <w:szCs w:val="22"/>
               </w:rPr>
-              <w:t>Rossana Moro</w:t>
-            </w:r>
-          </w:p>
-        </w:tc>
-        <w:tc>
-          <w:tcPr>
-            <w:tcW w:w="360" w:type="dxa"/>
-          </w:tcPr>
-          <w:p>
-            <w:pPr>
+            </w:pPr>
+            <w:r>
               <w:rPr>
                 <w:rFonts w:ascii="Calibri" w:hAnsi="Calibri" w:cs="Calibri"/>
                 <w:color w:val="000000"/>
                 <w:sz w:val="22"/>
                 <w:szCs w:val="22"/>
               </w:rPr>
-            </w:pPr>
-            <w:r>
-              <w:rPr>
-                <w:rFonts w:ascii="Calibri" w:hAnsi="Calibri" w:cs="Calibri"/>
-                <w:color w:val="000000"/>
-                <w:sz w:val="22"/>
-                <w:szCs w:val="22"/>
-              </w:rPr>
-              <w:t>F</w:t>
-            </w:r>
-          </w:p>
-        </w:tc>
-        <w:tc>
-          <w:tcPr>
-            <w:tcW w:w="1836" w:type="dxa"/>
-            <w:vAlign w:val="center"/>
-          </w:tcPr>
-          <w:p>
-            <w:pPr>
-              <w:rPr>
-                <w:rFonts w:ascii="Calibri" w:hAnsi="Calibri" w:cs="Calibri"/>
-                <w:color w:val="000000"/>
-                <w:sz w:val="22"/>
-                <w:szCs w:val="22"/>
-              </w:rPr>
-            </w:pPr>
-            <w:r>
-              <w:rPr>
-                <w:rFonts w:ascii="Calibri" w:hAnsi="Calibri" w:cs="Calibri"/>
-                <w:color w:val="000000"/>
-                <w:sz w:val="22"/>
-                <w:szCs w:val="22"/>
-              </w:rPr>
-              <w:t>Assistant</w:t>
+              <w:t>Moderator/Influencer</w:t>
             </w:r>
           </w:p>
         </w:tc>
         <w:tc>
           <w:tcPr>
             <w:tcW w:w="1418" w:type="dxa"/>
-            <w:vMerge/>
             <w:vAlign w:val="center"/>
           </w:tcPr>
           <w:p>
@@ -4774,6 +4758,25 @@
                 <w:szCs w:val="20"/>
               </w:rPr>
             </w:pPr>
+            <w:r>
+              <w:rPr>
+                <w:rFonts w:ascii="Calibri" w:hAnsi="Calibri" w:cs="Calibri"/>
+                <w:color w:val="000000"/>
+                <w:sz w:val="20"/>
+                <w:szCs w:val="20"/>
+              </w:rPr>
+              <w:t>@</w:t>
+            </w:r>
+            <w:r>
+              <w:rPr>
+                <w:rFonts w:ascii="Arial" w:hAnsi="Arial" w:cs="Arial"/>
+                <w:color w:val="4D5156"/>
+                <w:sz w:val="20"/>
+                <w:szCs w:val="20"/>
+                <w:shd w:val="clear" w:color="auto" w:fill="FFFFFF"/>
+              </w:rPr>
+              <w:t>costantinodellagherardesca</w:t>
+            </w:r>
           </w:p>
         </w:tc>
         <w:tc>
@@ -4845,7 +4848,7 @@
     <w:p>
       <w:pPr>
         <w:rPr>
-          <w:rFonts w:ascii="KaiTi" w:eastAsia="KaiTi" w:hAnsi="KaiTi" w:hint="eastAsia"/>
+          <w:rFonts w:ascii="KaiTi" w:eastAsia="KaiTi" w:hAnsi="KaiTi"/>
           <w:b/>
           <w:sz w:val="28"/>
           <w:szCs w:val="28"/>
@@ -5040,7 +5043,7 @@
               <w:spacing w:line="300" w:lineRule="exact"/>
               <w:jc w:val="center"/>
               <w:rPr>
-                <w:rFonts w:ascii="KaiTi" w:eastAsia="KaiTi" w:hAnsi="KaiTi" w:hint="eastAsia"/>
+                <w:rFonts w:ascii="KaiTi" w:eastAsia="KaiTi" w:hAnsi="KaiTi"/>
                 <w:sz w:val="26"/>
                 <w:szCs w:val="26"/>
               </w:rPr>
@@ -5090,7 +5093,7 @@
               <w:spacing w:line="300" w:lineRule="exact"/>
               <w:jc w:val="center"/>
               <w:rPr>
-                <w:rFonts w:ascii="KaiTi" w:eastAsia="KaiTi" w:hAnsi="KaiTi" w:hint="eastAsia"/>
+                <w:rFonts w:ascii="KaiTi" w:eastAsia="KaiTi" w:hAnsi="KaiTi"/>
                 <w:sz w:val="26"/>
                 <w:szCs w:val="26"/>
               </w:rPr>
@@ -5124,7 +5127,7 @@
               <w:spacing w:line="300" w:lineRule="exact"/>
               <w:jc w:val="center"/>
               <w:rPr>
-                <w:rFonts w:ascii="KaiTi" w:eastAsia="KaiTi" w:hAnsi="KaiTi" w:hint="eastAsia"/>
+                <w:rFonts w:ascii="KaiTi" w:eastAsia="KaiTi" w:hAnsi="KaiTi"/>
                 <w:sz w:val="26"/>
                 <w:szCs w:val="26"/>
               </w:rPr>
@@ -5691,41 +5694,63 @@
     </w:p>
     <w:tbl>
       <w:tblPr>
-        <w:tblW w:w="8789" w:type="dxa"/>
-        <w:tblCellSpacing w:w="20" w:type="dxa"/>
-        <w:tblInd w:w="163" w:type="dxa"/>
+        <w:tblW w:w="4891" w:type="pct"/>
+        <w:tblInd w:w="108" w:type="dxa"/>
         <w:tblBorders>
-          <w:top w:val="outset" w:sz="6" w:space="0" w:color="auto"/>
-          <w:left w:val="outset" w:sz="6" w:space="0" w:color="auto"/>
-          <w:bottom w:val="outset" w:sz="6" w:space="0" w:color="auto"/>
-          <w:right w:val="outset" w:sz="6" w:space="0" w:color="auto"/>
-          <w:insideH w:val="outset" w:sz="6" w:space="0" w:color="auto"/>
-          <w:insideV w:val="outset" w:sz="6" w:space="0" w:color="auto"/>
+          <w:top w:val="single" w:sz="4" w:space="0" w:color="auto"/>
+          <w:left w:val="single" w:sz="4" w:space="0" w:color="auto"/>
+          <w:bottom w:val="single" w:sz="4" w:space="0" w:color="auto"/>
+          <w:right w:val="single" w:sz="4" w:space="0" w:color="auto"/>
+          <w:insideH w:val="single" w:sz="4" w:space="0" w:color="auto"/>
+          <w:insideV w:val="single" w:sz="4" w:space="0" w:color="auto"/>
         </w:tblBorders>
-        <w:tblLook w:val="04A0" w:firstRow="1" w:lastRow="0" w:firstColumn="1" w:lastColumn="0" w:noHBand="0" w:noVBand="1"/>
+        <w:tblLook w:val="01E0" w:firstRow="1" w:lastRow="1" w:firstColumn="1" w:lastColumn="1" w:noHBand="0" w:noVBand="0"/>
       </w:tblPr>
       <w:tblGrid>
-        <w:gridCol w:w="2127"/>
-        <w:gridCol w:w="3969"/>
-        <w:gridCol w:w="2693"/>
+        <w:gridCol w:w="1890"/>
+        <w:gridCol w:w="5039"/>
+        <w:gridCol w:w="1878"/>
       </w:tblGrid>
       <w:tr>
-        <w:trPr>
-          <w:tblCellSpacing w:w="20" w:type="dxa"/>
-        </w:trPr>
-        <w:tc>
-          <w:tcPr>
-            <w:tcW w:w="2067" w:type="dxa"/>
+        <w:tc>
+          <w:tcPr>
+            <w:tcW w:w="1073" w:type="pct"/>
             <w:vAlign w:val="center"/>
           </w:tcPr>
           <w:p>
             <w:pPr>
+              <w:spacing w:line="300" w:lineRule="exact"/>
               <w:jc w:val="center"/>
+              <w:rPr>
+                <w:rFonts w:ascii="KaiTi" w:eastAsia="KaiTi" w:hAnsi="KaiTi"/>
+                <w:sz w:val="26"/>
+                <w:szCs w:val="26"/>
+              </w:rPr>
+            </w:pPr>
+            <w:r>
               <w:rPr>
                 <w:rFonts w:ascii="KaiTi" w:eastAsia="KaiTi" w:hAnsi="KaiTi" w:hint="eastAsia"/>
                 <w:bCs/>
                 <w:lang w:val="fr-FR"/>
               </w:rPr>
+              <w:t>日期</w:t>
+            </w:r>
+          </w:p>
+        </w:tc>
+        <w:tc>
+          <w:tcPr>
+            <w:tcW w:w="2861" w:type="pct"/>
+            <w:vAlign w:val="center"/>
+          </w:tcPr>
+          <w:p>
+            <w:pPr>
+              <w:spacing w:line="300" w:lineRule="exact"/>
+              <w:jc w:val="center"/>
+              <w:rPr>
+                <w:rFonts w:ascii="KaiTi" w:eastAsia="KaiTi" w:hAnsi="KaiTi"/>
+                <w:sz w:val="26"/>
+                <w:szCs w:val="26"/>
+              </w:rPr>
             </w:pPr>
             <w:r>
               <w:rPr>
@@ -5733,46 +5758,23 @@
                 <w:bCs/>
                 <w:lang w:val="fr-FR"/>
               </w:rPr>
-              <w:t>日期</w:t>
-            </w:r>
-          </w:p>
-        </w:tc>
-        <w:tc>
-          <w:tcPr>
-            <w:tcW w:w="3929" w:type="dxa"/>
+              <w:t>建議行程</w:t>
+            </w:r>
+          </w:p>
+        </w:tc>
+        <w:tc>
+          <w:tcPr>
+            <w:tcW w:w="1066" w:type="pct"/>
             <w:vAlign w:val="center"/>
           </w:tcPr>
           <w:p>
             <w:pPr>
+              <w:spacing w:line="300" w:lineRule="exact"/>
               <w:jc w:val="center"/>
               <w:rPr>
                 <w:rFonts w:ascii="KaiTi" w:eastAsia="KaiTi" w:hAnsi="KaiTi"/>
-                <w:bCs/>
-                <w:lang w:val="fr-FR"/>
-              </w:rPr>
-            </w:pPr>
-            <w:r>
-              <w:rPr>
-                <w:rFonts w:ascii="KaiTi" w:eastAsia="KaiTi" w:hAnsi="KaiTi" w:hint="eastAsia"/>
-                <w:bCs/>
-                <w:lang w:val="fr-FR"/>
-              </w:rPr>
-              <w:t>建議行程</w:t>
-            </w:r>
-          </w:p>
-        </w:tc>
-        <w:tc>
-          <w:tcPr>
-            <w:tcW w:w="2633" w:type="dxa"/>
-            <w:vAlign w:val="center"/>
-          </w:tcPr>
-          <w:p>
-            <w:pPr>
-              <w:jc w:val="center"/>
-              <w:rPr>
-                <w:rFonts w:ascii="KaiTi" w:eastAsia="KaiTi" w:hAnsi="KaiTi"/>
-                <w:bCs/>
-                <w:lang w:val="fr-FR"/>
+                <w:sz w:val="26"/>
+                <w:szCs w:val="26"/>
               </w:rPr>
             </w:pPr>
             <w:r>
@@ -5788,11 +5790,11 @@
       </w:tr>
       <w:tr>
         <w:trPr>
-          <w:tblCellSpacing w:w="20" w:type="dxa"/>
+          <w:trHeight w:val="720"/>
         </w:trPr>
         <w:tc>
           <w:tcPr>
-            <w:tcW w:w="2067" w:type="dxa"/>
+            <w:tcW w:w="1073" w:type="pct"/>
           </w:tcPr>
           <w:p>
             <w:pPr>
@@ -5825,37 +5827,35 @@
         </w:tc>
         <w:tc>
           <w:tcPr>
-            <w:tcW w:w="3929" w:type="dxa"/>
-          </w:tcPr>
-          <w:p>
-            <w:pPr>
+            <w:tcW w:w="2861" w:type="pct"/>
+          </w:tcPr>
+          <w:p>
+            <w:pPr>
+              <w:jc w:val="center"/>
+              <w:rPr>
+                <w:rFonts w:ascii="Calibri" w:eastAsia="DFKai-SB" w:hAnsi="Calibri"/>
+              </w:rPr>
+            </w:pPr>
+            <w:r>
               <w:rPr>
                 <w:rFonts w:ascii="Calibri" w:hAnsi="Calibri"/>
                 <w:b/>
                 <w:color w:val="0070C0"/>
                 <w:lang w:val="fr-FR"/>
               </w:rPr>
-            </w:pPr>
-            <w:r>
-              <w:rPr>
-                <w:rFonts w:ascii="Calibri" w:hAnsi="Calibri"/>
-                <w:b/>
-                <w:color w:val="0070C0"/>
-                <w:lang w:val="fr-FR"/>
-              </w:rPr>
               <w:t>MXP-TPE BR096</w:t>
             </w:r>
           </w:p>
         </w:tc>
         <w:tc>
           <w:tcPr>
-            <w:tcW w:w="2633" w:type="dxa"/>
-          </w:tcPr>
-          <w:p>
-            <w:pPr>
+            <w:tcW w:w="1066" w:type="pct"/>
+          </w:tcPr>
+          <w:p>
+            <w:pPr>
+              <w:jc w:val="center"/>
               <w:rPr>
                 <w:rFonts w:ascii="Calibri" w:eastAsia="DFKai-SB" w:hAnsi="Calibri"/>
-                <w:lang w:val="fr-FR"/>
               </w:rPr>
             </w:pPr>
             <w:r>
@@ -5870,11 +5870,17 @@
       </w:tr>
       <w:tr>
         <w:trPr>
-          <w:tblCellSpacing w:w="20" w:type="dxa"/>
+          <w:trHeight w:val="720"/>
         </w:trPr>
         <w:tc>
           <w:tcPr>
-            <w:tcW w:w="2067" w:type="dxa"/>
+            <w:tcW w:w="1073" w:type="pct"/>
+            <w:tcBorders>
+              <w:top w:val="single" w:sz="4" w:space="0" w:color="auto"/>
+              <w:left w:val="single" w:sz="4" w:space="0" w:color="auto"/>
+              <w:bottom w:val="single" w:sz="4" w:space="0" w:color="auto"/>
+              <w:right w:val="single" w:sz="4" w:space="0" w:color="auto"/>
+            </w:tcBorders>
           </w:tcPr>
           <w:p>
             <w:pPr>
@@ -5903,25 +5909,25 @@
               <w:rPr>
                 <w:rFonts w:ascii="Calibri" w:eastAsia="DFKai-SB" w:hAnsi="Calibri"/>
               </w:rPr>
-              <w:t>Thu</w:t>
+              <w:t xml:space="preserve">Thu </w:t>
             </w:r>
             <w:r>
               <w:rPr>
                 <w:rFonts w:ascii="Calibri" w:eastAsia="DFKai-SB" w:hAnsi="Calibri"/>
               </w:rPr>
-              <w:t xml:space="preserve"> </w:t>
-            </w:r>
-            <w:r>
-              <w:rPr>
-                <w:rFonts w:ascii="Calibri" w:eastAsia="DFKai-SB" w:hAnsi="Calibri"/>
-              </w:rPr>
               <w:t>(Day 1)</w:t>
             </w:r>
           </w:p>
         </w:tc>
         <w:tc>
           <w:tcPr>
-            <w:tcW w:w="3929" w:type="dxa"/>
+            <w:tcW w:w="2861" w:type="pct"/>
+            <w:tcBorders>
+              <w:top w:val="single" w:sz="4" w:space="0" w:color="auto"/>
+              <w:left w:val="single" w:sz="4" w:space="0" w:color="auto"/>
+              <w:bottom w:val="single" w:sz="4" w:space="0" w:color="auto"/>
+              <w:right w:val="single" w:sz="4" w:space="0" w:color="auto"/>
+            </w:tcBorders>
           </w:tcPr>
           <w:p>
             <w:pPr>
@@ -5929,7 +5935,7 @@
                 <w:tab w:val="center" w:pos="4153"/>
                 <w:tab w:val="right" w:pos="8306"/>
               </w:tabs>
-              <w:ind w:left="602" w:hangingChars="250" w:hanging="602"/>
+              <w:ind w:left="601" w:hangingChars="250" w:hanging="601"/>
               <w:jc w:val="both"/>
               <w:rPr>
                 <w:rFonts w:ascii="Calibri" w:hAnsi="Calibri"/>
@@ -5963,16 +5969,7 @@
                 <w:color w:val="0070C0"/>
                 <w:lang w:val="en-US"/>
               </w:rPr>
-              <w:t>2</w:t>
-            </w:r>
-            <w:r>
-              <w:rPr>
-                <w:rFonts w:ascii="Calibri" w:hAnsi="Calibri"/>
-                <w:b/>
-                <w:color w:val="0070C0"/>
-                <w:lang w:val="en-US"/>
-              </w:rPr>
-              <w:t>0</w:t>
+              <w:t>20</w:t>
             </w:r>
             <w:r>
               <w:rPr>
@@ -6005,12 +6002,7 @@
           </w:p>
           <w:p>
             <w:pPr>
-              <w:tabs>
-                <w:tab w:val="center" w:pos="4153"/>
-                <w:tab w:val="right" w:pos="8306"/>
-              </w:tabs>
-              <w:ind w:left="600" w:hangingChars="250" w:hanging="600"/>
-              <w:jc w:val="both"/>
+              <w:jc w:val="center"/>
               <w:rPr>
                 <w:rFonts w:ascii="Calibri" w:eastAsia="DFKai-SB" w:hAnsi="Calibri"/>
               </w:rPr>
@@ -6019,7 +6011,13 @@
         </w:tc>
         <w:tc>
           <w:tcPr>
-            <w:tcW w:w="2633" w:type="dxa"/>
+            <w:tcW w:w="1066" w:type="pct"/>
+            <w:tcBorders>
+              <w:top w:val="single" w:sz="4" w:space="0" w:color="auto"/>
+              <w:left w:val="single" w:sz="4" w:space="0" w:color="auto"/>
+              <w:bottom w:val="single" w:sz="4" w:space="0" w:color="auto"/>
+              <w:right w:val="single" w:sz="4" w:space="0" w:color="auto"/>
+            </w:tcBorders>
           </w:tcPr>
           <w:p>
             <w:pPr>
@@ -6037,13 +6035,7 @@
               <w:rPr>
                 <w:rFonts w:ascii="Calibri" w:eastAsia="DFKai-SB" w:hAnsi="Calibri"/>
               </w:rPr>
-              <w:t>Sun Moon Lake</w:t>
-            </w:r>
-            <w:r>
-              <w:rPr>
-                <w:rFonts w:ascii="Calibri" w:eastAsia="DFKai-SB" w:hAnsi="Calibri"/>
-              </w:rPr>
-              <w:t xml:space="preserve"> </w:t>
+              <w:t xml:space="preserve">Sun Moon Lake </w:t>
             </w:r>
           </w:p>
           <w:p>
@@ -6067,6 +6059,80 @@
           </w:p>
           <w:p>
             <w:pPr>
+              <w:jc w:val="center"/>
+              <w:rPr>
+                <w:rFonts w:ascii="Calibri" w:eastAsia="DFKai-SB" w:hAnsi="Calibri"/>
+                <w:b/>
+                <w:color w:val="0070C0"/>
+                <w:u w:val="single"/>
+              </w:rPr>
+            </w:pPr>
+          </w:p>
+        </w:tc>
+      </w:tr>
+      <w:tr>
+        <w:trPr>
+          <w:trHeight w:val="720"/>
+        </w:trPr>
+        <w:tc>
+          <w:tcPr>
+            <w:tcW w:w="1073" w:type="pct"/>
+            <w:tcBorders>
+              <w:top w:val="single" w:sz="4" w:space="0" w:color="auto"/>
+              <w:left w:val="single" w:sz="4" w:space="0" w:color="auto"/>
+              <w:bottom w:val="single" w:sz="4" w:space="0" w:color="auto"/>
+              <w:right w:val="single" w:sz="4" w:space="0" w:color="auto"/>
+            </w:tcBorders>
+          </w:tcPr>
+          <w:p>
+            <w:pPr>
+              <w:jc w:val="center"/>
+              <w:rPr>
+                <w:rFonts w:ascii="Calibri" w:eastAsia="DFKai-SB" w:hAnsi="Calibri"/>
+                <w:lang w:val="fr-FR"/>
+              </w:rPr>
+            </w:pPr>
+          </w:p>
+        </w:tc>
+        <w:tc>
+          <w:tcPr>
+            <w:tcW w:w="2861" w:type="pct"/>
+            <w:tcBorders>
+              <w:top w:val="single" w:sz="4" w:space="0" w:color="auto"/>
+              <w:left w:val="single" w:sz="4" w:space="0" w:color="auto"/>
+              <w:bottom w:val="single" w:sz="4" w:space="0" w:color="auto"/>
+              <w:right w:val="single" w:sz="4" w:space="0" w:color="auto"/>
+            </w:tcBorders>
+          </w:tcPr>
+          <w:p>
+            <w:pPr>
+              <w:tabs>
+                <w:tab w:val="center" w:pos="4153"/>
+                <w:tab w:val="right" w:pos="8306"/>
+              </w:tabs>
+              <w:ind w:left="601" w:hangingChars="250" w:hanging="601"/>
+              <w:jc w:val="both"/>
+              <w:rPr>
+                <w:rFonts w:ascii="Calibri" w:hAnsi="Calibri"/>
+                <w:b/>
+                <w:color w:val="0070C0"/>
+                <w:lang w:val="en-US"/>
+              </w:rPr>
+            </w:pPr>
+          </w:p>
+        </w:tc>
+        <w:tc>
+          <w:tcPr>
+            <w:tcW w:w="1066" w:type="pct"/>
+            <w:tcBorders>
+              <w:top w:val="single" w:sz="4" w:space="0" w:color="auto"/>
+              <w:left w:val="single" w:sz="4" w:space="0" w:color="auto"/>
+              <w:bottom w:val="single" w:sz="4" w:space="0" w:color="auto"/>
+              <w:right w:val="single" w:sz="4" w:space="0" w:color="auto"/>
+            </w:tcBorders>
+          </w:tcPr>
+          <w:p>
+            <w:pPr>
               <w:tabs>
                 <w:tab w:val="center" w:pos="4153"/>
                 <w:tab w:val="right" w:pos="8306"/>
@@ -6074,541 +6140,9 @@
               <w:ind w:left="720" w:hangingChars="300" w:hanging="720"/>
               <w:jc w:val="both"/>
               <w:rPr>
-                <w:rFonts w:eastAsia="DFKai-SB" w:hAnsi="Calibri"/>
-                <w:lang w:val="fr-FR"/>
-              </w:rPr>
-            </w:pPr>
-          </w:p>
-        </w:tc>
-      </w:tr>
-      <w:tr>
-        <w:trPr>
-          <w:tblCellSpacing w:w="20" w:type="dxa"/>
-        </w:trPr>
-        <w:tc>
-          <w:tcPr>
-            <w:tcW w:w="2067" w:type="dxa"/>
-          </w:tcPr>
-          <w:p>
-            <w:pPr>
-              <w:jc w:val="center"/>
-              <w:rPr>
                 <w:rFonts w:ascii="Calibri" w:eastAsia="DFKai-SB" w:hAnsi="Calibri"/>
-                <w:lang w:val="fr-FR"/>
-              </w:rPr>
-            </w:pPr>
-            <w:r>
-              <w:rPr>
-                <w:rFonts w:ascii="Calibri" w:eastAsia="DFKai-SB" w:hAnsi="Calibri"/>
-                <w:lang w:val="fr-FR"/>
-              </w:rPr>
-              <w:t>9th August</w:t>
-            </w:r>
-          </w:p>
-          <w:p>
-            <w:pPr>
-              <w:jc w:val="center"/>
-              <w:rPr>
-                <w:rFonts w:ascii="Calibri" w:eastAsia="DFKai-SB" w:hAnsi="Calibri"/>
-              </w:rPr>
-            </w:pPr>
-            <w:r>
-              <w:rPr>
-                <w:rFonts w:ascii="Calibri" w:eastAsia="DFKai-SB" w:hAnsi="Calibri"/>
-                <w:lang w:val="fr-FR"/>
-              </w:rPr>
-              <w:t xml:space="preserve">Fri </w:t>
-            </w:r>
-            <w:r>
-              <w:rPr>
-                <w:rFonts w:ascii="Calibri" w:eastAsia="DFKai-SB" w:hAnsi="Calibri"/>
-              </w:rPr>
-              <w:t>(Day 2)</w:t>
-            </w:r>
-          </w:p>
-        </w:tc>
-        <w:tc>
-          <w:tcPr>
-            <w:tcW w:w="3929" w:type="dxa"/>
-          </w:tcPr>
-          <w:p>
-            <w:r>
-              <w:t xml:space="preserve">Sun Moon Lake </w:t>
-            </w:r>
-          </w:p>
-          <w:p>
-            <w:r>
-              <w:t>Hanbi Trail-&gt;Chiang-Kai-Shek Pier</w:t>
-            </w:r>
-          </w:p>
-          <w:p>
-            <w:pPr>
-              <w:rPr>
-                <w:rFonts w:ascii="Calibri" w:eastAsia="DFKai-SB" w:hAnsi="Calibri" w:hint="eastAsia"/>
-                <w:lang w:val="fr-FR"/>
-              </w:rPr>
-            </w:pPr>
-            <w:r>
-              <w:t>Afternoon:</w:t>
-            </w:r>
-            <w:r>
-              <w:t>Boat tour Shuishe Pier-&gt;</w:t>
-            </w:r>
-            <w:r>
-              <w:rPr>
-                <w:rFonts w:hint="eastAsia"/>
-              </w:rPr>
-              <w:t>W</w:t>
-            </w:r>
-            <w:r>
-              <w:t>enwu Temple Steps</w:t>
-            </w:r>
-            <w:r>
-              <w:t>-&gt;Xuanzang Temple-&gt;Cien Pagoda</w:t>
-            </w:r>
-            <w:r>
-              <w:t>-&gt;Return to hotel</w:t>
-            </w:r>
-          </w:p>
-        </w:tc>
-        <w:tc>
-          <w:tcPr>
-            <w:tcW w:w="2633" w:type="dxa"/>
-          </w:tcPr>
-          <w:p>
-            <w:pPr>
-              <w:tabs>
-                <w:tab w:val="center" w:pos="4153"/>
-                <w:tab w:val="right" w:pos="8306"/>
-              </w:tabs>
-              <w:ind w:left="720" w:hangingChars="300" w:hanging="720"/>
-              <w:jc w:val="both"/>
-              <w:rPr>
-                <w:rFonts w:ascii="Calibri" w:eastAsia="DFKai-SB" w:hAnsi="Calibri"/>
-              </w:rPr>
-            </w:pPr>
-            <w:r>
-              <w:rPr>
-                <w:rFonts w:ascii="Calibri" w:eastAsia="DFKai-SB" w:hAnsi="Calibri"/>
-              </w:rPr>
-              <w:t xml:space="preserve">Sun Moon Lake </w:t>
-            </w:r>
-          </w:p>
-          <w:p>
-            <w:pPr>
-              <w:tabs>
-                <w:tab w:val="center" w:pos="4153"/>
-                <w:tab w:val="right" w:pos="8306"/>
-              </w:tabs>
-              <w:ind w:left="720" w:hangingChars="300" w:hanging="720"/>
-              <w:jc w:val="both"/>
-              <w:rPr>
-                <w:rFonts w:ascii="Calibri" w:eastAsia="DFKai-SB" w:hAnsi="Calibri"/>
-              </w:rPr>
-            </w:pPr>
-            <w:r>
-              <w:rPr>
-                <w:rFonts w:ascii="Calibri" w:eastAsia="DFKai-SB" w:hAnsi="Calibri"/>
-              </w:rPr>
-              <w:t>(The Lalu)</w:t>
-            </w:r>
-          </w:p>
-        </w:tc>
-      </w:tr>
-      <w:tr>
-        <w:trPr>
-          <w:tblCellSpacing w:w="20" w:type="dxa"/>
-        </w:trPr>
-        <w:tc>
-          <w:tcPr>
-            <w:tcW w:w="2067" w:type="dxa"/>
-          </w:tcPr>
-          <w:p>
-            <w:pPr>
-              <w:jc w:val="center"/>
-              <w:rPr>
-                <w:rFonts w:ascii="Calibri" w:eastAsia="DFKai-SB" w:hAnsi="Calibri"/>
-                <w:lang w:val="fr-FR"/>
-              </w:rPr>
-            </w:pPr>
-            <w:r>
-              <w:rPr>
-                <w:rFonts w:ascii="Calibri" w:eastAsia="DFKai-SB" w:hAnsi="Calibri"/>
-                <w:lang w:val="fr-FR"/>
-              </w:rPr>
-              <w:t>10th August</w:t>
-            </w:r>
-          </w:p>
-          <w:p>
-            <w:pPr>
-              <w:jc w:val="center"/>
-              <w:rPr>
-                <w:rFonts w:ascii="Calibri" w:eastAsia="DFKai-SB" w:hAnsi="Calibri"/>
-                <w:lang w:val="fr-FR"/>
-              </w:rPr>
-            </w:pPr>
-            <w:r>
-              <w:rPr>
-                <w:rFonts w:ascii="Calibri" w:eastAsia="DFKai-SB" w:hAnsi="Calibri"/>
-                <w:lang w:val="fr-FR"/>
-              </w:rPr>
-              <w:t xml:space="preserve">Sat </w:t>
-            </w:r>
-            <w:r>
-              <w:rPr>
-                <w:rFonts w:ascii="Calibri" w:eastAsia="DFKai-SB" w:hAnsi="Calibri"/>
-                <w:lang w:val="fr-FR"/>
-              </w:rPr>
-              <w:t xml:space="preserve">(Day </w:t>
-            </w:r>
-            <w:r>
-              <w:rPr>
-                <w:rFonts w:ascii="Calibri" w:eastAsia="DFKai-SB" w:hAnsi="Calibri"/>
-                <w:lang w:val="fr-FR"/>
-              </w:rPr>
-              <w:t>3</w:t>
-            </w:r>
-            <w:r>
-              <w:rPr>
-                <w:rFonts w:ascii="Calibri" w:eastAsia="DFKai-SB" w:hAnsi="Calibri"/>
-                <w:lang w:val="fr-FR"/>
-              </w:rPr>
-              <w:t>)</w:t>
-            </w:r>
-          </w:p>
-        </w:tc>
-        <w:tc>
-          <w:tcPr>
-            <w:tcW w:w="3929" w:type="dxa"/>
-          </w:tcPr>
-          <w:p>
-            <w:pPr>
-              <w:rPr>
-                <w:rFonts w:ascii="Calibri" w:eastAsia="DFKai-SB" w:hAnsi="Calibri"/>
-                <w:lang w:val="en-US"/>
-              </w:rPr>
-            </w:pPr>
-            <w:r>
-              <w:rPr>
-                <w:rFonts w:ascii="Calibri" w:eastAsia="DFKai-SB" w:hAnsi="Calibri"/>
-                <w:lang w:val="en-US"/>
-              </w:rPr>
-              <w:t>11:00 Hotel Check-out</w:t>
-            </w:r>
-          </w:p>
-          <w:p>
-            <w:pPr>
-              <w:rPr>
-                <w:rFonts w:ascii="Calibri" w:eastAsia="DFKai-SB" w:hAnsi="Calibri"/>
-                <w:lang w:val="en-US"/>
-              </w:rPr>
-            </w:pPr>
-            <w:r>
-              <w:rPr>
-                <w:rFonts w:ascii="Calibri" w:eastAsia="DFKai-SB" w:hAnsi="Calibri"/>
-                <w:lang w:val="en-US"/>
-              </w:rPr>
-              <w:t>Transfer to Taipei</w:t>
-            </w:r>
-          </w:p>
-          <w:p>
-            <w:pPr>
-              <w:rPr>
-                <w:rFonts w:ascii="Calibri" w:eastAsia="DFKai-SB" w:hAnsi="Calibri"/>
-                <w:lang w:val="en-US"/>
-              </w:rPr>
-            </w:pPr>
-            <w:r>
-              <w:rPr>
-                <w:rFonts w:ascii="Calibri" w:eastAsia="DFKai-SB" w:hAnsi="Calibri"/>
-                <w:lang w:val="en-US"/>
-              </w:rPr>
-              <w:t xml:space="preserve">Hotel Check-in upon arrival </w:t>
-            </w:r>
-          </w:p>
-        </w:tc>
-        <w:tc>
-          <w:tcPr>
-            <w:tcW w:w="2633" w:type="dxa"/>
-          </w:tcPr>
-          <w:p>
-            <w:pPr>
-              <w:tabs>
-                <w:tab w:val="center" w:pos="4153"/>
-                <w:tab w:val="right" w:pos="8306"/>
-              </w:tabs>
-              <w:ind w:left="720" w:hangingChars="300" w:hanging="720"/>
-              <w:jc w:val="both"/>
-              <w:rPr>
-                <w:rFonts w:ascii="Calibri" w:eastAsia="DFKai-SB" w:hAnsi="Calibri"/>
-              </w:rPr>
-            </w:pPr>
-            <w:r>
-              <w:rPr>
-                <w:rFonts w:ascii="Calibri" w:eastAsia="DFKai-SB" w:hAnsi="Calibri"/>
-              </w:rPr>
-              <w:t>Taipei</w:t>
-            </w:r>
-          </w:p>
-        </w:tc>
-      </w:tr>
-      <w:tr>
-        <w:trPr>
-          <w:tblCellSpacing w:w="20" w:type="dxa"/>
-        </w:trPr>
-        <w:tc>
-          <w:tcPr>
-            <w:tcW w:w="2067" w:type="dxa"/>
-            <w:tcBorders>
-              <w:top w:val="outset" w:sz="6" w:space="0" w:color="auto"/>
-              <w:left w:val="outset" w:sz="6" w:space="0" w:color="auto"/>
-              <w:bottom w:val="outset" w:sz="6" w:space="0" w:color="auto"/>
-              <w:right w:val="outset" w:sz="6" w:space="0" w:color="auto"/>
-            </w:tcBorders>
-          </w:tcPr>
-          <w:p>
-            <w:pPr>
-              <w:jc w:val="center"/>
-              <w:rPr>
-                <w:rFonts w:ascii="Calibri" w:eastAsia="DFKai-SB" w:hAnsi="Calibri"/>
-                <w:lang w:val="fr-FR"/>
-              </w:rPr>
-            </w:pPr>
-            <w:r>
-              <w:rPr>
-                <w:rFonts w:ascii="Calibri" w:eastAsia="DFKai-SB" w:hAnsi="Calibri"/>
-                <w:lang w:val="fr-FR"/>
-              </w:rPr>
-              <w:t>11th August</w:t>
-            </w:r>
-          </w:p>
-          <w:p>
-            <w:pPr>
-              <w:jc w:val="center"/>
-              <w:rPr>
-                <w:rFonts w:ascii="Calibri" w:eastAsia="DFKai-SB" w:hAnsi="Calibri"/>
-                <w:lang w:val="fr-FR"/>
-              </w:rPr>
-            </w:pPr>
-            <w:r>
-              <w:rPr>
-                <w:rFonts w:ascii="Calibri" w:eastAsia="DFKai-SB" w:hAnsi="Calibri"/>
-                <w:lang w:val="fr-FR"/>
-              </w:rPr>
-              <w:t>Fri (Day 4)</w:t>
-            </w:r>
-          </w:p>
-        </w:tc>
-        <w:tc>
-          <w:tcPr>
-            <w:tcW w:w="3929" w:type="dxa"/>
-            <w:tcBorders>
-              <w:top w:val="outset" w:sz="6" w:space="0" w:color="auto"/>
-              <w:left w:val="outset" w:sz="6" w:space="0" w:color="auto"/>
-              <w:bottom w:val="outset" w:sz="6" w:space="0" w:color="auto"/>
-              <w:right w:val="outset" w:sz="6" w:space="0" w:color="auto"/>
-            </w:tcBorders>
-          </w:tcPr>
-          <w:p>
-            <w:pPr>
-              <w:rPr>
-                <w:lang w:val="en-GB"/>
-              </w:rPr>
-            </w:pPr>
-            <w:r>
-              <w:rPr>
-                <w:lang w:val="en-GB"/>
-              </w:rPr>
-              <w:t>Visit Taipei101</w:t>
-            </w:r>
-          </w:p>
-          <w:p>
-            <w:r>
-              <w:rPr>
-                <w:lang w:val="en-GB"/>
-              </w:rPr>
-              <w:t>Free time for own research</w:t>
-            </w:r>
-          </w:p>
-        </w:tc>
-        <w:tc>
-          <w:tcPr>
-            <w:tcW w:w="2633" w:type="dxa"/>
-            <w:tcBorders>
-              <w:top w:val="outset" w:sz="6" w:space="0" w:color="auto"/>
-              <w:left w:val="outset" w:sz="6" w:space="0" w:color="auto"/>
-              <w:bottom w:val="outset" w:sz="6" w:space="0" w:color="auto"/>
-              <w:right w:val="outset" w:sz="6" w:space="0" w:color="auto"/>
-            </w:tcBorders>
-          </w:tcPr>
-          <w:p>
-            <w:pPr>
-              <w:tabs>
-                <w:tab w:val="center" w:pos="4153"/>
-                <w:tab w:val="right" w:pos="8306"/>
-              </w:tabs>
-              <w:ind w:left="720" w:hangingChars="300" w:hanging="720"/>
-              <w:rPr>
-                <w:rFonts w:ascii="Calibri" w:eastAsia="DFKai-SB" w:hAnsi="Calibri"/>
-                <w:lang w:val="fr-FR"/>
-              </w:rPr>
-            </w:pPr>
-            <w:r>
-              <w:rPr>
-                <w:rFonts w:ascii="Calibri" w:eastAsia="DFKai-SB" w:hAnsi="Calibri"/>
-                <w:lang w:val="fr-FR"/>
-              </w:rPr>
-              <w:t>Taipei</w:t>
-            </w:r>
-          </w:p>
-          <w:p>
-            <w:pPr>
-              <w:tabs>
-                <w:tab w:val="center" w:pos="4153"/>
-                <w:tab w:val="right" w:pos="8306"/>
-              </w:tabs>
-              <w:rPr>
-                <w:rFonts w:ascii="Calibri" w:eastAsia="DFKai-SB" w:hAnsi="Calibri"/>
-                <w:lang w:val="fr-FR"/>
-              </w:rPr>
-            </w:pPr>
-          </w:p>
-        </w:tc>
-      </w:tr>
-      <w:tr>
-        <w:trPr>
-          <w:tblCellSpacing w:w="20" w:type="dxa"/>
-        </w:trPr>
-        <w:tc>
-          <w:tcPr>
-            <w:tcW w:w="2067" w:type="dxa"/>
-            <w:tcBorders>
-              <w:top w:val="outset" w:sz="6" w:space="0" w:color="auto"/>
-              <w:left w:val="outset" w:sz="6" w:space="0" w:color="auto"/>
-              <w:bottom w:val="outset" w:sz="6" w:space="0" w:color="auto"/>
-              <w:right w:val="outset" w:sz="6" w:space="0" w:color="auto"/>
-            </w:tcBorders>
-          </w:tcPr>
-          <w:p>
-            <w:pPr>
-              <w:jc w:val="center"/>
-              <w:rPr>
-                <w:rFonts w:ascii="Calibri" w:eastAsia="DFKai-SB" w:hAnsi="Calibri"/>
-                <w:lang w:val="fr-FR"/>
-              </w:rPr>
-            </w:pPr>
-            <w:r>
-              <w:rPr>
-                <w:rFonts w:ascii="Calibri" w:eastAsia="DFKai-SB" w:hAnsi="Calibri"/>
-                <w:lang w:val="fr-FR"/>
-              </w:rPr>
-              <w:t>12th August</w:t>
-            </w:r>
-          </w:p>
-          <w:p>
-            <w:pPr>
-              <w:jc w:val="center"/>
-              <w:rPr>
-                <w:rFonts w:ascii="Calibri" w:eastAsia="DFKai-SB" w:hAnsi="Calibri"/>
-                <w:lang w:val="fr-FR"/>
-              </w:rPr>
-            </w:pPr>
-            <w:r>
-              <w:rPr>
-                <w:rFonts w:ascii="Calibri" w:eastAsia="DFKai-SB" w:hAnsi="Calibri"/>
-                <w:lang w:val="fr-FR"/>
-              </w:rPr>
-              <w:t xml:space="preserve">Sat </w:t>
-            </w:r>
-            <w:r>
-              <w:rPr>
-                <w:rFonts w:ascii="Calibri" w:eastAsia="DFKai-SB" w:hAnsi="Calibri"/>
-                <w:lang w:val="fr-FR"/>
-              </w:rPr>
-              <w:t xml:space="preserve">(Day </w:t>
-            </w:r>
-            <w:r>
-              <w:rPr>
-                <w:rFonts w:ascii="Calibri" w:eastAsia="DFKai-SB" w:hAnsi="Calibri"/>
-                <w:lang w:val="fr-FR"/>
-              </w:rPr>
-              <w:t>5</w:t>
-            </w:r>
-            <w:r>
-              <w:rPr>
-                <w:rFonts w:ascii="Calibri" w:eastAsia="DFKai-SB" w:hAnsi="Calibri"/>
-                <w:lang w:val="fr-FR"/>
-              </w:rPr>
-              <w:t>)</w:t>
-            </w:r>
-          </w:p>
-        </w:tc>
-        <w:tc>
-          <w:tcPr>
-            <w:tcW w:w="3929" w:type="dxa"/>
-            <w:tcBorders>
-              <w:top w:val="outset" w:sz="6" w:space="0" w:color="auto"/>
-              <w:left w:val="outset" w:sz="6" w:space="0" w:color="auto"/>
-              <w:bottom w:val="outset" w:sz="6" w:space="0" w:color="auto"/>
-              <w:right w:val="outset" w:sz="6" w:space="0" w:color="auto"/>
-            </w:tcBorders>
-          </w:tcPr>
-          <w:p>
-            <w:pPr>
-              <w:rPr>
-                <w:rFonts w:ascii="Calibri" w:eastAsia="DFKai-SB" w:hAnsi="Calibri"/>
-              </w:rPr>
-            </w:pPr>
-            <w:r>
-              <w:rPr>
-                <w:rFonts w:ascii="Calibri" w:eastAsia="DFKai-SB" w:hAnsi="Calibri"/>
-              </w:rPr>
-              <w:t>5:00 Transfer to TPE Airport</w:t>
-            </w:r>
-          </w:p>
-          <w:p>
-            <w:pPr>
-              <w:rPr>
-                <w:rFonts w:ascii="Calibri" w:eastAsia="DFKai-SB" w:hAnsi="Calibri" w:hint="eastAsia"/>
-              </w:rPr>
-            </w:pPr>
-            <w:r>
-              <w:rPr>
-                <w:rFonts w:ascii="Calibri" w:eastAsia="DFKai-SB" w:hAnsi="Calibri"/>
-              </w:rPr>
-              <w:t>BR257 07:25 to CNX</w:t>
-            </w:r>
-          </w:p>
-        </w:tc>
-        <w:tc>
-          <w:tcPr>
-            <w:tcW w:w="2633" w:type="dxa"/>
-            <w:tcBorders>
-              <w:top w:val="outset" w:sz="6" w:space="0" w:color="auto"/>
-              <w:left w:val="outset" w:sz="6" w:space="0" w:color="auto"/>
-              <w:bottom w:val="outset" w:sz="6" w:space="0" w:color="auto"/>
-              <w:right w:val="outset" w:sz="6" w:space="0" w:color="auto"/>
-            </w:tcBorders>
-          </w:tcPr>
-          <w:p>
-            <w:pPr>
-              <w:tabs>
-                <w:tab w:val="center" w:pos="4153"/>
-                <w:tab w:val="right" w:pos="8306"/>
-              </w:tabs>
-              <w:ind w:left="720" w:hangingChars="300" w:hanging="720"/>
-              <w:rPr>
-                <w:rFonts w:ascii="Calibri" w:eastAsia="DFKai-SB" w:hAnsi="Calibri"/>
-                <w:lang w:val="fr-FR"/>
-              </w:rPr>
-            </w:pPr>
-            <w:r>
-              <w:rPr>
-                <w:rFonts w:ascii="Calibri" w:eastAsia="DFKai-SB" w:hAnsi="Calibri"/>
-                <w:lang w:val="fr-FR"/>
-              </w:rPr>
-              <w:t>Taipei</w:t>
-            </w:r>
+              </w:rPr>
+            </w:pPr>
           </w:p>
         </w:tc>
       </w:tr>
@@ -6652,2406 +6186,629 @@
     <w:p>
       <w:pPr>
         <w:rPr>
-          <w:rFonts w:ascii="Calibri" w:hAnsi="Calibri" w:cs="Calibri"/>
+          <w:rFonts w:ascii="KaiTi" w:eastAsia="KaiTi" w:hAnsi="KaiTi"/>
           <w:b/>
-          <w:bCs/>
-          <w:color w:val="000000"/>
-          <w:sz w:val="22"/>
-          <w:szCs w:val="22"/>
-        </w:rPr>
-      </w:pPr>
-    </w:p>
-    <w:p>
-      <w:pPr>
-        <w:rPr>
-          <w:rFonts w:ascii="Calibri" w:hAnsi="Calibri" w:cs="Calibri"/>
-          <w:b/>
-          <w:bCs/>
-          <w:color w:val="000000"/>
-          <w:sz w:val="22"/>
-          <w:szCs w:val="22"/>
-        </w:rPr>
-      </w:pPr>
-    </w:p>
-    <w:p>
-      <w:pPr>
-        <w:rPr>
-          <w:rFonts w:ascii="Calibri" w:hAnsi="Calibri" w:cs="Calibri"/>
-          <w:b/>
-          <w:bCs/>
-          <w:color w:val="000000"/>
-          <w:sz w:val="22"/>
-          <w:szCs w:val="22"/>
-        </w:rPr>
-      </w:pPr>
-    </w:p>
-    <w:p>
-      <w:pPr>
-        <w:rPr>
-          <w:rFonts w:ascii="Calibri" w:hAnsi="Calibri" w:cs="Calibri"/>
-          <w:b/>
-          <w:bCs/>
-          <w:color w:val="000000"/>
-          <w:sz w:val="22"/>
-          <w:szCs w:val="22"/>
-        </w:rPr>
-      </w:pPr>
-    </w:p>
-    <w:p>
-      <w:pPr>
-        <w:rPr>
-          <w:rFonts w:ascii="Calibri" w:hAnsi="Calibri" w:cs="Calibri"/>
-          <w:b/>
-          <w:bCs/>
-          <w:color w:val="000000"/>
-          <w:sz w:val="22"/>
-          <w:szCs w:val="22"/>
-        </w:rPr>
-      </w:pPr>
-    </w:p>
-    <w:p>
-      <w:pPr>
-        <w:rPr>
-          <w:rFonts w:ascii="Calibri" w:hAnsi="Calibri" w:cs="Calibri"/>
-          <w:b/>
-          <w:bCs/>
-          <w:color w:val="000000"/>
-          <w:sz w:val="22"/>
-          <w:szCs w:val="22"/>
-        </w:rPr>
-      </w:pPr>
-    </w:p>
-    <w:p>
-      <w:pPr>
-        <w:rPr>
-          <w:rFonts w:ascii="Calibri" w:hAnsi="Calibri" w:cs="Calibri"/>
-          <w:b/>
-          <w:bCs/>
-          <w:color w:val="000000"/>
-          <w:sz w:val="22"/>
-          <w:szCs w:val="22"/>
-        </w:rPr>
-      </w:pPr>
-    </w:p>
-    <w:p>
-      <w:pPr>
-        <w:textAlignment w:val="center"/>
-        <w:rPr>
-          <w:rFonts w:ascii="Segoe UI" w:hAnsi="Segoe UI" w:cs="Segoe UI"/>
-          <w:color w:val="333333"/>
-          <w:sz w:val="26"/>
-          <w:szCs w:val="26"/>
+          <w:sz w:val="28"/>
+          <w:szCs w:val="28"/>
         </w:rPr>
       </w:pPr>
       <w:r>
         <w:rPr>
-          <w:rStyle w:val="bidi"/>
-          <w:rFonts w:ascii="Segoe UI" w:hAnsi="Segoe UI" w:cs="Segoe UI"/>
-          <w:color w:val="333333"/>
-          <w:sz w:val="26"/>
-          <w:szCs w:val="26"/>
+          <w:rFonts w:ascii="KaiTi" w:eastAsia="KaiTi" w:hAnsi="KaiTi"/>
+          <w:b/>
+          <w:sz w:val="28"/>
+          <w:szCs w:val="28"/>
         </w:rPr>
-        <w:t>Gaia Cilento &lt;gaiacilento@evaair.com&gt;</w:t>
+        <w:t>附件三：經費概算表</w:t>
       </w:r>
     </w:p>
     <w:p>
       <w:pPr>
+        <w:tabs>
+          <w:tab w:val="left" w:pos="8787"/>
+        </w:tabs>
+        <w:ind w:right="-33"/>
         <w:rPr>
-          <w:rFonts w:ascii="Segoe UI Semilight" w:hAnsi="Segoe UI Semilight" w:cs="Segoe UI Semilight"/>
-          <w:color w:val="666666"/>
-          <w:sz w:val="18"/>
-          <w:szCs w:val="18"/>
+          <w:rFonts w:ascii="KaiTi" w:eastAsia="KaiTi" w:hAnsi="KaiTi"/>
         </w:rPr>
       </w:pPr>
       <w:r>
         <w:rPr>
-          <w:rStyle w:val="allowtextselection"/>
-          <w:rFonts w:ascii="Segoe UI Semilight" w:hAnsi="Segoe UI Semilight" w:cs="Segoe UI Semilight"/>
-          <w:color w:val="666666"/>
-          <w:sz w:val="18"/>
-          <w:szCs w:val="18"/>
+          <w:rFonts w:ascii="KaiTi" w:eastAsia="KaiTi" w:hAnsi="KaiTi"/>
+          <w:sz w:val="28"/>
+          <w:szCs w:val="28"/>
         </w:rPr>
-        <w:t>Fr 05.07, 16:45</w:t>
-      </w:r>
-    </w:p>
-    <w:p>
-      <w:pPr>
-        <w:spacing w:line="270" w:lineRule="atLeast"/>
-        <w:textAlignment w:val="center"/>
-        <w:rPr>
-          <w:rFonts w:ascii="Segoe UI Semilight" w:hAnsi="Segoe UI Semilight" w:cs="Segoe UI Semilight"/>
-          <w:color w:val="666666"/>
-          <w:sz w:val="2"/>
-          <w:szCs w:val="2"/>
-          <w:bdr w:val="none" w:sz="0" w:space="0" w:color="auto" w:frame="1"/>
-        </w:rPr>
-      </w:pPr>
-      <w:r>
-        <w:rPr>
-          <w:rStyle w:val="pel"/>
-          <w:rFonts w:ascii="Segoe UI" w:hAnsi="Segoe UI" w:cs="Segoe UI"/>
-          <w:color w:val="333333"/>
-          <w:sz w:val="18"/>
-          <w:szCs w:val="18"/>
-          <w:bdr w:val="none" w:sz="0" w:space="0" w:color="auto" w:frame="1"/>
-        </w:rPr>
-        <w:t>Huang, Josephine;</w:t>
+        <w:t xml:space="preserve">         </w:t>
       </w:r>
       <w:r>
         <w:rPr>
-          <w:rFonts w:ascii="Segoe UI Semilight" w:hAnsi="Segoe UI Semilight" w:cs="Segoe UI Semilight"/>
-          <w:color w:val="666666"/>
-          <w:sz w:val="2"/>
-          <w:szCs w:val="2"/>
-          <w:bdr w:val="none" w:sz="0" w:space="0" w:color="auto" w:frame="1"/>
+          <w:rFonts w:ascii="KaiTi" w:eastAsia="KaiTi" w:hAnsi="KaiTi"/>
         </w:rPr>
-        <w:t xml:space="preserve"> </w:t>
+        <w:t xml:space="preserve">                                          幣別：</w:t>
       </w:r>
       <w:r>
         <w:rPr>
-          <w:rStyle w:val="pel"/>
-          <w:rFonts w:ascii="Segoe UI" w:hAnsi="Segoe UI" w:cs="Segoe UI"/>
-          <w:color w:val="333333"/>
-          <w:sz w:val="18"/>
-          <w:szCs w:val="18"/>
-          <w:bdr w:val="none" w:sz="0" w:space="0" w:color="auto" w:frame="1"/>
+          <w:rFonts w:ascii="KaiTi" w:eastAsia="KaiTi" w:hAnsi="KaiTi"/>
+          <w:u w:val="single"/>
         </w:rPr>
-        <w:t>Silvio Patronario &lt;spatronario@evaair.com&gt;;Alberto Taiana &lt;albertotaiana@evaair.com&gt;;</w:t>
-      </w:r>
-    </w:p>
-    <w:p>
-      <w:pPr>
-        <w:spacing w:line="270" w:lineRule="atLeast"/>
-        <w:textAlignment w:val="center"/>
-        <w:rPr>
-          <w:rFonts w:ascii="Segoe UI Semilight" w:hAnsi="Segoe UI Semilight" w:cs="Segoe UI Semilight"/>
-          <w:color w:val="666666"/>
-          <w:sz w:val="2"/>
-          <w:szCs w:val="2"/>
-          <w:bdr w:val="none" w:sz="0" w:space="0" w:color="auto" w:frame="1"/>
-        </w:rPr>
-      </w:pPr>
-      <w:r>
-        <w:rPr>
-          <w:rStyle w:val="pel"/>
-          <w:rFonts w:ascii="Segoe UI" w:hAnsi="Segoe UI" w:cs="Segoe UI"/>
-          <w:color w:val="333333"/>
-          <w:sz w:val="18"/>
-          <w:szCs w:val="18"/>
-          <w:bdr w:val="none" w:sz="0" w:space="0" w:color="auto" w:frame="1"/>
-        </w:rPr>
-        <w:t>Eva Perrotti &lt;evaperrotti@evaair.com&gt;</w:t>
-      </w:r>
-    </w:p>
-    <w:p>
-      <w:pPr>
-        <w:rPr>
-          <w:rFonts w:ascii="Calibri" w:hAnsi="Calibri" w:cs="Calibri"/>
-          <w:color w:val="000000"/>
-          <w:lang w:val="en-US"/>
-        </w:rPr>
-      </w:pPr>
-    </w:p>
-    <w:p>
-      <w:pPr>
-        <w:rPr>
-          <w:rFonts w:ascii="Calibri" w:hAnsi="Calibri" w:cs="Calibri"/>
-          <w:color w:val="000000"/>
-        </w:rPr>
-      </w:pPr>
-      <w:r>
-        <w:rPr>
-          <w:rFonts w:ascii="Calibri" w:hAnsi="Calibri" w:cs="Calibri"/>
-          <w:color w:val="000000"/>
-          <w:lang w:val="en-US"/>
-        </w:rPr>
-        <w:t>Dear Josephine,</w:t>
-      </w:r>
-    </w:p>
-    <w:p>
-      <w:pPr>
-        <w:rPr>
-          <w:rFonts w:ascii="Calibri" w:hAnsi="Calibri" w:cs="Calibri"/>
-          <w:color w:val="000000"/>
-        </w:rPr>
-      </w:pPr>
-      <w:r>
-        <w:rPr>
-          <w:rFonts w:ascii="Calibri" w:hAnsi="Calibri" w:cs="Calibri"/>
-          <w:color w:val="000000"/>
-          <w:lang w:val="en-US"/>
-        </w:rPr>
-        <w:t> </w:t>
-      </w:r>
-    </w:p>
-    <w:p>
-      <w:pPr>
-        <w:rPr>
-          <w:rFonts w:ascii="Calibri" w:hAnsi="Calibri" w:cs="Calibri"/>
-          <w:color w:val="000000"/>
-        </w:rPr>
-      </w:pPr>
-      <w:r>
-        <w:rPr>
-          <w:rFonts w:ascii="Calibri" w:hAnsi="Calibri" w:cs="Calibri"/>
-          <w:color w:val="000000"/>
-          <w:lang w:val="en-US"/>
-        </w:rPr>
-        <w:t>I do hope everything is fine in Frankfurt, here in Milan, despite the hot weather, all good our end.</w:t>
-      </w:r>
-    </w:p>
-    <w:p>
-      <w:pPr>
-        <w:rPr>
-          <w:rFonts w:ascii="Calibri" w:hAnsi="Calibri" w:cs="Calibri"/>
-          <w:color w:val="000000"/>
-        </w:rPr>
-      </w:pPr>
-      <w:r>
-        <w:rPr>
-          <w:rFonts w:ascii="Calibri" w:hAnsi="Calibri" w:cs="Calibri"/>
-          <w:color w:val="000000"/>
-          <w:lang w:val="en-US"/>
-        </w:rPr>
-        <w:t> </w:t>
-      </w:r>
-    </w:p>
-    <w:p>
-      <w:pPr>
-        <w:rPr>
-          <w:rFonts w:ascii="Calibri" w:hAnsi="Calibri" w:cs="Calibri"/>
-          <w:color w:val="000000"/>
-        </w:rPr>
-      </w:pPr>
-      <w:r>
-        <w:rPr>
-          <w:rFonts w:ascii="Calibri" w:hAnsi="Calibri" w:cs="Calibri"/>
-          <w:color w:val="000000"/>
-          <w:lang w:val="en-US"/>
-        </w:rPr>
-        <w:t>First at all thanks for your continuos support, it is very much appreciated.</w:t>
-      </w:r>
-    </w:p>
-    <w:p>
-      <w:pPr>
-        <w:rPr>
-          <w:rFonts w:ascii="Calibri" w:hAnsi="Calibri" w:cs="Calibri"/>
-          <w:color w:val="000000"/>
-        </w:rPr>
-      </w:pPr>
-      <w:r>
-        <w:rPr>
-          <w:rFonts w:ascii="Calibri" w:hAnsi="Calibri" w:cs="Calibri"/>
-          <w:color w:val="000000"/>
-          <w:lang w:val="en-US"/>
-        </w:rPr>
-        <w:t> </w:t>
-      </w:r>
-    </w:p>
-    <w:p>
-      <w:pPr>
-        <w:rPr>
-          <w:rFonts w:ascii="Calibri" w:hAnsi="Calibri" w:cs="Calibri"/>
-          <w:color w:val="000000"/>
-        </w:rPr>
-      </w:pPr>
-      <w:r>
-        <w:rPr>
-          <w:rFonts w:ascii="Calibri" w:hAnsi="Calibri" w:cs="Calibri"/>
-          <w:color w:val="000000"/>
-          <w:lang w:val="en-US"/>
-        </w:rPr>
-        <w:t>As anticipated in previous emails, we do have upcoming collaboration with important personalities.</w:t>
-      </w:r>
-    </w:p>
-    <w:p>
-      <w:pPr>
-        <w:rPr>
-          <w:rFonts w:ascii="Calibri" w:hAnsi="Calibri" w:cs="Calibri"/>
-          <w:color w:val="000000"/>
-        </w:rPr>
-      </w:pPr>
-      <w:r>
-        <w:rPr>
-          <w:rFonts w:ascii="Calibri" w:hAnsi="Calibri" w:cs="Calibri"/>
-          <w:color w:val="000000"/>
-          <w:lang w:val="en-US"/>
-        </w:rPr>
-        <w:t> </w:t>
-      </w:r>
-    </w:p>
-    <w:p>
-      <w:pPr>
-        <w:rPr>
-          <w:rFonts w:ascii="Calibri" w:hAnsi="Calibri" w:cs="Calibri"/>
-          <w:color w:val="000000"/>
-        </w:rPr>
-      </w:pPr>
-      <w:r>
-        <w:rPr>
-          <w:rFonts w:ascii="Calibri" w:hAnsi="Calibri" w:cs="Calibri"/>
-          <w:color w:val="000000"/>
-          <w:lang w:val="en-US"/>
-        </w:rPr>
-        <w:t>Here below you will find our imminent cooperation with Mr Costantino della Gherardesca.</w:t>
-      </w:r>
-    </w:p>
-    <w:p>
-      <w:pPr>
-        <w:rPr>
-          <w:rFonts w:ascii="Calibri" w:hAnsi="Calibri" w:cs="Calibri"/>
-          <w:color w:val="000000"/>
-        </w:rPr>
-      </w:pPr>
-      <w:r>
-        <w:rPr>
-          <w:rFonts w:ascii="Calibri" w:hAnsi="Calibri" w:cs="Calibri"/>
-          <w:color w:val="000000"/>
-          <w:lang w:val="en-US"/>
-        </w:rPr>
-        <w:t> </w:t>
-      </w:r>
-    </w:p>
-    <w:p>
-      <w:pPr>
-        <w:shd w:val="clear" w:color="auto" w:fill="FFFFFF"/>
-        <w:rPr>
-          <w:rFonts w:ascii="Calibri" w:hAnsi="Calibri" w:cs="Calibri"/>
-          <w:color w:val="000000"/>
-        </w:rPr>
-      </w:pPr>
-      <w:r>
-        <w:rPr>
-          <w:rFonts w:ascii="Courier New" w:hAnsi="Courier New" w:cs="Courier New"/>
-          <w:color w:val="000000"/>
-          <w:sz w:val="21"/>
-          <w:szCs w:val="21"/>
-          <w:lang w:val="it-IT"/>
-        </w:rPr>
-        <w:t> </w:t>
+        <w:t>歐元</w:t>
       </w:r>
       <w:r>
         <w:rPr>
-          <w:rStyle w:val="apple-converted-space"/>
-          <w:rFonts w:ascii="Courier New" w:hAnsi="Courier New" w:cs="Courier New"/>
-          <w:color w:val="000000"/>
-          <w:sz w:val="21"/>
-          <w:szCs w:val="21"/>
-          <w:lang w:val="it-IT"/>
+          <w:rFonts w:ascii="KaiTi" w:eastAsia="KaiTi" w:hAnsi="KaiTi"/>
         </w:rPr>
-        <w:t> </w:t>
-      </w:r>
-      <w:r>
-        <w:rPr>
-          <w:rFonts w:ascii="Courier New" w:hAnsi="Courier New" w:cs="Courier New"/>
-          <w:color w:val="FFFFFF"/>
-          <w:sz w:val="21"/>
-          <w:szCs w:val="21"/>
-          <w:shd w:val="clear" w:color="auto" w:fill="FF00FF"/>
-          <w:lang w:val="it-IT"/>
-        </w:rPr>
-        <w:t>1</w:t>
-      </w:r>
-      <w:r>
-        <w:rPr>
-          <w:rFonts w:ascii="Courier New" w:hAnsi="Courier New" w:cs="Courier New"/>
-          <w:color w:val="000000"/>
-          <w:sz w:val="21"/>
-          <w:szCs w:val="21"/>
-          <w:lang w:val="it-IT"/>
-        </w:rPr>
-        <w:t>.DELLAGHERARDESCA/COSTANTINO MR  </w:t>
-      </w:r>
-      <w:r>
-        <w:rPr>
-          <w:rStyle w:val="apple-converted-space"/>
-          <w:rFonts w:ascii="Courier New" w:hAnsi="Courier New" w:cs="Courier New"/>
-          <w:color w:val="000000"/>
-          <w:sz w:val="21"/>
-          <w:szCs w:val="21"/>
-          <w:lang w:val="it-IT"/>
-        </w:rPr>
-        <w:t> </w:t>
-      </w:r>
-      <w:r>
-        <w:rPr>
-          <w:rFonts w:ascii="Courier New" w:hAnsi="Courier New" w:cs="Courier New"/>
-          <w:color w:val="FF00FF"/>
-          <w:sz w:val="21"/>
-          <w:szCs w:val="21"/>
-          <w:lang w:val="it-IT"/>
-        </w:rPr>
-        <w:t>2</w:t>
-      </w:r>
-      <w:r>
-        <w:rPr>
-          <w:rFonts w:ascii="Courier New" w:hAnsi="Courier New" w:cs="Courier New"/>
-          <w:color w:val="000000"/>
-          <w:sz w:val="21"/>
-          <w:szCs w:val="21"/>
-          <w:lang w:val="it-IT"/>
-        </w:rPr>
-        <w:t>.MORO/ROSSANA MRS</w:t>
+        <w:t xml:space="preserve"> ，單位：元</w:t>
       </w:r>
     </w:p>
-    <w:p>
-      <w:pPr>
-        <w:shd w:val="clear" w:color="auto" w:fill="FFFFFF"/>
-        <w:rPr>
-          <w:rFonts w:ascii="Calibri" w:hAnsi="Calibri" w:cs="Calibri"/>
-          <w:color w:val="000000"/>
-        </w:rPr>
-      </w:pPr>
-      <w:r>
-        <w:rPr>
-          <w:rFonts w:ascii="Courier New" w:hAnsi="Courier New" w:cs="Courier New"/>
-          <w:color w:val="000000"/>
-          <w:sz w:val="21"/>
-          <w:szCs w:val="21"/>
-          <w:lang w:val="it-IT"/>
-        </w:rPr>
-        <w:t> </w:t>
-      </w:r>
-      <w:r>
-        <w:rPr>
-          <w:rStyle w:val="apple-converted-space"/>
-          <w:rFonts w:ascii="Courier New" w:hAnsi="Courier New" w:cs="Courier New"/>
-          <w:color w:val="000000"/>
-          <w:sz w:val="21"/>
-          <w:szCs w:val="21"/>
-          <w:lang w:val="it-IT"/>
-        </w:rPr>
-        <w:t> </w:t>
-      </w:r>
-      <w:r>
-        <w:rPr>
-          <w:rFonts w:ascii="Courier New" w:hAnsi="Courier New" w:cs="Courier New"/>
-          <w:color w:val="FF00FF"/>
-          <w:sz w:val="21"/>
-          <w:szCs w:val="21"/>
-          <w:lang w:val="it-IT"/>
-        </w:rPr>
-        <w:t>3</w:t>
-      </w:r>
-      <w:r>
-        <w:rPr>
-          <w:rFonts w:ascii="Courier New" w:hAnsi="Courier New" w:cs="Courier New"/>
-          <w:color w:val="000000"/>
-          <w:sz w:val="21"/>
-          <w:szCs w:val="21"/>
-          <w:lang w:val="it-IT"/>
-        </w:rPr>
-        <w:t>  BR</w:t>
-      </w:r>
-      <w:r>
-        <w:rPr>
-          <w:rStyle w:val="apple-converted-space"/>
-          <w:rFonts w:ascii="Courier New" w:hAnsi="Courier New" w:cs="Courier New"/>
-          <w:color w:val="000000"/>
-          <w:sz w:val="21"/>
-          <w:szCs w:val="21"/>
-          <w:lang w:val="it-IT"/>
-        </w:rPr>
-        <w:t> </w:t>
-      </w:r>
-      <w:r>
-        <w:rPr>
-          <w:rFonts w:ascii="Courier New" w:hAnsi="Courier New" w:cs="Courier New"/>
-          <w:color w:val="FF0000"/>
-          <w:sz w:val="21"/>
-          <w:szCs w:val="21"/>
-          <w:lang w:val="it-IT"/>
-        </w:rPr>
-        <w:t>096</w:t>
-      </w:r>
-      <w:r>
-        <w:rPr>
-          <w:rStyle w:val="apple-converted-space"/>
-          <w:rFonts w:ascii="Courier New" w:hAnsi="Courier New" w:cs="Courier New"/>
-          <w:color w:val="000000"/>
-          <w:sz w:val="21"/>
-          <w:szCs w:val="21"/>
-          <w:lang w:val="it-IT"/>
-        </w:rPr>
-        <w:t> </w:t>
-      </w:r>
-      <w:r>
-        <w:rPr>
-          <w:rFonts w:ascii="Courier New" w:hAnsi="Courier New" w:cs="Courier New"/>
-          <w:color w:val="0000FF"/>
-          <w:sz w:val="21"/>
-          <w:szCs w:val="21"/>
-          <w:lang w:val="it-IT"/>
-        </w:rPr>
-        <w:t>R</w:t>
-      </w:r>
-      <w:r>
-        <w:rPr>
-          <w:rStyle w:val="apple-converted-space"/>
-          <w:rFonts w:ascii="Courier New" w:hAnsi="Courier New" w:cs="Courier New"/>
-          <w:color w:val="000000"/>
-          <w:sz w:val="21"/>
-          <w:szCs w:val="21"/>
-          <w:lang w:val="it-IT"/>
-        </w:rPr>
-        <w:t> </w:t>
-      </w:r>
-      <w:r>
-        <w:rPr>
-          <w:rFonts w:ascii="Courier New" w:hAnsi="Courier New" w:cs="Courier New"/>
-          <w:color w:val="000000"/>
-          <w:sz w:val="21"/>
-          <w:szCs w:val="21"/>
-          <w:lang w:val="it-IT"/>
-        </w:rPr>
-        <w:t>07AUG 3 MXPTPE HK2       1  1115 0625+1 *1A/E*</w:t>
-      </w:r>
-    </w:p>
-    <w:p>
-      <w:pPr>
-        <w:shd w:val="clear" w:color="auto" w:fill="FFFFFF"/>
-        <w:rPr>
-          <w:rFonts w:ascii="Calibri" w:hAnsi="Calibri" w:cs="Calibri"/>
-          <w:color w:val="000000"/>
-        </w:rPr>
-      </w:pPr>
-      <w:r>
-        <w:rPr>
-          <w:rFonts w:ascii="Courier New" w:hAnsi="Courier New" w:cs="Courier New"/>
-          <w:color w:val="000000"/>
-          <w:sz w:val="21"/>
-          <w:szCs w:val="21"/>
-          <w:lang w:val="it-IT"/>
-        </w:rPr>
-        <w:t> </w:t>
-      </w:r>
-      <w:r>
-        <w:rPr>
-          <w:rStyle w:val="apple-converted-space"/>
-          <w:rFonts w:ascii="Courier New" w:hAnsi="Courier New" w:cs="Courier New"/>
-          <w:color w:val="000000"/>
-          <w:sz w:val="21"/>
-          <w:szCs w:val="21"/>
-          <w:lang w:val="it-IT"/>
-        </w:rPr>
-        <w:t> </w:t>
-      </w:r>
-      <w:r>
-        <w:rPr>
-          <w:rFonts w:ascii="Courier New" w:hAnsi="Courier New" w:cs="Courier New"/>
-          <w:color w:val="FF00FF"/>
-          <w:sz w:val="21"/>
-          <w:szCs w:val="21"/>
-          <w:lang w:val="it-IT"/>
-        </w:rPr>
-        <w:t>4</w:t>
-      </w:r>
-      <w:r>
-        <w:rPr>
-          <w:rFonts w:ascii="Courier New" w:hAnsi="Courier New" w:cs="Courier New"/>
-          <w:color w:val="000000"/>
-          <w:sz w:val="21"/>
-          <w:szCs w:val="21"/>
-          <w:lang w:val="it-IT"/>
-        </w:rPr>
-        <w:t>  BR</w:t>
-      </w:r>
-      <w:r>
-        <w:rPr>
-          <w:rStyle w:val="apple-converted-space"/>
-          <w:rFonts w:ascii="Courier New" w:hAnsi="Courier New" w:cs="Courier New"/>
-          <w:color w:val="000000"/>
-          <w:sz w:val="21"/>
-          <w:szCs w:val="21"/>
-          <w:lang w:val="it-IT"/>
-        </w:rPr>
-        <w:t> </w:t>
-      </w:r>
-      <w:r>
-        <w:rPr>
-          <w:rFonts w:ascii="Courier New" w:hAnsi="Courier New" w:cs="Courier New"/>
-          <w:color w:val="FF0000"/>
-          <w:sz w:val="21"/>
-          <w:szCs w:val="21"/>
-          <w:lang w:val="it-IT"/>
-        </w:rPr>
-        <w:t>257</w:t>
-      </w:r>
-      <w:r>
-        <w:rPr>
-          <w:rStyle w:val="apple-converted-space"/>
-          <w:rFonts w:ascii="Courier New" w:hAnsi="Courier New" w:cs="Courier New"/>
-          <w:color w:val="000000"/>
-          <w:sz w:val="21"/>
-          <w:szCs w:val="21"/>
-          <w:lang w:val="it-IT"/>
-        </w:rPr>
-        <w:t> </w:t>
-      </w:r>
-      <w:r>
-        <w:rPr>
-          <w:rFonts w:ascii="Courier New" w:hAnsi="Courier New" w:cs="Courier New"/>
-          <w:color w:val="0000FF"/>
-          <w:sz w:val="21"/>
-          <w:szCs w:val="21"/>
-          <w:lang w:val="it-IT"/>
-        </w:rPr>
-        <w:t>R</w:t>
-      </w:r>
-      <w:r>
-        <w:rPr>
-          <w:rStyle w:val="apple-converted-space"/>
-          <w:rFonts w:ascii="Courier New" w:hAnsi="Courier New" w:cs="Courier New"/>
-          <w:color w:val="000000"/>
-          <w:sz w:val="21"/>
-          <w:szCs w:val="21"/>
-          <w:lang w:val="it-IT"/>
-        </w:rPr>
-        <w:t> </w:t>
-      </w:r>
-      <w:r>
-        <w:rPr>
-          <w:rFonts w:ascii="Courier New" w:hAnsi="Courier New" w:cs="Courier New"/>
-          <w:color w:val="000000"/>
-          <w:sz w:val="21"/>
-          <w:szCs w:val="21"/>
-          <w:lang w:val="it-IT"/>
-        </w:rPr>
-        <w:t>12AUG 1 TPECNX HK2       2  0725 1025   *1A/E*</w:t>
-      </w:r>
-    </w:p>
-    <w:p>
-      <w:pPr>
-        <w:shd w:val="clear" w:color="auto" w:fill="FFFFFF"/>
-        <w:rPr>
-          <w:rFonts w:ascii="Calibri" w:hAnsi="Calibri" w:cs="Calibri"/>
-          <w:color w:val="000000"/>
-        </w:rPr>
-      </w:pPr>
-      <w:r>
-        <w:rPr>
-          <w:rFonts w:ascii="Courier New" w:hAnsi="Courier New" w:cs="Courier New"/>
-          <w:color w:val="000000"/>
-          <w:sz w:val="21"/>
-          <w:szCs w:val="21"/>
-          <w:lang w:val="it-IT"/>
-        </w:rPr>
-        <w:t> </w:t>
-      </w:r>
-      <w:r>
-        <w:rPr>
-          <w:rStyle w:val="apple-converted-space"/>
-          <w:rFonts w:ascii="Courier New" w:hAnsi="Courier New" w:cs="Courier New"/>
-          <w:color w:val="000000"/>
-          <w:sz w:val="21"/>
-          <w:szCs w:val="21"/>
-          <w:lang w:val="it-IT"/>
-        </w:rPr>
-        <w:t> </w:t>
-      </w:r>
-      <w:r>
-        <w:rPr>
-          <w:rFonts w:ascii="Courier New" w:hAnsi="Courier New" w:cs="Courier New"/>
-          <w:color w:val="FF00FF"/>
-          <w:sz w:val="21"/>
-          <w:szCs w:val="21"/>
-          <w:lang w:val="it-IT"/>
-        </w:rPr>
-        <w:t>5</w:t>
-      </w:r>
-      <w:r>
-        <w:rPr>
-          <w:rFonts w:ascii="Courier New" w:hAnsi="Courier New" w:cs="Courier New"/>
-          <w:color w:val="000000"/>
-          <w:sz w:val="21"/>
-          <w:szCs w:val="21"/>
-          <w:lang w:val="it-IT"/>
-        </w:rPr>
-        <w:t>  BR</w:t>
-      </w:r>
-      <w:r>
-        <w:rPr>
-          <w:rStyle w:val="apple-converted-space"/>
-          <w:rFonts w:ascii="Courier New" w:hAnsi="Courier New" w:cs="Courier New"/>
-          <w:color w:val="000000"/>
-          <w:sz w:val="21"/>
-          <w:szCs w:val="21"/>
-          <w:lang w:val="it-IT"/>
-        </w:rPr>
-        <w:t> </w:t>
-      </w:r>
-      <w:r>
-        <w:rPr>
-          <w:rFonts w:ascii="Courier New" w:hAnsi="Courier New" w:cs="Courier New"/>
-          <w:color w:val="FF0000"/>
-          <w:sz w:val="21"/>
-          <w:szCs w:val="21"/>
-          <w:lang w:val="it-IT"/>
-        </w:rPr>
-        <w:t>068</w:t>
-      </w:r>
-      <w:r>
-        <w:rPr>
-          <w:rStyle w:val="apple-converted-space"/>
-          <w:rFonts w:ascii="Courier New" w:hAnsi="Courier New" w:cs="Courier New"/>
-          <w:color w:val="000000"/>
-          <w:sz w:val="21"/>
-          <w:szCs w:val="21"/>
-          <w:lang w:val="it-IT"/>
-        </w:rPr>
-        <w:t> </w:t>
-      </w:r>
-      <w:r>
-        <w:rPr>
-          <w:rFonts w:ascii="Courier New" w:hAnsi="Courier New" w:cs="Courier New"/>
-          <w:color w:val="0000FF"/>
-          <w:sz w:val="21"/>
-          <w:szCs w:val="21"/>
-          <w:lang w:val="it-IT"/>
-        </w:rPr>
-        <w:t>R</w:t>
-      </w:r>
-      <w:r>
-        <w:rPr>
-          <w:rStyle w:val="apple-converted-space"/>
-          <w:rFonts w:ascii="Courier New" w:hAnsi="Courier New" w:cs="Courier New"/>
-          <w:color w:val="000000"/>
-          <w:sz w:val="21"/>
-          <w:szCs w:val="21"/>
-          <w:lang w:val="it-IT"/>
-        </w:rPr>
-        <w:t> </w:t>
-      </w:r>
-      <w:r>
-        <w:rPr>
-          <w:rFonts w:ascii="Courier New" w:hAnsi="Courier New" w:cs="Courier New"/>
-          <w:color w:val="000000"/>
-          <w:sz w:val="21"/>
-          <w:szCs w:val="21"/>
-          <w:lang w:val="it-IT"/>
-        </w:rPr>
-        <w:t>24AUG 6 BKKTPE HK2          1645 2130   *1A/E*</w:t>
-      </w:r>
-    </w:p>
-    <w:p>
-      <w:pPr>
-        <w:shd w:val="clear" w:color="auto" w:fill="FFFFFF"/>
-        <w:rPr>
-          <w:rFonts w:ascii="Calibri" w:hAnsi="Calibri" w:cs="Calibri"/>
-          <w:color w:val="000000"/>
-        </w:rPr>
-      </w:pPr>
-      <w:r>
-        <w:rPr>
-          <w:rFonts w:ascii="Courier New" w:hAnsi="Courier New" w:cs="Courier New"/>
-          <w:color w:val="000000"/>
-          <w:sz w:val="21"/>
-          <w:szCs w:val="21"/>
-          <w:lang w:val="it-IT"/>
-        </w:rPr>
-        <w:t> </w:t>
-      </w:r>
-      <w:r>
-        <w:rPr>
-          <w:rStyle w:val="apple-converted-space"/>
-          <w:rFonts w:ascii="Courier New" w:hAnsi="Courier New" w:cs="Courier New"/>
-          <w:color w:val="000000"/>
-          <w:sz w:val="21"/>
-          <w:szCs w:val="21"/>
-          <w:lang w:val="it-IT"/>
-        </w:rPr>
-        <w:t> </w:t>
-      </w:r>
-      <w:r>
-        <w:rPr>
-          <w:rFonts w:ascii="Courier New" w:hAnsi="Courier New" w:cs="Courier New"/>
-          <w:color w:val="FF00FF"/>
-          <w:sz w:val="21"/>
-          <w:szCs w:val="21"/>
-        </w:rPr>
-        <w:t>6</w:t>
-      </w:r>
-      <w:r>
-        <w:rPr>
-          <w:rFonts w:ascii="Courier New" w:hAnsi="Courier New" w:cs="Courier New"/>
-          <w:color w:val="000000"/>
-          <w:sz w:val="21"/>
-          <w:szCs w:val="21"/>
-        </w:rPr>
-        <w:t>  BR</w:t>
-      </w:r>
-      <w:r>
-        <w:rPr>
-          <w:rStyle w:val="apple-converted-space"/>
-          <w:rFonts w:ascii="Courier New" w:hAnsi="Courier New" w:cs="Courier New"/>
-          <w:color w:val="000000"/>
-          <w:sz w:val="21"/>
-          <w:szCs w:val="21"/>
-        </w:rPr>
-        <w:t> </w:t>
-      </w:r>
-      <w:r>
-        <w:rPr>
-          <w:rFonts w:ascii="Courier New" w:hAnsi="Courier New" w:cs="Courier New"/>
-          <w:color w:val="FF0000"/>
-          <w:sz w:val="21"/>
-          <w:szCs w:val="21"/>
-        </w:rPr>
-        <w:t>095</w:t>
-      </w:r>
-      <w:r>
-        <w:rPr>
-          <w:rStyle w:val="apple-converted-space"/>
-          <w:rFonts w:ascii="Courier New" w:hAnsi="Courier New" w:cs="Courier New"/>
-          <w:color w:val="000000"/>
-          <w:sz w:val="21"/>
-          <w:szCs w:val="21"/>
-        </w:rPr>
-        <w:t> </w:t>
-      </w:r>
-      <w:r>
-        <w:rPr>
-          <w:rFonts w:ascii="Courier New" w:hAnsi="Courier New" w:cs="Courier New"/>
-          <w:color w:val="0000FF"/>
-          <w:sz w:val="21"/>
-          <w:szCs w:val="21"/>
-        </w:rPr>
-        <w:t>R</w:t>
-      </w:r>
-      <w:r>
-        <w:rPr>
-          <w:rStyle w:val="apple-converted-space"/>
-          <w:rFonts w:ascii="Courier New" w:hAnsi="Courier New" w:cs="Courier New"/>
-          <w:color w:val="000000"/>
-          <w:sz w:val="21"/>
-          <w:szCs w:val="21"/>
-        </w:rPr>
-        <w:t> </w:t>
-      </w:r>
-      <w:r>
-        <w:rPr>
-          <w:rFonts w:ascii="Courier New" w:hAnsi="Courier New" w:cs="Courier New"/>
-          <w:color w:val="000000"/>
-          <w:sz w:val="21"/>
-          <w:szCs w:val="21"/>
-        </w:rPr>
-        <w:t>24AUG 6 TPEMXP HK2       2  2355 0750+1 *1A/E*</w:t>
-      </w:r>
-    </w:p>
-    <w:p>
-      <w:pPr>
-        <w:rPr>
-          <w:rFonts w:ascii="Calibri" w:hAnsi="Calibri" w:cs="Calibri"/>
-          <w:color w:val="000000"/>
-        </w:rPr>
-      </w:pPr>
-      <w:r>
-        <w:rPr>
-          <w:rFonts w:ascii="Calibri" w:hAnsi="Calibri" w:cs="Calibri"/>
-          <w:color w:val="000000"/>
-          <w:lang w:val="en-US"/>
-        </w:rPr>
-        <w:t> </w:t>
-      </w:r>
-    </w:p>
-    <w:p>
-      <w:pPr>
-        <w:rPr>
-          <w:rFonts w:ascii="Calibri" w:hAnsi="Calibri" w:cs="Calibri"/>
-          <w:color w:val="000000"/>
-        </w:rPr>
-      </w:pPr>
-      <w:r>
-        <w:rPr>
-          <w:rFonts w:ascii="Calibri" w:hAnsi="Calibri" w:cs="Calibri"/>
-          <w:color w:val="000000"/>
-          <w:lang w:val="en-US"/>
-        </w:rPr>
-        <w:t> </w:t>
-      </w:r>
-    </w:p>
-    <w:p>
-      <w:pPr>
-        <w:rPr>
-          <w:rFonts w:ascii="Calibri" w:hAnsi="Calibri" w:cs="Calibri"/>
-          <w:color w:val="000000"/>
-        </w:rPr>
-      </w:pPr>
-      <w:r>
-        <w:rPr>
-          <w:rFonts w:ascii="Calibri" w:hAnsi="Calibri" w:cs="Calibri"/>
-          <w:b/>
-          <w:bCs/>
-          <w:color w:val="000000"/>
-          <w:u w:val="single"/>
-        </w:rPr>
-        <w:t>Who is he?</w:t>
-      </w:r>
-    </w:p>
-    <w:p>
-      <w:pPr>
-        <w:rPr>
-          <w:rFonts w:ascii="Calibri" w:hAnsi="Calibri" w:cs="Calibri"/>
-          <w:color w:val="000000"/>
-        </w:rPr>
-      </w:pPr>
-      <w:r>
-        <w:rPr>
-          <w:rFonts w:ascii="Calibri" w:hAnsi="Calibri" w:cs="Calibri"/>
-          <w:color w:val="000000"/>
-        </w:rPr>
-        <w:t> </w:t>
-      </w:r>
-    </w:p>
-    <w:p>
-      <w:pPr>
-        <w:rPr>
-          <w:rFonts w:ascii="Calibri" w:hAnsi="Calibri" w:cs="Calibri"/>
-          <w:color w:val="000000"/>
-        </w:rPr>
-      </w:pPr>
-      <w:r>
-        <w:rPr>
-          <w:rFonts w:ascii="Calibri" w:hAnsi="Calibri" w:cs="Calibri"/>
-          <w:color w:val="000000"/>
-        </w:rPr>
-        <w:t>VIP, TV celebrity, presenter, very famous personality in Italy, Asian expert and lover, especially for being the presenter/ambassador since over 12 years of “Pechino Express”, in a nutshell, the most popular and adventurous prime-time travel reality in the history of Italian Television which consists in a race between VIP couples competition, who challenge each other along a path crossing several nations to reach a certain goal in a journey in stages of several days. Often the destination chosen are in Asia, only to mentions some: Taiwan, Vietnam, Cambodia, Thailand, South Korea, basically All EVA Air Destination. Thanks to his charm and notoriety he attracts great audiences, the last 2024 edition of the reality counted an average of 568.000 views, over 166K social media interaction, +122% in comparison of 2023.</w:t>
-      </w:r>
-      <w:r>
-        <w:rPr>
-          <w:rStyle w:val="apple-converted-space"/>
-          <w:rFonts w:ascii="Calibri" w:hAnsi="Calibri" w:cs="Calibri"/>
-          <w:color w:val="000000"/>
-        </w:rPr>
-        <w:t> </w:t>
-      </w:r>
-    </w:p>
-    <w:p>
-      <w:pPr>
-        <w:rPr>
-          <w:rFonts w:ascii="Calibri" w:hAnsi="Calibri" w:cs="Calibri"/>
-          <w:color w:val="000000"/>
-        </w:rPr>
-      </w:pPr>
-      <w:r>
-        <w:rPr>
-          <w:rFonts w:ascii="Calibri" w:hAnsi="Calibri" w:cs="Calibri"/>
-          <w:color w:val="000000"/>
-        </w:rPr>
-        <w:t>More details here:</w:t>
-      </w:r>
-      <w:r>
-        <w:rPr>
-          <w:rStyle w:val="apple-converted-space"/>
-          <w:rFonts w:ascii="Calibri" w:hAnsi="Calibri" w:cs="Calibri"/>
-          <w:color w:val="000000"/>
-        </w:rPr>
-        <w:t> </w:t>
-      </w:r>
-    </w:p>
-    <w:p>
-      <w:pPr>
-        <w:rPr>
-          <w:rFonts w:ascii="Calibri" w:hAnsi="Calibri" w:cs="Calibri"/>
-          <w:color w:val="000000"/>
-        </w:rPr>
-      </w:pPr>
-      <w:hyperlink r:id="rId8" w:history="1">
-        <w:r>
-          <w:rPr>
-            <w:rStyle w:val="Hyperlink"/>
-            <w:rFonts w:ascii="Calibri" w:hAnsi="Calibri" w:cs="Calibri"/>
-            <w:lang w:val="en-GB"/>
-          </w:rPr>
-          <w:t>https://it.wikipedia.org/wiki/Costantino_della_Gherardesca</w:t>
-        </w:r>
-      </w:hyperlink>
-    </w:p>
-    <w:p>
-      <w:pPr>
-        <w:rPr>
-          <w:rFonts w:ascii="Calibri" w:hAnsi="Calibri" w:cs="Calibri"/>
-          <w:color w:val="000000"/>
-        </w:rPr>
-      </w:pPr>
-      <w:hyperlink r:id="rId9" w:history="1">
-        <w:r>
-          <w:rPr>
-            <w:rStyle w:val="Hyperlink"/>
-            <w:rFonts w:ascii="Calibri" w:hAnsi="Calibri" w:cs="Calibri"/>
-            <w:lang w:val="en-GB"/>
-          </w:rPr>
-          <w:t>https://en.wikipedia.org/wiki/Pechino_Express</w:t>
-        </w:r>
-      </w:hyperlink>
-    </w:p>
-    <w:p>
-      <w:pPr>
-        <w:rPr>
-          <w:rFonts w:ascii="Calibri" w:hAnsi="Calibri" w:cs="Calibri"/>
-          <w:color w:val="000000"/>
-        </w:rPr>
-      </w:pPr>
-      <w:r>
-        <w:rPr>
-          <w:rFonts w:ascii="Calibri" w:hAnsi="Calibri" w:cs="Calibri"/>
-          <w:color w:val="000000"/>
-          <w:lang w:val="en-US"/>
-        </w:rPr>
-        <w:t> </w:t>
-      </w:r>
-    </w:p>
-    <w:p>
-      <w:pPr>
-        <w:rPr>
-          <w:rFonts w:ascii="Calibri" w:hAnsi="Calibri" w:cs="Calibri"/>
-          <w:color w:val="000000"/>
-        </w:rPr>
-      </w:pPr>
-      <w:r>
-        <w:rPr>
-          <w:rFonts w:ascii="Calibri" w:hAnsi="Calibri" w:cs="Calibri"/>
-          <w:b/>
-          <w:bCs/>
-          <w:color w:val="000000"/>
-          <w:u w:val="single"/>
-        </w:rPr>
-        <w:t>What is his request?</w:t>
-      </w:r>
-      <w:r>
-        <w:rPr>
-          <w:rStyle w:val="apple-converted-space"/>
-          <w:rFonts w:ascii="Calibri" w:hAnsi="Calibri" w:cs="Calibri"/>
-          <w:b/>
-          <w:bCs/>
-          <w:color w:val="000000"/>
-          <w:u w:val="single"/>
-        </w:rPr>
-        <w:t> </w:t>
-      </w:r>
-    </w:p>
-    <w:p>
-      <w:pPr>
-        <w:rPr>
-          <w:rFonts w:ascii="Calibri" w:hAnsi="Calibri" w:cs="Calibri"/>
-          <w:color w:val="000000"/>
-        </w:rPr>
-      </w:pPr>
-      <w:r>
-        <w:rPr>
-          <w:rFonts w:ascii="Calibri" w:hAnsi="Calibri" w:cs="Calibri"/>
-          <w:color w:val="000000"/>
-          <w:lang w:val="en-US"/>
-        </w:rPr>
-        <w:t> </w:t>
-      </w:r>
-    </w:p>
-    <w:p>
-      <w:pPr>
-        <w:rPr>
-          <w:rFonts w:ascii="Calibri" w:hAnsi="Calibri" w:cs="Calibri"/>
-          <w:color w:val="000000"/>
-        </w:rPr>
-      </w:pPr>
-      <w:r>
-        <w:rPr>
-          <w:rFonts w:ascii="Calibri" w:hAnsi="Calibri" w:cs="Calibri"/>
-          <w:color w:val="000000"/>
-          <w:lang w:val="en-US"/>
-        </w:rPr>
-        <w:t>Mr. Costantino Della Gherardesca came personally to visit our office and asked to experience both EVA AIR and a stopover in Taiwan due to his special relationship with it.</w:t>
-      </w:r>
-    </w:p>
-    <w:p>
-      <w:pPr>
-        <w:rPr>
-          <w:rFonts w:ascii="Calibri" w:hAnsi="Calibri" w:cs="Calibri"/>
-          <w:color w:val="000000"/>
-        </w:rPr>
-      </w:pPr>
-      <w:r>
-        <w:rPr>
-          <w:rFonts w:ascii="Calibri" w:hAnsi="Calibri" w:cs="Calibri"/>
-          <w:color w:val="000000"/>
-          <w:lang w:val="en-US"/>
-        </w:rPr>
-        <w:t>He is also asking if it would be possible to support him and his personal assistance with a trip to Sun Moon Lake with two rooms in Lalu Hotels for a couple of days during his staying in Taiwan which will be between the 08</w:t>
-      </w:r>
-      <w:r>
-        <w:rPr>
-          <w:rFonts w:ascii="Calibri" w:hAnsi="Calibri" w:cs="Calibri"/>
-          <w:color w:val="000000"/>
-          <w:vertAlign w:val="superscript"/>
-          <w:lang w:val="en-US"/>
-        </w:rPr>
-        <w:t>th</w:t>
-      </w:r>
-      <w:r>
-        <w:rPr>
-          <w:rStyle w:val="apple-converted-space"/>
-          <w:rFonts w:ascii="Calibri" w:hAnsi="Calibri" w:cs="Calibri"/>
-          <w:color w:val="000000"/>
-          <w:lang w:val="en-US"/>
-        </w:rPr>
-        <w:t> </w:t>
-      </w:r>
-      <w:r>
-        <w:rPr>
-          <w:rFonts w:ascii="Calibri" w:hAnsi="Calibri" w:cs="Calibri"/>
-          <w:color w:val="000000"/>
-          <w:lang w:val="en-US"/>
-        </w:rPr>
-        <w:t>of August and the 11</w:t>
-      </w:r>
-      <w:r>
-        <w:rPr>
-          <w:rFonts w:ascii="Calibri" w:hAnsi="Calibri" w:cs="Calibri"/>
-          <w:color w:val="000000"/>
-          <w:vertAlign w:val="superscript"/>
-          <w:lang w:val="en-US"/>
-        </w:rPr>
-        <w:t>th</w:t>
-      </w:r>
-      <w:r>
-        <w:rPr>
-          <w:rStyle w:val="apple-converted-space"/>
-          <w:rFonts w:ascii="Calibri" w:hAnsi="Calibri" w:cs="Calibri"/>
-          <w:color w:val="000000"/>
-          <w:lang w:val="en-US"/>
-        </w:rPr>
-        <w:t> </w:t>
-      </w:r>
-      <w:r>
-        <w:rPr>
-          <w:rFonts w:ascii="Calibri" w:hAnsi="Calibri" w:cs="Calibri"/>
-          <w:color w:val="000000"/>
-          <w:lang w:val="en-US"/>
-        </w:rPr>
-        <w:t>of August.</w:t>
-      </w:r>
-    </w:p>
-    <w:p>
-      <w:pPr>
-        <w:rPr>
-          <w:rFonts w:ascii="Calibri" w:hAnsi="Calibri" w:cs="Calibri"/>
-          <w:color w:val="000000"/>
-        </w:rPr>
-      </w:pPr>
-      <w:r>
-        <w:rPr>
-          <w:rFonts w:ascii="Calibri" w:hAnsi="Calibri" w:cs="Calibri"/>
-          <w:color w:val="000000"/>
-          <w:lang w:val="en-US"/>
-        </w:rPr>
-        <w:t>Do you think it would be possible? If yes, he promised some social media contents in exchange, in case you have some requests in this regards feel free to share with me your input and I will share with Mr Della Gherardesca.</w:t>
-      </w:r>
-    </w:p>
-    <w:p>
-      <w:pPr>
-        <w:rPr>
-          <w:rFonts w:ascii="Calibri" w:hAnsi="Calibri" w:cs="Calibri"/>
-          <w:color w:val="000000"/>
-        </w:rPr>
-      </w:pPr>
-      <w:r>
-        <w:rPr>
-          <w:rFonts w:ascii="Calibri" w:hAnsi="Calibri" w:cs="Calibri"/>
-          <w:color w:val="000000"/>
-          <w:lang w:val="en-US"/>
-        </w:rPr>
-        <w:t> </w:t>
-      </w:r>
-      <w:r>
-        <w:rPr>
-          <w:rFonts w:ascii="Calibri" w:hAnsi="Calibri" w:cs="Calibri"/>
-          <w:color w:val="212121"/>
-          <w:sz w:val="22"/>
-          <w:szCs w:val="22"/>
-        </w:rPr>
-        <w:t> </w:t>
-      </w:r>
-    </w:p>
-    <w:p>
-      <w:pPr>
-        <w:rPr>
-          <w:rFonts w:ascii="Segoe UI" w:hAnsi="Segoe UI" w:cs="Segoe UI"/>
-          <w:color w:val="212121"/>
-          <w:sz w:val="23"/>
-          <w:szCs w:val="23"/>
-        </w:rPr>
-      </w:pPr>
-      <w:r>
-        <w:rPr>
-          <w:rFonts w:ascii="Calibri" w:hAnsi="Calibri" w:cs="Calibri"/>
-          <w:color w:val="212121"/>
-          <w:sz w:val="22"/>
-          <w:szCs w:val="22"/>
-        </w:rPr>
-        <w:t>Below all Mr Della Gherardesca’s feedback, in</w:t>
-      </w:r>
-      <w:r>
-        <w:rPr>
-          <w:rStyle w:val="apple-converted-space"/>
-          <w:rFonts w:ascii="Calibri" w:hAnsi="Calibri" w:cs="Calibri"/>
-          <w:color w:val="212121"/>
-          <w:sz w:val="22"/>
-          <w:szCs w:val="22"/>
-        </w:rPr>
-        <w:t> </w:t>
-      </w:r>
-      <w:r>
-        <w:rPr>
-          <w:rFonts w:ascii="Calibri" w:hAnsi="Calibri" w:cs="Calibri"/>
-          <w:color w:val="4472C4"/>
-          <w:sz w:val="22"/>
-          <w:szCs w:val="22"/>
-        </w:rPr>
-        <w:t>blue:</w:t>
-      </w:r>
-    </w:p>
-    <w:p>
-      <w:pPr>
-        <w:rPr>
-          <w:rFonts w:ascii="Segoe UI" w:hAnsi="Segoe UI" w:cs="Segoe UI"/>
-          <w:color w:val="212121"/>
-          <w:sz w:val="23"/>
-          <w:szCs w:val="23"/>
-        </w:rPr>
-      </w:pPr>
-      <w:r>
-        <w:rPr>
-          <w:rFonts w:ascii="Calibri" w:hAnsi="Calibri" w:cs="Calibri"/>
-          <w:color w:val="212121"/>
-          <w:sz w:val="22"/>
-          <w:szCs w:val="22"/>
-        </w:rPr>
-        <w:t> </w:t>
-      </w:r>
-    </w:p>
-    <w:p>
-      <w:pPr>
-        <w:ind w:left="360" w:hanging="360"/>
-        <w:rPr>
-          <w:rFonts w:ascii="Segoe UI" w:hAnsi="Segoe UI" w:cs="Segoe UI"/>
-          <w:color w:val="212121"/>
-          <w:sz w:val="23"/>
-          <w:szCs w:val="23"/>
-        </w:rPr>
-      </w:pPr>
-      <w:r>
-        <w:rPr>
-          <w:rFonts w:ascii="Symbol" w:hAnsi="Symbol"/>
-          <w:color w:val="000000"/>
-        </w:rPr>
-        <w:t>·</w:t>
-      </w:r>
-      <w:r>
-        <w:rPr>
-          <w:rFonts w:ascii="Calibri" w:hAnsi="Calibri" w:cs="Calibri"/>
-          <w:color w:val="000000"/>
-        </w:rPr>
-        <w:t>Have you heard from Mr. Della Gherardesca</w:t>
-      </w:r>
-      <w:r>
-        <w:rPr>
-          <w:rFonts w:ascii="Calibri" w:hAnsi="Calibri" w:cs="Calibri"/>
-          <w:color w:val="212121"/>
-          <w:sz w:val="22"/>
-          <w:szCs w:val="22"/>
-        </w:rPr>
-        <w:t>?</w:t>
-      </w:r>
-      <w:r>
-        <w:rPr>
-          <w:rStyle w:val="apple-converted-space"/>
-          <w:rFonts w:ascii="Calibri" w:hAnsi="Calibri" w:cs="Calibri"/>
-          <w:color w:val="212121"/>
-          <w:sz w:val="22"/>
-          <w:szCs w:val="22"/>
-        </w:rPr>
-        <w:t> </w:t>
-      </w:r>
-      <w:r>
-        <w:rPr>
-          <w:rFonts w:ascii="Calibri" w:hAnsi="Calibri" w:cs="Calibri"/>
-          <w:color w:val="4472C4"/>
-          <w:sz w:val="22"/>
-          <w:szCs w:val="22"/>
-        </w:rPr>
-        <w:t>Yes, he comes back to me right now.</w:t>
-      </w:r>
-    </w:p>
-    <w:p>
-      <w:pPr>
-        <w:rPr>
-          <w:rFonts w:ascii="Segoe UI" w:hAnsi="Segoe UI" w:cs="Segoe UI"/>
-          <w:color w:val="212121"/>
-          <w:sz w:val="23"/>
-          <w:szCs w:val="23"/>
-        </w:rPr>
-      </w:pPr>
-      <w:r>
-        <w:rPr>
-          <w:rFonts w:ascii="Calibri" w:hAnsi="Calibri" w:cs="Calibri"/>
-          <w:color w:val="000000"/>
-        </w:rPr>
-        <w:t> </w:t>
-      </w:r>
-    </w:p>
-    <w:p>
-      <w:pPr>
-        <w:ind w:left="360" w:hanging="360"/>
-        <w:rPr>
-          <w:rFonts w:ascii="Segoe UI" w:hAnsi="Segoe UI" w:cs="Segoe UI"/>
-          <w:color w:val="212121"/>
-          <w:sz w:val="23"/>
-          <w:szCs w:val="23"/>
-        </w:rPr>
-      </w:pPr>
-      <w:r>
-        <w:rPr>
-          <w:rFonts w:ascii="Symbol" w:hAnsi="Symbol"/>
-          <w:color w:val="000000"/>
-        </w:rPr>
-        <w:t>·</w:t>
-      </w:r>
-      <w:r>
-        <w:rPr>
-          <w:rFonts w:ascii="Calibri" w:hAnsi="Calibri" w:cs="Calibri"/>
-          <w:color w:val="000000"/>
-        </w:rPr>
-        <w:t>Can he promise any social media exposure?</w:t>
-      </w:r>
-      <w:r>
-        <w:rPr>
-          <w:rStyle w:val="apple-converted-space"/>
-          <w:rFonts w:ascii="Calibri" w:hAnsi="Calibri" w:cs="Calibri"/>
-          <w:color w:val="000000"/>
-        </w:rPr>
-        <w:t> </w:t>
-      </w:r>
-      <w:r>
-        <w:rPr>
-          <w:rFonts w:ascii="Calibri" w:hAnsi="Calibri" w:cs="Calibri"/>
-          <w:color w:val="4472C4"/>
-          <w:sz w:val="22"/>
-          <w:szCs w:val="22"/>
-        </w:rPr>
-        <w:t>Yes, he can indeed, a story per place/activity and a story per hotel offered,  both IG/FB. He is also able to use AI (Artificial Intelligence) for his contents to assure high level of promotion.</w:t>
-      </w:r>
-    </w:p>
-    <w:p>
-      <w:pPr>
-        <w:rPr>
-          <w:rFonts w:ascii="Segoe UI" w:hAnsi="Segoe UI" w:cs="Segoe UI"/>
-          <w:color w:val="212121"/>
-          <w:sz w:val="23"/>
-          <w:szCs w:val="23"/>
-        </w:rPr>
-      </w:pPr>
-      <w:r>
-        <w:rPr>
-          <w:rFonts w:ascii="Calibri" w:hAnsi="Calibri" w:cs="Calibri"/>
-          <w:color w:val="000000"/>
-        </w:rPr>
-        <w:t> </w:t>
-      </w:r>
-    </w:p>
-    <w:p>
-      <w:pPr>
-        <w:ind w:left="360" w:hanging="360"/>
-        <w:rPr>
-          <w:rFonts w:ascii="Segoe UI" w:hAnsi="Segoe UI" w:cs="Segoe UI"/>
-          <w:color w:val="212121"/>
-          <w:sz w:val="23"/>
-          <w:szCs w:val="23"/>
-        </w:rPr>
-      </w:pPr>
-      <w:r>
-        <w:rPr>
-          <w:rFonts w:ascii="Symbol" w:hAnsi="Symbol"/>
-          <w:color w:val="000000"/>
-        </w:rPr>
-        <w:t>·</w:t>
-      </w:r>
-      <w:r>
-        <w:rPr>
-          <w:rFonts w:ascii="Calibri" w:hAnsi="Calibri" w:cs="Calibri"/>
-          <w:color w:val="000000"/>
-        </w:rPr>
-        <w:t>On the other hand, we might not be able to arrange accommodation at the Lalu hotel. Would he consider other hotel at Sun Moon Lake area? </w:t>
-      </w:r>
-    </w:p>
-    <w:p>
-      <w:pPr>
-        <w:rPr>
-          <w:rFonts w:ascii="Segoe UI" w:hAnsi="Segoe UI" w:cs="Segoe UI"/>
-          <w:color w:val="212121"/>
-          <w:sz w:val="23"/>
-          <w:szCs w:val="23"/>
-        </w:rPr>
-      </w:pPr>
-      <w:r>
-        <w:rPr>
-          <w:rFonts w:ascii="Calibri" w:hAnsi="Calibri" w:cs="Calibri"/>
-          <w:color w:val="4472C4"/>
-          <w:sz w:val="22"/>
-          <w:szCs w:val="22"/>
-        </w:rPr>
-        <w:t>Yes, he could consider an alternative</w:t>
-      </w:r>
-      <w:r>
-        <w:rPr>
-          <w:rStyle w:val="apple-converted-space"/>
-          <w:rFonts w:ascii="Calibri" w:hAnsi="Calibri" w:cs="Calibri"/>
-          <w:color w:val="4472C4"/>
-        </w:rPr>
-        <w:t> </w:t>
-      </w:r>
-      <w:r>
-        <w:rPr>
-          <w:rFonts w:ascii="Calibri" w:hAnsi="Calibri" w:cs="Calibri"/>
-          <w:color w:val="4472C4"/>
-          <w:sz w:val="22"/>
-          <w:szCs w:val="22"/>
-        </w:rPr>
-        <w:t>accommodation only if the alternative is close to the Lake (Lake view) 2 separate rooms: 1 room for himself + 1 room for his personal assistance Mrs Moro. Despite his appreciation and gratitude to TTB, if, due to the high season, the alternative hotel is a little bit far from the Sun Moon Lake area (for example 40 minutes driving), Mr Gherardesca will kindly refrain the offer. For him, it is important the proximity to the Lake to assure attractive social media contents.</w:t>
-      </w:r>
-      <w:r>
-        <w:rPr>
-          <w:rStyle w:val="apple-converted-space"/>
-          <w:rFonts w:ascii="Calibri" w:hAnsi="Calibri" w:cs="Calibri"/>
-          <w:color w:val="4472C4"/>
-          <w:sz w:val="22"/>
-          <w:szCs w:val="22"/>
-        </w:rPr>
-        <w:t> </w:t>
-      </w:r>
-    </w:p>
-    <w:p>
-      <w:pPr>
-        <w:rPr>
-          <w:rFonts w:ascii="Segoe UI" w:hAnsi="Segoe UI" w:cs="Segoe UI"/>
-          <w:color w:val="212121"/>
-          <w:sz w:val="23"/>
-          <w:szCs w:val="23"/>
-        </w:rPr>
-      </w:pPr>
-      <w:r>
-        <w:rPr>
-          <w:rFonts w:ascii="Calibri" w:hAnsi="Calibri" w:cs="Calibri"/>
-          <w:color w:val="4472C4"/>
-          <w:sz w:val="22"/>
-          <w:szCs w:val="22"/>
-        </w:rPr>
-        <w:t> </w:t>
-      </w:r>
-    </w:p>
-    <w:p>
-      <w:pPr>
-        <w:ind w:left="360" w:hanging="360"/>
-        <w:rPr>
-          <w:rFonts w:ascii="Segoe UI" w:hAnsi="Segoe UI" w:cs="Segoe UI" w:hint="eastAsia"/>
-          <w:color w:val="212121"/>
-          <w:sz w:val="23"/>
-          <w:szCs w:val="23"/>
-        </w:rPr>
-      </w:pPr>
-      <w:r>
-        <w:rPr>
-          <w:rFonts w:ascii="Symbol" w:hAnsi="Symbol"/>
-          <w:color w:val="000000"/>
-        </w:rPr>
-        <w:t>·</w:t>
-      </w:r>
-      <w:r>
-        <w:rPr>
-          <w:rFonts w:ascii="Calibri" w:hAnsi="Calibri" w:cs="Calibri"/>
-          <w:color w:val="000000"/>
-        </w:rPr>
-        <w:t>How is his travel plan? Would he spend 4 nights in Sun Moon Lake only? </w:t>
-      </w:r>
-    </w:p>
-    <w:p>
-      <w:pPr>
-        <w:rPr>
-          <w:rFonts w:ascii="Segoe UI" w:hAnsi="Segoe UI" w:cs="Segoe UI"/>
-          <w:color w:val="212121"/>
-          <w:sz w:val="23"/>
-          <w:szCs w:val="23"/>
-        </w:rPr>
-      </w:pPr>
-      <w:r>
-        <w:rPr>
-          <w:rFonts w:ascii="Calibri" w:hAnsi="Calibri" w:cs="Calibri"/>
-          <w:color w:val="4472C4"/>
-          <w:sz w:val="22"/>
-          <w:szCs w:val="22"/>
-        </w:rPr>
-        <w:t>Only if possible to have the Lalu or an alternative hotel close to the Sun Moon Lake (Lake view), based on his flights schedule, see below, he express the wish, to have an immediate transfer on his arrival (the 8</w:t>
-      </w:r>
-      <w:r>
-        <w:rPr>
-          <w:rFonts w:ascii="Calibri" w:hAnsi="Calibri" w:cs="Calibri"/>
-          <w:color w:val="4472C4"/>
-          <w:sz w:val="20"/>
-          <w:szCs w:val="20"/>
-          <w:vertAlign w:val="superscript"/>
-        </w:rPr>
-        <w:t>th</w:t>
-      </w:r>
-      <w:r>
-        <w:rPr>
-          <w:rStyle w:val="apple-converted-space"/>
-          <w:rFonts w:ascii="Calibri" w:hAnsi="Calibri" w:cs="Calibri"/>
-          <w:color w:val="4472C4"/>
-          <w:sz w:val="22"/>
-          <w:szCs w:val="22"/>
-        </w:rPr>
-        <w:t> </w:t>
-      </w:r>
-      <w:r>
-        <w:rPr>
-          <w:rFonts w:ascii="Calibri" w:hAnsi="Calibri" w:cs="Calibri"/>
-          <w:color w:val="4472C4"/>
-          <w:sz w:val="22"/>
-          <w:szCs w:val="22"/>
-        </w:rPr>
-        <w:t>of August) to the Sun Moon Lake Area, to make the most of it and spending 2 nights in there, for then coming back to Taipei and spending 2 nights in the city, too. If it can help or if not possible to arrange 2 nights, also 1 night in Sun Moon Lake will do and the remaining time he will spend in Taipei.</w:t>
-      </w:r>
-      <w:r>
-        <w:rPr>
-          <w:rStyle w:val="apple-converted-space"/>
-          <w:rFonts w:ascii="Calibri" w:hAnsi="Calibri" w:cs="Calibri"/>
-          <w:color w:val="4472C4"/>
-          <w:sz w:val="22"/>
-          <w:szCs w:val="22"/>
-        </w:rPr>
-        <w:t> </w:t>
-      </w:r>
-    </w:p>
-    <w:p>
-      <w:pPr>
-        <w:rPr>
-          <w:rFonts w:ascii="Segoe UI" w:hAnsi="Segoe UI" w:cs="Segoe UI"/>
-          <w:color w:val="212121"/>
-          <w:sz w:val="23"/>
-          <w:szCs w:val="23"/>
-        </w:rPr>
-      </w:pPr>
-      <w:r>
-        <w:rPr>
-          <w:rFonts w:ascii="Calibri" w:hAnsi="Calibri" w:cs="Calibri"/>
-          <w:color w:val="212121"/>
-          <w:sz w:val="22"/>
-          <w:szCs w:val="22"/>
-        </w:rPr>
-        <w:t> </w:t>
-      </w:r>
-    </w:p>
-    <w:p>
-      <w:pPr>
-        <w:shd w:val="clear" w:color="auto" w:fill="FFFFFF"/>
-        <w:rPr>
-          <w:rFonts w:ascii="Segoe UI" w:hAnsi="Segoe UI" w:cs="Segoe UI"/>
-          <w:color w:val="212121"/>
-          <w:sz w:val="23"/>
-          <w:szCs w:val="23"/>
-        </w:rPr>
-      </w:pPr>
-      <w:r>
-        <w:rPr>
-          <w:rFonts w:ascii="Courier New" w:hAnsi="Courier New" w:cs="Courier New"/>
-          <w:color w:val="000000"/>
-          <w:sz w:val="21"/>
-          <w:szCs w:val="21"/>
-          <w:shd w:val="clear" w:color="auto" w:fill="FFFFFF"/>
-        </w:rPr>
-        <w:t> </w:t>
-      </w:r>
-      <w:r>
-        <w:rPr>
-          <w:rStyle w:val="apple-converted-space"/>
-          <w:rFonts w:ascii="Courier New" w:hAnsi="Courier New" w:cs="Courier New"/>
-          <w:color w:val="000000"/>
-          <w:sz w:val="21"/>
-          <w:szCs w:val="21"/>
-          <w:shd w:val="clear" w:color="auto" w:fill="FFFFFF"/>
-        </w:rPr>
-        <w:t> </w:t>
-      </w:r>
-      <w:r>
-        <w:rPr>
-          <w:rFonts w:ascii="Courier New" w:hAnsi="Courier New" w:cs="Courier New"/>
-          <w:color w:val="FFFFFF"/>
-          <w:sz w:val="21"/>
-          <w:szCs w:val="21"/>
-          <w:shd w:val="clear" w:color="auto" w:fill="FF00FF"/>
-          <w:lang w:val="it-IT"/>
-        </w:rPr>
-        <w:t>1</w:t>
-      </w:r>
-      <w:r>
-        <w:rPr>
-          <w:rFonts w:ascii="Courier New" w:hAnsi="Courier New" w:cs="Courier New"/>
-          <w:color w:val="000000"/>
-          <w:sz w:val="21"/>
-          <w:szCs w:val="21"/>
-          <w:shd w:val="clear" w:color="auto" w:fill="FFFFFF"/>
-          <w:lang w:val="it-IT"/>
-        </w:rPr>
-        <w:t>.DELLAGHERARDESCAVERECONDISCORTECCI/COSTANTINO MR(ADT)</w:t>
-      </w:r>
-    </w:p>
-    <w:p>
-      <w:pPr>
-        <w:shd w:val="clear" w:color="auto" w:fill="FFFFFF"/>
-        <w:rPr>
-          <w:rFonts w:ascii="Segoe UI" w:hAnsi="Segoe UI" w:cs="Segoe UI"/>
-          <w:color w:val="212121"/>
-          <w:sz w:val="23"/>
-          <w:szCs w:val="23"/>
-        </w:rPr>
-      </w:pPr>
-      <w:r>
-        <w:rPr>
-          <w:rFonts w:ascii="Courier New" w:hAnsi="Courier New" w:cs="Courier New"/>
-          <w:color w:val="000000"/>
-          <w:sz w:val="21"/>
-          <w:szCs w:val="21"/>
-          <w:shd w:val="clear" w:color="auto" w:fill="FFFFFF"/>
-          <w:lang w:val="it-IT"/>
-        </w:rPr>
-        <w:t> </w:t>
-      </w:r>
-      <w:r>
-        <w:rPr>
-          <w:rStyle w:val="apple-converted-space"/>
-          <w:rFonts w:ascii="Courier New" w:hAnsi="Courier New" w:cs="Courier New"/>
-          <w:color w:val="000000"/>
-          <w:sz w:val="21"/>
-          <w:szCs w:val="21"/>
-          <w:shd w:val="clear" w:color="auto" w:fill="FFFFFF"/>
-          <w:lang w:val="it-IT"/>
-        </w:rPr>
-        <w:t> </w:t>
-      </w:r>
-      <w:r>
-        <w:rPr>
-          <w:rFonts w:ascii="Courier New" w:hAnsi="Courier New" w:cs="Courier New"/>
-          <w:color w:val="FF00FF"/>
-          <w:sz w:val="21"/>
-          <w:szCs w:val="21"/>
-          <w:shd w:val="clear" w:color="auto" w:fill="FFFFFF"/>
-          <w:lang w:val="it-IT"/>
-        </w:rPr>
-        <w:t>2</w:t>
-      </w:r>
-      <w:r>
-        <w:rPr>
-          <w:rFonts w:ascii="Courier New" w:hAnsi="Courier New" w:cs="Courier New"/>
-          <w:color w:val="000000"/>
-          <w:sz w:val="21"/>
-          <w:szCs w:val="21"/>
-          <w:shd w:val="clear" w:color="auto" w:fill="FFFFFF"/>
-          <w:lang w:val="it-IT"/>
-        </w:rPr>
-        <w:t>.MORO/ROSSANA ANTONIETTA MRS(ADT)</w:t>
-      </w:r>
-    </w:p>
-    <w:p>
-      <w:pPr>
-        <w:shd w:val="clear" w:color="auto" w:fill="FFFFFF"/>
-        <w:rPr>
-          <w:rFonts w:ascii="Segoe UI" w:hAnsi="Segoe UI" w:cs="Segoe UI"/>
-          <w:color w:val="212121"/>
-          <w:sz w:val="23"/>
-          <w:szCs w:val="23"/>
-        </w:rPr>
-      </w:pPr>
-      <w:r>
-        <w:rPr>
-          <w:rFonts w:ascii="Courier New" w:hAnsi="Courier New" w:cs="Courier New"/>
-          <w:color w:val="000000"/>
-          <w:sz w:val="21"/>
-          <w:szCs w:val="21"/>
-          <w:shd w:val="clear" w:color="auto" w:fill="FFFFFF"/>
-          <w:lang w:val="it-IT"/>
-        </w:rPr>
-        <w:t> </w:t>
-      </w:r>
-      <w:r>
-        <w:rPr>
-          <w:rStyle w:val="apple-converted-space"/>
-          <w:rFonts w:ascii="Courier New" w:hAnsi="Courier New" w:cs="Courier New"/>
-          <w:color w:val="000000"/>
-          <w:sz w:val="21"/>
-          <w:szCs w:val="21"/>
-          <w:shd w:val="clear" w:color="auto" w:fill="FFFFFF"/>
-          <w:lang w:val="it-IT"/>
-        </w:rPr>
-        <w:t> </w:t>
-      </w:r>
-      <w:r>
-        <w:rPr>
-          <w:rFonts w:ascii="Courier New" w:hAnsi="Courier New" w:cs="Courier New"/>
-          <w:color w:val="FF00FF"/>
-          <w:sz w:val="21"/>
-          <w:szCs w:val="21"/>
-          <w:shd w:val="clear" w:color="auto" w:fill="FFFFFF"/>
-          <w:lang w:val="it-IT"/>
-        </w:rPr>
-        <w:t>3</w:t>
-      </w:r>
-      <w:r>
-        <w:rPr>
-          <w:rFonts w:ascii="Courier New" w:hAnsi="Courier New" w:cs="Courier New"/>
-          <w:color w:val="000000"/>
-          <w:sz w:val="21"/>
-          <w:szCs w:val="21"/>
-          <w:shd w:val="clear" w:color="auto" w:fill="FFFFFF"/>
-          <w:lang w:val="it-IT"/>
-        </w:rPr>
-        <w:t>  BR</w:t>
-      </w:r>
-      <w:r>
-        <w:rPr>
-          <w:rStyle w:val="apple-converted-space"/>
-          <w:rFonts w:ascii="Courier New" w:hAnsi="Courier New" w:cs="Courier New"/>
-          <w:color w:val="000000"/>
-          <w:sz w:val="21"/>
-          <w:szCs w:val="21"/>
-          <w:shd w:val="clear" w:color="auto" w:fill="FFFFFF"/>
-          <w:lang w:val="it-IT"/>
-        </w:rPr>
-        <w:t> </w:t>
-      </w:r>
-      <w:r>
-        <w:rPr>
-          <w:rFonts w:ascii="Courier New" w:hAnsi="Courier New" w:cs="Courier New"/>
-          <w:color w:val="FF0000"/>
-          <w:sz w:val="21"/>
-          <w:szCs w:val="21"/>
-          <w:shd w:val="clear" w:color="auto" w:fill="FFFFFF"/>
-          <w:lang w:val="it-IT"/>
-        </w:rPr>
-        <w:t>096</w:t>
-      </w:r>
-      <w:r>
-        <w:rPr>
-          <w:rStyle w:val="apple-converted-space"/>
-          <w:rFonts w:ascii="Courier New" w:hAnsi="Courier New" w:cs="Courier New"/>
-          <w:color w:val="000000"/>
-          <w:sz w:val="21"/>
-          <w:szCs w:val="21"/>
-          <w:shd w:val="clear" w:color="auto" w:fill="FFFFFF"/>
-          <w:lang w:val="it-IT"/>
-        </w:rPr>
-        <w:t> </w:t>
-      </w:r>
-      <w:r>
-        <w:rPr>
-          <w:rFonts w:ascii="Courier New" w:hAnsi="Courier New" w:cs="Courier New"/>
-          <w:color w:val="0000FF"/>
-          <w:sz w:val="21"/>
-          <w:szCs w:val="21"/>
-          <w:shd w:val="clear" w:color="auto" w:fill="FFFFFF"/>
-          <w:lang w:val="it-IT"/>
-        </w:rPr>
-        <w:t>R</w:t>
-      </w:r>
-      <w:r>
-        <w:rPr>
-          <w:rStyle w:val="apple-converted-space"/>
-          <w:rFonts w:ascii="Courier New" w:hAnsi="Courier New" w:cs="Courier New"/>
-          <w:color w:val="000000"/>
-          <w:sz w:val="21"/>
-          <w:szCs w:val="21"/>
-          <w:shd w:val="clear" w:color="auto" w:fill="FFFFFF"/>
-          <w:lang w:val="it-IT"/>
-        </w:rPr>
-        <w:t> </w:t>
-      </w:r>
-      <w:r>
-        <w:rPr>
-          <w:rFonts w:ascii="Courier New" w:hAnsi="Courier New" w:cs="Courier New"/>
-          <w:color w:val="000000"/>
-          <w:sz w:val="21"/>
-          <w:szCs w:val="21"/>
-          <w:shd w:val="clear" w:color="auto" w:fill="FFFFFF"/>
-          <w:lang w:val="it-IT"/>
-        </w:rPr>
-        <w:t>07AUG 3 MXPTPE HK2       1  1115 0625+1 *1A/E*</w:t>
-      </w:r>
-    </w:p>
-    <w:p>
-      <w:pPr>
-        <w:shd w:val="clear" w:color="auto" w:fill="FFFFFF"/>
-        <w:rPr>
-          <w:rFonts w:ascii="Segoe UI" w:hAnsi="Segoe UI" w:cs="Segoe UI"/>
-          <w:color w:val="212121"/>
-          <w:sz w:val="23"/>
-          <w:szCs w:val="23"/>
-        </w:rPr>
-      </w:pPr>
-      <w:r>
-        <w:rPr>
-          <w:rFonts w:ascii="Courier New" w:hAnsi="Courier New" w:cs="Courier New"/>
-          <w:color w:val="000000"/>
-          <w:sz w:val="21"/>
-          <w:szCs w:val="21"/>
-          <w:shd w:val="clear" w:color="auto" w:fill="FFFFFF"/>
-          <w:lang w:val="it-IT"/>
-        </w:rPr>
-        <w:t> </w:t>
-      </w:r>
-      <w:r>
-        <w:rPr>
-          <w:rStyle w:val="apple-converted-space"/>
-          <w:rFonts w:ascii="Courier New" w:hAnsi="Courier New" w:cs="Courier New"/>
-          <w:color w:val="000000"/>
-          <w:sz w:val="21"/>
-          <w:szCs w:val="21"/>
-          <w:shd w:val="clear" w:color="auto" w:fill="FFFFFF"/>
-          <w:lang w:val="it-IT"/>
-        </w:rPr>
-        <w:t> </w:t>
-      </w:r>
-      <w:r>
-        <w:rPr>
-          <w:rFonts w:ascii="Courier New" w:hAnsi="Courier New" w:cs="Courier New"/>
-          <w:color w:val="FF00FF"/>
-          <w:sz w:val="21"/>
-          <w:szCs w:val="21"/>
-          <w:shd w:val="clear" w:color="auto" w:fill="FFFFFF"/>
-          <w:lang w:val="it-IT"/>
-        </w:rPr>
-        <w:t>4</w:t>
-      </w:r>
-      <w:r>
-        <w:rPr>
-          <w:rFonts w:ascii="Courier New" w:hAnsi="Courier New" w:cs="Courier New"/>
-          <w:color w:val="000000"/>
-          <w:sz w:val="21"/>
-          <w:szCs w:val="21"/>
-          <w:shd w:val="clear" w:color="auto" w:fill="FFFFFF"/>
-          <w:lang w:val="it-IT"/>
-        </w:rPr>
-        <w:t>  BR</w:t>
-      </w:r>
-      <w:r>
-        <w:rPr>
-          <w:rStyle w:val="apple-converted-space"/>
-          <w:rFonts w:ascii="Courier New" w:hAnsi="Courier New" w:cs="Courier New"/>
-          <w:color w:val="000000"/>
-          <w:sz w:val="21"/>
-          <w:szCs w:val="21"/>
-          <w:shd w:val="clear" w:color="auto" w:fill="FFFFFF"/>
-          <w:lang w:val="it-IT"/>
-        </w:rPr>
-        <w:t> </w:t>
-      </w:r>
-      <w:r>
-        <w:rPr>
-          <w:rFonts w:ascii="Courier New" w:hAnsi="Courier New" w:cs="Courier New"/>
-          <w:color w:val="FF0000"/>
-          <w:sz w:val="21"/>
-          <w:szCs w:val="21"/>
-          <w:shd w:val="clear" w:color="auto" w:fill="FFFFFF"/>
-          <w:lang w:val="it-IT"/>
-        </w:rPr>
-        <w:t>257</w:t>
-      </w:r>
-      <w:r>
-        <w:rPr>
-          <w:rStyle w:val="apple-converted-space"/>
-          <w:rFonts w:ascii="Courier New" w:hAnsi="Courier New" w:cs="Courier New"/>
-          <w:color w:val="000000"/>
-          <w:sz w:val="21"/>
-          <w:szCs w:val="21"/>
-          <w:shd w:val="clear" w:color="auto" w:fill="FFFFFF"/>
-          <w:lang w:val="it-IT"/>
-        </w:rPr>
-        <w:t> </w:t>
-      </w:r>
-      <w:r>
-        <w:rPr>
-          <w:rFonts w:ascii="Courier New" w:hAnsi="Courier New" w:cs="Courier New"/>
-          <w:color w:val="0000FF"/>
-          <w:sz w:val="21"/>
-          <w:szCs w:val="21"/>
-          <w:shd w:val="clear" w:color="auto" w:fill="FFFFFF"/>
-          <w:lang w:val="it-IT"/>
-        </w:rPr>
-        <w:t>R</w:t>
-      </w:r>
-      <w:r>
-        <w:rPr>
-          <w:rStyle w:val="apple-converted-space"/>
-          <w:rFonts w:ascii="Courier New" w:hAnsi="Courier New" w:cs="Courier New"/>
-          <w:color w:val="000000"/>
-          <w:sz w:val="21"/>
-          <w:szCs w:val="21"/>
-          <w:shd w:val="clear" w:color="auto" w:fill="FFFFFF"/>
-          <w:lang w:val="it-IT"/>
-        </w:rPr>
-        <w:t> </w:t>
-      </w:r>
-      <w:r>
-        <w:rPr>
-          <w:rFonts w:ascii="Courier New" w:hAnsi="Courier New" w:cs="Courier New"/>
-          <w:color w:val="000000"/>
-          <w:sz w:val="21"/>
-          <w:szCs w:val="21"/>
-          <w:shd w:val="clear" w:color="auto" w:fill="FFFFFF"/>
-          <w:lang w:val="it-IT"/>
-        </w:rPr>
-        <w:t>12AUG 1 TPECNX HK2       2  0725 1025   *1A/E*</w:t>
-      </w:r>
-    </w:p>
-    <w:p>
-      <w:pPr>
-        <w:shd w:val="clear" w:color="auto" w:fill="FFFFFF"/>
-        <w:rPr>
-          <w:rFonts w:ascii="Segoe UI" w:hAnsi="Segoe UI" w:cs="Segoe UI"/>
-          <w:color w:val="212121"/>
-          <w:sz w:val="23"/>
-          <w:szCs w:val="23"/>
-        </w:rPr>
-      </w:pPr>
-      <w:r>
-        <w:rPr>
-          <w:rFonts w:ascii="Courier New" w:hAnsi="Courier New" w:cs="Courier New"/>
-          <w:color w:val="000000"/>
-          <w:sz w:val="21"/>
-          <w:szCs w:val="21"/>
-          <w:shd w:val="clear" w:color="auto" w:fill="FFFFFF"/>
-          <w:lang w:val="it-IT"/>
-        </w:rPr>
-        <w:t> </w:t>
-      </w:r>
-      <w:r>
-        <w:rPr>
-          <w:rStyle w:val="apple-converted-space"/>
-          <w:rFonts w:ascii="Courier New" w:hAnsi="Courier New" w:cs="Courier New"/>
-          <w:color w:val="000000"/>
-          <w:sz w:val="21"/>
-          <w:szCs w:val="21"/>
-          <w:shd w:val="clear" w:color="auto" w:fill="FFFFFF"/>
-          <w:lang w:val="it-IT"/>
-        </w:rPr>
-        <w:t> </w:t>
-      </w:r>
-    </w:p>
-    <w:p>
-      <w:pPr>
-        <w:rPr>
-          <w:rFonts w:ascii="Segoe UI" w:hAnsi="Segoe UI" w:cs="Segoe UI"/>
-          <w:color w:val="212121"/>
-          <w:sz w:val="23"/>
-          <w:szCs w:val="23"/>
-        </w:rPr>
-      </w:pPr>
-      <w:r>
-        <w:rPr>
-          <w:rFonts w:ascii="Calibri" w:hAnsi="Calibri" w:cs="Calibri"/>
-          <w:color w:val="000000"/>
-        </w:rPr>
-        <w:t> </w:t>
-      </w:r>
-    </w:p>
-    <w:p>
-      <w:pPr>
-        <w:ind w:left="360" w:hanging="360"/>
-        <w:rPr>
-          <w:rFonts w:ascii="Calibri" w:hAnsi="Calibri" w:cs="Calibri"/>
-          <w:color w:val="000000"/>
-        </w:rPr>
-      </w:pPr>
-      <w:r>
-        <w:rPr>
-          <w:rFonts w:ascii="Symbol" w:hAnsi="Symbol"/>
-          <w:color w:val="000000"/>
-        </w:rPr>
-        <w:t>·</w:t>
-      </w:r>
-      <w:r>
-        <w:rPr>
-          <w:rFonts w:ascii="Calibri" w:hAnsi="Calibri" w:cs="Calibri"/>
-          <w:color w:val="000000"/>
-        </w:rPr>
-        <w:t xml:space="preserve">In order to create more contents, we'd rather arrange some tours at this area. Would he </w:t>
-      </w:r>
-    </w:p>
-    <w:p>
-      <w:pPr>
-        <w:ind w:left="360" w:hanging="360"/>
-        <w:rPr>
-          <w:rFonts w:ascii="Calibri" w:hAnsi="Calibri" w:cs="Calibri"/>
-          <w:color w:val="4472C4"/>
-          <w:sz w:val="22"/>
-          <w:szCs w:val="22"/>
-        </w:rPr>
-      </w:pPr>
-      <w:r>
-        <w:rPr>
-          <w:rFonts w:ascii="Calibri" w:hAnsi="Calibri" w:cs="Calibri"/>
-          <w:color w:val="000000"/>
-        </w:rPr>
-        <w:t>agree to promote the Sun Moon Lake area via his social media channel?</w:t>
-      </w:r>
-      <w:r>
-        <w:rPr>
-          <w:rStyle w:val="apple-converted-space"/>
-          <w:rFonts w:ascii="Calibri" w:hAnsi="Calibri" w:cs="Calibri"/>
-          <w:color w:val="000000"/>
-        </w:rPr>
-        <w:t> </w:t>
-      </w:r>
-      <w:r>
-        <w:rPr>
-          <w:rFonts w:ascii="Calibri" w:hAnsi="Calibri" w:cs="Calibri"/>
-          <w:color w:val="4472C4"/>
-          <w:sz w:val="22"/>
-          <w:szCs w:val="22"/>
-        </w:rPr>
-        <w:t xml:space="preserve">Yes, sure via his </w:t>
-      </w:r>
-    </w:p>
-    <w:p>
-      <w:pPr>
-        <w:ind w:left="360" w:hanging="360"/>
-        <w:rPr>
-          <w:rFonts w:ascii="Segoe UI" w:hAnsi="Segoe UI" w:cs="Segoe UI"/>
-          <w:color w:val="212121"/>
-          <w:sz w:val="23"/>
-          <w:szCs w:val="23"/>
-        </w:rPr>
-      </w:pPr>
-      <w:r>
-        <w:rPr>
-          <w:rFonts w:ascii="Calibri" w:hAnsi="Calibri" w:cs="Calibri"/>
-          <w:color w:val="4472C4"/>
-          <w:sz w:val="22"/>
-          <w:szCs w:val="22"/>
-        </w:rPr>
-        <w:t>IG/FB channels as per above.</w:t>
-      </w:r>
-    </w:p>
-    <w:p>
-      <w:pPr>
-        <w:rPr>
-          <w:rFonts w:ascii="Segoe UI" w:hAnsi="Segoe UI" w:cs="Segoe UI"/>
-          <w:color w:val="212121"/>
-          <w:sz w:val="23"/>
-          <w:szCs w:val="23"/>
-        </w:rPr>
-      </w:pPr>
-      <w:r>
-        <w:rPr>
-          <w:rFonts w:ascii="Calibri" w:hAnsi="Calibri" w:cs="Calibri"/>
-          <w:color w:val="000000"/>
-        </w:rPr>
-        <w:t> </w:t>
-      </w:r>
-    </w:p>
-    <w:p>
-      <w:pPr>
-        <w:ind w:left="360" w:hanging="360"/>
-        <w:rPr>
-          <w:rFonts w:ascii="Calibri" w:hAnsi="Calibri" w:cs="Calibri"/>
-          <w:color w:val="4472C4"/>
-          <w:sz w:val="22"/>
-          <w:szCs w:val="22"/>
-        </w:rPr>
-      </w:pPr>
-      <w:r>
-        <w:rPr>
-          <w:rFonts w:ascii="Symbol" w:hAnsi="Symbol"/>
-          <w:color w:val="000000"/>
-        </w:rPr>
-        <w:t>·</w:t>
-      </w:r>
-      <w:r>
-        <w:rPr>
-          <w:rFonts w:ascii="Calibri" w:hAnsi="Calibri" w:cs="Calibri"/>
-          <w:color w:val="000000"/>
-        </w:rPr>
-        <w:t>Please note that we need to submit application by Monday next week (8th of July).</w:t>
-      </w:r>
-      <w:r>
-        <w:rPr>
-          <w:rStyle w:val="apple-converted-space"/>
-          <w:rFonts w:ascii="Calibri" w:hAnsi="Calibri" w:cs="Calibri"/>
-          <w:color w:val="000000"/>
-        </w:rPr>
-        <w:t> </w:t>
-      </w:r>
-      <w:r>
-        <w:rPr>
-          <w:rFonts w:ascii="Calibri" w:hAnsi="Calibri" w:cs="Calibri"/>
-          <w:color w:val="4472C4"/>
-          <w:sz w:val="22"/>
-          <w:szCs w:val="22"/>
-        </w:rPr>
-        <w:t xml:space="preserve">In </w:t>
-      </w:r>
-    </w:p>
-    <w:p>
-      <w:pPr>
-        <w:ind w:left="360" w:hanging="360"/>
-        <w:rPr>
-          <w:rFonts w:ascii="Calibri" w:hAnsi="Calibri" w:cs="Calibri"/>
-          <w:color w:val="4472C4"/>
-          <w:sz w:val="22"/>
-          <w:szCs w:val="22"/>
-        </w:rPr>
-      </w:pPr>
-      <w:r>
-        <w:rPr>
-          <w:rFonts w:ascii="Calibri" w:hAnsi="Calibri" w:cs="Calibri"/>
-          <w:color w:val="4472C4"/>
-          <w:sz w:val="22"/>
-          <w:szCs w:val="22"/>
-        </w:rPr>
-        <w:t xml:space="preserve">case on Monday morning, you need any further details or clarification, feel free to write me or call </w:t>
-      </w:r>
-    </w:p>
-    <w:p>
-      <w:pPr>
-        <w:ind w:left="360" w:hanging="360"/>
-        <w:rPr>
-          <w:rFonts w:ascii="Segoe UI" w:hAnsi="Segoe UI" w:cs="Segoe UI"/>
-          <w:color w:val="212121"/>
-          <w:sz w:val="23"/>
-          <w:szCs w:val="23"/>
-        </w:rPr>
-      </w:pPr>
-      <w:r>
-        <w:rPr>
-          <w:rFonts w:ascii="Calibri" w:hAnsi="Calibri" w:cs="Calibri"/>
-          <w:color w:val="4472C4"/>
-          <w:sz w:val="22"/>
-          <w:szCs w:val="22"/>
-        </w:rPr>
-        <w:t>me,  I am here to support.</w:t>
-      </w:r>
-    </w:p>
-    <w:p>
-      <w:pPr>
-        <w:rPr>
-          <w:rFonts w:ascii="Segoe UI" w:hAnsi="Segoe UI" w:cs="Segoe UI"/>
-          <w:color w:val="212121"/>
-          <w:sz w:val="23"/>
-          <w:szCs w:val="23"/>
-        </w:rPr>
-      </w:pPr>
-      <w:r>
-        <w:rPr>
-          <w:rFonts w:ascii="Calibri" w:hAnsi="Calibri" w:cs="Calibri"/>
-          <w:color w:val="212121"/>
-          <w:sz w:val="22"/>
-          <w:szCs w:val="22"/>
-        </w:rPr>
-        <w:t> </w:t>
-      </w:r>
-    </w:p>
-    <w:p>
-      <w:pPr>
-        <w:rPr>
-          <w:rFonts w:ascii="Segoe UI" w:hAnsi="Segoe UI" w:cs="Segoe UI"/>
-          <w:color w:val="212121"/>
-          <w:sz w:val="23"/>
-          <w:szCs w:val="23"/>
-        </w:rPr>
-      </w:pPr>
-      <w:r>
-        <w:rPr>
-          <w:rFonts w:ascii="Calibri" w:hAnsi="Calibri" w:cs="Calibri"/>
-          <w:color w:val="212121"/>
-          <w:sz w:val="22"/>
-          <w:szCs w:val="22"/>
-        </w:rPr>
-        <w:t>Have a great week-end from Milan,</w:t>
-      </w:r>
-      <w:r>
-        <w:rPr>
-          <w:rStyle w:val="apple-converted-space"/>
-          <w:rFonts w:ascii="Calibri" w:hAnsi="Calibri" w:cs="Calibri"/>
-          <w:color w:val="212121"/>
-          <w:sz w:val="22"/>
-          <w:szCs w:val="22"/>
-        </w:rPr>
-        <w:t> </w:t>
-      </w:r>
-    </w:p>
-    <w:p>
-      <w:pPr>
-        <w:rPr>
-          <w:rFonts w:ascii="Segoe UI" w:hAnsi="Segoe UI" w:cs="Segoe UI"/>
-          <w:color w:val="212121"/>
-          <w:sz w:val="23"/>
-          <w:szCs w:val="23"/>
-        </w:rPr>
-      </w:pPr>
-      <w:r>
-        <w:rPr>
-          <w:rFonts w:ascii="Calibri" w:hAnsi="Calibri" w:cs="Calibri"/>
-          <w:color w:val="212121"/>
-          <w:sz w:val="22"/>
-          <w:szCs w:val="22"/>
-        </w:rPr>
-        <w:t> </w:t>
-      </w:r>
-    </w:p>
-    <w:p>
-      <w:pPr>
-        <w:rPr>
-          <w:rFonts w:ascii="Segoe UI" w:hAnsi="Segoe UI" w:cs="Segoe UI"/>
-          <w:color w:val="212121"/>
-          <w:sz w:val="23"/>
-          <w:szCs w:val="23"/>
-        </w:rPr>
-      </w:pPr>
-      <w:r>
-        <w:rPr>
-          <w:rFonts w:ascii="Calibri" w:hAnsi="Calibri" w:cs="Calibri"/>
-          <w:b/>
-          <w:bCs/>
-          <w:color w:val="000000"/>
-          <w:sz w:val="22"/>
-          <w:szCs w:val="22"/>
-          <w:lang w:val="en-US"/>
-        </w:rPr>
-        <w:t> </w:t>
-      </w:r>
-    </w:p>
-    <w:p>
-      <w:pPr>
-        <w:rPr>
-          <w:rFonts w:ascii="Segoe UI" w:hAnsi="Segoe UI" w:cs="Segoe UI"/>
-          <w:color w:val="212121"/>
-          <w:sz w:val="23"/>
-          <w:szCs w:val="23"/>
-        </w:rPr>
-      </w:pPr>
-      <w:r>
-        <w:rPr>
-          <w:rFonts w:ascii="Calibri" w:hAnsi="Calibri" w:cs="Calibri"/>
-          <w:b/>
-          <w:bCs/>
-          <w:color w:val="000000"/>
-          <w:sz w:val="22"/>
-          <w:szCs w:val="22"/>
-          <w:lang w:val="en-US"/>
-        </w:rPr>
-        <w:t>Gaia Cilento</w:t>
-      </w:r>
-      <w:r>
-        <w:rPr>
-          <w:rStyle w:val="apple-converted-space"/>
-          <w:rFonts w:ascii="Calibri" w:hAnsi="Calibri" w:cs="Calibri"/>
-          <w:b/>
-          <w:bCs/>
-          <w:color w:val="000000"/>
-          <w:sz w:val="22"/>
-          <w:szCs w:val="22"/>
-          <w:lang w:val="en-US"/>
-        </w:rPr>
-        <w:t> </w:t>
-      </w:r>
-    </w:p>
-    <w:p>
-      <w:pPr>
-        <w:rPr>
-          <w:rFonts w:ascii="Segoe UI" w:hAnsi="Segoe UI" w:cs="Segoe UI"/>
-          <w:color w:val="212121"/>
-          <w:sz w:val="23"/>
-          <w:szCs w:val="23"/>
-        </w:rPr>
-      </w:pPr>
-      <w:r>
-        <w:rPr>
-          <w:rFonts w:ascii="Calibri" w:hAnsi="Calibri" w:cs="Calibri"/>
-          <w:color w:val="000000"/>
-          <w:sz w:val="22"/>
-          <w:szCs w:val="22"/>
-          <w:lang w:val="en-US"/>
-        </w:rPr>
-        <w:t>Passenger Marketing Coordinator</w:t>
-      </w:r>
-      <w:r>
-        <w:rPr>
-          <w:rStyle w:val="apple-converted-space"/>
-          <w:rFonts w:ascii="Calibri" w:hAnsi="Calibri" w:cs="Calibri"/>
-          <w:color w:val="000000"/>
-          <w:sz w:val="22"/>
-          <w:szCs w:val="22"/>
-          <w:lang w:val="en-US"/>
-        </w:rPr>
-        <w:t> </w:t>
-      </w:r>
-    </w:p>
-    <w:p>
-      <w:pPr>
-        <w:rPr>
-          <w:rFonts w:ascii="Segoe UI" w:hAnsi="Segoe UI" w:cs="Segoe UI"/>
-          <w:color w:val="212121"/>
-          <w:sz w:val="23"/>
-          <w:szCs w:val="23"/>
-        </w:rPr>
-      </w:pPr>
-      <w:r>
-        <w:rPr>
-          <w:rFonts w:ascii="Calibri" w:hAnsi="Calibri" w:cs="Calibri"/>
-          <w:color w:val="000000"/>
-          <w:sz w:val="22"/>
-          <w:szCs w:val="22"/>
-          <w:lang w:val="en-US"/>
-        </w:rPr>
-        <w:t>EVA AIRWAYS ITALY</w:t>
-      </w:r>
-    </w:p>
-    <w:p>
-      <w:pPr>
-        <w:rPr>
-          <w:rFonts w:ascii="Segoe UI" w:hAnsi="Segoe UI" w:cs="Segoe UI"/>
-          <w:color w:val="212121"/>
-          <w:sz w:val="23"/>
-          <w:szCs w:val="23"/>
-        </w:rPr>
-      </w:pPr>
-      <w:r>
-        <w:rPr>
-          <w:rFonts w:ascii="Calibri" w:hAnsi="Calibri" w:cs="Calibri"/>
-          <w:color w:val="000000"/>
-          <w:sz w:val="22"/>
-          <w:szCs w:val="22"/>
-          <w:lang w:val="en-US"/>
-        </w:rPr>
-        <w:t>+39 02 78 602 422</w:t>
-      </w:r>
-    </w:p>
-    <w:p>
-      <w:pPr>
-        <w:rPr>
-          <w:rFonts w:ascii="Segoe UI" w:hAnsi="Segoe UI" w:cs="Segoe UI"/>
-          <w:color w:val="212121"/>
-          <w:sz w:val="23"/>
-          <w:szCs w:val="23"/>
-        </w:rPr>
-      </w:pPr>
-      <w:r>
-        <w:rPr>
-          <w:rFonts w:ascii="Calibri" w:hAnsi="Calibri" w:cs="Calibri"/>
-          <w:color w:val="000000"/>
-          <w:sz w:val="22"/>
-          <w:szCs w:val="22"/>
-          <w:lang w:val="en-US"/>
-        </w:rPr>
-        <w:t> </w:t>
-      </w:r>
-    </w:p>
+    <w:tbl>
+      <w:tblPr>
+        <w:tblW w:w="9606" w:type="dxa"/>
+        <w:tblBorders>
+          <w:top w:val="single" w:sz="4" w:space="0" w:color="auto"/>
+          <w:left w:val="single" w:sz="4" w:space="0" w:color="auto"/>
+          <w:bottom w:val="single" w:sz="4" w:space="0" w:color="auto"/>
+          <w:right w:val="single" w:sz="4" w:space="0" w:color="auto"/>
+          <w:insideH w:val="single" w:sz="4" w:space="0" w:color="auto"/>
+          <w:insideV w:val="single" w:sz="4" w:space="0" w:color="auto"/>
+        </w:tblBorders>
+        <w:tblLayout w:type="fixed"/>
+        <w:tblLook w:val="01E0" w:firstRow="1" w:lastRow="1" w:firstColumn="1" w:lastColumn="1" w:noHBand="0" w:noVBand="0"/>
+      </w:tblPr>
+      <w:tblGrid>
+        <w:gridCol w:w="1188"/>
+        <w:gridCol w:w="2748"/>
+        <w:gridCol w:w="1417"/>
+        <w:gridCol w:w="992"/>
+        <w:gridCol w:w="1418"/>
+        <w:gridCol w:w="1843"/>
+      </w:tblGrid>
+      <w:tr>
+        <w:tc>
+          <w:tcPr>
+            <w:tcW w:w="1188" w:type="dxa"/>
+            <w:vAlign w:val="center"/>
+          </w:tcPr>
+          <w:p>
+            <w:pPr>
+              <w:jc w:val="center"/>
+              <w:rPr>
+                <w:rFonts w:ascii="KaiTi" w:eastAsia="KaiTi" w:hAnsi="KaiTi"/>
+                <w:b/>
+              </w:rPr>
+            </w:pPr>
+            <w:r>
+              <w:rPr>
+                <w:rFonts w:ascii="KaiTi" w:eastAsia="KaiTi" w:hAnsi="KaiTi"/>
+                <w:b/>
+              </w:rPr>
+              <w:t>項目</w:t>
+            </w:r>
+          </w:p>
+        </w:tc>
+        <w:tc>
+          <w:tcPr>
+            <w:tcW w:w="2748" w:type="dxa"/>
+            <w:vAlign w:val="center"/>
+          </w:tcPr>
+          <w:p>
+            <w:pPr>
+              <w:jc w:val="center"/>
+              <w:rPr>
+                <w:rFonts w:ascii="KaiTi" w:eastAsia="KaiTi" w:hAnsi="KaiTi"/>
+                <w:b/>
+              </w:rPr>
+            </w:pPr>
+            <w:r>
+              <w:rPr>
+                <w:rFonts w:ascii="KaiTi" w:eastAsia="KaiTi" w:hAnsi="KaiTi"/>
+                <w:b/>
+              </w:rPr>
+              <w:t>內容</w:t>
+            </w:r>
+          </w:p>
+        </w:tc>
+        <w:tc>
+          <w:tcPr>
+            <w:tcW w:w="1417" w:type="dxa"/>
+            <w:vAlign w:val="center"/>
+          </w:tcPr>
+          <w:p>
+            <w:pPr>
+              <w:jc w:val="center"/>
+              <w:rPr>
+                <w:rFonts w:ascii="KaiTi" w:eastAsia="KaiTi" w:hAnsi="KaiTi"/>
+                <w:b/>
+              </w:rPr>
+            </w:pPr>
+            <w:r>
+              <w:rPr>
+                <w:rFonts w:ascii="KaiTi" w:eastAsia="KaiTi" w:hAnsi="KaiTi"/>
+                <w:b/>
+              </w:rPr>
+              <w:t>單價</w:t>
+            </w:r>
+          </w:p>
+        </w:tc>
+        <w:tc>
+          <w:tcPr>
+            <w:tcW w:w="992" w:type="dxa"/>
+            <w:vAlign w:val="center"/>
+          </w:tcPr>
+          <w:p>
+            <w:pPr>
+              <w:jc w:val="center"/>
+              <w:rPr>
+                <w:rFonts w:ascii="KaiTi" w:eastAsia="KaiTi" w:hAnsi="KaiTi"/>
+                <w:b/>
+              </w:rPr>
+            </w:pPr>
+            <w:r>
+              <w:rPr>
+                <w:rFonts w:ascii="KaiTi" w:eastAsia="KaiTi" w:hAnsi="KaiTi"/>
+                <w:b/>
+              </w:rPr>
+              <w:t>數量</w:t>
+            </w:r>
+          </w:p>
+        </w:tc>
+        <w:tc>
+          <w:tcPr>
+            <w:tcW w:w="1418" w:type="dxa"/>
+            <w:vAlign w:val="center"/>
+          </w:tcPr>
+          <w:p>
+            <w:pPr>
+              <w:jc w:val="center"/>
+              <w:rPr>
+                <w:rFonts w:ascii="KaiTi" w:eastAsia="KaiTi" w:hAnsi="KaiTi"/>
+                <w:b/>
+              </w:rPr>
+            </w:pPr>
+            <w:r>
+              <w:rPr>
+                <w:rFonts w:ascii="KaiTi" w:eastAsia="KaiTi" w:hAnsi="KaiTi"/>
+                <w:b/>
+              </w:rPr>
+              <w:t>總價</w:t>
+            </w:r>
+          </w:p>
+        </w:tc>
+        <w:tc>
+          <w:tcPr>
+            <w:tcW w:w="1843" w:type="dxa"/>
+            <w:vAlign w:val="center"/>
+          </w:tcPr>
+          <w:p>
+            <w:pPr>
+              <w:jc w:val="center"/>
+              <w:rPr>
+                <w:rFonts w:ascii="KaiTi" w:eastAsia="KaiTi" w:hAnsi="KaiTi"/>
+                <w:b/>
+              </w:rPr>
+            </w:pPr>
+            <w:r>
+              <w:rPr>
+                <w:rFonts w:ascii="KaiTi" w:eastAsia="KaiTi" w:hAnsi="KaiTi"/>
+                <w:b/>
+              </w:rPr>
+              <w:t>備註</w:t>
+            </w:r>
+          </w:p>
+        </w:tc>
+      </w:tr>
+      <w:tr>
+        <w:tc>
+          <w:tcPr>
+            <w:tcW w:w="1188" w:type="dxa"/>
+            <w:vAlign w:val="center"/>
+          </w:tcPr>
+          <w:p>
+            <w:pPr>
+              <w:jc w:val="center"/>
+              <w:rPr>
+                <w:rFonts w:ascii="KaiTi" w:eastAsia="KaiTi" w:hAnsi="KaiTi"/>
+                <w:bCs/>
+              </w:rPr>
+            </w:pPr>
+            <w:r>
+              <w:rPr>
+                <w:rFonts w:ascii="KaiTi" w:eastAsia="KaiTi" w:hAnsi="KaiTi"/>
+                <w:bCs/>
+              </w:rPr>
+              <w:t>1</w:t>
+            </w:r>
+          </w:p>
+        </w:tc>
+        <w:tc>
+          <w:tcPr>
+            <w:tcW w:w="2748" w:type="dxa"/>
+            <w:vAlign w:val="center"/>
+          </w:tcPr>
+          <w:p>
+            <w:pPr>
+              <w:rPr>
+                <w:rFonts w:ascii="KaiTi" w:eastAsia="KaiTi" w:hAnsi="KaiTi"/>
+                <w:bCs/>
+              </w:rPr>
+            </w:pPr>
+            <w:r>
+              <w:rPr>
+                <w:rFonts w:ascii="KaiTi" w:eastAsia="KaiTi" w:hAnsi="KaiTi" w:hint="eastAsia"/>
+                <w:bCs/>
+              </w:rPr>
+              <w:t>巴黎</w:t>
+            </w:r>
+            <w:r>
+              <w:rPr>
+                <w:rFonts w:ascii="KaiTi" w:eastAsia="KaiTi" w:hAnsi="KaiTi" w:hint="eastAsia"/>
+                <w:bCs/>
+              </w:rPr>
+              <w:t>至</w:t>
+            </w:r>
+            <w:r>
+              <w:rPr>
+                <w:rFonts w:ascii="KaiTi" w:eastAsia="KaiTi" w:hAnsi="KaiTi" w:hint="eastAsia"/>
+                <w:bCs/>
+              </w:rPr>
+              <w:t>台北</w:t>
+            </w:r>
+            <w:r>
+              <w:rPr>
+                <w:rFonts w:ascii="KaiTi" w:eastAsia="KaiTi" w:hAnsi="KaiTi"/>
+                <w:bCs/>
+              </w:rPr>
+              <w:t>經濟艙來回</w:t>
+            </w:r>
+            <w:r>
+              <w:rPr>
+                <w:rFonts w:ascii="KaiTi" w:eastAsia="KaiTi" w:hAnsi="KaiTi" w:hint="eastAsia"/>
+                <w:bCs/>
+              </w:rPr>
+              <w:t>機票款</w:t>
+            </w:r>
+          </w:p>
+        </w:tc>
+        <w:tc>
+          <w:tcPr>
+            <w:tcW w:w="1417" w:type="dxa"/>
+            <w:vAlign w:val="center"/>
+          </w:tcPr>
+          <w:p>
+            <w:pPr>
+              <w:jc w:val="right"/>
+              <w:rPr>
+                <w:rFonts w:ascii="KaiTi" w:eastAsia="PMingLiU" w:hAnsi="KaiTi" w:hint="eastAsia"/>
+                <w:bCs/>
+              </w:rPr>
+            </w:pPr>
+            <w:r>
+              <w:rPr>
+                <w:rFonts w:ascii="KaiTi" w:eastAsia="PMingLiU" w:hAnsi="KaiTi" w:hint="eastAsia"/>
+                <w:bCs/>
+              </w:rPr>
+              <w:t>1,000</w:t>
+            </w:r>
+          </w:p>
+        </w:tc>
+        <w:tc>
+          <w:tcPr>
+            <w:tcW w:w="992" w:type="dxa"/>
+            <w:vAlign w:val="center"/>
+          </w:tcPr>
+          <w:p>
+            <w:pPr>
+              <w:jc w:val="center"/>
+              <w:rPr>
+                <w:rFonts w:ascii="KaiTi" w:eastAsia="PMingLiU" w:hAnsi="KaiTi" w:hint="eastAsia"/>
+                <w:bCs/>
+              </w:rPr>
+            </w:pPr>
+            <w:r>
+              <w:rPr>
+                <w:rFonts w:ascii="KaiTi" w:eastAsia="PMingLiU" w:hAnsi="KaiTi" w:hint="eastAsia"/>
+                <w:bCs/>
+              </w:rPr>
+              <w:t>6</w:t>
+            </w:r>
+          </w:p>
+        </w:tc>
+        <w:tc>
+          <w:tcPr>
+            <w:tcW w:w="1418" w:type="dxa"/>
+            <w:vAlign w:val="center"/>
+          </w:tcPr>
+          <w:p>
+            <w:pPr>
+              <w:jc w:val="right"/>
+              <w:rPr>
+                <w:rFonts w:ascii="KaiTi" w:eastAsia="PMingLiU" w:hAnsi="KaiTi" w:hint="eastAsia"/>
+                <w:bCs/>
+              </w:rPr>
+            </w:pPr>
+            <w:r>
+              <w:rPr>
+                <w:rFonts w:ascii="KaiTi" w:eastAsia="PMingLiU" w:hAnsi="KaiTi" w:hint="eastAsia"/>
+                <w:bCs/>
+              </w:rPr>
+              <w:t>6</w:t>
+            </w:r>
+            <w:r>
+              <w:rPr>
+                <w:rFonts w:ascii="KaiTi" w:eastAsia="KaiTi" w:hAnsi="KaiTi"/>
+                <w:bCs/>
+              </w:rPr>
+              <w:t>,</w:t>
+            </w:r>
+            <w:r>
+              <w:rPr>
+                <w:rFonts w:ascii="KaiTi" w:eastAsia="PMingLiU" w:hAnsi="KaiTi" w:hint="eastAsia"/>
+                <w:bCs/>
+              </w:rPr>
+              <w:t>000</w:t>
+            </w:r>
+          </w:p>
+        </w:tc>
+        <w:tc>
+          <w:tcPr>
+            <w:tcW w:w="1843" w:type="dxa"/>
+            <w:vAlign w:val="center"/>
+          </w:tcPr>
+          <w:p>
+            <w:pPr>
+              <w:jc w:val="both"/>
+              <w:rPr>
+                <w:rFonts w:ascii="KaiTi" w:eastAsia="KaiTi" w:hAnsi="KaiTi"/>
+                <w:bCs/>
+              </w:rPr>
+            </w:pPr>
+          </w:p>
+        </w:tc>
+      </w:tr>
+      <w:tr>
+        <w:trPr>
+          <w:trHeight w:val="730"/>
+        </w:trPr>
+        <w:tc>
+          <w:tcPr>
+            <w:tcW w:w="1188" w:type="dxa"/>
+            <w:vAlign w:val="center"/>
+          </w:tcPr>
+          <w:p>
+            <w:pPr>
+              <w:jc w:val="center"/>
+              <w:rPr>
+                <w:rFonts w:ascii="KaiTi" w:eastAsia="KaiTi" w:hAnsi="KaiTi"/>
+                <w:bCs/>
+              </w:rPr>
+            </w:pPr>
+            <w:r>
+              <w:rPr>
+                <w:rFonts w:ascii="KaiTi" w:eastAsia="KaiTi" w:hAnsi="KaiTi"/>
+                <w:bCs/>
+              </w:rPr>
+              <w:t>2</w:t>
+            </w:r>
+          </w:p>
+        </w:tc>
+        <w:tc>
+          <w:tcPr>
+            <w:tcW w:w="5157" w:type="dxa"/>
+            <w:gridSpan w:val="3"/>
+            <w:vAlign w:val="center"/>
+          </w:tcPr>
+          <w:p>
+            <w:pPr>
+              <w:jc w:val="center"/>
+              <w:rPr>
+                <w:rFonts w:ascii="KaiTi" w:eastAsia="PMingLiU" w:hAnsi="KaiTi" w:hint="eastAsia"/>
+                <w:bCs/>
+              </w:rPr>
+            </w:pPr>
+            <w:r>
+              <w:rPr>
+                <w:rFonts w:ascii="KaiTi" w:eastAsia="KaiTi" w:hAnsi="KaiTi" w:hint="eastAsia"/>
+                <w:bCs/>
+              </w:rPr>
+              <w:t>浮動機場稅</w:t>
+            </w:r>
+          </w:p>
+        </w:tc>
+        <w:tc>
+          <w:tcPr>
+            <w:tcW w:w="1418" w:type="dxa"/>
+            <w:vAlign w:val="center"/>
+          </w:tcPr>
+          <w:p>
+            <w:pPr>
+              <w:jc w:val="right"/>
+              <w:rPr>
+                <w:rFonts w:ascii="KaiTi" w:eastAsia="KaiTi" w:hAnsi="KaiTi"/>
+                <w:bCs/>
+              </w:rPr>
+            </w:pPr>
+            <w:r>
+              <w:rPr>
+                <w:rFonts w:ascii="KaiTi" w:eastAsia="PMingLiU" w:hAnsi="KaiTi" w:hint="eastAsia"/>
+                <w:bCs/>
+              </w:rPr>
+              <w:t>5</w:t>
+            </w:r>
+            <w:r>
+              <w:rPr>
+                <w:rFonts w:ascii="KaiTi" w:eastAsia="KaiTi" w:hAnsi="KaiTi"/>
+                <w:bCs/>
+              </w:rPr>
+              <w:t>00</w:t>
+            </w:r>
+          </w:p>
+        </w:tc>
+        <w:tc>
+          <w:tcPr>
+            <w:tcW w:w="1843" w:type="dxa"/>
+            <w:vAlign w:val="center"/>
+          </w:tcPr>
+          <w:p>
+            <w:pPr>
+              <w:jc w:val="both"/>
+              <w:rPr>
+                <w:rFonts w:ascii="KaiTi" w:eastAsia="KaiTi" w:hAnsi="KaiTi"/>
+                <w:bCs/>
+              </w:rPr>
+            </w:pPr>
+          </w:p>
+        </w:tc>
+      </w:tr>
+      <w:tr>
+        <w:trPr>
+          <w:cantSplit/>
+        </w:trPr>
+        <w:tc>
+          <w:tcPr>
+            <w:tcW w:w="1188" w:type="dxa"/>
+            <w:vAlign w:val="center"/>
+          </w:tcPr>
+          <w:p>
+            <w:pPr>
+              <w:jc w:val="center"/>
+              <w:rPr>
+                <w:rFonts w:ascii="KaiTi" w:eastAsia="KaiTi" w:hAnsi="KaiTi"/>
+                <w:bCs/>
+              </w:rPr>
+            </w:pPr>
+            <w:r>
+              <w:rPr>
+                <w:rFonts w:ascii="KaiTi" w:eastAsia="KaiTi" w:hAnsi="KaiTi"/>
+                <w:bCs/>
+              </w:rPr>
+              <w:t>合計</w:t>
+            </w:r>
+          </w:p>
+        </w:tc>
+        <w:tc>
+          <w:tcPr>
+            <w:tcW w:w="8418" w:type="dxa"/>
+            <w:gridSpan w:val="5"/>
+            <w:vAlign w:val="center"/>
+          </w:tcPr>
+          <w:p>
+            <w:pPr>
+              <w:jc w:val="center"/>
+              <w:rPr>
+                <w:rFonts w:ascii="KaiTi" w:eastAsia="KaiTi" w:hAnsi="KaiTi"/>
+                <w:bCs/>
+              </w:rPr>
+            </w:pPr>
+            <w:r>
+              <w:rPr>
+                <w:rFonts w:ascii="KaiTi" w:eastAsia="KaiTi" w:hAnsi="KaiTi"/>
+                <w:bCs/>
+              </w:rPr>
+              <w:t>共計€</w:t>
+            </w:r>
+            <w:r>
+              <w:rPr>
+                <w:rFonts w:ascii="KaiTi" w:eastAsia="PMingLiU" w:hAnsi="KaiTi" w:hint="eastAsia"/>
+                <w:bCs/>
+              </w:rPr>
+              <w:t>6</w:t>
+            </w:r>
+            <w:r>
+              <w:rPr>
+                <w:rFonts w:ascii="KaiTi" w:eastAsia="KaiTi" w:hAnsi="KaiTi"/>
+                <w:bCs/>
+              </w:rPr>
+              <w:t>,</w:t>
+            </w:r>
+            <w:r>
+              <w:rPr>
+                <w:rFonts w:ascii="KaiTi" w:eastAsia="PMingLiU" w:hAnsi="KaiTi" w:hint="eastAsia"/>
+                <w:bCs/>
+              </w:rPr>
+              <w:t>500</w:t>
+            </w:r>
+            <w:r>
+              <w:rPr>
+                <w:rFonts w:ascii="KaiTi" w:eastAsia="KaiTi" w:hAnsi="KaiTi"/>
+                <w:bCs/>
+              </w:rPr>
+              <w:t>約合新台幣</w:t>
+            </w:r>
+            <w:r>
+              <w:rPr>
+                <w:rFonts w:ascii="KaiTi" w:eastAsia="PMingLiU" w:hAnsi="KaiTi" w:hint="eastAsia"/>
+                <w:bCs/>
+              </w:rPr>
+              <w:t>23</w:t>
+            </w:r>
+            <w:r>
+              <w:rPr>
+                <w:rFonts w:ascii="KaiTi" w:eastAsia="KaiTi" w:hAnsi="KaiTi"/>
+                <w:bCs/>
+              </w:rPr>
+              <w:t>萬</w:t>
+            </w:r>
+            <w:r>
+              <w:rPr>
+                <w:rFonts w:ascii="KaiTi" w:eastAsia="PMingLiU" w:hAnsi="KaiTi" w:hint="eastAsia"/>
+                <w:bCs/>
+              </w:rPr>
+              <w:t>4</w:t>
+            </w:r>
+            <w:r>
+              <w:rPr>
+                <w:rFonts w:ascii="KaiTi" w:eastAsia="KaiTi" w:hAnsi="KaiTi"/>
+                <w:bCs/>
+              </w:rPr>
+              <w:t>,</w:t>
+            </w:r>
+            <w:r>
+              <w:rPr>
+                <w:rFonts w:ascii="KaiTi" w:eastAsia="PMingLiU" w:hAnsi="KaiTi" w:hint="eastAsia"/>
+                <w:bCs/>
+              </w:rPr>
+              <w:t>000</w:t>
+            </w:r>
+            <w:r>
+              <w:rPr>
+                <w:rFonts w:ascii="KaiTi" w:eastAsia="KaiTi" w:hAnsi="KaiTi"/>
+                <w:bCs/>
+              </w:rPr>
+              <w:t>元整</w:t>
+            </w:r>
+          </w:p>
+          <w:p>
+            <w:pPr>
+              <w:jc w:val="center"/>
+              <w:rPr>
+                <w:rFonts w:ascii="KaiTi" w:eastAsia="PMingLiU" w:hAnsi="KaiTi" w:hint="eastAsia"/>
+                <w:b/>
+              </w:rPr>
+            </w:pPr>
+            <w:r>
+              <w:rPr>
+                <w:rFonts w:ascii="KaiTi" w:eastAsia="KaiTi" w:hAnsi="KaiTi"/>
+                <w:bCs/>
+              </w:rPr>
+              <w:t>兌換匯率 歐元:台幣=</w:t>
+            </w:r>
+            <w:r>
+              <w:rPr>
+                <w:rFonts w:ascii="KaiTi" w:eastAsia="KaiTi" w:hAnsi="KaiTi"/>
+                <w:bCs/>
+              </w:rPr>
+              <w:t>1:3</w:t>
+            </w:r>
+            <w:r>
+              <w:rPr>
+                <w:rFonts w:ascii="KaiTi" w:eastAsia="PMingLiU" w:hAnsi="KaiTi" w:hint="eastAsia"/>
+                <w:bCs/>
+              </w:rPr>
+              <w:t>6</w:t>
+            </w:r>
+          </w:p>
+        </w:tc>
+      </w:tr>
+    </w:tbl>
     <w:p>
       <w:pPr>
         <w:rPr>
@@ -9060,7 +6817,7 @@
       </w:pPr>
     </w:p>
     <w:sectPr>
-      <w:footerReference w:type="default" r:id="rId10"/>
+      <w:footerReference w:type="default" r:id="rId8"/>
       <w:pgSz w:w="11906" w:h="16838"/>
       <w:pgMar w:top="1418" w:right="1418" w:bottom="1134" w:left="1701" w:header="851" w:footer="992" w:gutter="0"/>
       <w:cols w:space="425"/>
@@ -11672,7 +9429,7 @@
     <w:rPrDefault>
       <w:rPr>
         <w:rFonts w:ascii="Times New Roman" w:eastAsia="PMingLiU" w:hAnsi="Times New Roman" w:cs="Times New Roman"/>
-        <w:lang w:val="en-US" w:eastAsia="zh-CN" w:bidi="ar-SA"/>
+        <w:lang w:val="en-US" w:eastAsia="zh-TW" w:bidi="ar-SA"/>
       </w:rPr>
     </w:rPrDefault>
     <w:pPrDefault/>
@@ -11696,7 +9453,51 @@
     <w:lsdException w:name="Emphasis" w:qFormat="1"/>
     <w:lsdException w:name="Plain Text" w:uiPriority="99"/>
     <w:lsdException w:name="Normal (Web)" w:uiPriority="99"/>
+    <w:lsdException w:name="Normal Table" w:semiHidden="1" w:unhideWhenUsed="1"/>
+    <w:lsdException w:name="Table Simple 1" w:semiHidden="1" w:unhideWhenUsed="1"/>
+    <w:lsdException w:name="Table Simple 2" w:semiHidden="1" w:unhideWhenUsed="1"/>
+    <w:lsdException w:name="Table Simple 3" w:semiHidden="1" w:unhideWhenUsed="1"/>
+    <w:lsdException w:name="Table Classic 1" w:semiHidden="1" w:unhideWhenUsed="1"/>
+    <w:lsdException w:name="Table Classic 2" w:semiHidden="1" w:unhideWhenUsed="1"/>
+    <w:lsdException w:name="Table Classic 3" w:semiHidden="1" w:unhideWhenUsed="1"/>
+    <w:lsdException w:name="Table Classic 4" w:semiHidden="1" w:unhideWhenUsed="1"/>
+    <w:lsdException w:name="Table Colorful 1" w:semiHidden="1" w:unhideWhenUsed="1"/>
+    <w:lsdException w:name="Table Colorful 2" w:semiHidden="1" w:unhideWhenUsed="1"/>
+    <w:lsdException w:name="Table Colorful 3" w:semiHidden="1" w:unhideWhenUsed="1"/>
+    <w:lsdException w:name="Table Columns 1" w:semiHidden="1" w:unhideWhenUsed="1"/>
+    <w:lsdException w:name="Table Columns 2" w:semiHidden="1" w:unhideWhenUsed="1"/>
+    <w:lsdException w:name="Table Columns 3" w:semiHidden="1" w:unhideWhenUsed="1"/>
+    <w:lsdException w:name="Table Columns 4" w:semiHidden="1" w:unhideWhenUsed="1"/>
+    <w:lsdException w:name="Table Columns 5" w:semiHidden="1" w:unhideWhenUsed="1"/>
+    <w:lsdException w:name="Table Grid 1" w:semiHidden="1" w:unhideWhenUsed="1"/>
+    <w:lsdException w:name="Table Grid 2" w:semiHidden="1" w:unhideWhenUsed="1"/>
+    <w:lsdException w:name="Table Grid 3" w:semiHidden="1" w:unhideWhenUsed="1"/>
+    <w:lsdException w:name="Table Grid 4" w:semiHidden="1" w:unhideWhenUsed="1"/>
+    <w:lsdException w:name="Table Grid 5" w:semiHidden="1" w:unhideWhenUsed="1"/>
+    <w:lsdException w:name="Table Grid 6" w:semiHidden="1" w:unhideWhenUsed="1"/>
+    <w:lsdException w:name="Table Grid 7" w:semiHidden="1" w:unhideWhenUsed="1"/>
+    <w:lsdException w:name="Table Grid 8" w:semiHidden="1" w:unhideWhenUsed="1"/>
+    <w:lsdException w:name="Table List 1" w:semiHidden="1" w:unhideWhenUsed="1"/>
+    <w:lsdException w:name="Table List 2" w:semiHidden="1" w:unhideWhenUsed="1"/>
+    <w:lsdException w:name="Table List 3" w:semiHidden="1" w:unhideWhenUsed="1"/>
+    <w:lsdException w:name="Table List 4" w:semiHidden="1" w:unhideWhenUsed="1"/>
+    <w:lsdException w:name="Table List 5" w:semiHidden="1" w:unhideWhenUsed="1"/>
+    <w:lsdException w:name="Table List 6" w:semiHidden="1" w:unhideWhenUsed="1"/>
+    <w:lsdException w:name="Table List 7" w:semiHidden="1" w:unhideWhenUsed="1"/>
+    <w:lsdException w:name="Table List 8" w:semiHidden="1" w:unhideWhenUsed="1"/>
+    <w:lsdException w:name="Table 3D effects 1" w:semiHidden="1" w:unhideWhenUsed="1"/>
+    <w:lsdException w:name="Table 3D effects 2" w:semiHidden="1" w:unhideWhenUsed="1"/>
+    <w:lsdException w:name="Table 3D effects 3" w:semiHidden="1" w:unhideWhenUsed="1"/>
+    <w:lsdException w:name="Table Contemporary" w:semiHidden="1" w:unhideWhenUsed="1"/>
+    <w:lsdException w:name="Table Elegant" w:semiHidden="1" w:unhideWhenUsed="1"/>
+    <w:lsdException w:name="Table Professional" w:semiHidden="1" w:unhideWhenUsed="1"/>
+    <w:lsdException w:name="Table Subtle 1" w:semiHidden="1" w:unhideWhenUsed="1"/>
+    <w:lsdException w:name="Table Subtle 2" w:semiHidden="1" w:unhideWhenUsed="1"/>
+    <w:lsdException w:name="Table Web 1" w:semiHidden="1" w:unhideWhenUsed="1"/>
+    <w:lsdException w:name="Table Web 2" w:semiHidden="1" w:unhideWhenUsed="1"/>
+    <w:lsdException w:name="Table Web 3" w:semiHidden="1" w:unhideWhenUsed="1"/>
     <w:lsdException w:name="Table Grid" w:uiPriority="39"/>
+    <w:lsdException w:name="Table Theme" w:semiHidden="1" w:unhideWhenUsed="1"/>
     <w:lsdException w:name="Placeholder Text" w:semiHidden="1" w:uiPriority="99" w:unhideWhenUsed="1"/>
     <w:lsdException w:name="No Spacing" w:uiPriority="99" w:qFormat="1"/>
     <w:lsdException w:name="Light Shading" w:uiPriority="99"/>
@@ -11808,15 +9609,15 @@
     <w:lsdException w:name="Book Title" w:uiPriority="69" w:qFormat="1"/>
     <w:lsdException w:name="Bibliography" w:semiHidden="1" w:uiPriority="70" w:unhideWhenUsed="1"/>
     <w:lsdException w:name="TOC Heading" w:semiHidden="1" w:uiPriority="71" w:unhideWhenUsed="1" w:qFormat="1"/>
-    <w:lsdException w:name="Plain Table 1" w:semiHidden="1" w:uiPriority="72" w:unhideWhenUsed="1"/>
-    <w:lsdException w:name="Plain Table 2" w:semiHidden="1" w:uiPriority="73" w:unhideWhenUsed="1"/>
+    <w:lsdException w:name="Plain Table 1" w:uiPriority="72"/>
+    <w:lsdException w:name="Plain Table 2" w:uiPriority="73"/>
     <w:lsdException w:name="Plain Table 3" w:uiPriority="19" w:qFormat="1"/>
     <w:lsdException w:name="Plain Table 4" w:uiPriority="21" w:qFormat="1"/>
     <w:lsdException w:name="Plain Table 5" w:uiPriority="31" w:qFormat="1"/>
     <w:lsdException w:name="Grid Table Light" w:uiPriority="32" w:qFormat="1"/>
     <w:lsdException w:name="Grid Table 1 Light" w:uiPriority="33" w:qFormat="1"/>
-    <w:lsdException w:name="Grid Table 2" w:semiHidden="1" w:uiPriority="37" w:unhideWhenUsed="1"/>
-    <w:lsdException w:name="Grid Table 3" w:semiHidden="1" w:uiPriority="39" w:unhideWhenUsed="1" w:qFormat="1"/>
+    <w:lsdException w:name="Grid Table 2" w:uiPriority="37"/>
+    <w:lsdException w:name="Grid Table 3" w:uiPriority="39" w:qFormat="1"/>
     <w:lsdException w:name="Grid Table 4" w:uiPriority="49"/>
     <w:lsdException w:name="Grid Table 5 Dark" w:uiPriority="50"/>
     <w:lsdException w:name="Grid Table 6 Colorful" w:uiPriority="51"/>
@@ -11926,7 +9727,7 @@
       <w:rFonts w:eastAsia="Times New Roman"/>
       <w:sz w:val="24"/>
       <w:szCs w:val="24"/>
-      <w:lang w:val="de-DE" w:eastAsia="zh-TW"/>
+      <w:lang w:val="de-DE"/>
     </w:rPr>
   </w:style>
   <w:style w:type="paragraph" w:styleId="Heading1">
@@ -12065,11 +9866,15 @@
   </w:style>
   <w:style w:type="character" w:default="1" w:styleId="DefaultParagraphFont">
     <w:name w:val="Default Paragraph Font"/>
+    <w:uiPriority w:val="1"/>
     <w:semiHidden/>
+    <w:unhideWhenUsed/>
   </w:style>
   <w:style w:type="table" w:default="1" w:styleId="TableNormal">
     <w:name w:val="Normal Table"/>
+    <w:uiPriority w:val="99"/>
     <w:semiHidden/>
+    <w:unhideWhenUsed/>
     <w:tblPr>
       <w:tblInd w:w="0" w:type="dxa"/>
       <w:tblCellMar>
@@ -12082,7 +9887,9 @@
   </w:style>
   <w:style w:type="numbering" w:default="1" w:styleId="NoList">
     <w:name w:val="No List"/>
+    <w:uiPriority w:val="99"/>
     <w:semiHidden/>
+    <w:unhideWhenUsed/>
   </w:style>
   <w:style w:type="character" w:styleId="Strong">
     <w:name w:val="Strong"/>
@@ -12320,7 +10127,7 @@
     <w:rPr>
       <w:rFonts w:eastAsia="Arial Unicode MS"/>
       <w:bdr w:val="nil"/>
-      <w:lang w:val="de-DE" w:eastAsia="zh-TW"/>
+      <w:lang w:val="de-DE"/>
     </w:rPr>
     <w:tblPr>
       <w:tblInd w:w="0" w:type="dxa"/>
@@ -12352,7 +10159,6 @@
       <w:szCs w:val="24"/>
       <w:u w:color="000000"/>
       <w:bdr w:val="nil"/>
-      <w:lang w:eastAsia="zh-TW"/>
     </w:rPr>
   </w:style>
   <w:style w:type="paragraph" w:customStyle="1" w:styleId="TextAA">
@@ -12375,7 +10181,7 @@
       <w:szCs w:val="22"/>
       <w:u w:color="000000"/>
       <w:bdr w:val="nil"/>
-      <w:lang w:val="de-DE" w:eastAsia="zh-TW"/>
+      <w:lang w:val="de-DE"/>
     </w:rPr>
   </w:style>
   <w:style w:type="paragraph" w:styleId="PlainText">

</xml_diff>

<commit_message>
Add 附件三：經費概算表 with auto-derived funding row (#51)
The application form's funding row (申請單位 / 其他來源 / 本署支應 with
amounts and share ratios) is now computed from 附件三.明細 rows tagged with
資金來源, instead of the model filling 9 separate flat-list fields.

Each budget item carries 內容 / 單價 / 數量 / 資金來源 / 備註; the renderer
auto-numbers 項目, computes 總價 = 單價 × 數量, totals per source, derives
share-ratio percentages, and fills the form's funding row as
"外幣：€X / 約合新台幣：X萬X,XXX 元" using a hardcoded 1 EUR = 36 TWD rate.

Also adds 附件三 page rendering: clones the template data row for each
item, updates the merged 合計 row with the grand total.

Co-authored-by: Claude Opus 4.7 <noreply@anthropic.com>
</commit_message>
<xml_diff>
--- a/src/main/resources/templates/important-person-invitation-template.docx
+++ b/src/main/resources/templates/important-person-invitation-template.docx
@@ -56,14 +56,14 @@
         <w:tblLook w:val="01E0" w:firstRow="1" w:lastRow="1" w:firstColumn="1" w:lastColumn="1" w:noHBand="0" w:noVBand="0"/>
       </w:tblPr>
       <w:tblGrid>
-        <w:gridCol w:w="491"/>
-        <w:gridCol w:w="1907"/>
-        <w:gridCol w:w="2177"/>
-        <w:gridCol w:w="1310"/>
-        <w:gridCol w:w="107"/>
-        <w:gridCol w:w="1308"/>
-        <w:gridCol w:w="834"/>
-        <w:gridCol w:w="835"/>
+        <w:gridCol w:w="473"/>
+        <w:gridCol w:w="1787"/>
+        <w:gridCol w:w="2038"/>
+        <w:gridCol w:w="210"/>
+        <w:gridCol w:w="1124"/>
+        <w:gridCol w:w="1133"/>
+        <w:gridCol w:w="393"/>
+        <w:gridCol w:w="1811"/>
       </w:tblGrid>
       <w:tr>
         <w:trPr>
@@ -676,7 +676,7 @@
           <w:p>
             <w:pPr>
               <w:rPr>
-                <w:rFonts w:ascii="Calibri" w:eastAsia="KaiTi" w:hAnsi="Calibri" w:cs="Calibri" w:hint="eastAsia"/>
+                <w:rFonts w:ascii="Calibri" w:eastAsia="KaiTi" w:hAnsi="Calibri" w:cs="Calibri"/>
                 <w:u w:val="single"/>
               </w:rPr>
             </w:pPr>
@@ -795,7 +795,7 @@
           <w:p>
             <w:pPr>
               <w:rPr>
-                <w:rFonts w:ascii="KaiTi" w:eastAsia="KaiTi" w:hAnsi="KaiTi" w:hint="eastAsia"/>
+                <w:rFonts w:ascii="KaiTi" w:eastAsia="KaiTi" w:hAnsi="KaiTi"/>
               </w:rPr>
             </w:pPr>
             <w:r>
@@ -1275,7 +1275,7 @@
           <w:p>
             <w:pPr>
               <w:rPr>
-                <w:rFonts w:ascii="KaiTi" w:eastAsia="KaiTi" w:hAnsi="KaiTi" w:hint="eastAsia"/>
+                <w:rFonts w:ascii="KaiTi" w:eastAsia="KaiTi" w:hAnsi="KaiTi"/>
                 <w:bCs/>
               </w:rPr>
             </w:pPr>
@@ -1289,7 +1289,7 @@
           <w:p>
             <w:pPr>
               <w:rPr>
-                <w:rFonts w:ascii="KaiTi" w:eastAsia="KaiTi" w:hAnsi="KaiTi" w:hint="eastAsia"/>
+                <w:rFonts w:ascii="KaiTi" w:eastAsia="KaiTi" w:hAnsi="KaiTi"/>
               </w:rPr>
             </w:pPr>
             <w:r>
@@ -1592,7 +1592,7 @@
           <w:p>
             <w:pPr>
               <w:rPr>
-                <w:rFonts w:ascii="KaiTi" w:eastAsia="KaiTi" w:hAnsi="KaiTi" w:hint="eastAsia"/>
+                <w:rFonts w:ascii="KaiTi" w:eastAsia="KaiTi" w:hAnsi="KaiTi"/>
               </w:rPr>
             </w:pPr>
             <w:r>
@@ -1897,7 +1897,7 @@
           <w:p>
             <w:pPr>
               <w:rPr>
-                <w:rFonts w:ascii="KaiTi" w:eastAsia="KaiTi" w:hAnsi="KaiTi" w:hint="eastAsia"/>
+                <w:rFonts w:ascii="KaiTi" w:eastAsia="KaiTi" w:hAnsi="KaiTi"/>
               </w:rPr>
             </w:pPr>
             <w:r>
@@ -2794,7 +2794,6 @@
                 <w:spacing w:val="0"/>
                 <w:kern w:val="2"/>
                 <w:szCs w:val="24"/>
-                <w:lang w:val="en-US"/>
               </w:rPr>
               <w:t>Costantino della Gherardesca</w:t>
             </w:r>
@@ -2823,9 +2822,54 @@
                 <w:spacing w:val="0"/>
                 <w:kern w:val="2"/>
                 <w:szCs w:val="24"/>
+              </w:rPr>
+              <w:t>，</w:t>
+            </w:r>
+            <w:r>
+              <w:rPr>
+                <w:rFonts w:ascii="KaiTi" w:eastAsia="KaiTi" w:hAnsi="KaiTi" w:hint="eastAsia"/>
+                <w:spacing w:val="0"/>
+                <w:kern w:val="2"/>
+                <w:szCs w:val="24"/>
                 <w:lang w:val="en-US"/>
               </w:rPr>
-              <w:t>，</w:t>
+              <w:t>目前</w:t>
+            </w:r>
+            <w:r>
+              <w:rPr>
+                <w:rFonts w:ascii="KaiTi" w:eastAsia="KaiTi" w:hAnsi="KaiTi"/>
+                <w:spacing w:val="0"/>
+                <w:kern w:val="2"/>
+                <w:szCs w:val="24"/>
+              </w:rPr>
+              <w:t>Instagram</w:t>
+            </w:r>
+            <w:r>
+              <w:rPr>
+                <w:rFonts w:ascii="KaiTi" w:eastAsia="KaiTi" w:hAnsi="KaiTi" w:hint="eastAsia"/>
+                <w:spacing w:val="0"/>
+                <w:kern w:val="2"/>
+                <w:szCs w:val="24"/>
+              </w:rPr>
+              <w:t>追蹤人數</w:t>
+            </w:r>
+            <w:r>
+              <w:rPr>
+                <w:rFonts w:ascii="KaiTi" w:eastAsia="KaiTi" w:hAnsi="KaiTi"/>
+                <w:spacing w:val="0"/>
+                <w:kern w:val="2"/>
+                <w:szCs w:val="24"/>
+              </w:rPr>
+              <w:t>331</w:t>
+            </w:r>
+            <w:r>
+              <w:rPr>
+                <w:rFonts w:ascii="KaiTi" w:eastAsia="KaiTi" w:hAnsi="KaiTi"/>
+                <w:spacing w:val="0"/>
+                <w:kern w:val="2"/>
+                <w:szCs w:val="24"/>
+              </w:rPr>
+              <w:t>,000</w:t>
             </w:r>
             <w:r>
               <w:rPr>
@@ -2835,43 +2879,95 @@
                 <w:szCs w:val="24"/>
                 <w:lang w:val="en-US"/>
               </w:rPr>
-              <w:t>目前</w:t>
-            </w:r>
-            <w:r>
-              <w:rPr>
-                <w:rFonts w:ascii="KaiTi" w:eastAsia="KaiTi" w:hAnsi="KaiTi"/>
-                <w:spacing w:val="0"/>
-                <w:kern w:val="2"/>
-                <w:szCs w:val="24"/>
-              </w:rPr>
-              <w:t>Instagram</w:t>
-            </w:r>
-            <w:r>
-              <w:rPr>
-                <w:rFonts w:ascii="KaiTi" w:eastAsia="KaiTi" w:hAnsi="KaiTi" w:hint="eastAsia"/>
-                <w:spacing w:val="0"/>
-                <w:kern w:val="2"/>
-                <w:szCs w:val="24"/>
-              </w:rPr>
-              <w:t>追蹤人數</w:t>
-            </w:r>
-            <w:r>
-              <w:rPr>
-                <w:rFonts w:ascii="KaiTi" w:eastAsia="KaiTi" w:hAnsi="KaiTi"/>
-                <w:spacing w:val="0"/>
-                <w:kern w:val="2"/>
-                <w:szCs w:val="24"/>
-                <w:lang w:val="en-US"/>
-              </w:rPr>
-              <w:t>331</w:t>
-            </w:r>
-            <w:r>
-              <w:rPr>
-                <w:rFonts w:ascii="KaiTi" w:eastAsia="KaiTi" w:hAnsi="KaiTi"/>
-                <w:spacing w:val="0"/>
-                <w:kern w:val="2"/>
-                <w:szCs w:val="24"/>
-                <w:lang w:val="en-US"/>
+              <w:t>、</w:t>
+            </w:r>
+            <w:r>
+              <w:rPr>
+                <w:rFonts w:ascii="KaiTi" w:eastAsia="KaiTi" w:hAnsi="KaiTi"/>
+                <w:spacing w:val="0"/>
+                <w:kern w:val="2"/>
+                <w:szCs w:val="24"/>
+              </w:rPr>
+              <w:t xml:space="preserve">TikTok </w:t>
+            </w:r>
+            <w:r>
+              <w:rPr>
+                <w:rFonts w:ascii="KaiTi" w:eastAsia="KaiTi" w:hAnsi="KaiTi"/>
+                <w:spacing w:val="0"/>
+                <w:kern w:val="2"/>
+                <w:szCs w:val="24"/>
+              </w:rPr>
+              <w:t>42</w:t>
+            </w:r>
+            <w:r>
+              <w:rPr>
+                <w:rFonts w:ascii="KaiTi" w:eastAsia="KaiTi" w:hAnsi="KaiTi"/>
+                <w:spacing w:val="0"/>
+                <w:kern w:val="2"/>
+                <w:szCs w:val="24"/>
+              </w:rPr>
+              <w:t>,</w:t>
+            </w:r>
+            <w:r>
+              <w:rPr>
+                <w:rFonts w:ascii="KaiTi" w:eastAsia="KaiTi" w:hAnsi="KaiTi"/>
+                <w:spacing w:val="0"/>
+                <w:kern w:val="2"/>
+                <w:szCs w:val="24"/>
+              </w:rPr>
+              <w:t>9</w:t>
+            </w:r>
+            <w:r>
+              <w:rPr>
+                <w:rFonts w:ascii="KaiTi" w:eastAsia="KaiTi" w:hAnsi="KaiTi"/>
+                <w:spacing w:val="0"/>
+                <w:kern w:val="2"/>
+                <w:szCs w:val="24"/>
+              </w:rPr>
+              <w:t>00</w:t>
+            </w:r>
+            <w:r>
+              <w:rPr>
+                <w:rFonts w:ascii="KaiTi" w:eastAsia="KaiTi" w:hAnsi="KaiTi" w:hint="eastAsia"/>
+                <w:spacing w:val="0"/>
+                <w:kern w:val="2"/>
+                <w:szCs w:val="24"/>
+              </w:rPr>
+              <w:t>人、</w:t>
+            </w:r>
+            <w:r>
+              <w:rPr>
+                <w:rFonts w:ascii="KaiTi" w:eastAsia="KaiTi" w:hAnsi="KaiTi"/>
+                <w:spacing w:val="0"/>
+                <w:kern w:val="2"/>
+                <w:szCs w:val="24"/>
+              </w:rPr>
+              <w:t>Youtube</w:t>
+            </w:r>
+            <w:r>
+              <w:rPr>
+                <w:rFonts w:ascii="KaiTi" w:eastAsia="KaiTi" w:hAnsi="KaiTi" w:hint="eastAsia"/>
+                <w:spacing w:val="0"/>
+                <w:kern w:val="2"/>
+                <w:szCs w:val="24"/>
+              </w:rPr>
+              <w:t xml:space="preserve"> </w:t>
+            </w:r>
+            <w:r>
+              <w:rPr>
+                <w:rFonts w:ascii="KaiTi" w:eastAsia="KaiTi" w:hAnsi="KaiTi"/>
+                <w:spacing w:val="0"/>
+                <w:kern w:val="2"/>
+                <w:szCs w:val="24"/>
+              </w:rPr>
+              <w:t>85</w:t>
+            </w:r>
+            <w:r>
+              <w:rPr>
+                <w:rFonts w:ascii="KaiTi" w:eastAsia="KaiTi" w:hAnsi="KaiTi"/>
+                <w:spacing w:val="0"/>
+                <w:kern w:val="2"/>
+                <w:szCs w:val="24"/>
               </w:rPr>
               <w:t>,000</w:t>
             </w:r>
@@ -2881,106 +2977,6 @@
                 <w:spacing w:val="0"/>
                 <w:kern w:val="2"/>
                 <w:szCs w:val="24"/>
-                <w:lang w:val="en-US"/>
-              </w:rPr>
-              <w:t>、</w:t>
-            </w:r>
-            <w:r>
-              <w:rPr>
-                <w:rFonts w:ascii="KaiTi" w:eastAsia="KaiTi" w:hAnsi="KaiTi"/>
-                <w:spacing w:val="0"/>
-                <w:kern w:val="2"/>
-                <w:szCs w:val="24"/>
-              </w:rPr>
-              <w:t xml:space="preserve">TikTok </w:t>
-            </w:r>
-            <w:r>
-              <w:rPr>
-                <w:rFonts w:ascii="KaiTi" w:eastAsia="KaiTi" w:hAnsi="KaiTi"/>
-                <w:spacing w:val="0"/>
-                <w:kern w:val="2"/>
-                <w:szCs w:val="24"/>
-              </w:rPr>
-              <w:t>42</w:t>
-            </w:r>
-            <w:r>
-              <w:rPr>
-                <w:rFonts w:ascii="KaiTi" w:eastAsia="KaiTi" w:hAnsi="KaiTi"/>
-                <w:spacing w:val="0"/>
-                <w:kern w:val="2"/>
-                <w:szCs w:val="24"/>
-              </w:rPr>
-              <w:t>,</w:t>
-            </w:r>
-            <w:r>
-              <w:rPr>
-                <w:rFonts w:ascii="KaiTi" w:eastAsia="KaiTi" w:hAnsi="KaiTi"/>
-                <w:spacing w:val="0"/>
-                <w:kern w:val="2"/>
-                <w:szCs w:val="24"/>
-              </w:rPr>
-              <w:t>9</w:t>
-            </w:r>
-            <w:r>
-              <w:rPr>
-                <w:rFonts w:ascii="KaiTi" w:eastAsia="KaiTi" w:hAnsi="KaiTi"/>
-                <w:spacing w:val="0"/>
-                <w:kern w:val="2"/>
-                <w:szCs w:val="24"/>
-              </w:rPr>
-              <w:t>00</w:t>
-            </w:r>
-            <w:r>
-              <w:rPr>
-                <w:rFonts w:ascii="KaiTi" w:eastAsia="KaiTi" w:hAnsi="KaiTi" w:hint="eastAsia"/>
-                <w:spacing w:val="0"/>
-                <w:kern w:val="2"/>
-                <w:szCs w:val="24"/>
-              </w:rPr>
-              <w:t>人、</w:t>
-            </w:r>
-            <w:r>
-              <w:rPr>
-                <w:rFonts w:ascii="KaiTi" w:eastAsia="KaiTi" w:hAnsi="KaiTi"/>
-                <w:spacing w:val="0"/>
-                <w:kern w:val="2"/>
-                <w:szCs w:val="24"/>
-              </w:rPr>
-              <w:t>Youtube</w:t>
-            </w:r>
-            <w:r>
-              <w:rPr>
-                <w:rFonts w:ascii="KaiTi" w:eastAsia="KaiTi" w:hAnsi="KaiTi" w:hint="eastAsia"/>
-                <w:spacing w:val="0"/>
-                <w:kern w:val="2"/>
-                <w:szCs w:val="24"/>
-              </w:rPr>
-              <w:t xml:space="preserve"> </w:t>
-            </w:r>
-            <w:r>
-              <w:rPr>
-                <w:rFonts w:ascii="KaiTi" w:eastAsia="KaiTi" w:hAnsi="KaiTi"/>
-                <w:spacing w:val="0"/>
-                <w:kern w:val="2"/>
-                <w:szCs w:val="24"/>
-              </w:rPr>
-              <w:t>85</w:t>
-            </w:r>
-            <w:r>
-              <w:rPr>
-                <w:rFonts w:ascii="KaiTi" w:eastAsia="KaiTi" w:hAnsi="KaiTi"/>
-                <w:spacing w:val="0"/>
-                <w:kern w:val="2"/>
-                <w:szCs w:val="24"/>
-              </w:rPr>
-              <w:t>,000</w:t>
-            </w:r>
-            <w:r>
-              <w:rPr>
-                <w:rFonts w:ascii="KaiTi" w:eastAsia="KaiTi" w:hAnsi="KaiTi" w:hint="eastAsia"/>
-                <w:spacing w:val="0"/>
-                <w:kern w:val="2"/>
-                <w:szCs w:val="24"/>
               </w:rPr>
               <w:t>人</w:t>
             </w:r>
@@ -2990,7 +2986,6 @@
                 <w:spacing w:val="0"/>
                 <w:kern w:val="2"/>
                 <w:szCs w:val="24"/>
-                <w:lang w:val="en-US"/>
               </w:rPr>
               <w:t>，</w:t>
             </w:r>
@@ -3292,7 +3287,7 @@
               </w:numPr>
               <w:spacing w:after="0" w:line="360" w:lineRule="exact"/>
               <w:rPr>
-                <w:rFonts w:ascii="KaiTi" w:eastAsia="KaiTi" w:hAnsi="KaiTi" w:hint="eastAsia"/>
+                <w:rFonts w:ascii="KaiTi" w:eastAsia="KaiTi" w:hAnsi="KaiTi"/>
                 <w:spacing w:val="0"/>
                 <w:kern w:val="2"/>
                 <w:szCs w:val="24"/>
@@ -3552,7 +3547,7 @@
               <w:spacing w:after="0" w:line="360" w:lineRule="exact"/>
               <w:ind w:left="357" w:hanging="357"/>
               <w:rPr>
-                <w:rFonts w:ascii="KaiTi" w:eastAsia="KaiTi" w:hAnsi="KaiTi" w:hint="eastAsia"/>
+                <w:rFonts w:ascii="KaiTi" w:eastAsia="KaiTi" w:hAnsi="KaiTi"/>
                 <w:spacing w:val="0"/>
                 <w:kern w:val="2"/>
                 <w:szCs w:val="24"/>
@@ -4054,7 +4049,7 @@
           <w:sz w:val="32"/>
           <w:szCs w:val="32"/>
         </w:rPr>
-        <w:pict w14:anchorId="79CCB533">
+        <w:pict w14:anchorId="53AF8ECB">
           <v:shapetype id="_x0000_t75" coordsize="21600,21600" o:spt="75" o:preferrelative="t" path="m@4@5l@4@11@9@11@9@5xe" filled="f" stroked="f">
             <v:stroke joinstyle="miter"/>
             <v:formulas>
@@ -4074,9 +4069,9 @@
             <v:path o:extrusionok="f" gradientshapeok="t" o:connecttype="rect"/>
             <o:lock v:ext="edit" aspectratio="t"/>
           </v:shapetype>
-          <v:shape id="Grafik 1" o:spid="_x0000_i1025" type="#_x0000_t75" style="width:110.5pt;height:108pt;visibility:visible">
+          <v:shape id="Grafik 1" o:spid="_x0000_i1025" type="#_x0000_t75" style="width:110.8pt;height:108.3pt;visibility:visible;mso-wrap-style:square">
             <v:imagedata r:id="rId7" o:title=""/>
-            <o:lock v:ext="edit" aspectratio="f"/>
+            <o:lock v:ext="edit" rotation="t" cropping="t" verticies="t"/>
           </v:shape>
         </w:pict>
       </w:r>
@@ -4484,35 +4479,35 @@
           <w:p>
             <w:pPr>
               <w:rPr>
-                <w:rFonts w:ascii="Calibri" w:hAnsi="Calibri" w:cs="Calibri" w:hint="eastAsia"/>
-                <w:color w:val="000000"/>
-                <w:sz w:val="22"/>
-                <w:szCs w:val="22"/>
-              </w:rPr>
-            </w:pPr>
-            <w:r>
-              <w:rPr>
                 <w:rFonts w:ascii="Calibri" w:hAnsi="Calibri" w:cs="Calibri"/>
                 <w:color w:val="000000"/>
                 <w:sz w:val="22"/>
                 <w:szCs w:val="22"/>
               </w:rPr>
-              <w:t>Costantino della Gherardesca</w:t>
-            </w:r>
-          </w:p>
-        </w:tc>
-        <w:tc>
-          <w:tcPr>
-            <w:tcW w:w="360" w:type="dxa"/>
-          </w:tcPr>
-          <w:p>
-            <w:pPr>
+            </w:pPr>
+            <w:r>
               <w:rPr>
                 <w:rFonts w:ascii="Calibri" w:hAnsi="Calibri" w:cs="Calibri"/>
                 <w:color w:val="000000"/>
                 <w:sz w:val="22"/>
                 <w:szCs w:val="22"/>
               </w:rPr>
+              <w:t>Costantino della Gherardesca</w:t>
+            </w:r>
+          </w:p>
+        </w:tc>
+        <w:tc>
+          <w:tcPr>
+            <w:tcW w:w="360" w:type="dxa"/>
+          </w:tcPr>
+          <w:p>
+            <w:pPr>
+              <w:rPr>
+                <w:rFonts w:ascii="Calibri" w:hAnsi="Calibri" w:cs="Calibri"/>
+                <w:color w:val="000000"/>
+                <w:sz w:val="22"/>
+                <w:szCs w:val="22"/>
+              </w:rPr>
             </w:pPr>
             <w:r>
               <w:rPr>
@@ -4562,7 +4557,6 @@
         <w:tc>
           <w:tcPr>
             <w:tcW w:w="1418" w:type="dxa"/>
-            <w:vMerge w:val="restart"/>
             <w:vAlign w:val="center"/>
           </w:tcPr>
           <w:p>
@@ -4646,7 +4640,7 @@
           <w:p>
             <w:pPr>
               <w:rPr>
-                <w:rFonts w:ascii="KaiTi" w:eastAsia="KaiTi" w:hAnsi="KaiTi" w:hint="eastAsia"/>
+                <w:rFonts w:ascii="KaiTi" w:eastAsia="KaiTi" w:hAnsi="KaiTi"/>
               </w:rPr>
             </w:pPr>
             <w:r>
@@ -4682,7 +4676,7 @@
                 <w:sz w:val="22"/>
                 <w:szCs w:val="22"/>
               </w:rPr>
-              <w:t>2</w:t>
+              <w:t>1</w:t>
             </w:r>
           </w:p>
         </w:tc>
@@ -4699,70 +4693,60 @@
                 <w:szCs w:val="22"/>
               </w:rPr>
             </w:pPr>
-            <w:r>
+          </w:p>
+        </w:tc>
+        <w:tc>
+          <w:tcPr>
+            <w:tcW w:w="360" w:type="dxa"/>
+          </w:tcPr>
+          <w:p>
+            <w:pPr>
+              <w:rPr>
+                <w:rFonts w:ascii="PingFang TC" w:eastAsia="PingFang TC" w:hAnsi="PingFang TC" w:cs="PingFang TC"/>
+                <w:color w:val="000000"/>
+                <w:sz w:val="22"/>
+                <w:szCs w:val="22"/>
+              </w:rPr>
+            </w:pPr>
+            <w:r>
+              <w:rPr>
+                <w:rFonts w:ascii="PingFang TC" w:eastAsia="PingFang TC" w:hAnsi="PingFang TC" w:cs="PingFang TC"/>
+                <w:color w:val="000000"/>
+                <w:sz w:val="22"/>
+                <w:szCs w:val="22"/>
+              </w:rPr>
+              <w:t>M</w:t>
+            </w:r>
+          </w:p>
+        </w:tc>
+        <w:tc>
+          <w:tcPr>
+            <w:tcW w:w="1836" w:type="dxa"/>
+            <w:vAlign w:val="center"/>
+          </w:tcPr>
+          <w:p>
+            <w:pPr>
               <w:rPr>
                 <w:rFonts w:ascii="Calibri" w:hAnsi="Calibri" w:cs="Calibri"/>
                 <w:color w:val="000000"/>
                 <w:sz w:val="22"/>
                 <w:szCs w:val="22"/>
               </w:rPr>
-              <w:t>Rossana Moro</w:t>
-            </w:r>
-          </w:p>
-        </w:tc>
-        <w:tc>
-          <w:tcPr>
-            <w:tcW w:w="360" w:type="dxa"/>
-          </w:tcPr>
-          <w:p>
-            <w:pPr>
+            </w:pPr>
+            <w:r>
               <w:rPr>
                 <w:rFonts w:ascii="Calibri" w:hAnsi="Calibri" w:cs="Calibri"/>
                 <w:color w:val="000000"/>
                 <w:sz w:val="22"/>
                 <w:szCs w:val="22"/>
               </w:rPr>
-            </w:pPr>
-            <w:r>
-              <w:rPr>
-                <w:rFonts w:ascii="Calibri" w:hAnsi="Calibri" w:cs="Calibri"/>
-                <w:color w:val="000000"/>
-                <w:sz w:val="22"/>
-                <w:szCs w:val="22"/>
-              </w:rPr>
-              <w:t>F</w:t>
-            </w:r>
-          </w:p>
-        </w:tc>
-        <w:tc>
-          <w:tcPr>
-            <w:tcW w:w="1836" w:type="dxa"/>
-            <w:vAlign w:val="center"/>
-          </w:tcPr>
-          <w:p>
-            <w:pPr>
-              <w:rPr>
-                <w:rFonts w:ascii="Calibri" w:hAnsi="Calibri" w:cs="Calibri"/>
-                <w:color w:val="000000"/>
-                <w:sz w:val="22"/>
-                <w:szCs w:val="22"/>
-              </w:rPr>
-            </w:pPr>
-            <w:r>
-              <w:rPr>
-                <w:rFonts w:ascii="Calibri" w:hAnsi="Calibri" w:cs="Calibri"/>
-                <w:color w:val="000000"/>
-                <w:sz w:val="22"/>
-                <w:szCs w:val="22"/>
-              </w:rPr>
-              <w:t>Assistant</w:t>
+              <w:t>Moderator/Influencer</w:t>
             </w:r>
           </w:p>
         </w:tc>
         <w:tc>
           <w:tcPr>
             <w:tcW w:w="1418" w:type="dxa"/>
-            <w:vMerge/>
             <w:vAlign w:val="center"/>
           </w:tcPr>
           <w:p>
@@ -4774,6 +4758,25 @@
                 <w:szCs w:val="20"/>
               </w:rPr>
             </w:pPr>
+            <w:r>
+              <w:rPr>
+                <w:rFonts w:ascii="Calibri" w:hAnsi="Calibri" w:cs="Calibri"/>
+                <w:color w:val="000000"/>
+                <w:sz w:val="20"/>
+                <w:szCs w:val="20"/>
+              </w:rPr>
+              <w:t>@</w:t>
+            </w:r>
+            <w:r>
+              <w:rPr>
+                <w:rFonts w:ascii="Arial" w:hAnsi="Arial" w:cs="Arial"/>
+                <w:color w:val="4D5156"/>
+                <w:sz w:val="20"/>
+                <w:szCs w:val="20"/>
+                <w:shd w:val="clear" w:color="auto" w:fill="FFFFFF"/>
+              </w:rPr>
+              <w:t>costantinodellagherardesca</w:t>
+            </w:r>
           </w:p>
         </w:tc>
         <w:tc>
@@ -4845,7 +4848,7 @@
     <w:p>
       <w:pPr>
         <w:rPr>
-          <w:rFonts w:ascii="KaiTi" w:eastAsia="KaiTi" w:hAnsi="KaiTi" w:hint="eastAsia"/>
+          <w:rFonts w:ascii="KaiTi" w:eastAsia="KaiTi" w:hAnsi="KaiTi"/>
           <w:b/>
           <w:sz w:val="28"/>
           <w:szCs w:val="28"/>
@@ -5040,7 +5043,7 @@
               <w:spacing w:line="300" w:lineRule="exact"/>
               <w:jc w:val="center"/>
               <w:rPr>
-                <w:rFonts w:ascii="KaiTi" w:eastAsia="KaiTi" w:hAnsi="KaiTi" w:hint="eastAsia"/>
+                <w:rFonts w:ascii="KaiTi" w:eastAsia="KaiTi" w:hAnsi="KaiTi"/>
                 <w:sz w:val="26"/>
                 <w:szCs w:val="26"/>
               </w:rPr>
@@ -5090,7 +5093,7 @@
               <w:spacing w:line="300" w:lineRule="exact"/>
               <w:jc w:val="center"/>
               <w:rPr>
-                <w:rFonts w:ascii="KaiTi" w:eastAsia="KaiTi" w:hAnsi="KaiTi" w:hint="eastAsia"/>
+                <w:rFonts w:ascii="KaiTi" w:eastAsia="KaiTi" w:hAnsi="KaiTi"/>
                 <w:sz w:val="26"/>
                 <w:szCs w:val="26"/>
               </w:rPr>
@@ -5124,7 +5127,7 @@
               <w:spacing w:line="300" w:lineRule="exact"/>
               <w:jc w:val="center"/>
               <w:rPr>
-                <w:rFonts w:ascii="KaiTi" w:eastAsia="KaiTi" w:hAnsi="KaiTi" w:hint="eastAsia"/>
+                <w:rFonts w:ascii="KaiTi" w:eastAsia="KaiTi" w:hAnsi="KaiTi"/>
                 <w:sz w:val="26"/>
                 <w:szCs w:val="26"/>
               </w:rPr>
@@ -5691,41 +5694,63 @@
     </w:p>
     <w:tbl>
       <w:tblPr>
-        <w:tblW w:w="8789" w:type="dxa"/>
-        <w:tblCellSpacing w:w="20" w:type="dxa"/>
-        <w:tblInd w:w="163" w:type="dxa"/>
+        <w:tblW w:w="4891" w:type="pct"/>
+        <w:tblInd w:w="108" w:type="dxa"/>
         <w:tblBorders>
-          <w:top w:val="outset" w:sz="6" w:space="0" w:color="auto"/>
-          <w:left w:val="outset" w:sz="6" w:space="0" w:color="auto"/>
-          <w:bottom w:val="outset" w:sz="6" w:space="0" w:color="auto"/>
-          <w:right w:val="outset" w:sz="6" w:space="0" w:color="auto"/>
-          <w:insideH w:val="outset" w:sz="6" w:space="0" w:color="auto"/>
-          <w:insideV w:val="outset" w:sz="6" w:space="0" w:color="auto"/>
+          <w:top w:val="single" w:sz="4" w:space="0" w:color="auto"/>
+          <w:left w:val="single" w:sz="4" w:space="0" w:color="auto"/>
+          <w:bottom w:val="single" w:sz="4" w:space="0" w:color="auto"/>
+          <w:right w:val="single" w:sz="4" w:space="0" w:color="auto"/>
+          <w:insideH w:val="single" w:sz="4" w:space="0" w:color="auto"/>
+          <w:insideV w:val="single" w:sz="4" w:space="0" w:color="auto"/>
         </w:tblBorders>
-        <w:tblLook w:val="04A0" w:firstRow="1" w:lastRow="0" w:firstColumn="1" w:lastColumn="0" w:noHBand="0" w:noVBand="1"/>
+        <w:tblLook w:val="01E0" w:firstRow="1" w:lastRow="1" w:firstColumn="1" w:lastColumn="1" w:noHBand="0" w:noVBand="0"/>
       </w:tblPr>
       <w:tblGrid>
-        <w:gridCol w:w="2127"/>
-        <w:gridCol w:w="3969"/>
-        <w:gridCol w:w="2693"/>
+        <w:gridCol w:w="1890"/>
+        <w:gridCol w:w="5039"/>
+        <w:gridCol w:w="1878"/>
       </w:tblGrid>
       <w:tr>
-        <w:trPr>
-          <w:tblCellSpacing w:w="20" w:type="dxa"/>
-        </w:trPr>
-        <w:tc>
-          <w:tcPr>
-            <w:tcW w:w="2067" w:type="dxa"/>
+        <w:tc>
+          <w:tcPr>
+            <w:tcW w:w="1073" w:type="pct"/>
             <w:vAlign w:val="center"/>
           </w:tcPr>
           <w:p>
             <w:pPr>
+              <w:spacing w:line="300" w:lineRule="exact"/>
               <w:jc w:val="center"/>
+              <w:rPr>
+                <w:rFonts w:ascii="KaiTi" w:eastAsia="KaiTi" w:hAnsi="KaiTi"/>
+                <w:sz w:val="26"/>
+                <w:szCs w:val="26"/>
+              </w:rPr>
+            </w:pPr>
+            <w:r>
               <w:rPr>
                 <w:rFonts w:ascii="KaiTi" w:eastAsia="KaiTi" w:hAnsi="KaiTi" w:hint="eastAsia"/>
                 <w:bCs/>
                 <w:lang w:val="fr-FR"/>
               </w:rPr>
+              <w:t>日期</w:t>
+            </w:r>
+          </w:p>
+        </w:tc>
+        <w:tc>
+          <w:tcPr>
+            <w:tcW w:w="2861" w:type="pct"/>
+            <w:vAlign w:val="center"/>
+          </w:tcPr>
+          <w:p>
+            <w:pPr>
+              <w:spacing w:line="300" w:lineRule="exact"/>
+              <w:jc w:val="center"/>
+              <w:rPr>
+                <w:rFonts w:ascii="KaiTi" w:eastAsia="KaiTi" w:hAnsi="KaiTi"/>
+                <w:sz w:val="26"/>
+                <w:szCs w:val="26"/>
+              </w:rPr>
             </w:pPr>
             <w:r>
               <w:rPr>
@@ -5733,46 +5758,23 @@
                 <w:bCs/>
                 <w:lang w:val="fr-FR"/>
               </w:rPr>
-              <w:t>日期</w:t>
-            </w:r>
-          </w:p>
-        </w:tc>
-        <w:tc>
-          <w:tcPr>
-            <w:tcW w:w="3929" w:type="dxa"/>
+              <w:t>建議行程</w:t>
+            </w:r>
+          </w:p>
+        </w:tc>
+        <w:tc>
+          <w:tcPr>
+            <w:tcW w:w="1066" w:type="pct"/>
             <w:vAlign w:val="center"/>
           </w:tcPr>
           <w:p>
             <w:pPr>
+              <w:spacing w:line="300" w:lineRule="exact"/>
               <w:jc w:val="center"/>
               <w:rPr>
                 <w:rFonts w:ascii="KaiTi" w:eastAsia="KaiTi" w:hAnsi="KaiTi"/>
-                <w:bCs/>
-                <w:lang w:val="fr-FR"/>
-              </w:rPr>
-            </w:pPr>
-            <w:r>
-              <w:rPr>
-                <w:rFonts w:ascii="KaiTi" w:eastAsia="KaiTi" w:hAnsi="KaiTi" w:hint="eastAsia"/>
-                <w:bCs/>
-                <w:lang w:val="fr-FR"/>
-              </w:rPr>
-              <w:t>建議行程</w:t>
-            </w:r>
-          </w:p>
-        </w:tc>
-        <w:tc>
-          <w:tcPr>
-            <w:tcW w:w="2633" w:type="dxa"/>
-            <w:vAlign w:val="center"/>
-          </w:tcPr>
-          <w:p>
-            <w:pPr>
-              <w:jc w:val="center"/>
-              <w:rPr>
-                <w:rFonts w:ascii="KaiTi" w:eastAsia="KaiTi" w:hAnsi="KaiTi"/>
-                <w:bCs/>
-                <w:lang w:val="fr-FR"/>
+                <w:sz w:val="26"/>
+                <w:szCs w:val="26"/>
               </w:rPr>
             </w:pPr>
             <w:r>
@@ -5788,11 +5790,11 @@
       </w:tr>
       <w:tr>
         <w:trPr>
-          <w:tblCellSpacing w:w="20" w:type="dxa"/>
+          <w:trHeight w:val="720"/>
         </w:trPr>
         <w:tc>
           <w:tcPr>
-            <w:tcW w:w="2067" w:type="dxa"/>
+            <w:tcW w:w="1073" w:type="pct"/>
           </w:tcPr>
           <w:p>
             <w:pPr>
@@ -5825,37 +5827,35 @@
         </w:tc>
         <w:tc>
           <w:tcPr>
-            <w:tcW w:w="3929" w:type="dxa"/>
-          </w:tcPr>
-          <w:p>
-            <w:pPr>
+            <w:tcW w:w="2861" w:type="pct"/>
+          </w:tcPr>
+          <w:p>
+            <w:pPr>
+              <w:jc w:val="center"/>
+              <w:rPr>
+                <w:rFonts w:ascii="Calibri" w:eastAsia="DFKai-SB" w:hAnsi="Calibri"/>
+              </w:rPr>
+            </w:pPr>
+            <w:r>
               <w:rPr>
                 <w:rFonts w:ascii="Calibri" w:hAnsi="Calibri"/>
                 <w:b/>
                 <w:color w:val="0070C0"/>
                 <w:lang w:val="fr-FR"/>
               </w:rPr>
-            </w:pPr>
-            <w:r>
-              <w:rPr>
-                <w:rFonts w:ascii="Calibri" w:hAnsi="Calibri"/>
-                <w:b/>
-                <w:color w:val="0070C0"/>
-                <w:lang w:val="fr-FR"/>
-              </w:rPr>
               <w:t>MXP-TPE BR096</w:t>
             </w:r>
           </w:p>
         </w:tc>
         <w:tc>
           <w:tcPr>
-            <w:tcW w:w="2633" w:type="dxa"/>
-          </w:tcPr>
-          <w:p>
-            <w:pPr>
+            <w:tcW w:w="1066" w:type="pct"/>
+          </w:tcPr>
+          <w:p>
+            <w:pPr>
+              <w:jc w:val="center"/>
               <w:rPr>
                 <w:rFonts w:ascii="Calibri" w:eastAsia="DFKai-SB" w:hAnsi="Calibri"/>
-                <w:lang w:val="fr-FR"/>
               </w:rPr>
             </w:pPr>
             <w:r>
@@ -5870,11 +5870,17 @@
       </w:tr>
       <w:tr>
         <w:trPr>
-          <w:tblCellSpacing w:w="20" w:type="dxa"/>
+          <w:trHeight w:val="720"/>
         </w:trPr>
         <w:tc>
           <w:tcPr>
-            <w:tcW w:w="2067" w:type="dxa"/>
+            <w:tcW w:w="1073" w:type="pct"/>
+            <w:tcBorders>
+              <w:top w:val="single" w:sz="4" w:space="0" w:color="auto"/>
+              <w:left w:val="single" w:sz="4" w:space="0" w:color="auto"/>
+              <w:bottom w:val="single" w:sz="4" w:space="0" w:color="auto"/>
+              <w:right w:val="single" w:sz="4" w:space="0" w:color="auto"/>
+            </w:tcBorders>
           </w:tcPr>
           <w:p>
             <w:pPr>
@@ -5903,25 +5909,25 @@
               <w:rPr>
                 <w:rFonts w:ascii="Calibri" w:eastAsia="DFKai-SB" w:hAnsi="Calibri"/>
               </w:rPr>
-              <w:t>Thu</w:t>
+              <w:t xml:space="preserve">Thu </w:t>
             </w:r>
             <w:r>
               <w:rPr>
                 <w:rFonts w:ascii="Calibri" w:eastAsia="DFKai-SB" w:hAnsi="Calibri"/>
               </w:rPr>
-              <w:t xml:space="preserve"> </w:t>
-            </w:r>
-            <w:r>
-              <w:rPr>
-                <w:rFonts w:ascii="Calibri" w:eastAsia="DFKai-SB" w:hAnsi="Calibri"/>
-              </w:rPr>
               <w:t>(Day 1)</w:t>
             </w:r>
           </w:p>
         </w:tc>
         <w:tc>
           <w:tcPr>
-            <w:tcW w:w="3929" w:type="dxa"/>
+            <w:tcW w:w="2861" w:type="pct"/>
+            <w:tcBorders>
+              <w:top w:val="single" w:sz="4" w:space="0" w:color="auto"/>
+              <w:left w:val="single" w:sz="4" w:space="0" w:color="auto"/>
+              <w:bottom w:val="single" w:sz="4" w:space="0" w:color="auto"/>
+              <w:right w:val="single" w:sz="4" w:space="0" w:color="auto"/>
+            </w:tcBorders>
           </w:tcPr>
           <w:p>
             <w:pPr>
@@ -5929,7 +5935,7 @@
                 <w:tab w:val="center" w:pos="4153"/>
                 <w:tab w:val="right" w:pos="8306"/>
               </w:tabs>
-              <w:ind w:left="602" w:hangingChars="250" w:hanging="602"/>
+              <w:ind w:left="601" w:hangingChars="250" w:hanging="601"/>
               <w:jc w:val="both"/>
               <w:rPr>
                 <w:rFonts w:ascii="Calibri" w:hAnsi="Calibri"/>
@@ -5963,16 +5969,7 @@
                 <w:color w:val="0070C0"/>
                 <w:lang w:val="en-US"/>
               </w:rPr>
-              <w:t>2</w:t>
-            </w:r>
-            <w:r>
-              <w:rPr>
-                <w:rFonts w:ascii="Calibri" w:hAnsi="Calibri"/>
-                <w:b/>
-                <w:color w:val="0070C0"/>
-                <w:lang w:val="en-US"/>
-              </w:rPr>
-              <w:t>0</w:t>
+              <w:t>20</w:t>
             </w:r>
             <w:r>
               <w:rPr>
@@ -6005,12 +6002,7 @@
           </w:p>
           <w:p>
             <w:pPr>
-              <w:tabs>
-                <w:tab w:val="center" w:pos="4153"/>
-                <w:tab w:val="right" w:pos="8306"/>
-              </w:tabs>
-              <w:ind w:left="600" w:hangingChars="250" w:hanging="600"/>
-              <w:jc w:val="both"/>
+              <w:jc w:val="center"/>
               <w:rPr>
                 <w:rFonts w:ascii="Calibri" w:eastAsia="DFKai-SB" w:hAnsi="Calibri"/>
               </w:rPr>
@@ -6019,7 +6011,13 @@
         </w:tc>
         <w:tc>
           <w:tcPr>
-            <w:tcW w:w="2633" w:type="dxa"/>
+            <w:tcW w:w="1066" w:type="pct"/>
+            <w:tcBorders>
+              <w:top w:val="single" w:sz="4" w:space="0" w:color="auto"/>
+              <w:left w:val="single" w:sz="4" w:space="0" w:color="auto"/>
+              <w:bottom w:val="single" w:sz="4" w:space="0" w:color="auto"/>
+              <w:right w:val="single" w:sz="4" w:space="0" w:color="auto"/>
+            </w:tcBorders>
           </w:tcPr>
           <w:p>
             <w:pPr>
@@ -6037,13 +6035,7 @@
               <w:rPr>
                 <w:rFonts w:ascii="Calibri" w:eastAsia="DFKai-SB" w:hAnsi="Calibri"/>
               </w:rPr>
-              <w:t>Sun Moon Lake</w:t>
-            </w:r>
-            <w:r>
-              <w:rPr>
-                <w:rFonts w:ascii="Calibri" w:eastAsia="DFKai-SB" w:hAnsi="Calibri"/>
-              </w:rPr>
-              <w:t xml:space="preserve"> </w:t>
+              <w:t xml:space="preserve">Sun Moon Lake </w:t>
             </w:r>
           </w:p>
           <w:p>
@@ -6067,6 +6059,80 @@
           </w:p>
           <w:p>
             <w:pPr>
+              <w:jc w:val="center"/>
+              <w:rPr>
+                <w:rFonts w:ascii="Calibri" w:eastAsia="DFKai-SB" w:hAnsi="Calibri"/>
+                <w:b/>
+                <w:color w:val="0070C0"/>
+                <w:u w:val="single"/>
+              </w:rPr>
+            </w:pPr>
+          </w:p>
+        </w:tc>
+      </w:tr>
+      <w:tr>
+        <w:trPr>
+          <w:trHeight w:val="720"/>
+        </w:trPr>
+        <w:tc>
+          <w:tcPr>
+            <w:tcW w:w="1073" w:type="pct"/>
+            <w:tcBorders>
+              <w:top w:val="single" w:sz="4" w:space="0" w:color="auto"/>
+              <w:left w:val="single" w:sz="4" w:space="0" w:color="auto"/>
+              <w:bottom w:val="single" w:sz="4" w:space="0" w:color="auto"/>
+              <w:right w:val="single" w:sz="4" w:space="0" w:color="auto"/>
+            </w:tcBorders>
+          </w:tcPr>
+          <w:p>
+            <w:pPr>
+              <w:jc w:val="center"/>
+              <w:rPr>
+                <w:rFonts w:ascii="Calibri" w:eastAsia="DFKai-SB" w:hAnsi="Calibri"/>
+                <w:lang w:val="fr-FR"/>
+              </w:rPr>
+            </w:pPr>
+          </w:p>
+        </w:tc>
+        <w:tc>
+          <w:tcPr>
+            <w:tcW w:w="2861" w:type="pct"/>
+            <w:tcBorders>
+              <w:top w:val="single" w:sz="4" w:space="0" w:color="auto"/>
+              <w:left w:val="single" w:sz="4" w:space="0" w:color="auto"/>
+              <w:bottom w:val="single" w:sz="4" w:space="0" w:color="auto"/>
+              <w:right w:val="single" w:sz="4" w:space="0" w:color="auto"/>
+            </w:tcBorders>
+          </w:tcPr>
+          <w:p>
+            <w:pPr>
+              <w:tabs>
+                <w:tab w:val="center" w:pos="4153"/>
+                <w:tab w:val="right" w:pos="8306"/>
+              </w:tabs>
+              <w:ind w:left="601" w:hangingChars="250" w:hanging="601"/>
+              <w:jc w:val="both"/>
+              <w:rPr>
+                <w:rFonts w:ascii="Calibri" w:hAnsi="Calibri"/>
+                <w:b/>
+                <w:color w:val="0070C0"/>
+                <w:lang w:val="en-US"/>
+              </w:rPr>
+            </w:pPr>
+          </w:p>
+        </w:tc>
+        <w:tc>
+          <w:tcPr>
+            <w:tcW w:w="1066" w:type="pct"/>
+            <w:tcBorders>
+              <w:top w:val="single" w:sz="4" w:space="0" w:color="auto"/>
+              <w:left w:val="single" w:sz="4" w:space="0" w:color="auto"/>
+              <w:bottom w:val="single" w:sz="4" w:space="0" w:color="auto"/>
+              <w:right w:val="single" w:sz="4" w:space="0" w:color="auto"/>
+            </w:tcBorders>
+          </w:tcPr>
+          <w:p>
+            <w:pPr>
               <w:tabs>
                 <w:tab w:val="center" w:pos="4153"/>
                 <w:tab w:val="right" w:pos="8306"/>
@@ -6074,541 +6140,9 @@
               <w:ind w:left="720" w:hangingChars="300" w:hanging="720"/>
               <w:jc w:val="both"/>
               <w:rPr>
-                <w:rFonts w:eastAsia="DFKai-SB" w:hAnsi="Calibri"/>
-                <w:lang w:val="fr-FR"/>
-              </w:rPr>
-            </w:pPr>
-          </w:p>
-        </w:tc>
-      </w:tr>
-      <w:tr>
-        <w:trPr>
-          <w:tblCellSpacing w:w="20" w:type="dxa"/>
-        </w:trPr>
-        <w:tc>
-          <w:tcPr>
-            <w:tcW w:w="2067" w:type="dxa"/>
-          </w:tcPr>
-          <w:p>
-            <w:pPr>
-              <w:jc w:val="center"/>
-              <w:rPr>
                 <w:rFonts w:ascii="Calibri" w:eastAsia="DFKai-SB" w:hAnsi="Calibri"/>
-                <w:lang w:val="fr-FR"/>
-              </w:rPr>
-            </w:pPr>
-            <w:r>
-              <w:rPr>
-                <w:rFonts w:ascii="Calibri" w:eastAsia="DFKai-SB" w:hAnsi="Calibri"/>
-                <w:lang w:val="fr-FR"/>
-              </w:rPr>
-              <w:t>9th August</w:t>
-            </w:r>
-          </w:p>
-          <w:p>
-            <w:pPr>
-              <w:jc w:val="center"/>
-              <w:rPr>
-                <w:rFonts w:ascii="Calibri" w:eastAsia="DFKai-SB" w:hAnsi="Calibri"/>
-              </w:rPr>
-            </w:pPr>
-            <w:r>
-              <w:rPr>
-                <w:rFonts w:ascii="Calibri" w:eastAsia="DFKai-SB" w:hAnsi="Calibri"/>
-                <w:lang w:val="fr-FR"/>
-              </w:rPr>
-              <w:t xml:space="preserve">Fri </w:t>
-            </w:r>
-            <w:r>
-              <w:rPr>
-                <w:rFonts w:ascii="Calibri" w:eastAsia="DFKai-SB" w:hAnsi="Calibri"/>
-              </w:rPr>
-              <w:t>(Day 2)</w:t>
-            </w:r>
-          </w:p>
-        </w:tc>
-        <w:tc>
-          <w:tcPr>
-            <w:tcW w:w="3929" w:type="dxa"/>
-          </w:tcPr>
-          <w:p>
-            <w:r>
-              <w:t xml:space="preserve">Sun Moon Lake </w:t>
-            </w:r>
-          </w:p>
-          <w:p>
-            <w:r>
-              <w:t>Hanbi Trail-&gt;Chiang-Kai-Shek Pier</w:t>
-            </w:r>
-          </w:p>
-          <w:p>
-            <w:pPr>
-              <w:rPr>
-                <w:rFonts w:ascii="Calibri" w:eastAsia="DFKai-SB" w:hAnsi="Calibri" w:hint="eastAsia"/>
-                <w:lang w:val="fr-FR"/>
-              </w:rPr>
-            </w:pPr>
-            <w:r>
-              <w:t>Afternoon:</w:t>
-            </w:r>
-            <w:r>
-              <w:t>Boat tour Shuishe Pier-&gt;</w:t>
-            </w:r>
-            <w:r>
-              <w:rPr>
-                <w:rFonts w:hint="eastAsia"/>
-              </w:rPr>
-              <w:t>W</w:t>
-            </w:r>
-            <w:r>
-              <w:t>enwu Temple Steps</w:t>
-            </w:r>
-            <w:r>
-              <w:t>-&gt;Xuanzang Temple-&gt;Cien Pagoda</w:t>
-            </w:r>
-            <w:r>
-              <w:t>-&gt;Return to hotel</w:t>
-            </w:r>
-          </w:p>
-        </w:tc>
-        <w:tc>
-          <w:tcPr>
-            <w:tcW w:w="2633" w:type="dxa"/>
-          </w:tcPr>
-          <w:p>
-            <w:pPr>
-              <w:tabs>
-                <w:tab w:val="center" w:pos="4153"/>
-                <w:tab w:val="right" w:pos="8306"/>
-              </w:tabs>
-              <w:ind w:left="720" w:hangingChars="300" w:hanging="720"/>
-              <w:jc w:val="both"/>
-              <w:rPr>
-                <w:rFonts w:ascii="Calibri" w:eastAsia="DFKai-SB" w:hAnsi="Calibri"/>
-              </w:rPr>
-            </w:pPr>
-            <w:r>
-              <w:rPr>
-                <w:rFonts w:ascii="Calibri" w:eastAsia="DFKai-SB" w:hAnsi="Calibri"/>
-              </w:rPr>
-              <w:t xml:space="preserve">Sun Moon Lake </w:t>
-            </w:r>
-          </w:p>
-          <w:p>
-            <w:pPr>
-              <w:tabs>
-                <w:tab w:val="center" w:pos="4153"/>
-                <w:tab w:val="right" w:pos="8306"/>
-              </w:tabs>
-              <w:ind w:left="720" w:hangingChars="300" w:hanging="720"/>
-              <w:jc w:val="both"/>
-              <w:rPr>
-                <w:rFonts w:ascii="Calibri" w:eastAsia="DFKai-SB" w:hAnsi="Calibri"/>
-              </w:rPr>
-            </w:pPr>
-            <w:r>
-              <w:rPr>
-                <w:rFonts w:ascii="Calibri" w:eastAsia="DFKai-SB" w:hAnsi="Calibri"/>
-              </w:rPr>
-              <w:t>(The Lalu)</w:t>
-            </w:r>
-          </w:p>
-        </w:tc>
-      </w:tr>
-      <w:tr>
-        <w:trPr>
-          <w:tblCellSpacing w:w="20" w:type="dxa"/>
-        </w:trPr>
-        <w:tc>
-          <w:tcPr>
-            <w:tcW w:w="2067" w:type="dxa"/>
-          </w:tcPr>
-          <w:p>
-            <w:pPr>
-              <w:jc w:val="center"/>
-              <w:rPr>
-                <w:rFonts w:ascii="Calibri" w:eastAsia="DFKai-SB" w:hAnsi="Calibri"/>
-                <w:lang w:val="fr-FR"/>
-              </w:rPr>
-            </w:pPr>
-            <w:r>
-              <w:rPr>
-                <w:rFonts w:ascii="Calibri" w:eastAsia="DFKai-SB" w:hAnsi="Calibri"/>
-                <w:lang w:val="fr-FR"/>
-              </w:rPr>
-              <w:t>10th August</w:t>
-            </w:r>
-          </w:p>
-          <w:p>
-            <w:pPr>
-              <w:jc w:val="center"/>
-              <w:rPr>
-                <w:rFonts w:ascii="Calibri" w:eastAsia="DFKai-SB" w:hAnsi="Calibri"/>
-                <w:lang w:val="fr-FR"/>
-              </w:rPr>
-            </w:pPr>
-            <w:r>
-              <w:rPr>
-                <w:rFonts w:ascii="Calibri" w:eastAsia="DFKai-SB" w:hAnsi="Calibri"/>
-                <w:lang w:val="fr-FR"/>
-              </w:rPr>
-              <w:t xml:space="preserve">Sat </w:t>
-            </w:r>
-            <w:r>
-              <w:rPr>
-                <w:rFonts w:ascii="Calibri" w:eastAsia="DFKai-SB" w:hAnsi="Calibri"/>
-                <w:lang w:val="fr-FR"/>
-              </w:rPr>
-              <w:t xml:space="preserve">(Day </w:t>
-            </w:r>
-            <w:r>
-              <w:rPr>
-                <w:rFonts w:ascii="Calibri" w:eastAsia="DFKai-SB" w:hAnsi="Calibri"/>
-                <w:lang w:val="fr-FR"/>
-              </w:rPr>
-              <w:t>3</w:t>
-            </w:r>
-            <w:r>
-              <w:rPr>
-                <w:rFonts w:ascii="Calibri" w:eastAsia="DFKai-SB" w:hAnsi="Calibri"/>
-                <w:lang w:val="fr-FR"/>
-              </w:rPr>
-              <w:t>)</w:t>
-            </w:r>
-          </w:p>
-        </w:tc>
-        <w:tc>
-          <w:tcPr>
-            <w:tcW w:w="3929" w:type="dxa"/>
-          </w:tcPr>
-          <w:p>
-            <w:pPr>
-              <w:rPr>
-                <w:rFonts w:ascii="Calibri" w:eastAsia="DFKai-SB" w:hAnsi="Calibri"/>
-                <w:lang w:val="en-US"/>
-              </w:rPr>
-            </w:pPr>
-            <w:r>
-              <w:rPr>
-                <w:rFonts w:ascii="Calibri" w:eastAsia="DFKai-SB" w:hAnsi="Calibri"/>
-                <w:lang w:val="en-US"/>
-              </w:rPr>
-              <w:t>11:00 Hotel Check-out</w:t>
-            </w:r>
-          </w:p>
-          <w:p>
-            <w:pPr>
-              <w:rPr>
-                <w:rFonts w:ascii="Calibri" w:eastAsia="DFKai-SB" w:hAnsi="Calibri"/>
-                <w:lang w:val="en-US"/>
-              </w:rPr>
-            </w:pPr>
-            <w:r>
-              <w:rPr>
-                <w:rFonts w:ascii="Calibri" w:eastAsia="DFKai-SB" w:hAnsi="Calibri"/>
-                <w:lang w:val="en-US"/>
-              </w:rPr>
-              <w:t>Transfer to Taipei</w:t>
-            </w:r>
-          </w:p>
-          <w:p>
-            <w:pPr>
-              <w:rPr>
-                <w:rFonts w:ascii="Calibri" w:eastAsia="DFKai-SB" w:hAnsi="Calibri"/>
-                <w:lang w:val="en-US"/>
-              </w:rPr>
-            </w:pPr>
-            <w:r>
-              <w:rPr>
-                <w:rFonts w:ascii="Calibri" w:eastAsia="DFKai-SB" w:hAnsi="Calibri"/>
-                <w:lang w:val="en-US"/>
-              </w:rPr>
-              <w:t xml:space="preserve">Hotel Check-in upon arrival </w:t>
-            </w:r>
-          </w:p>
-        </w:tc>
-        <w:tc>
-          <w:tcPr>
-            <w:tcW w:w="2633" w:type="dxa"/>
-          </w:tcPr>
-          <w:p>
-            <w:pPr>
-              <w:tabs>
-                <w:tab w:val="center" w:pos="4153"/>
-                <w:tab w:val="right" w:pos="8306"/>
-              </w:tabs>
-              <w:ind w:left="720" w:hangingChars="300" w:hanging="720"/>
-              <w:jc w:val="both"/>
-              <w:rPr>
-                <w:rFonts w:ascii="Calibri" w:eastAsia="DFKai-SB" w:hAnsi="Calibri"/>
-              </w:rPr>
-            </w:pPr>
-            <w:r>
-              <w:rPr>
-                <w:rFonts w:ascii="Calibri" w:eastAsia="DFKai-SB" w:hAnsi="Calibri"/>
-              </w:rPr>
-              <w:t>Taipei</w:t>
-            </w:r>
-          </w:p>
-        </w:tc>
-      </w:tr>
-      <w:tr>
-        <w:trPr>
-          <w:tblCellSpacing w:w="20" w:type="dxa"/>
-        </w:trPr>
-        <w:tc>
-          <w:tcPr>
-            <w:tcW w:w="2067" w:type="dxa"/>
-            <w:tcBorders>
-              <w:top w:val="outset" w:sz="6" w:space="0" w:color="auto"/>
-              <w:left w:val="outset" w:sz="6" w:space="0" w:color="auto"/>
-              <w:bottom w:val="outset" w:sz="6" w:space="0" w:color="auto"/>
-              <w:right w:val="outset" w:sz="6" w:space="0" w:color="auto"/>
-            </w:tcBorders>
-          </w:tcPr>
-          <w:p>
-            <w:pPr>
-              <w:jc w:val="center"/>
-              <w:rPr>
-                <w:rFonts w:ascii="Calibri" w:eastAsia="DFKai-SB" w:hAnsi="Calibri"/>
-                <w:lang w:val="fr-FR"/>
-              </w:rPr>
-            </w:pPr>
-            <w:r>
-              <w:rPr>
-                <w:rFonts w:ascii="Calibri" w:eastAsia="DFKai-SB" w:hAnsi="Calibri"/>
-                <w:lang w:val="fr-FR"/>
-              </w:rPr>
-              <w:t>11th August</w:t>
-            </w:r>
-          </w:p>
-          <w:p>
-            <w:pPr>
-              <w:jc w:val="center"/>
-              <w:rPr>
-                <w:rFonts w:ascii="Calibri" w:eastAsia="DFKai-SB" w:hAnsi="Calibri"/>
-                <w:lang w:val="fr-FR"/>
-              </w:rPr>
-            </w:pPr>
-            <w:r>
-              <w:rPr>
-                <w:rFonts w:ascii="Calibri" w:eastAsia="DFKai-SB" w:hAnsi="Calibri"/>
-                <w:lang w:val="fr-FR"/>
-              </w:rPr>
-              <w:t>Fri (Day 4)</w:t>
-            </w:r>
-          </w:p>
-        </w:tc>
-        <w:tc>
-          <w:tcPr>
-            <w:tcW w:w="3929" w:type="dxa"/>
-            <w:tcBorders>
-              <w:top w:val="outset" w:sz="6" w:space="0" w:color="auto"/>
-              <w:left w:val="outset" w:sz="6" w:space="0" w:color="auto"/>
-              <w:bottom w:val="outset" w:sz="6" w:space="0" w:color="auto"/>
-              <w:right w:val="outset" w:sz="6" w:space="0" w:color="auto"/>
-            </w:tcBorders>
-          </w:tcPr>
-          <w:p>
-            <w:pPr>
-              <w:rPr>
-                <w:lang w:val="en-GB"/>
-              </w:rPr>
-            </w:pPr>
-            <w:r>
-              <w:rPr>
-                <w:lang w:val="en-GB"/>
-              </w:rPr>
-              <w:t>Visit Taipei101</w:t>
-            </w:r>
-          </w:p>
-          <w:p>
-            <w:r>
-              <w:rPr>
-                <w:lang w:val="en-GB"/>
-              </w:rPr>
-              <w:t>Free time for own research</w:t>
-            </w:r>
-          </w:p>
-        </w:tc>
-        <w:tc>
-          <w:tcPr>
-            <w:tcW w:w="2633" w:type="dxa"/>
-            <w:tcBorders>
-              <w:top w:val="outset" w:sz="6" w:space="0" w:color="auto"/>
-              <w:left w:val="outset" w:sz="6" w:space="0" w:color="auto"/>
-              <w:bottom w:val="outset" w:sz="6" w:space="0" w:color="auto"/>
-              <w:right w:val="outset" w:sz="6" w:space="0" w:color="auto"/>
-            </w:tcBorders>
-          </w:tcPr>
-          <w:p>
-            <w:pPr>
-              <w:tabs>
-                <w:tab w:val="center" w:pos="4153"/>
-                <w:tab w:val="right" w:pos="8306"/>
-              </w:tabs>
-              <w:ind w:left="720" w:hangingChars="300" w:hanging="720"/>
-              <w:rPr>
-                <w:rFonts w:ascii="Calibri" w:eastAsia="DFKai-SB" w:hAnsi="Calibri"/>
-                <w:lang w:val="fr-FR"/>
-              </w:rPr>
-            </w:pPr>
-            <w:r>
-              <w:rPr>
-                <w:rFonts w:ascii="Calibri" w:eastAsia="DFKai-SB" w:hAnsi="Calibri"/>
-                <w:lang w:val="fr-FR"/>
-              </w:rPr>
-              <w:t>Taipei</w:t>
-            </w:r>
-          </w:p>
-          <w:p>
-            <w:pPr>
-              <w:tabs>
-                <w:tab w:val="center" w:pos="4153"/>
-                <w:tab w:val="right" w:pos="8306"/>
-              </w:tabs>
-              <w:rPr>
-                <w:rFonts w:ascii="Calibri" w:eastAsia="DFKai-SB" w:hAnsi="Calibri"/>
-                <w:lang w:val="fr-FR"/>
-              </w:rPr>
-            </w:pPr>
-          </w:p>
-        </w:tc>
-      </w:tr>
-      <w:tr>
-        <w:trPr>
-          <w:tblCellSpacing w:w="20" w:type="dxa"/>
-        </w:trPr>
-        <w:tc>
-          <w:tcPr>
-            <w:tcW w:w="2067" w:type="dxa"/>
-            <w:tcBorders>
-              <w:top w:val="outset" w:sz="6" w:space="0" w:color="auto"/>
-              <w:left w:val="outset" w:sz="6" w:space="0" w:color="auto"/>
-              <w:bottom w:val="outset" w:sz="6" w:space="0" w:color="auto"/>
-              <w:right w:val="outset" w:sz="6" w:space="0" w:color="auto"/>
-            </w:tcBorders>
-          </w:tcPr>
-          <w:p>
-            <w:pPr>
-              <w:jc w:val="center"/>
-              <w:rPr>
-                <w:rFonts w:ascii="Calibri" w:eastAsia="DFKai-SB" w:hAnsi="Calibri"/>
-                <w:lang w:val="fr-FR"/>
-              </w:rPr>
-            </w:pPr>
-            <w:r>
-              <w:rPr>
-                <w:rFonts w:ascii="Calibri" w:eastAsia="DFKai-SB" w:hAnsi="Calibri"/>
-                <w:lang w:val="fr-FR"/>
-              </w:rPr>
-              <w:t>12th August</w:t>
-            </w:r>
-          </w:p>
-          <w:p>
-            <w:pPr>
-              <w:jc w:val="center"/>
-              <w:rPr>
-                <w:rFonts w:ascii="Calibri" w:eastAsia="DFKai-SB" w:hAnsi="Calibri"/>
-                <w:lang w:val="fr-FR"/>
-              </w:rPr>
-            </w:pPr>
-            <w:r>
-              <w:rPr>
-                <w:rFonts w:ascii="Calibri" w:eastAsia="DFKai-SB" w:hAnsi="Calibri"/>
-                <w:lang w:val="fr-FR"/>
-              </w:rPr>
-              <w:t xml:space="preserve">Sat </w:t>
-            </w:r>
-            <w:r>
-              <w:rPr>
-                <w:rFonts w:ascii="Calibri" w:eastAsia="DFKai-SB" w:hAnsi="Calibri"/>
-                <w:lang w:val="fr-FR"/>
-              </w:rPr>
-              <w:t xml:space="preserve">(Day </w:t>
-            </w:r>
-            <w:r>
-              <w:rPr>
-                <w:rFonts w:ascii="Calibri" w:eastAsia="DFKai-SB" w:hAnsi="Calibri"/>
-                <w:lang w:val="fr-FR"/>
-              </w:rPr>
-              <w:t>5</w:t>
-            </w:r>
-            <w:r>
-              <w:rPr>
-                <w:rFonts w:ascii="Calibri" w:eastAsia="DFKai-SB" w:hAnsi="Calibri"/>
-                <w:lang w:val="fr-FR"/>
-              </w:rPr>
-              <w:t>)</w:t>
-            </w:r>
-          </w:p>
-        </w:tc>
-        <w:tc>
-          <w:tcPr>
-            <w:tcW w:w="3929" w:type="dxa"/>
-            <w:tcBorders>
-              <w:top w:val="outset" w:sz="6" w:space="0" w:color="auto"/>
-              <w:left w:val="outset" w:sz="6" w:space="0" w:color="auto"/>
-              <w:bottom w:val="outset" w:sz="6" w:space="0" w:color="auto"/>
-              <w:right w:val="outset" w:sz="6" w:space="0" w:color="auto"/>
-            </w:tcBorders>
-          </w:tcPr>
-          <w:p>
-            <w:pPr>
-              <w:rPr>
-                <w:rFonts w:ascii="Calibri" w:eastAsia="DFKai-SB" w:hAnsi="Calibri"/>
-              </w:rPr>
-            </w:pPr>
-            <w:r>
-              <w:rPr>
-                <w:rFonts w:ascii="Calibri" w:eastAsia="DFKai-SB" w:hAnsi="Calibri"/>
-              </w:rPr>
-              <w:t>5:00 Transfer to TPE Airport</w:t>
-            </w:r>
-          </w:p>
-          <w:p>
-            <w:pPr>
-              <w:rPr>
-                <w:rFonts w:ascii="Calibri" w:eastAsia="DFKai-SB" w:hAnsi="Calibri" w:hint="eastAsia"/>
-              </w:rPr>
-            </w:pPr>
-            <w:r>
-              <w:rPr>
-                <w:rFonts w:ascii="Calibri" w:eastAsia="DFKai-SB" w:hAnsi="Calibri"/>
-              </w:rPr>
-              <w:t>BR257 07:25 to CNX</w:t>
-            </w:r>
-          </w:p>
-        </w:tc>
-        <w:tc>
-          <w:tcPr>
-            <w:tcW w:w="2633" w:type="dxa"/>
-            <w:tcBorders>
-              <w:top w:val="outset" w:sz="6" w:space="0" w:color="auto"/>
-              <w:left w:val="outset" w:sz="6" w:space="0" w:color="auto"/>
-              <w:bottom w:val="outset" w:sz="6" w:space="0" w:color="auto"/>
-              <w:right w:val="outset" w:sz="6" w:space="0" w:color="auto"/>
-            </w:tcBorders>
-          </w:tcPr>
-          <w:p>
-            <w:pPr>
-              <w:tabs>
-                <w:tab w:val="center" w:pos="4153"/>
-                <w:tab w:val="right" w:pos="8306"/>
-              </w:tabs>
-              <w:ind w:left="720" w:hangingChars="300" w:hanging="720"/>
-              <w:rPr>
-                <w:rFonts w:ascii="Calibri" w:eastAsia="DFKai-SB" w:hAnsi="Calibri"/>
-                <w:lang w:val="fr-FR"/>
-              </w:rPr>
-            </w:pPr>
-            <w:r>
-              <w:rPr>
-                <w:rFonts w:ascii="Calibri" w:eastAsia="DFKai-SB" w:hAnsi="Calibri"/>
-                <w:lang w:val="fr-FR"/>
-              </w:rPr>
-              <w:t>Taipei</w:t>
-            </w:r>
+              </w:rPr>
+            </w:pPr>
           </w:p>
         </w:tc>
       </w:tr>
@@ -6652,2406 +6186,629 @@
     <w:p>
       <w:pPr>
         <w:rPr>
-          <w:rFonts w:ascii="Calibri" w:hAnsi="Calibri" w:cs="Calibri"/>
+          <w:rFonts w:ascii="KaiTi" w:eastAsia="KaiTi" w:hAnsi="KaiTi"/>
           <w:b/>
-          <w:bCs/>
-          <w:color w:val="000000"/>
-          <w:sz w:val="22"/>
-          <w:szCs w:val="22"/>
-        </w:rPr>
-      </w:pPr>
-    </w:p>
-    <w:p>
-      <w:pPr>
-        <w:rPr>
-          <w:rFonts w:ascii="Calibri" w:hAnsi="Calibri" w:cs="Calibri"/>
-          <w:b/>
-          <w:bCs/>
-          <w:color w:val="000000"/>
-          <w:sz w:val="22"/>
-          <w:szCs w:val="22"/>
-        </w:rPr>
-      </w:pPr>
-    </w:p>
-    <w:p>
-      <w:pPr>
-        <w:rPr>
-          <w:rFonts w:ascii="Calibri" w:hAnsi="Calibri" w:cs="Calibri"/>
-          <w:b/>
-          <w:bCs/>
-          <w:color w:val="000000"/>
-          <w:sz w:val="22"/>
-          <w:szCs w:val="22"/>
-        </w:rPr>
-      </w:pPr>
-    </w:p>
-    <w:p>
-      <w:pPr>
-        <w:rPr>
-          <w:rFonts w:ascii="Calibri" w:hAnsi="Calibri" w:cs="Calibri"/>
-          <w:b/>
-          <w:bCs/>
-          <w:color w:val="000000"/>
-          <w:sz w:val="22"/>
-          <w:szCs w:val="22"/>
-        </w:rPr>
-      </w:pPr>
-    </w:p>
-    <w:p>
-      <w:pPr>
-        <w:rPr>
-          <w:rFonts w:ascii="Calibri" w:hAnsi="Calibri" w:cs="Calibri"/>
-          <w:b/>
-          <w:bCs/>
-          <w:color w:val="000000"/>
-          <w:sz w:val="22"/>
-          <w:szCs w:val="22"/>
-        </w:rPr>
-      </w:pPr>
-    </w:p>
-    <w:p>
-      <w:pPr>
-        <w:rPr>
-          <w:rFonts w:ascii="Calibri" w:hAnsi="Calibri" w:cs="Calibri"/>
-          <w:b/>
-          <w:bCs/>
-          <w:color w:val="000000"/>
-          <w:sz w:val="22"/>
-          <w:szCs w:val="22"/>
-        </w:rPr>
-      </w:pPr>
-    </w:p>
-    <w:p>
-      <w:pPr>
-        <w:rPr>
-          <w:rFonts w:ascii="Calibri" w:hAnsi="Calibri" w:cs="Calibri"/>
-          <w:b/>
-          <w:bCs/>
-          <w:color w:val="000000"/>
-          <w:sz w:val="22"/>
-          <w:szCs w:val="22"/>
-        </w:rPr>
-      </w:pPr>
-    </w:p>
-    <w:p>
-      <w:pPr>
-        <w:textAlignment w:val="center"/>
-        <w:rPr>
-          <w:rFonts w:ascii="Segoe UI" w:hAnsi="Segoe UI" w:cs="Segoe UI"/>
-          <w:color w:val="333333"/>
-          <w:sz w:val="26"/>
-          <w:szCs w:val="26"/>
+          <w:sz w:val="28"/>
+          <w:szCs w:val="28"/>
         </w:rPr>
       </w:pPr>
       <w:r>
         <w:rPr>
-          <w:rStyle w:val="bidi"/>
-          <w:rFonts w:ascii="Segoe UI" w:hAnsi="Segoe UI" w:cs="Segoe UI"/>
-          <w:color w:val="333333"/>
-          <w:sz w:val="26"/>
-          <w:szCs w:val="26"/>
+          <w:rFonts w:ascii="KaiTi" w:eastAsia="KaiTi" w:hAnsi="KaiTi"/>
+          <w:b/>
+          <w:sz w:val="28"/>
+          <w:szCs w:val="28"/>
         </w:rPr>
-        <w:t>Gaia Cilento &lt;gaiacilento@evaair.com&gt;</w:t>
+        <w:t>附件三：經費概算表</w:t>
       </w:r>
     </w:p>
     <w:p>
       <w:pPr>
+        <w:tabs>
+          <w:tab w:val="left" w:pos="8787"/>
+        </w:tabs>
+        <w:ind w:right="-33"/>
         <w:rPr>
-          <w:rFonts w:ascii="Segoe UI Semilight" w:hAnsi="Segoe UI Semilight" w:cs="Segoe UI Semilight"/>
-          <w:color w:val="666666"/>
-          <w:sz w:val="18"/>
-          <w:szCs w:val="18"/>
+          <w:rFonts w:ascii="KaiTi" w:eastAsia="KaiTi" w:hAnsi="KaiTi"/>
         </w:rPr>
       </w:pPr>
       <w:r>
         <w:rPr>
-          <w:rStyle w:val="allowtextselection"/>
-          <w:rFonts w:ascii="Segoe UI Semilight" w:hAnsi="Segoe UI Semilight" w:cs="Segoe UI Semilight"/>
-          <w:color w:val="666666"/>
-          <w:sz w:val="18"/>
-          <w:szCs w:val="18"/>
+          <w:rFonts w:ascii="KaiTi" w:eastAsia="KaiTi" w:hAnsi="KaiTi"/>
+          <w:sz w:val="28"/>
+          <w:szCs w:val="28"/>
         </w:rPr>
-        <w:t>Fr 05.07, 16:45</w:t>
-      </w:r>
-    </w:p>
-    <w:p>
-      <w:pPr>
-        <w:spacing w:line="270" w:lineRule="atLeast"/>
-        <w:textAlignment w:val="center"/>
-        <w:rPr>
-          <w:rFonts w:ascii="Segoe UI Semilight" w:hAnsi="Segoe UI Semilight" w:cs="Segoe UI Semilight"/>
-          <w:color w:val="666666"/>
-          <w:sz w:val="2"/>
-          <w:szCs w:val="2"/>
-          <w:bdr w:val="none" w:sz="0" w:space="0" w:color="auto" w:frame="1"/>
-        </w:rPr>
-      </w:pPr>
-      <w:r>
-        <w:rPr>
-          <w:rStyle w:val="pel"/>
-          <w:rFonts w:ascii="Segoe UI" w:hAnsi="Segoe UI" w:cs="Segoe UI"/>
-          <w:color w:val="333333"/>
-          <w:sz w:val="18"/>
-          <w:szCs w:val="18"/>
-          <w:bdr w:val="none" w:sz="0" w:space="0" w:color="auto" w:frame="1"/>
-        </w:rPr>
-        <w:t>Huang, Josephine;</w:t>
+        <w:t xml:space="preserve">         </w:t>
       </w:r>
       <w:r>
         <w:rPr>
-          <w:rFonts w:ascii="Segoe UI Semilight" w:hAnsi="Segoe UI Semilight" w:cs="Segoe UI Semilight"/>
-          <w:color w:val="666666"/>
-          <w:sz w:val="2"/>
-          <w:szCs w:val="2"/>
-          <w:bdr w:val="none" w:sz="0" w:space="0" w:color="auto" w:frame="1"/>
+          <w:rFonts w:ascii="KaiTi" w:eastAsia="KaiTi" w:hAnsi="KaiTi"/>
         </w:rPr>
-        <w:t xml:space="preserve"> </w:t>
+        <w:t xml:space="preserve">                                          幣別：</w:t>
       </w:r>
       <w:r>
         <w:rPr>
-          <w:rStyle w:val="pel"/>
-          <w:rFonts w:ascii="Segoe UI" w:hAnsi="Segoe UI" w:cs="Segoe UI"/>
-          <w:color w:val="333333"/>
-          <w:sz w:val="18"/>
-          <w:szCs w:val="18"/>
-          <w:bdr w:val="none" w:sz="0" w:space="0" w:color="auto" w:frame="1"/>
+          <w:rFonts w:ascii="KaiTi" w:eastAsia="KaiTi" w:hAnsi="KaiTi"/>
+          <w:u w:val="single"/>
         </w:rPr>
-        <w:t>Silvio Patronario &lt;spatronario@evaair.com&gt;;Alberto Taiana &lt;albertotaiana@evaair.com&gt;;</w:t>
-      </w:r>
-    </w:p>
-    <w:p>
-      <w:pPr>
-        <w:spacing w:line="270" w:lineRule="atLeast"/>
-        <w:textAlignment w:val="center"/>
-        <w:rPr>
-          <w:rFonts w:ascii="Segoe UI Semilight" w:hAnsi="Segoe UI Semilight" w:cs="Segoe UI Semilight"/>
-          <w:color w:val="666666"/>
-          <w:sz w:val="2"/>
-          <w:szCs w:val="2"/>
-          <w:bdr w:val="none" w:sz="0" w:space="0" w:color="auto" w:frame="1"/>
-        </w:rPr>
-      </w:pPr>
-      <w:r>
-        <w:rPr>
-          <w:rStyle w:val="pel"/>
-          <w:rFonts w:ascii="Segoe UI" w:hAnsi="Segoe UI" w:cs="Segoe UI"/>
-          <w:color w:val="333333"/>
-          <w:sz w:val="18"/>
-          <w:szCs w:val="18"/>
-          <w:bdr w:val="none" w:sz="0" w:space="0" w:color="auto" w:frame="1"/>
-        </w:rPr>
-        <w:t>Eva Perrotti &lt;evaperrotti@evaair.com&gt;</w:t>
-      </w:r>
-    </w:p>
-    <w:p>
-      <w:pPr>
-        <w:rPr>
-          <w:rFonts w:ascii="Calibri" w:hAnsi="Calibri" w:cs="Calibri"/>
-          <w:color w:val="000000"/>
-          <w:lang w:val="en-US"/>
-        </w:rPr>
-      </w:pPr>
-    </w:p>
-    <w:p>
-      <w:pPr>
-        <w:rPr>
-          <w:rFonts w:ascii="Calibri" w:hAnsi="Calibri" w:cs="Calibri"/>
-          <w:color w:val="000000"/>
-        </w:rPr>
-      </w:pPr>
-      <w:r>
-        <w:rPr>
-          <w:rFonts w:ascii="Calibri" w:hAnsi="Calibri" w:cs="Calibri"/>
-          <w:color w:val="000000"/>
-          <w:lang w:val="en-US"/>
-        </w:rPr>
-        <w:t>Dear Josephine,</w:t>
-      </w:r>
-    </w:p>
-    <w:p>
-      <w:pPr>
-        <w:rPr>
-          <w:rFonts w:ascii="Calibri" w:hAnsi="Calibri" w:cs="Calibri"/>
-          <w:color w:val="000000"/>
-        </w:rPr>
-      </w:pPr>
-      <w:r>
-        <w:rPr>
-          <w:rFonts w:ascii="Calibri" w:hAnsi="Calibri" w:cs="Calibri"/>
-          <w:color w:val="000000"/>
-          <w:lang w:val="en-US"/>
-        </w:rPr>
-        <w:t> </w:t>
-      </w:r>
-    </w:p>
-    <w:p>
-      <w:pPr>
-        <w:rPr>
-          <w:rFonts w:ascii="Calibri" w:hAnsi="Calibri" w:cs="Calibri"/>
-          <w:color w:val="000000"/>
-        </w:rPr>
-      </w:pPr>
-      <w:r>
-        <w:rPr>
-          <w:rFonts w:ascii="Calibri" w:hAnsi="Calibri" w:cs="Calibri"/>
-          <w:color w:val="000000"/>
-          <w:lang w:val="en-US"/>
-        </w:rPr>
-        <w:t>I do hope everything is fine in Frankfurt, here in Milan, despite the hot weather, all good our end.</w:t>
-      </w:r>
-    </w:p>
-    <w:p>
-      <w:pPr>
-        <w:rPr>
-          <w:rFonts w:ascii="Calibri" w:hAnsi="Calibri" w:cs="Calibri"/>
-          <w:color w:val="000000"/>
-        </w:rPr>
-      </w:pPr>
-      <w:r>
-        <w:rPr>
-          <w:rFonts w:ascii="Calibri" w:hAnsi="Calibri" w:cs="Calibri"/>
-          <w:color w:val="000000"/>
-          <w:lang w:val="en-US"/>
-        </w:rPr>
-        <w:t> </w:t>
-      </w:r>
-    </w:p>
-    <w:p>
-      <w:pPr>
-        <w:rPr>
-          <w:rFonts w:ascii="Calibri" w:hAnsi="Calibri" w:cs="Calibri"/>
-          <w:color w:val="000000"/>
-        </w:rPr>
-      </w:pPr>
-      <w:r>
-        <w:rPr>
-          <w:rFonts w:ascii="Calibri" w:hAnsi="Calibri" w:cs="Calibri"/>
-          <w:color w:val="000000"/>
-          <w:lang w:val="en-US"/>
-        </w:rPr>
-        <w:t>First at all thanks for your continuos support, it is very much appreciated.</w:t>
-      </w:r>
-    </w:p>
-    <w:p>
-      <w:pPr>
-        <w:rPr>
-          <w:rFonts w:ascii="Calibri" w:hAnsi="Calibri" w:cs="Calibri"/>
-          <w:color w:val="000000"/>
-        </w:rPr>
-      </w:pPr>
-      <w:r>
-        <w:rPr>
-          <w:rFonts w:ascii="Calibri" w:hAnsi="Calibri" w:cs="Calibri"/>
-          <w:color w:val="000000"/>
-          <w:lang w:val="en-US"/>
-        </w:rPr>
-        <w:t> </w:t>
-      </w:r>
-    </w:p>
-    <w:p>
-      <w:pPr>
-        <w:rPr>
-          <w:rFonts w:ascii="Calibri" w:hAnsi="Calibri" w:cs="Calibri"/>
-          <w:color w:val="000000"/>
-        </w:rPr>
-      </w:pPr>
-      <w:r>
-        <w:rPr>
-          <w:rFonts w:ascii="Calibri" w:hAnsi="Calibri" w:cs="Calibri"/>
-          <w:color w:val="000000"/>
-          <w:lang w:val="en-US"/>
-        </w:rPr>
-        <w:t>As anticipated in previous emails, we do have upcoming collaboration with important personalities.</w:t>
-      </w:r>
-    </w:p>
-    <w:p>
-      <w:pPr>
-        <w:rPr>
-          <w:rFonts w:ascii="Calibri" w:hAnsi="Calibri" w:cs="Calibri"/>
-          <w:color w:val="000000"/>
-        </w:rPr>
-      </w:pPr>
-      <w:r>
-        <w:rPr>
-          <w:rFonts w:ascii="Calibri" w:hAnsi="Calibri" w:cs="Calibri"/>
-          <w:color w:val="000000"/>
-          <w:lang w:val="en-US"/>
-        </w:rPr>
-        <w:t> </w:t>
-      </w:r>
-    </w:p>
-    <w:p>
-      <w:pPr>
-        <w:rPr>
-          <w:rFonts w:ascii="Calibri" w:hAnsi="Calibri" w:cs="Calibri"/>
-          <w:color w:val="000000"/>
-        </w:rPr>
-      </w:pPr>
-      <w:r>
-        <w:rPr>
-          <w:rFonts w:ascii="Calibri" w:hAnsi="Calibri" w:cs="Calibri"/>
-          <w:color w:val="000000"/>
-          <w:lang w:val="en-US"/>
-        </w:rPr>
-        <w:t>Here below you will find our imminent cooperation with Mr Costantino della Gherardesca.</w:t>
-      </w:r>
-    </w:p>
-    <w:p>
-      <w:pPr>
-        <w:rPr>
-          <w:rFonts w:ascii="Calibri" w:hAnsi="Calibri" w:cs="Calibri"/>
-          <w:color w:val="000000"/>
-        </w:rPr>
-      </w:pPr>
-      <w:r>
-        <w:rPr>
-          <w:rFonts w:ascii="Calibri" w:hAnsi="Calibri" w:cs="Calibri"/>
-          <w:color w:val="000000"/>
-          <w:lang w:val="en-US"/>
-        </w:rPr>
-        <w:t> </w:t>
-      </w:r>
-    </w:p>
-    <w:p>
-      <w:pPr>
-        <w:shd w:val="clear" w:color="auto" w:fill="FFFFFF"/>
-        <w:rPr>
-          <w:rFonts w:ascii="Calibri" w:hAnsi="Calibri" w:cs="Calibri"/>
-          <w:color w:val="000000"/>
-        </w:rPr>
-      </w:pPr>
-      <w:r>
-        <w:rPr>
-          <w:rFonts w:ascii="Courier New" w:hAnsi="Courier New" w:cs="Courier New"/>
-          <w:color w:val="000000"/>
-          <w:sz w:val="21"/>
-          <w:szCs w:val="21"/>
-          <w:lang w:val="it-IT"/>
-        </w:rPr>
-        <w:t> </w:t>
+        <w:t>歐元</w:t>
       </w:r>
       <w:r>
         <w:rPr>
-          <w:rStyle w:val="apple-converted-space"/>
-          <w:rFonts w:ascii="Courier New" w:hAnsi="Courier New" w:cs="Courier New"/>
-          <w:color w:val="000000"/>
-          <w:sz w:val="21"/>
-          <w:szCs w:val="21"/>
-          <w:lang w:val="it-IT"/>
+          <w:rFonts w:ascii="KaiTi" w:eastAsia="KaiTi" w:hAnsi="KaiTi"/>
         </w:rPr>
-        <w:t> </w:t>
-      </w:r>
-      <w:r>
-        <w:rPr>
-          <w:rFonts w:ascii="Courier New" w:hAnsi="Courier New" w:cs="Courier New"/>
-          <w:color w:val="FFFFFF"/>
-          <w:sz w:val="21"/>
-          <w:szCs w:val="21"/>
-          <w:shd w:val="clear" w:color="auto" w:fill="FF00FF"/>
-          <w:lang w:val="it-IT"/>
-        </w:rPr>
-        <w:t>1</w:t>
-      </w:r>
-      <w:r>
-        <w:rPr>
-          <w:rFonts w:ascii="Courier New" w:hAnsi="Courier New" w:cs="Courier New"/>
-          <w:color w:val="000000"/>
-          <w:sz w:val="21"/>
-          <w:szCs w:val="21"/>
-          <w:lang w:val="it-IT"/>
-        </w:rPr>
-        <w:t>.DELLAGHERARDESCA/COSTANTINO MR  </w:t>
-      </w:r>
-      <w:r>
-        <w:rPr>
-          <w:rStyle w:val="apple-converted-space"/>
-          <w:rFonts w:ascii="Courier New" w:hAnsi="Courier New" w:cs="Courier New"/>
-          <w:color w:val="000000"/>
-          <w:sz w:val="21"/>
-          <w:szCs w:val="21"/>
-          <w:lang w:val="it-IT"/>
-        </w:rPr>
-        <w:t> </w:t>
-      </w:r>
-      <w:r>
-        <w:rPr>
-          <w:rFonts w:ascii="Courier New" w:hAnsi="Courier New" w:cs="Courier New"/>
-          <w:color w:val="FF00FF"/>
-          <w:sz w:val="21"/>
-          <w:szCs w:val="21"/>
-          <w:lang w:val="it-IT"/>
-        </w:rPr>
-        <w:t>2</w:t>
-      </w:r>
-      <w:r>
-        <w:rPr>
-          <w:rFonts w:ascii="Courier New" w:hAnsi="Courier New" w:cs="Courier New"/>
-          <w:color w:val="000000"/>
-          <w:sz w:val="21"/>
-          <w:szCs w:val="21"/>
-          <w:lang w:val="it-IT"/>
-        </w:rPr>
-        <w:t>.MORO/ROSSANA MRS</w:t>
+        <w:t xml:space="preserve"> ，單位：元</w:t>
       </w:r>
     </w:p>
-    <w:p>
-      <w:pPr>
-        <w:shd w:val="clear" w:color="auto" w:fill="FFFFFF"/>
-        <w:rPr>
-          <w:rFonts w:ascii="Calibri" w:hAnsi="Calibri" w:cs="Calibri"/>
-          <w:color w:val="000000"/>
-        </w:rPr>
-      </w:pPr>
-      <w:r>
-        <w:rPr>
-          <w:rFonts w:ascii="Courier New" w:hAnsi="Courier New" w:cs="Courier New"/>
-          <w:color w:val="000000"/>
-          <w:sz w:val="21"/>
-          <w:szCs w:val="21"/>
-          <w:lang w:val="it-IT"/>
-        </w:rPr>
-        <w:t> </w:t>
-      </w:r>
-      <w:r>
-        <w:rPr>
-          <w:rStyle w:val="apple-converted-space"/>
-          <w:rFonts w:ascii="Courier New" w:hAnsi="Courier New" w:cs="Courier New"/>
-          <w:color w:val="000000"/>
-          <w:sz w:val="21"/>
-          <w:szCs w:val="21"/>
-          <w:lang w:val="it-IT"/>
-        </w:rPr>
-        <w:t> </w:t>
-      </w:r>
-      <w:r>
-        <w:rPr>
-          <w:rFonts w:ascii="Courier New" w:hAnsi="Courier New" w:cs="Courier New"/>
-          <w:color w:val="FF00FF"/>
-          <w:sz w:val="21"/>
-          <w:szCs w:val="21"/>
-          <w:lang w:val="it-IT"/>
-        </w:rPr>
-        <w:t>3</w:t>
-      </w:r>
-      <w:r>
-        <w:rPr>
-          <w:rFonts w:ascii="Courier New" w:hAnsi="Courier New" w:cs="Courier New"/>
-          <w:color w:val="000000"/>
-          <w:sz w:val="21"/>
-          <w:szCs w:val="21"/>
-          <w:lang w:val="it-IT"/>
-        </w:rPr>
-        <w:t>  BR</w:t>
-      </w:r>
-      <w:r>
-        <w:rPr>
-          <w:rStyle w:val="apple-converted-space"/>
-          <w:rFonts w:ascii="Courier New" w:hAnsi="Courier New" w:cs="Courier New"/>
-          <w:color w:val="000000"/>
-          <w:sz w:val="21"/>
-          <w:szCs w:val="21"/>
-          <w:lang w:val="it-IT"/>
-        </w:rPr>
-        <w:t> </w:t>
-      </w:r>
-      <w:r>
-        <w:rPr>
-          <w:rFonts w:ascii="Courier New" w:hAnsi="Courier New" w:cs="Courier New"/>
-          <w:color w:val="FF0000"/>
-          <w:sz w:val="21"/>
-          <w:szCs w:val="21"/>
-          <w:lang w:val="it-IT"/>
-        </w:rPr>
-        <w:t>096</w:t>
-      </w:r>
-      <w:r>
-        <w:rPr>
-          <w:rStyle w:val="apple-converted-space"/>
-          <w:rFonts w:ascii="Courier New" w:hAnsi="Courier New" w:cs="Courier New"/>
-          <w:color w:val="000000"/>
-          <w:sz w:val="21"/>
-          <w:szCs w:val="21"/>
-          <w:lang w:val="it-IT"/>
-        </w:rPr>
-        <w:t> </w:t>
-      </w:r>
-      <w:r>
-        <w:rPr>
-          <w:rFonts w:ascii="Courier New" w:hAnsi="Courier New" w:cs="Courier New"/>
-          <w:color w:val="0000FF"/>
-          <w:sz w:val="21"/>
-          <w:szCs w:val="21"/>
-          <w:lang w:val="it-IT"/>
-        </w:rPr>
-        <w:t>R</w:t>
-      </w:r>
-      <w:r>
-        <w:rPr>
-          <w:rStyle w:val="apple-converted-space"/>
-          <w:rFonts w:ascii="Courier New" w:hAnsi="Courier New" w:cs="Courier New"/>
-          <w:color w:val="000000"/>
-          <w:sz w:val="21"/>
-          <w:szCs w:val="21"/>
-          <w:lang w:val="it-IT"/>
-        </w:rPr>
-        <w:t> </w:t>
-      </w:r>
-      <w:r>
-        <w:rPr>
-          <w:rFonts w:ascii="Courier New" w:hAnsi="Courier New" w:cs="Courier New"/>
-          <w:color w:val="000000"/>
-          <w:sz w:val="21"/>
-          <w:szCs w:val="21"/>
-          <w:lang w:val="it-IT"/>
-        </w:rPr>
-        <w:t>07AUG 3 MXPTPE HK2       1  1115 0625+1 *1A/E*</w:t>
-      </w:r>
-    </w:p>
-    <w:p>
-      <w:pPr>
-        <w:shd w:val="clear" w:color="auto" w:fill="FFFFFF"/>
-        <w:rPr>
-          <w:rFonts w:ascii="Calibri" w:hAnsi="Calibri" w:cs="Calibri"/>
-          <w:color w:val="000000"/>
-        </w:rPr>
-      </w:pPr>
-      <w:r>
-        <w:rPr>
-          <w:rFonts w:ascii="Courier New" w:hAnsi="Courier New" w:cs="Courier New"/>
-          <w:color w:val="000000"/>
-          <w:sz w:val="21"/>
-          <w:szCs w:val="21"/>
-          <w:lang w:val="it-IT"/>
-        </w:rPr>
-        <w:t> </w:t>
-      </w:r>
-      <w:r>
-        <w:rPr>
-          <w:rStyle w:val="apple-converted-space"/>
-          <w:rFonts w:ascii="Courier New" w:hAnsi="Courier New" w:cs="Courier New"/>
-          <w:color w:val="000000"/>
-          <w:sz w:val="21"/>
-          <w:szCs w:val="21"/>
-          <w:lang w:val="it-IT"/>
-        </w:rPr>
-        <w:t> </w:t>
-      </w:r>
-      <w:r>
-        <w:rPr>
-          <w:rFonts w:ascii="Courier New" w:hAnsi="Courier New" w:cs="Courier New"/>
-          <w:color w:val="FF00FF"/>
-          <w:sz w:val="21"/>
-          <w:szCs w:val="21"/>
-          <w:lang w:val="it-IT"/>
-        </w:rPr>
-        <w:t>4</w:t>
-      </w:r>
-      <w:r>
-        <w:rPr>
-          <w:rFonts w:ascii="Courier New" w:hAnsi="Courier New" w:cs="Courier New"/>
-          <w:color w:val="000000"/>
-          <w:sz w:val="21"/>
-          <w:szCs w:val="21"/>
-          <w:lang w:val="it-IT"/>
-        </w:rPr>
-        <w:t>  BR</w:t>
-      </w:r>
-      <w:r>
-        <w:rPr>
-          <w:rStyle w:val="apple-converted-space"/>
-          <w:rFonts w:ascii="Courier New" w:hAnsi="Courier New" w:cs="Courier New"/>
-          <w:color w:val="000000"/>
-          <w:sz w:val="21"/>
-          <w:szCs w:val="21"/>
-          <w:lang w:val="it-IT"/>
-        </w:rPr>
-        <w:t> </w:t>
-      </w:r>
-      <w:r>
-        <w:rPr>
-          <w:rFonts w:ascii="Courier New" w:hAnsi="Courier New" w:cs="Courier New"/>
-          <w:color w:val="FF0000"/>
-          <w:sz w:val="21"/>
-          <w:szCs w:val="21"/>
-          <w:lang w:val="it-IT"/>
-        </w:rPr>
-        <w:t>257</w:t>
-      </w:r>
-      <w:r>
-        <w:rPr>
-          <w:rStyle w:val="apple-converted-space"/>
-          <w:rFonts w:ascii="Courier New" w:hAnsi="Courier New" w:cs="Courier New"/>
-          <w:color w:val="000000"/>
-          <w:sz w:val="21"/>
-          <w:szCs w:val="21"/>
-          <w:lang w:val="it-IT"/>
-        </w:rPr>
-        <w:t> </w:t>
-      </w:r>
-      <w:r>
-        <w:rPr>
-          <w:rFonts w:ascii="Courier New" w:hAnsi="Courier New" w:cs="Courier New"/>
-          <w:color w:val="0000FF"/>
-          <w:sz w:val="21"/>
-          <w:szCs w:val="21"/>
-          <w:lang w:val="it-IT"/>
-        </w:rPr>
-        <w:t>R</w:t>
-      </w:r>
-      <w:r>
-        <w:rPr>
-          <w:rStyle w:val="apple-converted-space"/>
-          <w:rFonts w:ascii="Courier New" w:hAnsi="Courier New" w:cs="Courier New"/>
-          <w:color w:val="000000"/>
-          <w:sz w:val="21"/>
-          <w:szCs w:val="21"/>
-          <w:lang w:val="it-IT"/>
-        </w:rPr>
-        <w:t> </w:t>
-      </w:r>
-      <w:r>
-        <w:rPr>
-          <w:rFonts w:ascii="Courier New" w:hAnsi="Courier New" w:cs="Courier New"/>
-          <w:color w:val="000000"/>
-          <w:sz w:val="21"/>
-          <w:szCs w:val="21"/>
-          <w:lang w:val="it-IT"/>
-        </w:rPr>
-        <w:t>12AUG 1 TPECNX HK2       2  0725 1025   *1A/E*</w:t>
-      </w:r>
-    </w:p>
-    <w:p>
-      <w:pPr>
-        <w:shd w:val="clear" w:color="auto" w:fill="FFFFFF"/>
-        <w:rPr>
-          <w:rFonts w:ascii="Calibri" w:hAnsi="Calibri" w:cs="Calibri"/>
-          <w:color w:val="000000"/>
-        </w:rPr>
-      </w:pPr>
-      <w:r>
-        <w:rPr>
-          <w:rFonts w:ascii="Courier New" w:hAnsi="Courier New" w:cs="Courier New"/>
-          <w:color w:val="000000"/>
-          <w:sz w:val="21"/>
-          <w:szCs w:val="21"/>
-          <w:lang w:val="it-IT"/>
-        </w:rPr>
-        <w:t> </w:t>
-      </w:r>
-      <w:r>
-        <w:rPr>
-          <w:rStyle w:val="apple-converted-space"/>
-          <w:rFonts w:ascii="Courier New" w:hAnsi="Courier New" w:cs="Courier New"/>
-          <w:color w:val="000000"/>
-          <w:sz w:val="21"/>
-          <w:szCs w:val="21"/>
-          <w:lang w:val="it-IT"/>
-        </w:rPr>
-        <w:t> </w:t>
-      </w:r>
-      <w:r>
-        <w:rPr>
-          <w:rFonts w:ascii="Courier New" w:hAnsi="Courier New" w:cs="Courier New"/>
-          <w:color w:val="FF00FF"/>
-          <w:sz w:val="21"/>
-          <w:szCs w:val="21"/>
-          <w:lang w:val="it-IT"/>
-        </w:rPr>
-        <w:t>5</w:t>
-      </w:r>
-      <w:r>
-        <w:rPr>
-          <w:rFonts w:ascii="Courier New" w:hAnsi="Courier New" w:cs="Courier New"/>
-          <w:color w:val="000000"/>
-          <w:sz w:val="21"/>
-          <w:szCs w:val="21"/>
-          <w:lang w:val="it-IT"/>
-        </w:rPr>
-        <w:t>  BR</w:t>
-      </w:r>
-      <w:r>
-        <w:rPr>
-          <w:rStyle w:val="apple-converted-space"/>
-          <w:rFonts w:ascii="Courier New" w:hAnsi="Courier New" w:cs="Courier New"/>
-          <w:color w:val="000000"/>
-          <w:sz w:val="21"/>
-          <w:szCs w:val="21"/>
-          <w:lang w:val="it-IT"/>
-        </w:rPr>
-        <w:t> </w:t>
-      </w:r>
-      <w:r>
-        <w:rPr>
-          <w:rFonts w:ascii="Courier New" w:hAnsi="Courier New" w:cs="Courier New"/>
-          <w:color w:val="FF0000"/>
-          <w:sz w:val="21"/>
-          <w:szCs w:val="21"/>
-          <w:lang w:val="it-IT"/>
-        </w:rPr>
-        <w:t>068</w:t>
-      </w:r>
-      <w:r>
-        <w:rPr>
-          <w:rStyle w:val="apple-converted-space"/>
-          <w:rFonts w:ascii="Courier New" w:hAnsi="Courier New" w:cs="Courier New"/>
-          <w:color w:val="000000"/>
-          <w:sz w:val="21"/>
-          <w:szCs w:val="21"/>
-          <w:lang w:val="it-IT"/>
-        </w:rPr>
-        <w:t> </w:t>
-      </w:r>
-      <w:r>
-        <w:rPr>
-          <w:rFonts w:ascii="Courier New" w:hAnsi="Courier New" w:cs="Courier New"/>
-          <w:color w:val="0000FF"/>
-          <w:sz w:val="21"/>
-          <w:szCs w:val="21"/>
-          <w:lang w:val="it-IT"/>
-        </w:rPr>
-        <w:t>R</w:t>
-      </w:r>
-      <w:r>
-        <w:rPr>
-          <w:rStyle w:val="apple-converted-space"/>
-          <w:rFonts w:ascii="Courier New" w:hAnsi="Courier New" w:cs="Courier New"/>
-          <w:color w:val="000000"/>
-          <w:sz w:val="21"/>
-          <w:szCs w:val="21"/>
-          <w:lang w:val="it-IT"/>
-        </w:rPr>
-        <w:t> </w:t>
-      </w:r>
-      <w:r>
-        <w:rPr>
-          <w:rFonts w:ascii="Courier New" w:hAnsi="Courier New" w:cs="Courier New"/>
-          <w:color w:val="000000"/>
-          <w:sz w:val="21"/>
-          <w:szCs w:val="21"/>
-          <w:lang w:val="it-IT"/>
-        </w:rPr>
-        <w:t>24AUG 6 BKKTPE HK2          1645 2130   *1A/E*</w:t>
-      </w:r>
-    </w:p>
-    <w:p>
-      <w:pPr>
-        <w:shd w:val="clear" w:color="auto" w:fill="FFFFFF"/>
-        <w:rPr>
-          <w:rFonts w:ascii="Calibri" w:hAnsi="Calibri" w:cs="Calibri"/>
-          <w:color w:val="000000"/>
-        </w:rPr>
-      </w:pPr>
-      <w:r>
-        <w:rPr>
-          <w:rFonts w:ascii="Courier New" w:hAnsi="Courier New" w:cs="Courier New"/>
-          <w:color w:val="000000"/>
-          <w:sz w:val="21"/>
-          <w:szCs w:val="21"/>
-          <w:lang w:val="it-IT"/>
-        </w:rPr>
-        <w:t> </w:t>
-      </w:r>
-      <w:r>
-        <w:rPr>
-          <w:rStyle w:val="apple-converted-space"/>
-          <w:rFonts w:ascii="Courier New" w:hAnsi="Courier New" w:cs="Courier New"/>
-          <w:color w:val="000000"/>
-          <w:sz w:val="21"/>
-          <w:szCs w:val="21"/>
-          <w:lang w:val="it-IT"/>
-        </w:rPr>
-        <w:t> </w:t>
-      </w:r>
-      <w:r>
-        <w:rPr>
-          <w:rFonts w:ascii="Courier New" w:hAnsi="Courier New" w:cs="Courier New"/>
-          <w:color w:val="FF00FF"/>
-          <w:sz w:val="21"/>
-          <w:szCs w:val="21"/>
-        </w:rPr>
-        <w:t>6</w:t>
-      </w:r>
-      <w:r>
-        <w:rPr>
-          <w:rFonts w:ascii="Courier New" w:hAnsi="Courier New" w:cs="Courier New"/>
-          <w:color w:val="000000"/>
-          <w:sz w:val="21"/>
-          <w:szCs w:val="21"/>
-        </w:rPr>
-        <w:t>  BR</w:t>
-      </w:r>
-      <w:r>
-        <w:rPr>
-          <w:rStyle w:val="apple-converted-space"/>
-          <w:rFonts w:ascii="Courier New" w:hAnsi="Courier New" w:cs="Courier New"/>
-          <w:color w:val="000000"/>
-          <w:sz w:val="21"/>
-          <w:szCs w:val="21"/>
-        </w:rPr>
-        <w:t> </w:t>
-      </w:r>
-      <w:r>
-        <w:rPr>
-          <w:rFonts w:ascii="Courier New" w:hAnsi="Courier New" w:cs="Courier New"/>
-          <w:color w:val="FF0000"/>
-          <w:sz w:val="21"/>
-          <w:szCs w:val="21"/>
-        </w:rPr>
-        <w:t>095</w:t>
-      </w:r>
-      <w:r>
-        <w:rPr>
-          <w:rStyle w:val="apple-converted-space"/>
-          <w:rFonts w:ascii="Courier New" w:hAnsi="Courier New" w:cs="Courier New"/>
-          <w:color w:val="000000"/>
-          <w:sz w:val="21"/>
-          <w:szCs w:val="21"/>
-        </w:rPr>
-        <w:t> </w:t>
-      </w:r>
-      <w:r>
-        <w:rPr>
-          <w:rFonts w:ascii="Courier New" w:hAnsi="Courier New" w:cs="Courier New"/>
-          <w:color w:val="0000FF"/>
-          <w:sz w:val="21"/>
-          <w:szCs w:val="21"/>
-        </w:rPr>
-        <w:t>R</w:t>
-      </w:r>
-      <w:r>
-        <w:rPr>
-          <w:rStyle w:val="apple-converted-space"/>
-          <w:rFonts w:ascii="Courier New" w:hAnsi="Courier New" w:cs="Courier New"/>
-          <w:color w:val="000000"/>
-          <w:sz w:val="21"/>
-          <w:szCs w:val="21"/>
-        </w:rPr>
-        <w:t> </w:t>
-      </w:r>
-      <w:r>
-        <w:rPr>
-          <w:rFonts w:ascii="Courier New" w:hAnsi="Courier New" w:cs="Courier New"/>
-          <w:color w:val="000000"/>
-          <w:sz w:val="21"/>
-          <w:szCs w:val="21"/>
-        </w:rPr>
-        <w:t>24AUG 6 TPEMXP HK2       2  2355 0750+1 *1A/E*</w:t>
-      </w:r>
-    </w:p>
-    <w:p>
-      <w:pPr>
-        <w:rPr>
-          <w:rFonts w:ascii="Calibri" w:hAnsi="Calibri" w:cs="Calibri"/>
-          <w:color w:val="000000"/>
-        </w:rPr>
-      </w:pPr>
-      <w:r>
-        <w:rPr>
-          <w:rFonts w:ascii="Calibri" w:hAnsi="Calibri" w:cs="Calibri"/>
-          <w:color w:val="000000"/>
-          <w:lang w:val="en-US"/>
-        </w:rPr>
-        <w:t> </w:t>
-      </w:r>
-    </w:p>
-    <w:p>
-      <w:pPr>
-        <w:rPr>
-          <w:rFonts w:ascii="Calibri" w:hAnsi="Calibri" w:cs="Calibri"/>
-          <w:color w:val="000000"/>
-        </w:rPr>
-      </w:pPr>
-      <w:r>
-        <w:rPr>
-          <w:rFonts w:ascii="Calibri" w:hAnsi="Calibri" w:cs="Calibri"/>
-          <w:color w:val="000000"/>
-          <w:lang w:val="en-US"/>
-        </w:rPr>
-        <w:t> </w:t>
-      </w:r>
-    </w:p>
-    <w:p>
-      <w:pPr>
-        <w:rPr>
-          <w:rFonts w:ascii="Calibri" w:hAnsi="Calibri" w:cs="Calibri"/>
-          <w:color w:val="000000"/>
-        </w:rPr>
-      </w:pPr>
-      <w:r>
-        <w:rPr>
-          <w:rFonts w:ascii="Calibri" w:hAnsi="Calibri" w:cs="Calibri"/>
-          <w:b/>
-          <w:bCs/>
-          <w:color w:val="000000"/>
-          <w:u w:val="single"/>
-        </w:rPr>
-        <w:t>Who is he?</w:t>
-      </w:r>
-    </w:p>
-    <w:p>
-      <w:pPr>
-        <w:rPr>
-          <w:rFonts w:ascii="Calibri" w:hAnsi="Calibri" w:cs="Calibri"/>
-          <w:color w:val="000000"/>
-        </w:rPr>
-      </w:pPr>
-      <w:r>
-        <w:rPr>
-          <w:rFonts w:ascii="Calibri" w:hAnsi="Calibri" w:cs="Calibri"/>
-          <w:color w:val="000000"/>
-        </w:rPr>
-        <w:t> </w:t>
-      </w:r>
-    </w:p>
-    <w:p>
-      <w:pPr>
-        <w:rPr>
-          <w:rFonts w:ascii="Calibri" w:hAnsi="Calibri" w:cs="Calibri"/>
-          <w:color w:val="000000"/>
-        </w:rPr>
-      </w:pPr>
-      <w:r>
-        <w:rPr>
-          <w:rFonts w:ascii="Calibri" w:hAnsi="Calibri" w:cs="Calibri"/>
-          <w:color w:val="000000"/>
-        </w:rPr>
-        <w:t>VIP, TV celebrity, presenter, very famous personality in Italy, Asian expert and lover, especially for being the presenter/ambassador since over 12 years of “Pechino Express”, in a nutshell, the most popular and adventurous prime-time travel reality in the history of Italian Television which consists in a race between VIP couples competition, who challenge each other along a path crossing several nations to reach a certain goal in a journey in stages of several days. Often the destination chosen are in Asia, only to mentions some: Taiwan, Vietnam, Cambodia, Thailand, South Korea, basically All EVA Air Destination. Thanks to his charm and notoriety he attracts great audiences, the last 2024 edition of the reality counted an average of 568.000 views, over 166K social media interaction, +122% in comparison of 2023.</w:t>
-      </w:r>
-      <w:r>
-        <w:rPr>
-          <w:rStyle w:val="apple-converted-space"/>
-          <w:rFonts w:ascii="Calibri" w:hAnsi="Calibri" w:cs="Calibri"/>
-          <w:color w:val="000000"/>
-        </w:rPr>
-        <w:t> </w:t>
-      </w:r>
-    </w:p>
-    <w:p>
-      <w:pPr>
-        <w:rPr>
-          <w:rFonts w:ascii="Calibri" w:hAnsi="Calibri" w:cs="Calibri"/>
-          <w:color w:val="000000"/>
-        </w:rPr>
-      </w:pPr>
-      <w:r>
-        <w:rPr>
-          <w:rFonts w:ascii="Calibri" w:hAnsi="Calibri" w:cs="Calibri"/>
-          <w:color w:val="000000"/>
-        </w:rPr>
-        <w:t>More details here:</w:t>
-      </w:r>
-      <w:r>
-        <w:rPr>
-          <w:rStyle w:val="apple-converted-space"/>
-          <w:rFonts w:ascii="Calibri" w:hAnsi="Calibri" w:cs="Calibri"/>
-          <w:color w:val="000000"/>
-        </w:rPr>
-        <w:t> </w:t>
-      </w:r>
-    </w:p>
-    <w:p>
-      <w:pPr>
-        <w:rPr>
-          <w:rFonts w:ascii="Calibri" w:hAnsi="Calibri" w:cs="Calibri"/>
-          <w:color w:val="000000"/>
-        </w:rPr>
-      </w:pPr>
-      <w:hyperlink r:id="rId8" w:history="1">
-        <w:r>
-          <w:rPr>
-            <w:rStyle w:val="Hyperlink"/>
-            <w:rFonts w:ascii="Calibri" w:hAnsi="Calibri" w:cs="Calibri"/>
-            <w:lang w:val="en-GB"/>
-          </w:rPr>
-          <w:t>https://it.wikipedia.org/wiki/Costantino_della_Gherardesca</w:t>
-        </w:r>
-      </w:hyperlink>
-    </w:p>
-    <w:p>
-      <w:pPr>
-        <w:rPr>
-          <w:rFonts w:ascii="Calibri" w:hAnsi="Calibri" w:cs="Calibri"/>
-          <w:color w:val="000000"/>
-        </w:rPr>
-      </w:pPr>
-      <w:hyperlink r:id="rId9" w:history="1">
-        <w:r>
-          <w:rPr>
-            <w:rStyle w:val="Hyperlink"/>
-            <w:rFonts w:ascii="Calibri" w:hAnsi="Calibri" w:cs="Calibri"/>
-            <w:lang w:val="en-GB"/>
-          </w:rPr>
-          <w:t>https://en.wikipedia.org/wiki/Pechino_Express</w:t>
-        </w:r>
-      </w:hyperlink>
-    </w:p>
-    <w:p>
-      <w:pPr>
-        <w:rPr>
-          <w:rFonts w:ascii="Calibri" w:hAnsi="Calibri" w:cs="Calibri"/>
-          <w:color w:val="000000"/>
-        </w:rPr>
-      </w:pPr>
-      <w:r>
-        <w:rPr>
-          <w:rFonts w:ascii="Calibri" w:hAnsi="Calibri" w:cs="Calibri"/>
-          <w:color w:val="000000"/>
-          <w:lang w:val="en-US"/>
-        </w:rPr>
-        <w:t> </w:t>
-      </w:r>
-    </w:p>
-    <w:p>
-      <w:pPr>
-        <w:rPr>
-          <w:rFonts w:ascii="Calibri" w:hAnsi="Calibri" w:cs="Calibri"/>
-          <w:color w:val="000000"/>
-        </w:rPr>
-      </w:pPr>
-      <w:r>
-        <w:rPr>
-          <w:rFonts w:ascii="Calibri" w:hAnsi="Calibri" w:cs="Calibri"/>
-          <w:b/>
-          <w:bCs/>
-          <w:color w:val="000000"/>
-          <w:u w:val="single"/>
-        </w:rPr>
-        <w:t>What is his request?</w:t>
-      </w:r>
-      <w:r>
-        <w:rPr>
-          <w:rStyle w:val="apple-converted-space"/>
-          <w:rFonts w:ascii="Calibri" w:hAnsi="Calibri" w:cs="Calibri"/>
-          <w:b/>
-          <w:bCs/>
-          <w:color w:val="000000"/>
-          <w:u w:val="single"/>
-        </w:rPr>
-        <w:t> </w:t>
-      </w:r>
-    </w:p>
-    <w:p>
-      <w:pPr>
-        <w:rPr>
-          <w:rFonts w:ascii="Calibri" w:hAnsi="Calibri" w:cs="Calibri"/>
-          <w:color w:val="000000"/>
-        </w:rPr>
-      </w:pPr>
-      <w:r>
-        <w:rPr>
-          <w:rFonts w:ascii="Calibri" w:hAnsi="Calibri" w:cs="Calibri"/>
-          <w:color w:val="000000"/>
-          <w:lang w:val="en-US"/>
-        </w:rPr>
-        <w:t> </w:t>
-      </w:r>
-    </w:p>
-    <w:p>
-      <w:pPr>
-        <w:rPr>
-          <w:rFonts w:ascii="Calibri" w:hAnsi="Calibri" w:cs="Calibri"/>
-          <w:color w:val="000000"/>
-        </w:rPr>
-      </w:pPr>
-      <w:r>
-        <w:rPr>
-          <w:rFonts w:ascii="Calibri" w:hAnsi="Calibri" w:cs="Calibri"/>
-          <w:color w:val="000000"/>
-          <w:lang w:val="en-US"/>
-        </w:rPr>
-        <w:t>Mr. Costantino Della Gherardesca came personally to visit our office and asked to experience both EVA AIR and a stopover in Taiwan due to his special relationship with it.</w:t>
-      </w:r>
-    </w:p>
-    <w:p>
-      <w:pPr>
-        <w:rPr>
-          <w:rFonts w:ascii="Calibri" w:hAnsi="Calibri" w:cs="Calibri"/>
-          <w:color w:val="000000"/>
-        </w:rPr>
-      </w:pPr>
-      <w:r>
-        <w:rPr>
-          <w:rFonts w:ascii="Calibri" w:hAnsi="Calibri" w:cs="Calibri"/>
-          <w:color w:val="000000"/>
-          <w:lang w:val="en-US"/>
-        </w:rPr>
-        <w:t>He is also asking if it would be possible to support him and his personal assistance with a trip to Sun Moon Lake with two rooms in Lalu Hotels for a couple of days during his staying in Taiwan which will be between the 08</w:t>
-      </w:r>
-      <w:r>
-        <w:rPr>
-          <w:rFonts w:ascii="Calibri" w:hAnsi="Calibri" w:cs="Calibri"/>
-          <w:color w:val="000000"/>
-          <w:vertAlign w:val="superscript"/>
-          <w:lang w:val="en-US"/>
-        </w:rPr>
-        <w:t>th</w:t>
-      </w:r>
-      <w:r>
-        <w:rPr>
-          <w:rStyle w:val="apple-converted-space"/>
-          <w:rFonts w:ascii="Calibri" w:hAnsi="Calibri" w:cs="Calibri"/>
-          <w:color w:val="000000"/>
-          <w:lang w:val="en-US"/>
-        </w:rPr>
-        <w:t> </w:t>
-      </w:r>
-      <w:r>
-        <w:rPr>
-          <w:rFonts w:ascii="Calibri" w:hAnsi="Calibri" w:cs="Calibri"/>
-          <w:color w:val="000000"/>
-          <w:lang w:val="en-US"/>
-        </w:rPr>
-        <w:t>of August and the 11</w:t>
-      </w:r>
-      <w:r>
-        <w:rPr>
-          <w:rFonts w:ascii="Calibri" w:hAnsi="Calibri" w:cs="Calibri"/>
-          <w:color w:val="000000"/>
-          <w:vertAlign w:val="superscript"/>
-          <w:lang w:val="en-US"/>
-        </w:rPr>
-        <w:t>th</w:t>
-      </w:r>
-      <w:r>
-        <w:rPr>
-          <w:rStyle w:val="apple-converted-space"/>
-          <w:rFonts w:ascii="Calibri" w:hAnsi="Calibri" w:cs="Calibri"/>
-          <w:color w:val="000000"/>
-          <w:lang w:val="en-US"/>
-        </w:rPr>
-        <w:t> </w:t>
-      </w:r>
-      <w:r>
-        <w:rPr>
-          <w:rFonts w:ascii="Calibri" w:hAnsi="Calibri" w:cs="Calibri"/>
-          <w:color w:val="000000"/>
-          <w:lang w:val="en-US"/>
-        </w:rPr>
-        <w:t>of August.</w:t>
-      </w:r>
-    </w:p>
-    <w:p>
-      <w:pPr>
-        <w:rPr>
-          <w:rFonts w:ascii="Calibri" w:hAnsi="Calibri" w:cs="Calibri"/>
-          <w:color w:val="000000"/>
-        </w:rPr>
-      </w:pPr>
-      <w:r>
-        <w:rPr>
-          <w:rFonts w:ascii="Calibri" w:hAnsi="Calibri" w:cs="Calibri"/>
-          <w:color w:val="000000"/>
-          <w:lang w:val="en-US"/>
-        </w:rPr>
-        <w:t>Do you think it would be possible? If yes, he promised some social media contents in exchange, in case you have some requests in this regards feel free to share with me your input and I will share with Mr Della Gherardesca.</w:t>
-      </w:r>
-    </w:p>
-    <w:p>
-      <w:pPr>
-        <w:rPr>
-          <w:rFonts w:ascii="Calibri" w:hAnsi="Calibri" w:cs="Calibri"/>
-          <w:color w:val="000000"/>
-        </w:rPr>
-      </w:pPr>
-      <w:r>
-        <w:rPr>
-          <w:rFonts w:ascii="Calibri" w:hAnsi="Calibri" w:cs="Calibri"/>
-          <w:color w:val="000000"/>
-          <w:lang w:val="en-US"/>
-        </w:rPr>
-        <w:t> </w:t>
-      </w:r>
-      <w:r>
-        <w:rPr>
-          <w:rFonts w:ascii="Calibri" w:hAnsi="Calibri" w:cs="Calibri"/>
-          <w:color w:val="212121"/>
-          <w:sz w:val="22"/>
-          <w:szCs w:val="22"/>
-        </w:rPr>
-        <w:t> </w:t>
-      </w:r>
-    </w:p>
-    <w:p>
-      <w:pPr>
-        <w:rPr>
-          <w:rFonts w:ascii="Segoe UI" w:hAnsi="Segoe UI" w:cs="Segoe UI"/>
-          <w:color w:val="212121"/>
-          <w:sz w:val="23"/>
-          <w:szCs w:val="23"/>
-        </w:rPr>
-      </w:pPr>
-      <w:r>
-        <w:rPr>
-          <w:rFonts w:ascii="Calibri" w:hAnsi="Calibri" w:cs="Calibri"/>
-          <w:color w:val="212121"/>
-          <w:sz w:val="22"/>
-          <w:szCs w:val="22"/>
-        </w:rPr>
-        <w:t>Below all Mr Della Gherardesca’s feedback, in</w:t>
-      </w:r>
-      <w:r>
-        <w:rPr>
-          <w:rStyle w:val="apple-converted-space"/>
-          <w:rFonts w:ascii="Calibri" w:hAnsi="Calibri" w:cs="Calibri"/>
-          <w:color w:val="212121"/>
-          <w:sz w:val="22"/>
-          <w:szCs w:val="22"/>
-        </w:rPr>
-        <w:t> </w:t>
-      </w:r>
-      <w:r>
-        <w:rPr>
-          <w:rFonts w:ascii="Calibri" w:hAnsi="Calibri" w:cs="Calibri"/>
-          <w:color w:val="4472C4"/>
-          <w:sz w:val="22"/>
-          <w:szCs w:val="22"/>
-        </w:rPr>
-        <w:t>blue:</w:t>
-      </w:r>
-    </w:p>
-    <w:p>
-      <w:pPr>
-        <w:rPr>
-          <w:rFonts w:ascii="Segoe UI" w:hAnsi="Segoe UI" w:cs="Segoe UI"/>
-          <w:color w:val="212121"/>
-          <w:sz w:val="23"/>
-          <w:szCs w:val="23"/>
-        </w:rPr>
-      </w:pPr>
-      <w:r>
-        <w:rPr>
-          <w:rFonts w:ascii="Calibri" w:hAnsi="Calibri" w:cs="Calibri"/>
-          <w:color w:val="212121"/>
-          <w:sz w:val="22"/>
-          <w:szCs w:val="22"/>
-        </w:rPr>
-        <w:t> </w:t>
-      </w:r>
-    </w:p>
-    <w:p>
-      <w:pPr>
-        <w:ind w:left="360" w:hanging="360"/>
-        <w:rPr>
-          <w:rFonts w:ascii="Segoe UI" w:hAnsi="Segoe UI" w:cs="Segoe UI"/>
-          <w:color w:val="212121"/>
-          <w:sz w:val="23"/>
-          <w:szCs w:val="23"/>
-        </w:rPr>
-      </w:pPr>
-      <w:r>
-        <w:rPr>
-          <w:rFonts w:ascii="Symbol" w:hAnsi="Symbol"/>
-          <w:color w:val="000000"/>
-        </w:rPr>
-        <w:t>·</w:t>
-      </w:r>
-      <w:r>
-        <w:rPr>
-          <w:rFonts w:ascii="Calibri" w:hAnsi="Calibri" w:cs="Calibri"/>
-          <w:color w:val="000000"/>
-        </w:rPr>
-        <w:t>Have you heard from Mr. Della Gherardesca</w:t>
-      </w:r>
-      <w:r>
-        <w:rPr>
-          <w:rFonts w:ascii="Calibri" w:hAnsi="Calibri" w:cs="Calibri"/>
-          <w:color w:val="212121"/>
-          <w:sz w:val="22"/>
-          <w:szCs w:val="22"/>
-        </w:rPr>
-        <w:t>?</w:t>
-      </w:r>
-      <w:r>
-        <w:rPr>
-          <w:rStyle w:val="apple-converted-space"/>
-          <w:rFonts w:ascii="Calibri" w:hAnsi="Calibri" w:cs="Calibri"/>
-          <w:color w:val="212121"/>
-          <w:sz w:val="22"/>
-          <w:szCs w:val="22"/>
-        </w:rPr>
-        <w:t> </w:t>
-      </w:r>
-      <w:r>
-        <w:rPr>
-          <w:rFonts w:ascii="Calibri" w:hAnsi="Calibri" w:cs="Calibri"/>
-          <w:color w:val="4472C4"/>
-          <w:sz w:val="22"/>
-          <w:szCs w:val="22"/>
-        </w:rPr>
-        <w:t>Yes, he comes back to me right now.</w:t>
-      </w:r>
-    </w:p>
-    <w:p>
-      <w:pPr>
-        <w:rPr>
-          <w:rFonts w:ascii="Segoe UI" w:hAnsi="Segoe UI" w:cs="Segoe UI"/>
-          <w:color w:val="212121"/>
-          <w:sz w:val="23"/>
-          <w:szCs w:val="23"/>
-        </w:rPr>
-      </w:pPr>
-      <w:r>
-        <w:rPr>
-          <w:rFonts w:ascii="Calibri" w:hAnsi="Calibri" w:cs="Calibri"/>
-          <w:color w:val="000000"/>
-        </w:rPr>
-        <w:t> </w:t>
-      </w:r>
-    </w:p>
-    <w:p>
-      <w:pPr>
-        <w:ind w:left="360" w:hanging="360"/>
-        <w:rPr>
-          <w:rFonts w:ascii="Segoe UI" w:hAnsi="Segoe UI" w:cs="Segoe UI"/>
-          <w:color w:val="212121"/>
-          <w:sz w:val="23"/>
-          <w:szCs w:val="23"/>
-        </w:rPr>
-      </w:pPr>
-      <w:r>
-        <w:rPr>
-          <w:rFonts w:ascii="Symbol" w:hAnsi="Symbol"/>
-          <w:color w:val="000000"/>
-        </w:rPr>
-        <w:t>·</w:t>
-      </w:r>
-      <w:r>
-        <w:rPr>
-          <w:rFonts w:ascii="Calibri" w:hAnsi="Calibri" w:cs="Calibri"/>
-          <w:color w:val="000000"/>
-        </w:rPr>
-        <w:t>Can he promise any social media exposure?</w:t>
-      </w:r>
-      <w:r>
-        <w:rPr>
-          <w:rStyle w:val="apple-converted-space"/>
-          <w:rFonts w:ascii="Calibri" w:hAnsi="Calibri" w:cs="Calibri"/>
-          <w:color w:val="000000"/>
-        </w:rPr>
-        <w:t> </w:t>
-      </w:r>
-      <w:r>
-        <w:rPr>
-          <w:rFonts w:ascii="Calibri" w:hAnsi="Calibri" w:cs="Calibri"/>
-          <w:color w:val="4472C4"/>
-          <w:sz w:val="22"/>
-          <w:szCs w:val="22"/>
-        </w:rPr>
-        <w:t>Yes, he can indeed, a story per place/activity and a story per hotel offered,  both IG/FB. He is also able to use AI (Artificial Intelligence) for his contents to assure high level of promotion.</w:t>
-      </w:r>
-    </w:p>
-    <w:p>
-      <w:pPr>
-        <w:rPr>
-          <w:rFonts w:ascii="Segoe UI" w:hAnsi="Segoe UI" w:cs="Segoe UI"/>
-          <w:color w:val="212121"/>
-          <w:sz w:val="23"/>
-          <w:szCs w:val="23"/>
-        </w:rPr>
-      </w:pPr>
-      <w:r>
-        <w:rPr>
-          <w:rFonts w:ascii="Calibri" w:hAnsi="Calibri" w:cs="Calibri"/>
-          <w:color w:val="000000"/>
-        </w:rPr>
-        <w:t> </w:t>
-      </w:r>
-    </w:p>
-    <w:p>
-      <w:pPr>
-        <w:ind w:left="360" w:hanging="360"/>
-        <w:rPr>
-          <w:rFonts w:ascii="Segoe UI" w:hAnsi="Segoe UI" w:cs="Segoe UI"/>
-          <w:color w:val="212121"/>
-          <w:sz w:val="23"/>
-          <w:szCs w:val="23"/>
-        </w:rPr>
-      </w:pPr>
-      <w:r>
-        <w:rPr>
-          <w:rFonts w:ascii="Symbol" w:hAnsi="Symbol"/>
-          <w:color w:val="000000"/>
-        </w:rPr>
-        <w:t>·</w:t>
-      </w:r>
-      <w:r>
-        <w:rPr>
-          <w:rFonts w:ascii="Calibri" w:hAnsi="Calibri" w:cs="Calibri"/>
-          <w:color w:val="000000"/>
-        </w:rPr>
-        <w:t>On the other hand, we might not be able to arrange accommodation at the Lalu hotel. Would he consider other hotel at Sun Moon Lake area? </w:t>
-      </w:r>
-    </w:p>
-    <w:p>
-      <w:pPr>
-        <w:rPr>
-          <w:rFonts w:ascii="Segoe UI" w:hAnsi="Segoe UI" w:cs="Segoe UI"/>
-          <w:color w:val="212121"/>
-          <w:sz w:val="23"/>
-          <w:szCs w:val="23"/>
-        </w:rPr>
-      </w:pPr>
-      <w:r>
-        <w:rPr>
-          <w:rFonts w:ascii="Calibri" w:hAnsi="Calibri" w:cs="Calibri"/>
-          <w:color w:val="4472C4"/>
-          <w:sz w:val="22"/>
-          <w:szCs w:val="22"/>
-        </w:rPr>
-        <w:t>Yes, he could consider an alternative</w:t>
-      </w:r>
-      <w:r>
-        <w:rPr>
-          <w:rStyle w:val="apple-converted-space"/>
-          <w:rFonts w:ascii="Calibri" w:hAnsi="Calibri" w:cs="Calibri"/>
-          <w:color w:val="4472C4"/>
-        </w:rPr>
-        <w:t> </w:t>
-      </w:r>
-      <w:r>
-        <w:rPr>
-          <w:rFonts w:ascii="Calibri" w:hAnsi="Calibri" w:cs="Calibri"/>
-          <w:color w:val="4472C4"/>
-          <w:sz w:val="22"/>
-          <w:szCs w:val="22"/>
-        </w:rPr>
-        <w:t>accommodation only if the alternative is close to the Lake (Lake view) 2 separate rooms: 1 room for himself + 1 room for his personal assistance Mrs Moro. Despite his appreciation and gratitude to TTB, if, due to the high season, the alternative hotel is a little bit far from the Sun Moon Lake area (for example 40 minutes driving), Mr Gherardesca will kindly refrain the offer. For him, it is important the proximity to the Lake to assure attractive social media contents.</w:t>
-      </w:r>
-      <w:r>
-        <w:rPr>
-          <w:rStyle w:val="apple-converted-space"/>
-          <w:rFonts w:ascii="Calibri" w:hAnsi="Calibri" w:cs="Calibri"/>
-          <w:color w:val="4472C4"/>
-          <w:sz w:val="22"/>
-          <w:szCs w:val="22"/>
-        </w:rPr>
-        <w:t> </w:t>
-      </w:r>
-    </w:p>
-    <w:p>
-      <w:pPr>
-        <w:rPr>
-          <w:rFonts w:ascii="Segoe UI" w:hAnsi="Segoe UI" w:cs="Segoe UI"/>
-          <w:color w:val="212121"/>
-          <w:sz w:val="23"/>
-          <w:szCs w:val="23"/>
-        </w:rPr>
-      </w:pPr>
-      <w:r>
-        <w:rPr>
-          <w:rFonts w:ascii="Calibri" w:hAnsi="Calibri" w:cs="Calibri"/>
-          <w:color w:val="4472C4"/>
-          <w:sz w:val="22"/>
-          <w:szCs w:val="22"/>
-        </w:rPr>
-        <w:t> </w:t>
-      </w:r>
-    </w:p>
-    <w:p>
-      <w:pPr>
-        <w:ind w:left="360" w:hanging="360"/>
-        <w:rPr>
-          <w:rFonts w:ascii="Segoe UI" w:hAnsi="Segoe UI" w:cs="Segoe UI" w:hint="eastAsia"/>
-          <w:color w:val="212121"/>
-          <w:sz w:val="23"/>
-          <w:szCs w:val="23"/>
-        </w:rPr>
-      </w:pPr>
-      <w:r>
-        <w:rPr>
-          <w:rFonts w:ascii="Symbol" w:hAnsi="Symbol"/>
-          <w:color w:val="000000"/>
-        </w:rPr>
-        <w:t>·</w:t>
-      </w:r>
-      <w:r>
-        <w:rPr>
-          <w:rFonts w:ascii="Calibri" w:hAnsi="Calibri" w:cs="Calibri"/>
-          <w:color w:val="000000"/>
-        </w:rPr>
-        <w:t>How is his travel plan? Would he spend 4 nights in Sun Moon Lake only? </w:t>
-      </w:r>
-    </w:p>
-    <w:p>
-      <w:pPr>
-        <w:rPr>
-          <w:rFonts w:ascii="Segoe UI" w:hAnsi="Segoe UI" w:cs="Segoe UI"/>
-          <w:color w:val="212121"/>
-          <w:sz w:val="23"/>
-          <w:szCs w:val="23"/>
-        </w:rPr>
-      </w:pPr>
-      <w:r>
-        <w:rPr>
-          <w:rFonts w:ascii="Calibri" w:hAnsi="Calibri" w:cs="Calibri"/>
-          <w:color w:val="4472C4"/>
-          <w:sz w:val="22"/>
-          <w:szCs w:val="22"/>
-        </w:rPr>
-        <w:t>Only if possible to have the Lalu or an alternative hotel close to the Sun Moon Lake (Lake view), based on his flights schedule, see below, he express the wish, to have an immediate transfer on his arrival (the 8</w:t>
-      </w:r>
-      <w:r>
-        <w:rPr>
-          <w:rFonts w:ascii="Calibri" w:hAnsi="Calibri" w:cs="Calibri"/>
-          <w:color w:val="4472C4"/>
-          <w:sz w:val="20"/>
-          <w:szCs w:val="20"/>
-          <w:vertAlign w:val="superscript"/>
-        </w:rPr>
-        <w:t>th</w:t>
-      </w:r>
-      <w:r>
-        <w:rPr>
-          <w:rStyle w:val="apple-converted-space"/>
-          <w:rFonts w:ascii="Calibri" w:hAnsi="Calibri" w:cs="Calibri"/>
-          <w:color w:val="4472C4"/>
-          <w:sz w:val="22"/>
-          <w:szCs w:val="22"/>
-        </w:rPr>
-        <w:t> </w:t>
-      </w:r>
-      <w:r>
-        <w:rPr>
-          <w:rFonts w:ascii="Calibri" w:hAnsi="Calibri" w:cs="Calibri"/>
-          <w:color w:val="4472C4"/>
-          <w:sz w:val="22"/>
-          <w:szCs w:val="22"/>
-        </w:rPr>
-        <w:t>of August) to the Sun Moon Lake Area, to make the most of it and spending 2 nights in there, for then coming back to Taipei and spending 2 nights in the city, too. If it can help or if not possible to arrange 2 nights, also 1 night in Sun Moon Lake will do and the remaining time he will spend in Taipei.</w:t>
-      </w:r>
-      <w:r>
-        <w:rPr>
-          <w:rStyle w:val="apple-converted-space"/>
-          <w:rFonts w:ascii="Calibri" w:hAnsi="Calibri" w:cs="Calibri"/>
-          <w:color w:val="4472C4"/>
-          <w:sz w:val="22"/>
-          <w:szCs w:val="22"/>
-        </w:rPr>
-        <w:t> </w:t>
-      </w:r>
-    </w:p>
-    <w:p>
-      <w:pPr>
-        <w:rPr>
-          <w:rFonts w:ascii="Segoe UI" w:hAnsi="Segoe UI" w:cs="Segoe UI"/>
-          <w:color w:val="212121"/>
-          <w:sz w:val="23"/>
-          <w:szCs w:val="23"/>
-        </w:rPr>
-      </w:pPr>
-      <w:r>
-        <w:rPr>
-          <w:rFonts w:ascii="Calibri" w:hAnsi="Calibri" w:cs="Calibri"/>
-          <w:color w:val="212121"/>
-          <w:sz w:val="22"/>
-          <w:szCs w:val="22"/>
-        </w:rPr>
-        <w:t> </w:t>
-      </w:r>
-    </w:p>
-    <w:p>
-      <w:pPr>
-        <w:shd w:val="clear" w:color="auto" w:fill="FFFFFF"/>
-        <w:rPr>
-          <w:rFonts w:ascii="Segoe UI" w:hAnsi="Segoe UI" w:cs="Segoe UI"/>
-          <w:color w:val="212121"/>
-          <w:sz w:val="23"/>
-          <w:szCs w:val="23"/>
-        </w:rPr>
-      </w:pPr>
-      <w:r>
-        <w:rPr>
-          <w:rFonts w:ascii="Courier New" w:hAnsi="Courier New" w:cs="Courier New"/>
-          <w:color w:val="000000"/>
-          <w:sz w:val="21"/>
-          <w:szCs w:val="21"/>
-          <w:shd w:val="clear" w:color="auto" w:fill="FFFFFF"/>
-        </w:rPr>
-        <w:t> </w:t>
-      </w:r>
-      <w:r>
-        <w:rPr>
-          <w:rStyle w:val="apple-converted-space"/>
-          <w:rFonts w:ascii="Courier New" w:hAnsi="Courier New" w:cs="Courier New"/>
-          <w:color w:val="000000"/>
-          <w:sz w:val="21"/>
-          <w:szCs w:val="21"/>
-          <w:shd w:val="clear" w:color="auto" w:fill="FFFFFF"/>
-        </w:rPr>
-        <w:t> </w:t>
-      </w:r>
-      <w:r>
-        <w:rPr>
-          <w:rFonts w:ascii="Courier New" w:hAnsi="Courier New" w:cs="Courier New"/>
-          <w:color w:val="FFFFFF"/>
-          <w:sz w:val="21"/>
-          <w:szCs w:val="21"/>
-          <w:shd w:val="clear" w:color="auto" w:fill="FF00FF"/>
-          <w:lang w:val="it-IT"/>
-        </w:rPr>
-        <w:t>1</w:t>
-      </w:r>
-      <w:r>
-        <w:rPr>
-          <w:rFonts w:ascii="Courier New" w:hAnsi="Courier New" w:cs="Courier New"/>
-          <w:color w:val="000000"/>
-          <w:sz w:val="21"/>
-          <w:szCs w:val="21"/>
-          <w:shd w:val="clear" w:color="auto" w:fill="FFFFFF"/>
-          <w:lang w:val="it-IT"/>
-        </w:rPr>
-        <w:t>.DELLAGHERARDESCAVERECONDISCORTECCI/COSTANTINO MR(ADT)</w:t>
-      </w:r>
-    </w:p>
-    <w:p>
-      <w:pPr>
-        <w:shd w:val="clear" w:color="auto" w:fill="FFFFFF"/>
-        <w:rPr>
-          <w:rFonts w:ascii="Segoe UI" w:hAnsi="Segoe UI" w:cs="Segoe UI"/>
-          <w:color w:val="212121"/>
-          <w:sz w:val="23"/>
-          <w:szCs w:val="23"/>
-        </w:rPr>
-      </w:pPr>
-      <w:r>
-        <w:rPr>
-          <w:rFonts w:ascii="Courier New" w:hAnsi="Courier New" w:cs="Courier New"/>
-          <w:color w:val="000000"/>
-          <w:sz w:val="21"/>
-          <w:szCs w:val="21"/>
-          <w:shd w:val="clear" w:color="auto" w:fill="FFFFFF"/>
-          <w:lang w:val="it-IT"/>
-        </w:rPr>
-        <w:t> </w:t>
-      </w:r>
-      <w:r>
-        <w:rPr>
-          <w:rStyle w:val="apple-converted-space"/>
-          <w:rFonts w:ascii="Courier New" w:hAnsi="Courier New" w:cs="Courier New"/>
-          <w:color w:val="000000"/>
-          <w:sz w:val="21"/>
-          <w:szCs w:val="21"/>
-          <w:shd w:val="clear" w:color="auto" w:fill="FFFFFF"/>
-          <w:lang w:val="it-IT"/>
-        </w:rPr>
-        <w:t> </w:t>
-      </w:r>
-      <w:r>
-        <w:rPr>
-          <w:rFonts w:ascii="Courier New" w:hAnsi="Courier New" w:cs="Courier New"/>
-          <w:color w:val="FF00FF"/>
-          <w:sz w:val="21"/>
-          <w:szCs w:val="21"/>
-          <w:shd w:val="clear" w:color="auto" w:fill="FFFFFF"/>
-          <w:lang w:val="it-IT"/>
-        </w:rPr>
-        <w:t>2</w:t>
-      </w:r>
-      <w:r>
-        <w:rPr>
-          <w:rFonts w:ascii="Courier New" w:hAnsi="Courier New" w:cs="Courier New"/>
-          <w:color w:val="000000"/>
-          <w:sz w:val="21"/>
-          <w:szCs w:val="21"/>
-          <w:shd w:val="clear" w:color="auto" w:fill="FFFFFF"/>
-          <w:lang w:val="it-IT"/>
-        </w:rPr>
-        <w:t>.MORO/ROSSANA ANTONIETTA MRS(ADT)</w:t>
-      </w:r>
-    </w:p>
-    <w:p>
-      <w:pPr>
-        <w:shd w:val="clear" w:color="auto" w:fill="FFFFFF"/>
-        <w:rPr>
-          <w:rFonts w:ascii="Segoe UI" w:hAnsi="Segoe UI" w:cs="Segoe UI"/>
-          <w:color w:val="212121"/>
-          <w:sz w:val="23"/>
-          <w:szCs w:val="23"/>
-        </w:rPr>
-      </w:pPr>
-      <w:r>
-        <w:rPr>
-          <w:rFonts w:ascii="Courier New" w:hAnsi="Courier New" w:cs="Courier New"/>
-          <w:color w:val="000000"/>
-          <w:sz w:val="21"/>
-          <w:szCs w:val="21"/>
-          <w:shd w:val="clear" w:color="auto" w:fill="FFFFFF"/>
-          <w:lang w:val="it-IT"/>
-        </w:rPr>
-        <w:t> </w:t>
-      </w:r>
-      <w:r>
-        <w:rPr>
-          <w:rStyle w:val="apple-converted-space"/>
-          <w:rFonts w:ascii="Courier New" w:hAnsi="Courier New" w:cs="Courier New"/>
-          <w:color w:val="000000"/>
-          <w:sz w:val="21"/>
-          <w:szCs w:val="21"/>
-          <w:shd w:val="clear" w:color="auto" w:fill="FFFFFF"/>
-          <w:lang w:val="it-IT"/>
-        </w:rPr>
-        <w:t> </w:t>
-      </w:r>
-      <w:r>
-        <w:rPr>
-          <w:rFonts w:ascii="Courier New" w:hAnsi="Courier New" w:cs="Courier New"/>
-          <w:color w:val="FF00FF"/>
-          <w:sz w:val="21"/>
-          <w:szCs w:val="21"/>
-          <w:shd w:val="clear" w:color="auto" w:fill="FFFFFF"/>
-          <w:lang w:val="it-IT"/>
-        </w:rPr>
-        <w:t>3</w:t>
-      </w:r>
-      <w:r>
-        <w:rPr>
-          <w:rFonts w:ascii="Courier New" w:hAnsi="Courier New" w:cs="Courier New"/>
-          <w:color w:val="000000"/>
-          <w:sz w:val="21"/>
-          <w:szCs w:val="21"/>
-          <w:shd w:val="clear" w:color="auto" w:fill="FFFFFF"/>
-          <w:lang w:val="it-IT"/>
-        </w:rPr>
-        <w:t>  BR</w:t>
-      </w:r>
-      <w:r>
-        <w:rPr>
-          <w:rStyle w:val="apple-converted-space"/>
-          <w:rFonts w:ascii="Courier New" w:hAnsi="Courier New" w:cs="Courier New"/>
-          <w:color w:val="000000"/>
-          <w:sz w:val="21"/>
-          <w:szCs w:val="21"/>
-          <w:shd w:val="clear" w:color="auto" w:fill="FFFFFF"/>
-          <w:lang w:val="it-IT"/>
-        </w:rPr>
-        <w:t> </w:t>
-      </w:r>
-      <w:r>
-        <w:rPr>
-          <w:rFonts w:ascii="Courier New" w:hAnsi="Courier New" w:cs="Courier New"/>
-          <w:color w:val="FF0000"/>
-          <w:sz w:val="21"/>
-          <w:szCs w:val="21"/>
-          <w:shd w:val="clear" w:color="auto" w:fill="FFFFFF"/>
-          <w:lang w:val="it-IT"/>
-        </w:rPr>
-        <w:t>096</w:t>
-      </w:r>
-      <w:r>
-        <w:rPr>
-          <w:rStyle w:val="apple-converted-space"/>
-          <w:rFonts w:ascii="Courier New" w:hAnsi="Courier New" w:cs="Courier New"/>
-          <w:color w:val="000000"/>
-          <w:sz w:val="21"/>
-          <w:szCs w:val="21"/>
-          <w:shd w:val="clear" w:color="auto" w:fill="FFFFFF"/>
-          <w:lang w:val="it-IT"/>
-        </w:rPr>
-        <w:t> </w:t>
-      </w:r>
-      <w:r>
-        <w:rPr>
-          <w:rFonts w:ascii="Courier New" w:hAnsi="Courier New" w:cs="Courier New"/>
-          <w:color w:val="0000FF"/>
-          <w:sz w:val="21"/>
-          <w:szCs w:val="21"/>
-          <w:shd w:val="clear" w:color="auto" w:fill="FFFFFF"/>
-          <w:lang w:val="it-IT"/>
-        </w:rPr>
-        <w:t>R</w:t>
-      </w:r>
-      <w:r>
-        <w:rPr>
-          <w:rStyle w:val="apple-converted-space"/>
-          <w:rFonts w:ascii="Courier New" w:hAnsi="Courier New" w:cs="Courier New"/>
-          <w:color w:val="000000"/>
-          <w:sz w:val="21"/>
-          <w:szCs w:val="21"/>
-          <w:shd w:val="clear" w:color="auto" w:fill="FFFFFF"/>
-          <w:lang w:val="it-IT"/>
-        </w:rPr>
-        <w:t> </w:t>
-      </w:r>
-      <w:r>
-        <w:rPr>
-          <w:rFonts w:ascii="Courier New" w:hAnsi="Courier New" w:cs="Courier New"/>
-          <w:color w:val="000000"/>
-          <w:sz w:val="21"/>
-          <w:szCs w:val="21"/>
-          <w:shd w:val="clear" w:color="auto" w:fill="FFFFFF"/>
-          <w:lang w:val="it-IT"/>
-        </w:rPr>
-        <w:t>07AUG 3 MXPTPE HK2       1  1115 0625+1 *1A/E*</w:t>
-      </w:r>
-    </w:p>
-    <w:p>
-      <w:pPr>
-        <w:shd w:val="clear" w:color="auto" w:fill="FFFFFF"/>
-        <w:rPr>
-          <w:rFonts w:ascii="Segoe UI" w:hAnsi="Segoe UI" w:cs="Segoe UI"/>
-          <w:color w:val="212121"/>
-          <w:sz w:val="23"/>
-          <w:szCs w:val="23"/>
-        </w:rPr>
-      </w:pPr>
-      <w:r>
-        <w:rPr>
-          <w:rFonts w:ascii="Courier New" w:hAnsi="Courier New" w:cs="Courier New"/>
-          <w:color w:val="000000"/>
-          <w:sz w:val="21"/>
-          <w:szCs w:val="21"/>
-          <w:shd w:val="clear" w:color="auto" w:fill="FFFFFF"/>
-          <w:lang w:val="it-IT"/>
-        </w:rPr>
-        <w:t> </w:t>
-      </w:r>
-      <w:r>
-        <w:rPr>
-          <w:rStyle w:val="apple-converted-space"/>
-          <w:rFonts w:ascii="Courier New" w:hAnsi="Courier New" w:cs="Courier New"/>
-          <w:color w:val="000000"/>
-          <w:sz w:val="21"/>
-          <w:szCs w:val="21"/>
-          <w:shd w:val="clear" w:color="auto" w:fill="FFFFFF"/>
-          <w:lang w:val="it-IT"/>
-        </w:rPr>
-        <w:t> </w:t>
-      </w:r>
-      <w:r>
-        <w:rPr>
-          <w:rFonts w:ascii="Courier New" w:hAnsi="Courier New" w:cs="Courier New"/>
-          <w:color w:val="FF00FF"/>
-          <w:sz w:val="21"/>
-          <w:szCs w:val="21"/>
-          <w:shd w:val="clear" w:color="auto" w:fill="FFFFFF"/>
-          <w:lang w:val="it-IT"/>
-        </w:rPr>
-        <w:t>4</w:t>
-      </w:r>
-      <w:r>
-        <w:rPr>
-          <w:rFonts w:ascii="Courier New" w:hAnsi="Courier New" w:cs="Courier New"/>
-          <w:color w:val="000000"/>
-          <w:sz w:val="21"/>
-          <w:szCs w:val="21"/>
-          <w:shd w:val="clear" w:color="auto" w:fill="FFFFFF"/>
-          <w:lang w:val="it-IT"/>
-        </w:rPr>
-        <w:t>  BR</w:t>
-      </w:r>
-      <w:r>
-        <w:rPr>
-          <w:rStyle w:val="apple-converted-space"/>
-          <w:rFonts w:ascii="Courier New" w:hAnsi="Courier New" w:cs="Courier New"/>
-          <w:color w:val="000000"/>
-          <w:sz w:val="21"/>
-          <w:szCs w:val="21"/>
-          <w:shd w:val="clear" w:color="auto" w:fill="FFFFFF"/>
-          <w:lang w:val="it-IT"/>
-        </w:rPr>
-        <w:t> </w:t>
-      </w:r>
-      <w:r>
-        <w:rPr>
-          <w:rFonts w:ascii="Courier New" w:hAnsi="Courier New" w:cs="Courier New"/>
-          <w:color w:val="FF0000"/>
-          <w:sz w:val="21"/>
-          <w:szCs w:val="21"/>
-          <w:shd w:val="clear" w:color="auto" w:fill="FFFFFF"/>
-          <w:lang w:val="it-IT"/>
-        </w:rPr>
-        <w:t>257</w:t>
-      </w:r>
-      <w:r>
-        <w:rPr>
-          <w:rStyle w:val="apple-converted-space"/>
-          <w:rFonts w:ascii="Courier New" w:hAnsi="Courier New" w:cs="Courier New"/>
-          <w:color w:val="000000"/>
-          <w:sz w:val="21"/>
-          <w:szCs w:val="21"/>
-          <w:shd w:val="clear" w:color="auto" w:fill="FFFFFF"/>
-          <w:lang w:val="it-IT"/>
-        </w:rPr>
-        <w:t> </w:t>
-      </w:r>
-      <w:r>
-        <w:rPr>
-          <w:rFonts w:ascii="Courier New" w:hAnsi="Courier New" w:cs="Courier New"/>
-          <w:color w:val="0000FF"/>
-          <w:sz w:val="21"/>
-          <w:szCs w:val="21"/>
-          <w:shd w:val="clear" w:color="auto" w:fill="FFFFFF"/>
-          <w:lang w:val="it-IT"/>
-        </w:rPr>
-        <w:t>R</w:t>
-      </w:r>
-      <w:r>
-        <w:rPr>
-          <w:rStyle w:val="apple-converted-space"/>
-          <w:rFonts w:ascii="Courier New" w:hAnsi="Courier New" w:cs="Courier New"/>
-          <w:color w:val="000000"/>
-          <w:sz w:val="21"/>
-          <w:szCs w:val="21"/>
-          <w:shd w:val="clear" w:color="auto" w:fill="FFFFFF"/>
-          <w:lang w:val="it-IT"/>
-        </w:rPr>
-        <w:t> </w:t>
-      </w:r>
-      <w:r>
-        <w:rPr>
-          <w:rFonts w:ascii="Courier New" w:hAnsi="Courier New" w:cs="Courier New"/>
-          <w:color w:val="000000"/>
-          <w:sz w:val="21"/>
-          <w:szCs w:val="21"/>
-          <w:shd w:val="clear" w:color="auto" w:fill="FFFFFF"/>
-          <w:lang w:val="it-IT"/>
-        </w:rPr>
-        <w:t>12AUG 1 TPECNX HK2       2  0725 1025   *1A/E*</w:t>
-      </w:r>
-    </w:p>
-    <w:p>
-      <w:pPr>
-        <w:shd w:val="clear" w:color="auto" w:fill="FFFFFF"/>
-        <w:rPr>
-          <w:rFonts w:ascii="Segoe UI" w:hAnsi="Segoe UI" w:cs="Segoe UI"/>
-          <w:color w:val="212121"/>
-          <w:sz w:val="23"/>
-          <w:szCs w:val="23"/>
-        </w:rPr>
-      </w:pPr>
-      <w:r>
-        <w:rPr>
-          <w:rFonts w:ascii="Courier New" w:hAnsi="Courier New" w:cs="Courier New"/>
-          <w:color w:val="000000"/>
-          <w:sz w:val="21"/>
-          <w:szCs w:val="21"/>
-          <w:shd w:val="clear" w:color="auto" w:fill="FFFFFF"/>
-          <w:lang w:val="it-IT"/>
-        </w:rPr>
-        <w:t> </w:t>
-      </w:r>
-      <w:r>
-        <w:rPr>
-          <w:rStyle w:val="apple-converted-space"/>
-          <w:rFonts w:ascii="Courier New" w:hAnsi="Courier New" w:cs="Courier New"/>
-          <w:color w:val="000000"/>
-          <w:sz w:val="21"/>
-          <w:szCs w:val="21"/>
-          <w:shd w:val="clear" w:color="auto" w:fill="FFFFFF"/>
-          <w:lang w:val="it-IT"/>
-        </w:rPr>
-        <w:t> </w:t>
-      </w:r>
-    </w:p>
-    <w:p>
-      <w:pPr>
-        <w:rPr>
-          <w:rFonts w:ascii="Segoe UI" w:hAnsi="Segoe UI" w:cs="Segoe UI"/>
-          <w:color w:val="212121"/>
-          <w:sz w:val="23"/>
-          <w:szCs w:val="23"/>
-        </w:rPr>
-      </w:pPr>
-      <w:r>
-        <w:rPr>
-          <w:rFonts w:ascii="Calibri" w:hAnsi="Calibri" w:cs="Calibri"/>
-          <w:color w:val="000000"/>
-        </w:rPr>
-        <w:t> </w:t>
-      </w:r>
-    </w:p>
-    <w:p>
-      <w:pPr>
-        <w:ind w:left="360" w:hanging="360"/>
-        <w:rPr>
-          <w:rFonts w:ascii="Calibri" w:hAnsi="Calibri" w:cs="Calibri"/>
-          <w:color w:val="000000"/>
-        </w:rPr>
-      </w:pPr>
-      <w:r>
-        <w:rPr>
-          <w:rFonts w:ascii="Symbol" w:hAnsi="Symbol"/>
-          <w:color w:val="000000"/>
-        </w:rPr>
-        <w:t>·</w:t>
-      </w:r>
-      <w:r>
-        <w:rPr>
-          <w:rFonts w:ascii="Calibri" w:hAnsi="Calibri" w:cs="Calibri"/>
-          <w:color w:val="000000"/>
-        </w:rPr>
-        <w:t xml:space="preserve">In order to create more contents, we'd rather arrange some tours at this area. Would he </w:t>
-      </w:r>
-    </w:p>
-    <w:p>
-      <w:pPr>
-        <w:ind w:left="360" w:hanging="360"/>
-        <w:rPr>
-          <w:rFonts w:ascii="Calibri" w:hAnsi="Calibri" w:cs="Calibri"/>
-          <w:color w:val="4472C4"/>
-          <w:sz w:val="22"/>
-          <w:szCs w:val="22"/>
-        </w:rPr>
-      </w:pPr>
-      <w:r>
-        <w:rPr>
-          <w:rFonts w:ascii="Calibri" w:hAnsi="Calibri" w:cs="Calibri"/>
-          <w:color w:val="000000"/>
-        </w:rPr>
-        <w:t>agree to promote the Sun Moon Lake area via his social media channel?</w:t>
-      </w:r>
-      <w:r>
-        <w:rPr>
-          <w:rStyle w:val="apple-converted-space"/>
-          <w:rFonts w:ascii="Calibri" w:hAnsi="Calibri" w:cs="Calibri"/>
-          <w:color w:val="000000"/>
-        </w:rPr>
-        <w:t> </w:t>
-      </w:r>
-      <w:r>
-        <w:rPr>
-          <w:rFonts w:ascii="Calibri" w:hAnsi="Calibri" w:cs="Calibri"/>
-          <w:color w:val="4472C4"/>
-          <w:sz w:val="22"/>
-          <w:szCs w:val="22"/>
-        </w:rPr>
-        <w:t xml:space="preserve">Yes, sure via his </w:t>
-      </w:r>
-    </w:p>
-    <w:p>
-      <w:pPr>
-        <w:ind w:left="360" w:hanging="360"/>
-        <w:rPr>
-          <w:rFonts w:ascii="Segoe UI" w:hAnsi="Segoe UI" w:cs="Segoe UI"/>
-          <w:color w:val="212121"/>
-          <w:sz w:val="23"/>
-          <w:szCs w:val="23"/>
-        </w:rPr>
-      </w:pPr>
-      <w:r>
-        <w:rPr>
-          <w:rFonts w:ascii="Calibri" w:hAnsi="Calibri" w:cs="Calibri"/>
-          <w:color w:val="4472C4"/>
-          <w:sz w:val="22"/>
-          <w:szCs w:val="22"/>
-        </w:rPr>
-        <w:t>IG/FB channels as per above.</w:t>
-      </w:r>
-    </w:p>
-    <w:p>
-      <w:pPr>
-        <w:rPr>
-          <w:rFonts w:ascii="Segoe UI" w:hAnsi="Segoe UI" w:cs="Segoe UI"/>
-          <w:color w:val="212121"/>
-          <w:sz w:val="23"/>
-          <w:szCs w:val="23"/>
-        </w:rPr>
-      </w:pPr>
-      <w:r>
-        <w:rPr>
-          <w:rFonts w:ascii="Calibri" w:hAnsi="Calibri" w:cs="Calibri"/>
-          <w:color w:val="000000"/>
-        </w:rPr>
-        <w:t> </w:t>
-      </w:r>
-    </w:p>
-    <w:p>
-      <w:pPr>
-        <w:ind w:left="360" w:hanging="360"/>
-        <w:rPr>
-          <w:rFonts w:ascii="Calibri" w:hAnsi="Calibri" w:cs="Calibri"/>
-          <w:color w:val="4472C4"/>
-          <w:sz w:val="22"/>
-          <w:szCs w:val="22"/>
-        </w:rPr>
-      </w:pPr>
-      <w:r>
-        <w:rPr>
-          <w:rFonts w:ascii="Symbol" w:hAnsi="Symbol"/>
-          <w:color w:val="000000"/>
-        </w:rPr>
-        <w:t>·</w:t>
-      </w:r>
-      <w:r>
-        <w:rPr>
-          <w:rFonts w:ascii="Calibri" w:hAnsi="Calibri" w:cs="Calibri"/>
-          <w:color w:val="000000"/>
-        </w:rPr>
-        <w:t>Please note that we need to submit application by Monday next week (8th of July).</w:t>
-      </w:r>
-      <w:r>
-        <w:rPr>
-          <w:rStyle w:val="apple-converted-space"/>
-          <w:rFonts w:ascii="Calibri" w:hAnsi="Calibri" w:cs="Calibri"/>
-          <w:color w:val="000000"/>
-        </w:rPr>
-        <w:t> </w:t>
-      </w:r>
-      <w:r>
-        <w:rPr>
-          <w:rFonts w:ascii="Calibri" w:hAnsi="Calibri" w:cs="Calibri"/>
-          <w:color w:val="4472C4"/>
-          <w:sz w:val="22"/>
-          <w:szCs w:val="22"/>
-        </w:rPr>
-        <w:t xml:space="preserve">In </w:t>
-      </w:r>
-    </w:p>
-    <w:p>
-      <w:pPr>
-        <w:ind w:left="360" w:hanging="360"/>
-        <w:rPr>
-          <w:rFonts w:ascii="Calibri" w:hAnsi="Calibri" w:cs="Calibri"/>
-          <w:color w:val="4472C4"/>
-          <w:sz w:val="22"/>
-          <w:szCs w:val="22"/>
-        </w:rPr>
-      </w:pPr>
-      <w:r>
-        <w:rPr>
-          <w:rFonts w:ascii="Calibri" w:hAnsi="Calibri" w:cs="Calibri"/>
-          <w:color w:val="4472C4"/>
-          <w:sz w:val="22"/>
-          <w:szCs w:val="22"/>
-        </w:rPr>
-        <w:t xml:space="preserve">case on Monday morning, you need any further details or clarification, feel free to write me or call </w:t>
-      </w:r>
-    </w:p>
-    <w:p>
-      <w:pPr>
-        <w:ind w:left="360" w:hanging="360"/>
-        <w:rPr>
-          <w:rFonts w:ascii="Segoe UI" w:hAnsi="Segoe UI" w:cs="Segoe UI"/>
-          <w:color w:val="212121"/>
-          <w:sz w:val="23"/>
-          <w:szCs w:val="23"/>
-        </w:rPr>
-      </w:pPr>
-      <w:r>
-        <w:rPr>
-          <w:rFonts w:ascii="Calibri" w:hAnsi="Calibri" w:cs="Calibri"/>
-          <w:color w:val="4472C4"/>
-          <w:sz w:val="22"/>
-          <w:szCs w:val="22"/>
-        </w:rPr>
-        <w:t>me,  I am here to support.</w:t>
-      </w:r>
-    </w:p>
-    <w:p>
-      <w:pPr>
-        <w:rPr>
-          <w:rFonts w:ascii="Segoe UI" w:hAnsi="Segoe UI" w:cs="Segoe UI"/>
-          <w:color w:val="212121"/>
-          <w:sz w:val="23"/>
-          <w:szCs w:val="23"/>
-        </w:rPr>
-      </w:pPr>
-      <w:r>
-        <w:rPr>
-          <w:rFonts w:ascii="Calibri" w:hAnsi="Calibri" w:cs="Calibri"/>
-          <w:color w:val="212121"/>
-          <w:sz w:val="22"/>
-          <w:szCs w:val="22"/>
-        </w:rPr>
-        <w:t> </w:t>
-      </w:r>
-    </w:p>
-    <w:p>
-      <w:pPr>
-        <w:rPr>
-          <w:rFonts w:ascii="Segoe UI" w:hAnsi="Segoe UI" w:cs="Segoe UI"/>
-          <w:color w:val="212121"/>
-          <w:sz w:val="23"/>
-          <w:szCs w:val="23"/>
-        </w:rPr>
-      </w:pPr>
-      <w:r>
-        <w:rPr>
-          <w:rFonts w:ascii="Calibri" w:hAnsi="Calibri" w:cs="Calibri"/>
-          <w:color w:val="212121"/>
-          <w:sz w:val="22"/>
-          <w:szCs w:val="22"/>
-        </w:rPr>
-        <w:t>Have a great week-end from Milan,</w:t>
-      </w:r>
-      <w:r>
-        <w:rPr>
-          <w:rStyle w:val="apple-converted-space"/>
-          <w:rFonts w:ascii="Calibri" w:hAnsi="Calibri" w:cs="Calibri"/>
-          <w:color w:val="212121"/>
-          <w:sz w:val="22"/>
-          <w:szCs w:val="22"/>
-        </w:rPr>
-        <w:t> </w:t>
-      </w:r>
-    </w:p>
-    <w:p>
-      <w:pPr>
-        <w:rPr>
-          <w:rFonts w:ascii="Segoe UI" w:hAnsi="Segoe UI" w:cs="Segoe UI"/>
-          <w:color w:val="212121"/>
-          <w:sz w:val="23"/>
-          <w:szCs w:val="23"/>
-        </w:rPr>
-      </w:pPr>
-      <w:r>
-        <w:rPr>
-          <w:rFonts w:ascii="Calibri" w:hAnsi="Calibri" w:cs="Calibri"/>
-          <w:color w:val="212121"/>
-          <w:sz w:val="22"/>
-          <w:szCs w:val="22"/>
-        </w:rPr>
-        <w:t> </w:t>
-      </w:r>
-    </w:p>
-    <w:p>
-      <w:pPr>
-        <w:rPr>
-          <w:rFonts w:ascii="Segoe UI" w:hAnsi="Segoe UI" w:cs="Segoe UI"/>
-          <w:color w:val="212121"/>
-          <w:sz w:val="23"/>
-          <w:szCs w:val="23"/>
-        </w:rPr>
-      </w:pPr>
-      <w:r>
-        <w:rPr>
-          <w:rFonts w:ascii="Calibri" w:hAnsi="Calibri" w:cs="Calibri"/>
-          <w:b/>
-          <w:bCs/>
-          <w:color w:val="000000"/>
-          <w:sz w:val="22"/>
-          <w:szCs w:val="22"/>
-          <w:lang w:val="en-US"/>
-        </w:rPr>
-        <w:t> </w:t>
-      </w:r>
-    </w:p>
-    <w:p>
-      <w:pPr>
-        <w:rPr>
-          <w:rFonts w:ascii="Segoe UI" w:hAnsi="Segoe UI" w:cs="Segoe UI"/>
-          <w:color w:val="212121"/>
-          <w:sz w:val="23"/>
-          <w:szCs w:val="23"/>
-        </w:rPr>
-      </w:pPr>
-      <w:r>
-        <w:rPr>
-          <w:rFonts w:ascii="Calibri" w:hAnsi="Calibri" w:cs="Calibri"/>
-          <w:b/>
-          <w:bCs/>
-          <w:color w:val="000000"/>
-          <w:sz w:val="22"/>
-          <w:szCs w:val="22"/>
-          <w:lang w:val="en-US"/>
-        </w:rPr>
-        <w:t>Gaia Cilento</w:t>
-      </w:r>
-      <w:r>
-        <w:rPr>
-          <w:rStyle w:val="apple-converted-space"/>
-          <w:rFonts w:ascii="Calibri" w:hAnsi="Calibri" w:cs="Calibri"/>
-          <w:b/>
-          <w:bCs/>
-          <w:color w:val="000000"/>
-          <w:sz w:val="22"/>
-          <w:szCs w:val="22"/>
-          <w:lang w:val="en-US"/>
-        </w:rPr>
-        <w:t> </w:t>
-      </w:r>
-    </w:p>
-    <w:p>
-      <w:pPr>
-        <w:rPr>
-          <w:rFonts w:ascii="Segoe UI" w:hAnsi="Segoe UI" w:cs="Segoe UI"/>
-          <w:color w:val="212121"/>
-          <w:sz w:val="23"/>
-          <w:szCs w:val="23"/>
-        </w:rPr>
-      </w:pPr>
-      <w:r>
-        <w:rPr>
-          <w:rFonts w:ascii="Calibri" w:hAnsi="Calibri" w:cs="Calibri"/>
-          <w:color w:val="000000"/>
-          <w:sz w:val="22"/>
-          <w:szCs w:val="22"/>
-          <w:lang w:val="en-US"/>
-        </w:rPr>
-        <w:t>Passenger Marketing Coordinator</w:t>
-      </w:r>
-      <w:r>
-        <w:rPr>
-          <w:rStyle w:val="apple-converted-space"/>
-          <w:rFonts w:ascii="Calibri" w:hAnsi="Calibri" w:cs="Calibri"/>
-          <w:color w:val="000000"/>
-          <w:sz w:val="22"/>
-          <w:szCs w:val="22"/>
-          <w:lang w:val="en-US"/>
-        </w:rPr>
-        <w:t> </w:t>
-      </w:r>
-    </w:p>
-    <w:p>
-      <w:pPr>
-        <w:rPr>
-          <w:rFonts w:ascii="Segoe UI" w:hAnsi="Segoe UI" w:cs="Segoe UI"/>
-          <w:color w:val="212121"/>
-          <w:sz w:val="23"/>
-          <w:szCs w:val="23"/>
-        </w:rPr>
-      </w:pPr>
-      <w:r>
-        <w:rPr>
-          <w:rFonts w:ascii="Calibri" w:hAnsi="Calibri" w:cs="Calibri"/>
-          <w:color w:val="000000"/>
-          <w:sz w:val="22"/>
-          <w:szCs w:val="22"/>
-          <w:lang w:val="en-US"/>
-        </w:rPr>
-        <w:t>EVA AIRWAYS ITALY</w:t>
-      </w:r>
-    </w:p>
-    <w:p>
-      <w:pPr>
-        <w:rPr>
-          <w:rFonts w:ascii="Segoe UI" w:hAnsi="Segoe UI" w:cs="Segoe UI"/>
-          <w:color w:val="212121"/>
-          <w:sz w:val="23"/>
-          <w:szCs w:val="23"/>
-        </w:rPr>
-      </w:pPr>
-      <w:r>
-        <w:rPr>
-          <w:rFonts w:ascii="Calibri" w:hAnsi="Calibri" w:cs="Calibri"/>
-          <w:color w:val="000000"/>
-          <w:sz w:val="22"/>
-          <w:szCs w:val="22"/>
-          <w:lang w:val="en-US"/>
-        </w:rPr>
-        <w:t>+39 02 78 602 422</w:t>
-      </w:r>
-    </w:p>
-    <w:p>
-      <w:pPr>
-        <w:rPr>
-          <w:rFonts w:ascii="Segoe UI" w:hAnsi="Segoe UI" w:cs="Segoe UI"/>
-          <w:color w:val="212121"/>
-          <w:sz w:val="23"/>
-          <w:szCs w:val="23"/>
-        </w:rPr>
-      </w:pPr>
-      <w:r>
-        <w:rPr>
-          <w:rFonts w:ascii="Calibri" w:hAnsi="Calibri" w:cs="Calibri"/>
-          <w:color w:val="000000"/>
-          <w:sz w:val="22"/>
-          <w:szCs w:val="22"/>
-          <w:lang w:val="en-US"/>
-        </w:rPr>
-        <w:t> </w:t>
-      </w:r>
-    </w:p>
+    <w:tbl>
+      <w:tblPr>
+        <w:tblW w:w="9606" w:type="dxa"/>
+        <w:tblBorders>
+          <w:top w:val="single" w:sz="4" w:space="0" w:color="auto"/>
+          <w:left w:val="single" w:sz="4" w:space="0" w:color="auto"/>
+          <w:bottom w:val="single" w:sz="4" w:space="0" w:color="auto"/>
+          <w:right w:val="single" w:sz="4" w:space="0" w:color="auto"/>
+          <w:insideH w:val="single" w:sz="4" w:space="0" w:color="auto"/>
+          <w:insideV w:val="single" w:sz="4" w:space="0" w:color="auto"/>
+        </w:tblBorders>
+        <w:tblLayout w:type="fixed"/>
+        <w:tblLook w:val="01E0" w:firstRow="1" w:lastRow="1" w:firstColumn="1" w:lastColumn="1" w:noHBand="0" w:noVBand="0"/>
+      </w:tblPr>
+      <w:tblGrid>
+        <w:gridCol w:w="1188"/>
+        <w:gridCol w:w="2748"/>
+        <w:gridCol w:w="1417"/>
+        <w:gridCol w:w="992"/>
+        <w:gridCol w:w="1418"/>
+        <w:gridCol w:w="1843"/>
+      </w:tblGrid>
+      <w:tr>
+        <w:tc>
+          <w:tcPr>
+            <w:tcW w:w="1188" w:type="dxa"/>
+            <w:vAlign w:val="center"/>
+          </w:tcPr>
+          <w:p>
+            <w:pPr>
+              <w:jc w:val="center"/>
+              <w:rPr>
+                <w:rFonts w:ascii="KaiTi" w:eastAsia="KaiTi" w:hAnsi="KaiTi"/>
+                <w:b/>
+              </w:rPr>
+            </w:pPr>
+            <w:r>
+              <w:rPr>
+                <w:rFonts w:ascii="KaiTi" w:eastAsia="KaiTi" w:hAnsi="KaiTi"/>
+                <w:b/>
+              </w:rPr>
+              <w:t>項目</w:t>
+            </w:r>
+          </w:p>
+        </w:tc>
+        <w:tc>
+          <w:tcPr>
+            <w:tcW w:w="2748" w:type="dxa"/>
+            <w:vAlign w:val="center"/>
+          </w:tcPr>
+          <w:p>
+            <w:pPr>
+              <w:jc w:val="center"/>
+              <w:rPr>
+                <w:rFonts w:ascii="KaiTi" w:eastAsia="KaiTi" w:hAnsi="KaiTi"/>
+                <w:b/>
+              </w:rPr>
+            </w:pPr>
+            <w:r>
+              <w:rPr>
+                <w:rFonts w:ascii="KaiTi" w:eastAsia="KaiTi" w:hAnsi="KaiTi"/>
+                <w:b/>
+              </w:rPr>
+              <w:t>內容</w:t>
+            </w:r>
+          </w:p>
+        </w:tc>
+        <w:tc>
+          <w:tcPr>
+            <w:tcW w:w="1417" w:type="dxa"/>
+            <w:vAlign w:val="center"/>
+          </w:tcPr>
+          <w:p>
+            <w:pPr>
+              <w:jc w:val="center"/>
+              <w:rPr>
+                <w:rFonts w:ascii="KaiTi" w:eastAsia="KaiTi" w:hAnsi="KaiTi"/>
+                <w:b/>
+              </w:rPr>
+            </w:pPr>
+            <w:r>
+              <w:rPr>
+                <w:rFonts w:ascii="KaiTi" w:eastAsia="KaiTi" w:hAnsi="KaiTi"/>
+                <w:b/>
+              </w:rPr>
+              <w:t>單價</w:t>
+            </w:r>
+          </w:p>
+        </w:tc>
+        <w:tc>
+          <w:tcPr>
+            <w:tcW w:w="992" w:type="dxa"/>
+            <w:vAlign w:val="center"/>
+          </w:tcPr>
+          <w:p>
+            <w:pPr>
+              <w:jc w:val="center"/>
+              <w:rPr>
+                <w:rFonts w:ascii="KaiTi" w:eastAsia="KaiTi" w:hAnsi="KaiTi"/>
+                <w:b/>
+              </w:rPr>
+            </w:pPr>
+            <w:r>
+              <w:rPr>
+                <w:rFonts w:ascii="KaiTi" w:eastAsia="KaiTi" w:hAnsi="KaiTi"/>
+                <w:b/>
+              </w:rPr>
+              <w:t>數量</w:t>
+            </w:r>
+          </w:p>
+        </w:tc>
+        <w:tc>
+          <w:tcPr>
+            <w:tcW w:w="1418" w:type="dxa"/>
+            <w:vAlign w:val="center"/>
+          </w:tcPr>
+          <w:p>
+            <w:pPr>
+              <w:jc w:val="center"/>
+              <w:rPr>
+                <w:rFonts w:ascii="KaiTi" w:eastAsia="KaiTi" w:hAnsi="KaiTi"/>
+                <w:b/>
+              </w:rPr>
+            </w:pPr>
+            <w:r>
+              <w:rPr>
+                <w:rFonts w:ascii="KaiTi" w:eastAsia="KaiTi" w:hAnsi="KaiTi"/>
+                <w:b/>
+              </w:rPr>
+              <w:t>總價</w:t>
+            </w:r>
+          </w:p>
+        </w:tc>
+        <w:tc>
+          <w:tcPr>
+            <w:tcW w:w="1843" w:type="dxa"/>
+            <w:vAlign w:val="center"/>
+          </w:tcPr>
+          <w:p>
+            <w:pPr>
+              <w:jc w:val="center"/>
+              <w:rPr>
+                <w:rFonts w:ascii="KaiTi" w:eastAsia="KaiTi" w:hAnsi="KaiTi"/>
+                <w:b/>
+              </w:rPr>
+            </w:pPr>
+            <w:r>
+              <w:rPr>
+                <w:rFonts w:ascii="KaiTi" w:eastAsia="KaiTi" w:hAnsi="KaiTi"/>
+                <w:b/>
+              </w:rPr>
+              <w:t>備註</w:t>
+            </w:r>
+          </w:p>
+        </w:tc>
+      </w:tr>
+      <w:tr>
+        <w:tc>
+          <w:tcPr>
+            <w:tcW w:w="1188" w:type="dxa"/>
+            <w:vAlign w:val="center"/>
+          </w:tcPr>
+          <w:p>
+            <w:pPr>
+              <w:jc w:val="center"/>
+              <w:rPr>
+                <w:rFonts w:ascii="KaiTi" w:eastAsia="KaiTi" w:hAnsi="KaiTi"/>
+                <w:bCs/>
+              </w:rPr>
+            </w:pPr>
+            <w:r>
+              <w:rPr>
+                <w:rFonts w:ascii="KaiTi" w:eastAsia="KaiTi" w:hAnsi="KaiTi"/>
+                <w:bCs/>
+              </w:rPr>
+              <w:t>1</w:t>
+            </w:r>
+          </w:p>
+        </w:tc>
+        <w:tc>
+          <w:tcPr>
+            <w:tcW w:w="2748" w:type="dxa"/>
+            <w:vAlign w:val="center"/>
+          </w:tcPr>
+          <w:p>
+            <w:pPr>
+              <w:rPr>
+                <w:rFonts w:ascii="KaiTi" w:eastAsia="KaiTi" w:hAnsi="KaiTi"/>
+                <w:bCs/>
+              </w:rPr>
+            </w:pPr>
+            <w:r>
+              <w:rPr>
+                <w:rFonts w:ascii="KaiTi" w:eastAsia="KaiTi" w:hAnsi="KaiTi" w:hint="eastAsia"/>
+                <w:bCs/>
+              </w:rPr>
+              <w:t>巴黎</w:t>
+            </w:r>
+            <w:r>
+              <w:rPr>
+                <w:rFonts w:ascii="KaiTi" w:eastAsia="KaiTi" w:hAnsi="KaiTi" w:hint="eastAsia"/>
+                <w:bCs/>
+              </w:rPr>
+              <w:t>至</w:t>
+            </w:r>
+            <w:r>
+              <w:rPr>
+                <w:rFonts w:ascii="KaiTi" w:eastAsia="KaiTi" w:hAnsi="KaiTi" w:hint="eastAsia"/>
+                <w:bCs/>
+              </w:rPr>
+              <w:t>台北</w:t>
+            </w:r>
+            <w:r>
+              <w:rPr>
+                <w:rFonts w:ascii="KaiTi" w:eastAsia="KaiTi" w:hAnsi="KaiTi"/>
+                <w:bCs/>
+              </w:rPr>
+              <w:t>經濟艙來回</w:t>
+            </w:r>
+            <w:r>
+              <w:rPr>
+                <w:rFonts w:ascii="KaiTi" w:eastAsia="KaiTi" w:hAnsi="KaiTi" w:hint="eastAsia"/>
+                <w:bCs/>
+              </w:rPr>
+              <w:t>機票款</w:t>
+            </w:r>
+          </w:p>
+        </w:tc>
+        <w:tc>
+          <w:tcPr>
+            <w:tcW w:w="1417" w:type="dxa"/>
+            <w:vAlign w:val="center"/>
+          </w:tcPr>
+          <w:p>
+            <w:pPr>
+              <w:jc w:val="right"/>
+              <w:rPr>
+                <w:rFonts w:ascii="KaiTi" w:eastAsia="PMingLiU" w:hAnsi="KaiTi" w:hint="eastAsia"/>
+                <w:bCs/>
+              </w:rPr>
+            </w:pPr>
+            <w:r>
+              <w:rPr>
+                <w:rFonts w:ascii="KaiTi" w:eastAsia="PMingLiU" w:hAnsi="KaiTi" w:hint="eastAsia"/>
+                <w:bCs/>
+              </w:rPr>
+              <w:t>1,000</w:t>
+            </w:r>
+          </w:p>
+        </w:tc>
+        <w:tc>
+          <w:tcPr>
+            <w:tcW w:w="992" w:type="dxa"/>
+            <w:vAlign w:val="center"/>
+          </w:tcPr>
+          <w:p>
+            <w:pPr>
+              <w:jc w:val="center"/>
+              <w:rPr>
+                <w:rFonts w:ascii="KaiTi" w:eastAsia="PMingLiU" w:hAnsi="KaiTi" w:hint="eastAsia"/>
+                <w:bCs/>
+              </w:rPr>
+            </w:pPr>
+            <w:r>
+              <w:rPr>
+                <w:rFonts w:ascii="KaiTi" w:eastAsia="PMingLiU" w:hAnsi="KaiTi" w:hint="eastAsia"/>
+                <w:bCs/>
+              </w:rPr>
+              <w:t>6</w:t>
+            </w:r>
+          </w:p>
+        </w:tc>
+        <w:tc>
+          <w:tcPr>
+            <w:tcW w:w="1418" w:type="dxa"/>
+            <w:vAlign w:val="center"/>
+          </w:tcPr>
+          <w:p>
+            <w:pPr>
+              <w:jc w:val="right"/>
+              <w:rPr>
+                <w:rFonts w:ascii="KaiTi" w:eastAsia="PMingLiU" w:hAnsi="KaiTi" w:hint="eastAsia"/>
+                <w:bCs/>
+              </w:rPr>
+            </w:pPr>
+            <w:r>
+              <w:rPr>
+                <w:rFonts w:ascii="KaiTi" w:eastAsia="PMingLiU" w:hAnsi="KaiTi" w:hint="eastAsia"/>
+                <w:bCs/>
+              </w:rPr>
+              <w:t>6</w:t>
+            </w:r>
+            <w:r>
+              <w:rPr>
+                <w:rFonts w:ascii="KaiTi" w:eastAsia="KaiTi" w:hAnsi="KaiTi"/>
+                <w:bCs/>
+              </w:rPr>
+              <w:t>,</w:t>
+            </w:r>
+            <w:r>
+              <w:rPr>
+                <w:rFonts w:ascii="KaiTi" w:eastAsia="PMingLiU" w:hAnsi="KaiTi" w:hint="eastAsia"/>
+                <w:bCs/>
+              </w:rPr>
+              <w:t>000</w:t>
+            </w:r>
+          </w:p>
+        </w:tc>
+        <w:tc>
+          <w:tcPr>
+            <w:tcW w:w="1843" w:type="dxa"/>
+            <w:vAlign w:val="center"/>
+          </w:tcPr>
+          <w:p>
+            <w:pPr>
+              <w:jc w:val="both"/>
+              <w:rPr>
+                <w:rFonts w:ascii="KaiTi" w:eastAsia="KaiTi" w:hAnsi="KaiTi"/>
+                <w:bCs/>
+              </w:rPr>
+            </w:pPr>
+          </w:p>
+        </w:tc>
+      </w:tr>
+      <w:tr>
+        <w:trPr>
+          <w:trHeight w:val="730"/>
+        </w:trPr>
+        <w:tc>
+          <w:tcPr>
+            <w:tcW w:w="1188" w:type="dxa"/>
+            <w:vAlign w:val="center"/>
+          </w:tcPr>
+          <w:p>
+            <w:pPr>
+              <w:jc w:val="center"/>
+              <w:rPr>
+                <w:rFonts w:ascii="KaiTi" w:eastAsia="KaiTi" w:hAnsi="KaiTi"/>
+                <w:bCs/>
+              </w:rPr>
+            </w:pPr>
+            <w:r>
+              <w:rPr>
+                <w:rFonts w:ascii="KaiTi" w:eastAsia="KaiTi" w:hAnsi="KaiTi"/>
+                <w:bCs/>
+              </w:rPr>
+              <w:t>2</w:t>
+            </w:r>
+          </w:p>
+        </w:tc>
+        <w:tc>
+          <w:tcPr>
+            <w:tcW w:w="5157" w:type="dxa"/>
+            <w:gridSpan w:val="3"/>
+            <w:vAlign w:val="center"/>
+          </w:tcPr>
+          <w:p>
+            <w:pPr>
+              <w:jc w:val="center"/>
+              <w:rPr>
+                <w:rFonts w:ascii="KaiTi" w:eastAsia="PMingLiU" w:hAnsi="KaiTi" w:hint="eastAsia"/>
+                <w:bCs/>
+              </w:rPr>
+            </w:pPr>
+            <w:r>
+              <w:rPr>
+                <w:rFonts w:ascii="KaiTi" w:eastAsia="KaiTi" w:hAnsi="KaiTi" w:hint="eastAsia"/>
+                <w:bCs/>
+              </w:rPr>
+              <w:t>浮動機場稅</w:t>
+            </w:r>
+          </w:p>
+        </w:tc>
+        <w:tc>
+          <w:tcPr>
+            <w:tcW w:w="1418" w:type="dxa"/>
+            <w:vAlign w:val="center"/>
+          </w:tcPr>
+          <w:p>
+            <w:pPr>
+              <w:jc w:val="right"/>
+              <w:rPr>
+                <w:rFonts w:ascii="KaiTi" w:eastAsia="KaiTi" w:hAnsi="KaiTi"/>
+                <w:bCs/>
+              </w:rPr>
+            </w:pPr>
+            <w:r>
+              <w:rPr>
+                <w:rFonts w:ascii="KaiTi" w:eastAsia="PMingLiU" w:hAnsi="KaiTi" w:hint="eastAsia"/>
+                <w:bCs/>
+              </w:rPr>
+              <w:t>5</w:t>
+            </w:r>
+            <w:r>
+              <w:rPr>
+                <w:rFonts w:ascii="KaiTi" w:eastAsia="KaiTi" w:hAnsi="KaiTi"/>
+                <w:bCs/>
+              </w:rPr>
+              <w:t>00</w:t>
+            </w:r>
+          </w:p>
+        </w:tc>
+        <w:tc>
+          <w:tcPr>
+            <w:tcW w:w="1843" w:type="dxa"/>
+            <w:vAlign w:val="center"/>
+          </w:tcPr>
+          <w:p>
+            <w:pPr>
+              <w:jc w:val="both"/>
+              <w:rPr>
+                <w:rFonts w:ascii="KaiTi" w:eastAsia="KaiTi" w:hAnsi="KaiTi"/>
+                <w:bCs/>
+              </w:rPr>
+            </w:pPr>
+          </w:p>
+        </w:tc>
+      </w:tr>
+      <w:tr>
+        <w:trPr>
+          <w:cantSplit/>
+        </w:trPr>
+        <w:tc>
+          <w:tcPr>
+            <w:tcW w:w="1188" w:type="dxa"/>
+            <w:vAlign w:val="center"/>
+          </w:tcPr>
+          <w:p>
+            <w:pPr>
+              <w:jc w:val="center"/>
+              <w:rPr>
+                <w:rFonts w:ascii="KaiTi" w:eastAsia="KaiTi" w:hAnsi="KaiTi"/>
+                <w:bCs/>
+              </w:rPr>
+            </w:pPr>
+            <w:r>
+              <w:rPr>
+                <w:rFonts w:ascii="KaiTi" w:eastAsia="KaiTi" w:hAnsi="KaiTi"/>
+                <w:bCs/>
+              </w:rPr>
+              <w:t>合計</w:t>
+            </w:r>
+          </w:p>
+        </w:tc>
+        <w:tc>
+          <w:tcPr>
+            <w:tcW w:w="8418" w:type="dxa"/>
+            <w:gridSpan w:val="5"/>
+            <w:vAlign w:val="center"/>
+          </w:tcPr>
+          <w:p>
+            <w:pPr>
+              <w:jc w:val="center"/>
+              <w:rPr>
+                <w:rFonts w:ascii="KaiTi" w:eastAsia="KaiTi" w:hAnsi="KaiTi"/>
+                <w:bCs/>
+              </w:rPr>
+            </w:pPr>
+            <w:r>
+              <w:rPr>
+                <w:rFonts w:ascii="KaiTi" w:eastAsia="KaiTi" w:hAnsi="KaiTi"/>
+                <w:bCs/>
+              </w:rPr>
+              <w:t>共計€</w:t>
+            </w:r>
+            <w:r>
+              <w:rPr>
+                <w:rFonts w:ascii="KaiTi" w:eastAsia="PMingLiU" w:hAnsi="KaiTi" w:hint="eastAsia"/>
+                <w:bCs/>
+              </w:rPr>
+              <w:t>6</w:t>
+            </w:r>
+            <w:r>
+              <w:rPr>
+                <w:rFonts w:ascii="KaiTi" w:eastAsia="KaiTi" w:hAnsi="KaiTi"/>
+                <w:bCs/>
+              </w:rPr>
+              <w:t>,</w:t>
+            </w:r>
+            <w:r>
+              <w:rPr>
+                <w:rFonts w:ascii="KaiTi" w:eastAsia="PMingLiU" w:hAnsi="KaiTi" w:hint="eastAsia"/>
+                <w:bCs/>
+              </w:rPr>
+              <w:t>500</w:t>
+            </w:r>
+            <w:r>
+              <w:rPr>
+                <w:rFonts w:ascii="KaiTi" w:eastAsia="KaiTi" w:hAnsi="KaiTi"/>
+                <w:bCs/>
+              </w:rPr>
+              <w:t>約合新台幣</w:t>
+            </w:r>
+            <w:r>
+              <w:rPr>
+                <w:rFonts w:ascii="KaiTi" w:eastAsia="PMingLiU" w:hAnsi="KaiTi" w:hint="eastAsia"/>
+                <w:bCs/>
+              </w:rPr>
+              <w:t>23</w:t>
+            </w:r>
+            <w:r>
+              <w:rPr>
+                <w:rFonts w:ascii="KaiTi" w:eastAsia="KaiTi" w:hAnsi="KaiTi"/>
+                <w:bCs/>
+              </w:rPr>
+              <w:t>萬</w:t>
+            </w:r>
+            <w:r>
+              <w:rPr>
+                <w:rFonts w:ascii="KaiTi" w:eastAsia="PMingLiU" w:hAnsi="KaiTi" w:hint="eastAsia"/>
+                <w:bCs/>
+              </w:rPr>
+              <w:t>4</w:t>
+            </w:r>
+            <w:r>
+              <w:rPr>
+                <w:rFonts w:ascii="KaiTi" w:eastAsia="KaiTi" w:hAnsi="KaiTi"/>
+                <w:bCs/>
+              </w:rPr>
+              <w:t>,</w:t>
+            </w:r>
+            <w:r>
+              <w:rPr>
+                <w:rFonts w:ascii="KaiTi" w:eastAsia="PMingLiU" w:hAnsi="KaiTi" w:hint="eastAsia"/>
+                <w:bCs/>
+              </w:rPr>
+              <w:t>000</w:t>
+            </w:r>
+            <w:r>
+              <w:rPr>
+                <w:rFonts w:ascii="KaiTi" w:eastAsia="KaiTi" w:hAnsi="KaiTi"/>
+                <w:bCs/>
+              </w:rPr>
+              <w:t>元整</w:t>
+            </w:r>
+          </w:p>
+          <w:p>
+            <w:pPr>
+              <w:jc w:val="center"/>
+              <w:rPr>
+                <w:rFonts w:ascii="KaiTi" w:eastAsia="PMingLiU" w:hAnsi="KaiTi" w:hint="eastAsia"/>
+                <w:b/>
+              </w:rPr>
+            </w:pPr>
+            <w:r>
+              <w:rPr>
+                <w:rFonts w:ascii="KaiTi" w:eastAsia="KaiTi" w:hAnsi="KaiTi"/>
+                <w:bCs/>
+              </w:rPr>
+              <w:t>兌換匯率 歐元:台幣=</w:t>
+            </w:r>
+            <w:r>
+              <w:rPr>
+                <w:rFonts w:ascii="KaiTi" w:eastAsia="KaiTi" w:hAnsi="KaiTi"/>
+                <w:bCs/>
+              </w:rPr>
+              <w:t>1:3</w:t>
+            </w:r>
+            <w:r>
+              <w:rPr>
+                <w:rFonts w:ascii="KaiTi" w:eastAsia="PMingLiU" w:hAnsi="KaiTi" w:hint="eastAsia"/>
+                <w:bCs/>
+              </w:rPr>
+              <w:t>6</w:t>
+            </w:r>
+          </w:p>
+        </w:tc>
+      </w:tr>
+    </w:tbl>
     <w:p>
       <w:pPr>
         <w:rPr>
@@ -9060,7 +6817,7 @@
       </w:pPr>
     </w:p>
     <w:sectPr>
-      <w:footerReference w:type="default" r:id="rId10"/>
+      <w:footerReference w:type="default" r:id="rId8"/>
       <w:pgSz w:w="11906" w:h="16838"/>
       <w:pgMar w:top="1418" w:right="1418" w:bottom="1134" w:left="1701" w:header="851" w:footer="992" w:gutter="0"/>
       <w:cols w:space="425"/>
@@ -11672,7 +9429,7 @@
     <w:rPrDefault>
       <w:rPr>
         <w:rFonts w:ascii="Times New Roman" w:eastAsia="PMingLiU" w:hAnsi="Times New Roman" w:cs="Times New Roman"/>
-        <w:lang w:val="en-US" w:eastAsia="zh-CN" w:bidi="ar-SA"/>
+        <w:lang w:val="en-US" w:eastAsia="zh-TW" w:bidi="ar-SA"/>
       </w:rPr>
     </w:rPrDefault>
     <w:pPrDefault/>
@@ -11696,7 +9453,51 @@
     <w:lsdException w:name="Emphasis" w:qFormat="1"/>
     <w:lsdException w:name="Plain Text" w:uiPriority="99"/>
     <w:lsdException w:name="Normal (Web)" w:uiPriority="99"/>
+    <w:lsdException w:name="Normal Table" w:semiHidden="1" w:unhideWhenUsed="1"/>
+    <w:lsdException w:name="Table Simple 1" w:semiHidden="1" w:unhideWhenUsed="1"/>
+    <w:lsdException w:name="Table Simple 2" w:semiHidden="1" w:unhideWhenUsed="1"/>
+    <w:lsdException w:name="Table Simple 3" w:semiHidden="1" w:unhideWhenUsed="1"/>
+    <w:lsdException w:name="Table Classic 1" w:semiHidden="1" w:unhideWhenUsed="1"/>
+    <w:lsdException w:name="Table Classic 2" w:semiHidden="1" w:unhideWhenUsed="1"/>
+    <w:lsdException w:name="Table Classic 3" w:semiHidden="1" w:unhideWhenUsed="1"/>
+    <w:lsdException w:name="Table Classic 4" w:semiHidden="1" w:unhideWhenUsed="1"/>
+    <w:lsdException w:name="Table Colorful 1" w:semiHidden="1" w:unhideWhenUsed="1"/>
+    <w:lsdException w:name="Table Colorful 2" w:semiHidden="1" w:unhideWhenUsed="1"/>
+    <w:lsdException w:name="Table Colorful 3" w:semiHidden="1" w:unhideWhenUsed="1"/>
+    <w:lsdException w:name="Table Columns 1" w:semiHidden="1" w:unhideWhenUsed="1"/>
+    <w:lsdException w:name="Table Columns 2" w:semiHidden="1" w:unhideWhenUsed="1"/>
+    <w:lsdException w:name="Table Columns 3" w:semiHidden="1" w:unhideWhenUsed="1"/>
+    <w:lsdException w:name="Table Columns 4" w:semiHidden="1" w:unhideWhenUsed="1"/>
+    <w:lsdException w:name="Table Columns 5" w:semiHidden="1" w:unhideWhenUsed="1"/>
+    <w:lsdException w:name="Table Grid 1" w:semiHidden="1" w:unhideWhenUsed="1"/>
+    <w:lsdException w:name="Table Grid 2" w:semiHidden="1" w:unhideWhenUsed="1"/>
+    <w:lsdException w:name="Table Grid 3" w:semiHidden="1" w:unhideWhenUsed="1"/>
+    <w:lsdException w:name="Table Grid 4" w:semiHidden="1" w:unhideWhenUsed="1"/>
+    <w:lsdException w:name="Table Grid 5" w:semiHidden="1" w:unhideWhenUsed="1"/>
+    <w:lsdException w:name="Table Grid 6" w:semiHidden="1" w:unhideWhenUsed="1"/>
+    <w:lsdException w:name="Table Grid 7" w:semiHidden="1" w:unhideWhenUsed="1"/>
+    <w:lsdException w:name="Table Grid 8" w:semiHidden="1" w:unhideWhenUsed="1"/>
+    <w:lsdException w:name="Table List 1" w:semiHidden="1" w:unhideWhenUsed="1"/>
+    <w:lsdException w:name="Table List 2" w:semiHidden="1" w:unhideWhenUsed="1"/>
+    <w:lsdException w:name="Table List 3" w:semiHidden="1" w:unhideWhenUsed="1"/>
+    <w:lsdException w:name="Table List 4" w:semiHidden="1" w:unhideWhenUsed="1"/>
+    <w:lsdException w:name="Table List 5" w:semiHidden="1" w:unhideWhenUsed="1"/>
+    <w:lsdException w:name="Table List 6" w:semiHidden="1" w:unhideWhenUsed="1"/>
+    <w:lsdException w:name="Table List 7" w:semiHidden="1" w:unhideWhenUsed="1"/>
+    <w:lsdException w:name="Table List 8" w:semiHidden="1" w:unhideWhenUsed="1"/>
+    <w:lsdException w:name="Table 3D effects 1" w:semiHidden="1" w:unhideWhenUsed="1"/>
+    <w:lsdException w:name="Table 3D effects 2" w:semiHidden="1" w:unhideWhenUsed="1"/>
+    <w:lsdException w:name="Table 3D effects 3" w:semiHidden="1" w:unhideWhenUsed="1"/>
+    <w:lsdException w:name="Table Contemporary" w:semiHidden="1" w:unhideWhenUsed="1"/>
+    <w:lsdException w:name="Table Elegant" w:semiHidden="1" w:unhideWhenUsed="1"/>
+    <w:lsdException w:name="Table Professional" w:semiHidden="1" w:unhideWhenUsed="1"/>
+    <w:lsdException w:name="Table Subtle 1" w:semiHidden="1" w:unhideWhenUsed="1"/>
+    <w:lsdException w:name="Table Subtle 2" w:semiHidden="1" w:unhideWhenUsed="1"/>
+    <w:lsdException w:name="Table Web 1" w:semiHidden="1" w:unhideWhenUsed="1"/>
+    <w:lsdException w:name="Table Web 2" w:semiHidden="1" w:unhideWhenUsed="1"/>
+    <w:lsdException w:name="Table Web 3" w:semiHidden="1" w:unhideWhenUsed="1"/>
     <w:lsdException w:name="Table Grid" w:uiPriority="39"/>
+    <w:lsdException w:name="Table Theme" w:semiHidden="1" w:unhideWhenUsed="1"/>
     <w:lsdException w:name="Placeholder Text" w:semiHidden="1" w:uiPriority="99" w:unhideWhenUsed="1"/>
     <w:lsdException w:name="No Spacing" w:uiPriority="99" w:qFormat="1"/>
     <w:lsdException w:name="Light Shading" w:uiPriority="99"/>
@@ -11808,15 +9609,15 @@
     <w:lsdException w:name="Book Title" w:uiPriority="69" w:qFormat="1"/>
     <w:lsdException w:name="Bibliography" w:semiHidden="1" w:uiPriority="70" w:unhideWhenUsed="1"/>
     <w:lsdException w:name="TOC Heading" w:semiHidden="1" w:uiPriority="71" w:unhideWhenUsed="1" w:qFormat="1"/>
-    <w:lsdException w:name="Plain Table 1" w:semiHidden="1" w:uiPriority="72" w:unhideWhenUsed="1"/>
-    <w:lsdException w:name="Plain Table 2" w:semiHidden="1" w:uiPriority="73" w:unhideWhenUsed="1"/>
+    <w:lsdException w:name="Plain Table 1" w:uiPriority="72"/>
+    <w:lsdException w:name="Plain Table 2" w:uiPriority="73"/>
     <w:lsdException w:name="Plain Table 3" w:uiPriority="19" w:qFormat="1"/>
     <w:lsdException w:name="Plain Table 4" w:uiPriority="21" w:qFormat="1"/>
     <w:lsdException w:name="Plain Table 5" w:uiPriority="31" w:qFormat="1"/>
     <w:lsdException w:name="Grid Table Light" w:uiPriority="32" w:qFormat="1"/>
     <w:lsdException w:name="Grid Table 1 Light" w:uiPriority="33" w:qFormat="1"/>
-    <w:lsdException w:name="Grid Table 2" w:semiHidden="1" w:uiPriority="37" w:unhideWhenUsed="1"/>
-    <w:lsdException w:name="Grid Table 3" w:semiHidden="1" w:uiPriority="39" w:unhideWhenUsed="1" w:qFormat="1"/>
+    <w:lsdException w:name="Grid Table 2" w:uiPriority="37"/>
+    <w:lsdException w:name="Grid Table 3" w:uiPriority="39" w:qFormat="1"/>
     <w:lsdException w:name="Grid Table 4" w:uiPriority="49"/>
     <w:lsdException w:name="Grid Table 5 Dark" w:uiPriority="50"/>
     <w:lsdException w:name="Grid Table 6 Colorful" w:uiPriority="51"/>
@@ -11926,7 +9727,7 @@
       <w:rFonts w:eastAsia="Times New Roman"/>
       <w:sz w:val="24"/>
       <w:szCs w:val="24"/>
-      <w:lang w:val="de-DE" w:eastAsia="zh-TW"/>
+      <w:lang w:val="de-DE"/>
     </w:rPr>
   </w:style>
   <w:style w:type="paragraph" w:styleId="Heading1">
@@ -12065,11 +9866,15 @@
   </w:style>
   <w:style w:type="character" w:default="1" w:styleId="DefaultParagraphFont">
     <w:name w:val="Default Paragraph Font"/>
+    <w:uiPriority w:val="1"/>
     <w:semiHidden/>
+    <w:unhideWhenUsed/>
   </w:style>
   <w:style w:type="table" w:default="1" w:styleId="TableNormal">
     <w:name w:val="Normal Table"/>
+    <w:uiPriority w:val="99"/>
     <w:semiHidden/>
+    <w:unhideWhenUsed/>
     <w:tblPr>
       <w:tblInd w:w="0" w:type="dxa"/>
       <w:tblCellMar>
@@ -12082,7 +9887,9 @@
   </w:style>
   <w:style w:type="numbering" w:default="1" w:styleId="NoList">
     <w:name w:val="No List"/>
+    <w:uiPriority w:val="99"/>
     <w:semiHidden/>
+    <w:unhideWhenUsed/>
   </w:style>
   <w:style w:type="character" w:styleId="Strong">
     <w:name w:val="Strong"/>
@@ -12320,7 +10127,7 @@
     <w:rPr>
       <w:rFonts w:eastAsia="Arial Unicode MS"/>
       <w:bdr w:val="nil"/>
-      <w:lang w:val="de-DE" w:eastAsia="zh-TW"/>
+      <w:lang w:val="de-DE"/>
     </w:rPr>
     <w:tblPr>
       <w:tblInd w:w="0" w:type="dxa"/>
@@ -12352,7 +10159,6 @@
       <w:szCs w:val="24"/>
       <w:u w:color="000000"/>
       <w:bdr w:val="nil"/>
-      <w:lang w:eastAsia="zh-TW"/>
     </w:rPr>
   </w:style>
   <w:style w:type="paragraph" w:customStyle="1" w:styleId="TextAA">
@@ -12375,7 +10181,7 @@
       <w:szCs w:val="22"/>
       <w:u w:color="000000"/>
       <w:bdr w:val="nil"/>
-      <w:lang w:val="de-DE" w:eastAsia="zh-TW"/>
+      <w:lang w:val="de-DE"/>
     </w:rPr>
   </w:style>
   <w:style w:type="paragraph" w:styleId="PlainText">

</xml_diff>